<commit_message>
kleine aanpassingen aan user study
</commit_message>
<xml_diff>
--- a/userstudy_case.docx
+++ b/userstudy_case.docx
@@ -18,7 +18,6 @@
           <w14:ligatures w14:val="none"/>
         </w:rPr>
       </w:pPr>
-      <w:proofErr w:type="spellStart"/>
       <w:r>
         <w:rPr>
           <w:rFonts w:eastAsia="Times New Roman" w:cs="Times New Roman"/>
@@ -30,37 +29,8 @@
           <w:lang w:eastAsia="nl-BE"/>
           <w14:ligatures w14:val="none"/>
         </w:rPr>
-        <w:t>Informed</w:t>
-      </w:r>
-      <w:proofErr w:type="spellEnd"/>
-      <w:r>
-        <w:rPr>
-          <w:rFonts w:eastAsia="Times New Roman" w:cs="Times New Roman"/>
-          <w:b/>
-          <w:bCs/>
-          <w:kern w:val="36"/>
-          <w:sz w:val="40"/>
-          <w:szCs w:val="40"/>
-          <w:lang w:eastAsia="nl-BE"/>
-          <w14:ligatures w14:val="none"/>
-        </w:rPr>
-        <w:t xml:space="preserve"> Consent – User </w:t>
-      </w:r>
-      <w:proofErr w:type="spellStart"/>
-      <w:r>
-        <w:rPr>
-          <w:rFonts w:eastAsia="Times New Roman" w:cs="Times New Roman"/>
-          <w:b/>
-          <w:bCs/>
-          <w:kern w:val="36"/>
-          <w:sz w:val="40"/>
-          <w:szCs w:val="40"/>
-          <w:lang w:eastAsia="nl-BE"/>
-          <w14:ligatures w14:val="none"/>
-        </w:rPr>
-        <w:t>Study</w:t>
-      </w:r>
-      <w:proofErr w:type="spellEnd"/>
+        <w:t>Informed Consent – User Study</w:t>
+      </w:r>
       <w:r>
         <w:rPr>
           <w:rFonts w:eastAsia="Times New Roman" w:cs="Times New Roman"/>
@@ -99,127 +69,7 @@
           <w:lang w:eastAsia="nl-BE"/>
           <w14:ligatures w14:val="none"/>
         </w:rPr>
-        <w:t xml:space="preserve">Ontwikkeling van een gebruiksvriendelijke </w:t>
-      </w:r>
-      <w:proofErr w:type="spellStart"/>
-      <w:r>
-        <w:rPr>
-          <w:rFonts w:eastAsia="Times New Roman" w:cs="Times New Roman"/>
-          <w:b/>
-          <w:bCs/>
-          <w:i/>
-          <w:kern w:val="36"/>
-          <w:sz w:val="40"/>
-          <w:szCs w:val="40"/>
-          <w:lang w:eastAsia="nl-BE"/>
-          <w14:ligatures w14:val="none"/>
-        </w:rPr>
-        <w:t>threat</w:t>
-      </w:r>
-      <w:proofErr w:type="spellEnd"/>
-      <w:r>
-        <w:rPr>
-          <w:rFonts w:eastAsia="Times New Roman" w:cs="Times New Roman"/>
-          <w:b/>
-          <w:bCs/>
-          <w:i/>
-          <w:kern w:val="36"/>
-          <w:sz w:val="40"/>
-          <w:szCs w:val="40"/>
-          <w:lang w:eastAsia="nl-BE"/>
-          <w14:ligatures w14:val="none"/>
-        </w:rPr>
-        <w:t xml:space="preserve"> </w:t>
-      </w:r>
-      <w:proofErr w:type="spellStart"/>
-      <w:r>
-        <w:rPr>
-          <w:rFonts w:eastAsia="Times New Roman" w:cs="Times New Roman"/>
-          <w:b/>
-          <w:bCs/>
-          <w:i/>
-          <w:kern w:val="36"/>
-          <w:sz w:val="40"/>
-          <w:szCs w:val="40"/>
-          <w:lang w:eastAsia="nl-BE"/>
-          <w14:ligatures w14:val="none"/>
-        </w:rPr>
-        <w:t>modeling</w:t>
-      </w:r>
-      <w:proofErr w:type="spellEnd"/>
-      <w:r>
-        <w:rPr>
-          <w:rFonts w:eastAsia="Times New Roman" w:cs="Times New Roman"/>
-          <w:b/>
-          <w:bCs/>
-          <w:i/>
-          <w:kern w:val="36"/>
-          <w:sz w:val="40"/>
-          <w:szCs w:val="40"/>
-          <w:lang w:eastAsia="nl-BE"/>
-          <w14:ligatures w14:val="none"/>
-        </w:rPr>
-        <w:t xml:space="preserve"> tool gebaseerd op </w:t>
-      </w:r>
-      <w:proofErr w:type="spellStart"/>
-      <w:r>
-        <w:rPr>
-          <w:rFonts w:eastAsia="Times New Roman" w:cs="Times New Roman"/>
-          <w:b/>
-          <w:bCs/>
-          <w:i/>
-          <w:kern w:val="36"/>
-          <w:sz w:val="40"/>
-          <w:szCs w:val="40"/>
-          <w:lang w:eastAsia="nl-BE"/>
-          <w14:ligatures w14:val="none"/>
-        </w:rPr>
-        <w:t>fortunately</w:t>
-      </w:r>
-      <w:proofErr w:type="spellEnd"/>
-      <w:r>
-        <w:rPr>
-          <w:rFonts w:eastAsia="Times New Roman" w:cs="Times New Roman"/>
-          <w:b/>
-          <w:bCs/>
-          <w:i/>
-          <w:kern w:val="36"/>
-          <w:sz w:val="40"/>
-          <w:szCs w:val="40"/>
-          <w:lang w:eastAsia="nl-BE"/>
-          <w14:ligatures w14:val="none"/>
-        </w:rPr>
-        <w:t>/</w:t>
-      </w:r>
-      <w:proofErr w:type="spellStart"/>
-      <w:r>
-        <w:rPr>
-          <w:rFonts w:eastAsia="Times New Roman" w:cs="Times New Roman"/>
-          <w:b/>
-          <w:bCs/>
-          <w:i/>
-          <w:kern w:val="36"/>
-          <w:sz w:val="40"/>
-          <w:szCs w:val="40"/>
-          <w:lang w:eastAsia="nl-BE"/>
-          <w14:ligatures w14:val="none"/>
-        </w:rPr>
-        <w:t>unfortunately</w:t>
-      </w:r>
-      <w:proofErr w:type="spellEnd"/>
-      <w:r>
-        <w:rPr>
-          <w:rFonts w:eastAsia="Times New Roman" w:cs="Times New Roman"/>
-          <w:b/>
-          <w:bCs/>
-          <w:i/>
-          <w:kern w:val="36"/>
-          <w:sz w:val="40"/>
-          <w:szCs w:val="40"/>
-          <w:lang w:eastAsia="nl-BE"/>
-          <w14:ligatures w14:val="none"/>
-        </w:rPr>
-        <w:t xml:space="preserve"> methode</w:t>
+        <w:t>Ontwikkeling van een gebruiksvriendelijke threat modeling tool gebaseerd op fortunately/unfortunately methode</w:t>
       </w:r>
       <w:r>
         <w:rPr>
@@ -283,7 +133,6 @@
         </w:rPr>
         <w:t xml:space="preserve"> </w:t>
       </w:r>
-      <w:proofErr w:type="spellStart"/>
       <w:r>
         <w:rPr>
           <w:rFonts w:eastAsia="Times New Roman" w:cs="Times New Roman"/>
@@ -293,35 +142,14 @@
         </w:rPr>
         <w:t>threat</w:t>
       </w:r>
-      <w:proofErr w:type="spellEnd"/>
-      <w:r>
-        <w:rPr>
-          <w:rFonts w:eastAsia="Times New Roman" w:cs="Times New Roman"/>
-          <w:kern w:val="0"/>
-          <w:lang w:eastAsia="nl-BE"/>
-          <w14:ligatures w14:val="none"/>
-        </w:rPr>
-        <w:t xml:space="preserve"> tree </w:t>
-      </w:r>
-      <w:proofErr w:type="spellStart"/>
-      <w:r>
-        <w:rPr>
-          <w:rFonts w:eastAsia="Times New Roman" w:cs="Times New Roman"/>
-          <w:kern w:val="0"/>
-          <w:lang w:eastAsia="nl-BE"/>
-          <w14:ligatures w14:val="none"/>
-        </w:rPr>
-        <w:t>modeling</w:t>
-      </w:r>
-      <w:proofErr w:type="spellEnd"/>
-      <w:r>
-        <w:rPr>
-          <w:rFonts w:eastAsia="Times New Roman" w:cs="Times New Roman"/>
-          <w:kern w:val="0"/>
-          <w:lang w:eastAsia="nl-BE"/>
-          <w14:ligatures w14:val="none"/>
-        </w:rPr>
-        <w:t xml:space="preserve"> tool</w:t>
+      <w:r>
+        <w:rPr>
+          <w:rFonts w:eastAsia="Times New Roman" w:cs="Times New Roman"/>
+          <w:kern w:val="0"/>
+          <w:lang w:eastAsia="nl-BE"/>
+          <w14:ligatures w14:val="none"/>
+        </w:rPr>
+        <w:t xml:space="preserve"> tree modeling tool</w:t>
       </w:r>
       <w:r>
         <w:rPr>
@@ -422,7 +250,7 @@
           <w14:ligatures w14:val="none"/>
         </w:rPr>
         <w:pict w14:anchorId="0AB5CBB2">
-          <v:rect id="_x0000_i1138" style="width:0;height:1.5pt" o:hralign="center" o:hrstd="t" o:hr="t" fillcolor="#a0a0a0" stroked="f"/>
+          <v:rect id="_x0000_i1025" style="width:0;height:1.5pt" o:hralign="center" o:hrstd="t" o:hr="t" fillcolor="#a0a0a0" stroked="f"/>
         </w:pict>
       </w:r>
     </w:p>
@@ -472,47 +300,7 @@
           <w:lang w:eastAsia="nl-BE"/>
           <w14:ligatures w14:val="none"/>
         </w:rPr>
-        <w:t>U wordt uitgenodigd om deel te nemen aan een studie die onderzoekt hoe softwaregebruikers security- en AI-risicoscenario’s analyseren met behulp van een “</w:t>
-      </w:r>
-      <w:proofErr w:type="spellStart"/>
-      <w:r>
-        <w:rPr>
-          <w:rFonts w:eastAsia="Times New Roman" w:cs="Times New Roman"/>
-          <w:kern w:val="0"/>
-          <w:lang w:eastAsia="nl-BE"/>
-          <w14:ligatures w14:val="none"/>
-        </w:rPr>
-        <w:t>Fortunately</w:t>
-      </w:r>
-      <w:proofErr w:type="spellEnd"/>
-      <w:r>
-        <w:rPr>
-          <w:rFonts w:eastAsia="Times New Roman" w:cs="Times New Roman"/>
-          <w:kern w:val="0"/>
-          <w:lang w:eastAsia="nl-BE"/>
-          <w14:ligatures w14:val="none"/>
-        </w:rPr>
-        <w:t>–</w:t>
-      </w:r>
-      <w:proofErr w:type="spellStart"/>
-      <w:r>
-        <w:rPr>
-          <w:rFonts w:eastAsia="Times New Roman" w:cs="Times New Roman"/>
-          <w:kern w:val="0"/>
-          <w:lang w:eastAsia="nl-BE"/>
-          <w14:ligatures w14:val="none"/>
-        </w:rPr>
-        <w:t>Unfortunately</w:t>
-      </w:r>
-      <w:proofErr w:type="spellEnd"/>
-      <w:r>
-        <w:rPr>
-          <w:rFonts w:eastAsia="Times New Roman" w:cs="Times New Roman"/>
-          <w:kern w:val="0"/>
-          <w:lang w:eastAsia="nl-BE"/>
-          <w14:ligatures w14:val="none"/>
-        </w:rPr>
-        <w:t>”-model. Uw deelname helpt ons om de bruikbaarheid, helderheid en efficiëntie van de software te evalueren en te verbeteren.</w:t>
+        <w:t>U wordt uitgenodigd om deel te nemen aan een studie die onderzoekt hoe softwaregebruikers security- en AI-risicoscenario’s analyseren met behulp van een “Fortunately–Unfortunately”-model. Uw deelname helpt ons om de bruikbaarheid, helderheid en efficiëntie van de software te evalueren en te verbeteren.</w:t>
       </w:r>
     </w:p>
     <w:p>
@@ -533,7 +321,7 @@
           <w14:ligatures w14:val="none"/>
         </w:rPr>
         <w:pict w14:anchorId="7B541818">
-          <v:rect id="_x0000_i1139" style="width:0;height:1.5pt" o:hralign="center" o:hrstd="t" o:hr="t" fillcolor="#a0a0a0" stroked="f"/>
+          <v:rect id="_x0000_i1026" style="width:0;height:1.5pt" o:hralign="center" o:hrstd="t" o:hr="t" fillcolor="#a0a0a0" stroked="f"/>
         </w:pict>
       </w:r>
     </w:p>
@@ -717,7 +505,7 @@
           <w14:ligatures w14:val="none"/>
         </w:rPr>
         <w:pict w14:anchorId="642D45E8">
-          <v:rect id="_x0000_i1140" style="width:0;height:1.5pt" o:hralign="center" o:hrstd="t" o:hr="t" fillcolor="#a0a0a0" stroked="f"/>
+          <v:rect id="_x0000_i1027" style="width:0;height:1.5pt" o:hralign="center" o:hrstd="t" o:hr="t" fillcolor="#a0a0a0" stroked="f"/>
         </w:pict>
       </w:r>
     </w:p>
@@ -808,7 +596,7 @@
           <w14:ligatures w14:val="none"/>
         </w:rPr>
         <w:pict w14:anchorId="37DFB26B">
-          <v:rect id="_x0000_i1141" style="width:0;height:1.5pt" o:hralign="center" o:hrstd="t" o:hr="t" fillcolor="#a0a0a0" stroked="f"/>
+          <v:rect id="_x0000_i1028" style="width:0;height:1.5pt" o:hralign="center" o:hrstd="t" o:hr="t" fillcolor="#a0a0a0" stroked="f"/>
         </w:pict>
       </w:r>
     </w:p>
@@ -1070,7 +858,7 @@
           <w14:ligatures w14:val="none"/>
         </w:rPr>
         <w:pict w14:anchorId="1BCC843F">
-          <v:rect id="_x0000_i1142" style="width:0;height:1.5pt" o:hralign="center" o:hrstd="t" o:hr="t" fillcolor="#a0a0a0" stroked="f"/>
+          <v:rect id="_x0000_i1029" style="width:0;height:1.5pt" o:hralign="center" o:hrstd="t" o:hr="t" fillcolor="#a0a0a0" stroked="f"/>
         </w:pict>
       </w:r>
     </w:p>
@@ -1219,7 +1007,7 @@
           <w14:ligatures w14:val="none"/>
         </w:rPr>
         <w:pict w14:anchorId="0FFA2268">
-          <v:rect id="_x0000_i1143" style="width:0;height:1.5pt" o:hralign="center" o:hrstd="t" o:hr="t" fillcolor="#a0a0a0" stroked="f"/>
+          <v:rect id="_x0000_i1030" style="width:0;height:1.5pt" o:hralign="center" o:hrstd="t" o:hr="t" fillcolor="#a0a0a0" stroked="f"/>
         </w:pict>
       </w:r>
     </w:p>
@@ -1402,7 +1190,7 @@
           <w14:ligatures w14:val="none"/>
         </w:rPr>
         <w:pict w14:anchorId="3C6CC43E">
-          <v:rect id="_x0000_i1145" style="width:0;height:1.5pt" o:hralign="center" o:hrstd="t" o:hr="t" fillcolor="#a0a0a0" stroked="f"/>
+          <v:rect id="_x0000_i1031" style="width:0;height:1.5pt" o:hralign="center" o:hrstd="t" o:hr="t" fillcolor="#a0a0a0" stroked="f"/>
         </w:pict>
       </w:r>
     </w:p>
@@ -1617,7 +1405,7 @@
     <w:p>
       <w:r>
         <w:pict w14:anchorId="47911A2D">
-          <v:rect id="_x0000_i1031" style="width:0;height:1.5pt" o:hralign="center" o:hrstd="t" o:hr="t" fillcolor="#a0a0a0" stroked="f"/>
+          <v:rect id="_x0000_i1032" style="width:0;height:1.5pt" o:hralign="center" o:hrstd="t" o:hr="t" fillcolor="#a0a0a0" stroked="f"/>
         </w:pict>
       </w:r>
     </w:p>
@@ -1625,88 +1413,31 @@
       <w:r>
         <w:t xml:space="preserve">Je werkt binnen een softwareteam dat bezig is met het uitwerken van een securitymodel voor een -inlog- en authenticatiesysteem. Een deel van het team heeft al een begin gemaakt aan een </w:t>
       </w:r>
-      <w:proofErr w:type="spellStart"/>
       <w:r>
         <w:rPr>
           <w:i/>
           <w:iCs/>
         </w:rPr>
-        <w:t>Fortunately</w:t>
-      </w:r>
-      <w:proofErr w:type="spellEnd"/>
+        <w:t>Fortunately–Unfortunately</w:t>
+      </w:r>
+      <w:r>
+        <w:t>-model.</w:t>
+      </w:r>
+    </w:p>
+    <w:p>
+      <w:r>
+        <w:t xml:space="preserve">De </w:t>
+      </w:r>
       <w:r>
         <w:rPr>
           <w:i/>
           <w:iCs/>
         </w:rPr>
-        <w:t>–</w:t>
-      </w:r>
-      <w:proofErr w:type="spellStart"/>
-      <w:r>
-        <w:rPr>
-          <w:i/>
-          <w:iCs/>
-        </w:rPr>
-        <w:t>Unfortunately</w:t>
-      </w:r>
-      <w:proofErr w:type="spellEnd"/>
-      <w:r>
-        <w:t>-model.</w:t>
-      </w:r>
-    </w:p>
-    <w:p>
-      <w:r>
-        <w:t xml:space="preserve">De </w:t>
-      </w:r>
-      <w:proofErr w:type="spellStart"/>
-      <w:r>
-        <w:rPr>
-          <w:i/>
-          <w:iCs/>
-        </w:rPr>
-        <w:t>Fortunately</w:t>
-      </w:r>
-      <w:proofErr w:type="spellEnd"/>
-      <w:r>
-        <w:rPr>
-          <w:i/>
-          <w:iCs/>
-        </w:rPr>
-        <w:t>–</w:t>
-      </w:r>
-      <w:proofErr w:type="spellStart"/>
-      <w:r>
-        <w:rPr>
-          <w:i/>
-          <w:iCs/>
-        </w:rPr>
-        <w:t>Unfortunately</w:t>
-      </w:r>
-      <w:proofErr w:type="spellEnd"/>
-      <w:r>
-        <w:t>-methode komt oorspronkelijk uit improvisatietheater. Het is een techniek waarbij een verhaal zich afwisselend positief en negatief ontwikkelt. Elke nieuwe stap begint met “</w:t>
-      </w:r>
-      <w:proofErr w:type="spellStart"/>
-      <w:r>
-        <w:t>Fortunately</w:t>
-      </w:r>
-      <w:proofErr w:type="spellEnd"/>
-      <w:r>
-        <w:t>…” (gelukkig/positieve tegenmaatregel) of “</w:t>
-      </w:r>
-      <w:proofErr w:type="spellStart"/>
-      <w:r>
-        <w:t>Unfortunately</w:t>
-      </w:r>
-      <w:proofErr w:type="spellEnd"/>
-      <w:r>
-        <w:t xml:space="preserve">…” (helaas/risico’s) en verandert zo het verloop van het verhaal. Dit zorgt ervoor dat gebruikers verschillende scenario’s verkennen en onverwachte wendingen ontdekken. → </w:t>
-      </w:r>
-      <w:proofErr w:type="spellStart"/>
-      <w:r>
-        <w:t>example</w:t>
-      </w:r>
-      <w:proofErr w:type="spellEnd"/>
+        <w:t>Fortunately–Unfortunately</w:t>
+      </w:r>
+      <w:r>
+        <w:t>-methode komt oorspronkelijk uit improvisatietheater. Het is een techniek waarbij een verhaal zich afwisselend positief en negatief ontwikkelt. Elke nieuwe stap begint met “Fortunately…” (gelukkig/positieve tegenmaatregel) of “Unfortunately…” (helaas/risico’s) en verandert zo het verloop van het verhaal. Dit zorgt ervoor dat gebruikers verschillende scenario’s verkennen en onverwachte wendingen ontdekken. → example</w:t>
+      </w:r>
     </w:p>
     <w:p>
       <w:pPr>
@@ -1723,15 +1454,7 @@
         <w:t>“We willen een veilige IT-infrastructuur onderhouden.”</w:t>
       </w:r>
       <w:r>
-        <w:t xml:space="preserve"> (</w:t>
-      </w:r>
-      <w:proofErr w:type="spellStart"/>
-      <w:r>
-        <w:t>fortunate</w:t>
-      </w:r>
-      <w:proofErr w:type="spellEnd"/>
-      <w:r>
-        <w:t>)</w:t>
+        <w:t xml:space="preserve"> (fortunate)</w:t>
       </w:r>
     </w:p>
     <w:p>
@@ -1746,23 +1469,7 @@
           <w:i/>
           <w:iCs/>
         </w:rPr>
-        <w:t>“</w:t>
-      </w:r>
-      <w:proofErr w:type="spellStart"/>
-      <w:r>
-        <w:rPr>
-          <w:i/>
-          <w:iCs/>
-        </w:rPr>
-        <w:t>Unfortunately</w:t>
-      </w:r>
-      <w:proofErr w:type="spellEnd"/>
-      <w:r>
-        <w:rPr>
-          <w:i/>
-          <w:iCs/>
-        </w:rPr>
-        <w:t>, er zijn cyberdreigingen en kwetsbaarheden.”</w:t>
+        <w:t>“Unfortunately, er zijn cyberdreigingen en kwetsbaarheden.”</w:t>
       </w:r>
     </w:p>
     <w:p>
@@ -1775,21 +1482,12 @@
       <w:r>
         <w:t>“</w:t>
       </w:r>
-      <w:proofErr w:type="spellStart"/>
       <w:r>
         <w:rPr>
           <w:i/>
           <w:iCs/>
         </w:rPr>
-        <w:t>Fortunately</w:t>
-      </w:r>
-      <w:proofErr w:type="spellEnd"/>
-      <w:r>
-        <w:rPr>
-          <w:i/>
-          <w:iCs/>
-        </w:rPr>
-        <w:t>, we kunnen firewalls en detectiesystemen inzetten.”</w:t>
+        <w:t>Fortunately, we kunnen firewalls en detectiesystemen inzetten.”</w:t>
       </w:r>
     </w:p>
     <w:p>
@@ -1804,52 +1502,12 @@
           <w:i/>
           <w:iCs/>
         </w:rPr>
-        <w:t>“</w:t>
-      </w:r>
-      <w:proofErr w:type="spellStart"/>
-      <w:r>
-        <w:rPr>
-          <w:i/>
-          <w:iCs/>
-        </w:rPr>
-        <w:t>Unfortunately</w:t>
-      </w:r>
-      <w:proofErr w:type="spellEnd"/>
-      <w:r>
-        <w:rPr>
-          <w:i/>
-          <w:iCs/>
-        </w:rPr>
-        <w:t>, deze systemen kunnen falen of verkeerd geconfigureerd zijn.”</w:t>
-      </w:r>
-    </w:p>
-    <w:p>
-      <w:r>
-        <w:t xml:space="preserve">In de context van dit onderzoek zijn er nog een paar definities toegevoegd aan de </w:t>
-      </w:r>
-      <w:proofErr w:type="spellStart"/>
-      <w:r>
-        <w:t>unfortunately</w:t>
-      </w:r>
-      <w:proofErr w:type="spellEnd"/>
-      <w:r>
-        <w:t xml:space="preserve"> en </w:t>
-      </w:r>
-      <w:proofErr w:type="spellStart"/>
-      <w:r>
-        <w:t>fortunately</w:t>
-      </w:r>
-      <w:proofErr w:type="spellEnd"/>
-      <w:r>
-        <w:t xml:space="preserve"> </w:t>
-      </w:r>
-      <w:proofErr w:type="spellStart"/>
-      <w:r>
-        <w:t>nodes</w:t>
-      </w:r>
-      <w:proofErr w:type="spellEnd"/>
-      <w:r>
-        <w:t>:</w:t>
+        <w:t>“Unfortunately, deze systemen kunnen falen of verkeerd geconfigureerd zijn.”</w:t>
+      </w:r>
+    </w:p>
+    <w:p>
+      <w:r>
+        <w:t>In de context van dit onderzoek zijn er nog een paar definities toegevoegd aan de unfortunately en fortunately nodes:</w:t>
       </w:r>
     </w:p>
     <w:p>
@@ -1860,31 +1518,7 @@
         </w:numPr>
       </w:pPr>
       <w:r>
-        <w:t xml:space="preserve">Een </w:t>
-      </w:r>
-      <w:proofErr w:type="spellStart"/>
-      <w:r>
-        <w:t>unfortunately</w:t>
-      </w:r>
-      <w:proofErr w:type="spellEnd"/>
-      <w:r>
-        <w:t xml:space="preserve"> waar een </w:t>
-      </w:r>
-      <w:proofErr w:type="spellStart"/>
-      <w:r>
-        <w:t>branch</w:t>
-      </w:r>
-      <w:proofErr w:type="spellEnd"/>
-      <w:r>
-        <w:t xml:space="preserve"> op eindigt → Een </w:t>
-      </w:r>
-      <w:proofErr w:type="spellStart"/>
-      <w:r>
-        <w:t>weakness</w:t>
-      </w:r>
-      <w:proofErr w:type="spellEnd"/>
-      <w:r>
-        <w:t xml:space="preserve"> van de software</w:t>
+        <w:t>Een unfortunately waar een branch op eindigt → Een weakness van de software</w:t>
       </w:r>
     </w:p>
     <w:p>
@@ -1895,37 +1529,8 @@
         </w:numPr>
       </w:pPr>
       <w:r>
-        <w:t xml:space="preserve">Een </w:t>
-      </w:r>
-      <w:proofErr w:type="spellStart"/>
-      <w:r>
-        <w:t>unfortunately</w:t>
-      </w:r>
-      <w:proofErr w:type="spellEnd"/>
-      <w:r>
-        <w:t xml:space="preserve"> dat niet op het einde van een </w:t>
-      </w:r>
-      <w:proofErr w:type="spellStart"/>
-      <w:r>
-        <w:t>branch</w:t>
-      </w:r>
-      <w:proofErr w:type="spellEnd"/>
-      <w:r>
-        <w:t xml:space="preserve"> staat en nog niet volledig klaar is → </w:t>
-      </w:r>
-      <w:proofErr w:type="spellStart"/>
-      <w:r>
-        <w:t>Further</w:t>
-      </w:r>
-      <w:proofErr w:type="spellEnd"/>
-      <w:r>
-        <w:t xml:space="preserve"> </w:t>
-      </w:r>
-      <w:proofErr w:type="spellStart"/>
-      <w:r>
-        <w:t>investigation</w:t>
-      </w:r>
-      <w:proofErr w:type="spellEnd"/>
+        <w:t>Een unfortunately dat niet op het einde van een branch staat en nog niet volledig klaar is → Further investigation</w:t>
+      </w:r>
     </w:p>
     <w:p>
       <w:pPr>
@@ -1935,45 +1540,8 @@
         </w:numPr>
       </w:pPr>
       <w:r>
-        <w:t xml:space="preserve">Een </w:t>
-      </w:r>
-      <w:proofErr w:type="spellStart"/>
-      <w:r>
-        <w:t>fortunately</w:t>
-      </w:r>
-      <w:proofErr w:type="spellEnd"/>
-      <w:r>
-        <w:t xml:space="preserve"> node dat niet op het einde van een </w:t>
-      </w:r>
-      <w:proofErr w:type="spellStart"/>
-      <w:r>
-        <w:t>branch</w:t>
-      </w:r>
-      <w:proofErr w:type="spellEnd"/>
-      <w:r>
-        <w:t xml:space="preserve"> staat en nog niet volledig klaar is → </w:t>
-      </w:r>
-      <w:proofErr w:type="spellStart"/>
-      <w:r>
-        <w:t>Assumption</w:t>
-      </w:r>
-      <w:proofErr w:type="spellEnd"/>
-      <w:r>
-        <w:t xml:space="preserve"> </w:t>
-      </w:r>
-      <w:proofErr w:type="spellStart"/>
-      <w:r>
-        <w:t>to</w:t>
-      </w:r>
-      <w:proofErr w:type="spellEnd"/>
-      <w:r>
-        <w:t xml:space="preserve"> </w:t>
-      </w:r>
-      <w:proofErr w:type="spellStart"/>
-      <w:r>
-        <w:t>verify</w:t>
-      </w:r>
-      <w:proofErr w:type="spellEnd"/>
+        <w:t>Een fortunately node dat niet op het einde van een branch staat en nog niet volledig klaar is → Assumption to verify</w:t>
+      </w:r>
     </w:p>
     <w:p>
       <w:pPr>
@@ -1983,37 +1551,8 @@
         </w:numPr>
       </w:pPr>
       <w:r>
-        <w:t xml:space="preserve">Een </w:t>
-      </w:r>
-      <w:proofErr w:type="spellStart"/>
-      <w:r>
-        <w:t>fortunately</w:t>
-      </w:r>
-      <w:proofErr w:type="spellEnd"/>
-      <w:r>
-        <w:t xml:space="preserve"> node dat op het einde van een </w:t>
-      </w:r>
-      <w:proofErr w:type="spellStart"/>
-      <w:r>
-        <w:t>branch</w:t>
-      </w:r>
-      <w:proofErr w:type="spellEnd"/>
-      <w:r>
-        <w:t xml:space="preserve"> is en klaar is → </w:t>
-      </w:r>
-      <w:proofErr w:type="spellStart"/>
-      <w:r>
-        <w:t>Verified</w:t>
-      </w:r>
-      <w:proofErr w:type="spellEnd"/>
-      <w:r>
-        <w:t xml:space="preserve"> </w:t>
-      </w:r>
-      <w:proofErr w:type="spellStart"/>
-      <w:r>
-        <w:t>assumption</w:t>
-      </w:r>
-      <w:proofErr w:type="spellEnd"/>
+        <w:t>Een fortunately node dat op het einde van een branch is en klaar is → Verified assumption</w:t>
+      </w:r>
     </w:p>
     <w:p>
       <w:r>
@@ -2022,9 +1561,8 @@
     </w:p>
     <w:p>
       <w:r>
-        <w:t xml:space="preserve">Tijdens je verkenning merk je dat er nog een </w:t>
-      </w:r>
-      <w:proofErr w:type="spellStart"/>
+        <w:t xml:space="preserve">Bij het controleren van de tree merk je dat er nog een </w:t>
+      </w:r>
       <w:r>
         <w:rPr>
           <w:i/>
@@ -2032,59 +1570,47 @@
         </w:rPr>
         <w:t>unfortunate</w:t>
       </w:r>
-      <w:proofErr w:type="spellEnd"/>
-      <w:r>
-        <w:t xml:space="preserve"> ontbreekt — namelijk een </w:t>
-      </w:r>
-      <w:proofErr w:type="spellStart"/>
-      <w:r>
-        <w:t>weakness</w:t>
-      </w:r>
-      <w:proofErr w:type="spellEnd"/>
-      <w:r>
-        <w:t>/risico dat nog niet in het model is opgenomen ‘</w:t>
+      <w:r>
+        <w:t xml:space="preserve"> ontbreekt: een weakness/risico dat nog niet in het model is opgenomen, namelijk </w:t>
       </w:r>
       <w:r>
         <w:rPr>
           <w:i/>
           <w:iCs/>
         </w:rPr>
-        <w:t>Sommige werknemers weigeren wachtwoordmanagers te gebruiken’</w:t>
-      </w:r>
-      <w:r>
-        <w:t xml:space="preserve">. Voeg dit ontbrekende negatieve scenario toe onder de node </w:t>
+        <w:t>“Sommige werknemers weigeren wachtwoordmanagers te gebruiken”</w:t>
+      </w:r>
+      <w:r>
+        <w:t xml:space="preserve">. Voeg dit negatieve scenario toe onder de node </w:t>
       </w:r>
       <w:r>
         <w:rPr>
           <w:i/>
           <w:iCs/>
         </w:rPr>
-        <w:t>‘Uitrol van wachtwoordmanager verbetert gebruiksgemak’</w:t>
-      </w:r>
-      <w:r>
-        <w:t xml:space="preserve">. Deze tak is nu voltooid en de node hoort een </w:t>
-      </w:r>
-      <w:proofErr w:type="spellStart"/>
-      <w:r>
+        <w:t>“Uitrol van wachtwoordmanager verbetert gebruiksgemak”</w:t>
+      </w:r>
+      <w:r>
+        <w:t xml:space="preserve">. Omdat deze tak nu voltooid is, moet de laatste node als een </w:t>
+      </w:r>
+      <w:r>
+        <w:rPr>
+          <w:i/>
+          <w:iCs/>
+        </w:rPr>
         <w:t>assumption</w:t>
       </w:r>
-      <w:proofErr w:type="spellEnd"/>
-      <w:r>
-        <w:t xml:space="preserve"> te worden. Zorg ervoor dat dit duidelijk is voor je teamgenoten.</w:t>
+      <w:r>
+        <w:t xml:space="preserve"> worden gemarkeerd. Zorg dat dit duidelijk is voor je teamgenoten.</w:t>
+      </w:r>
+      <w:r>
+        <w:t xml:space="preserve"> </w:t>
       </w:r>
     </w:p>
     <w:p>
       <w:r>
         <w:lastRenderedPageBreak/>
-        <w:t xml:space="preserve">Heeft het team al nagedacht over authenticatieprovider? Zo niet, bekijk de tree en vul deze aan. Het is mogelijk om de volgende </w:t>
-      </w:r>
-      <w:proofErr w:type="spellStart"/>
-      <w:r>
-        <w:t>nodes</w:t>
-      </w:r>
-      <w:proofErr w:type="spellEnd"/>
-      <w:r>
-        <w:t xml:space="preserve"> aan te vullen:</w:t>
+        <w:t>Heeft het team al nagedacht over authenticatieprovider? Zo niet, bekijk de tree en vul deze aan. Het is mogelijk om de volgende nodes aan te vullen:</w:t>
       </w:r>
     </w:p>
     <w:p>
@@ -2094,13 +1620,8 @@
           <w:numId w:val="3"/>
         </w:numPr>
       </w:pPr>
-      <w:proofErr w:type="spellStart"/>
-      <w:r>
-        <w:t>Fortunately</w:t>
-      </w:r>
-      <w:proofErr w:type="spellEnd"/>
-      <w:r>
-        <w:t xml:space="preserve">: </w:t>
+      <w:r>
+        <w:t xml:space="preserve">Fortunately: </w:t>
       </w:r>
       <w:r>
         <w:rPr>
@@ -2117,13 +1638,8 @@
           <w:numId w:val="3"/>
         </w:numPr>
       </w:pPr>
-      <w:proofErr w:type="spellStart"/>
-      <w:r>
-        <w:t>Unfortunately</w:t>
-      </w:r>
-      <w:proofErr w:type="spellEnd"/>
-      <w:r>
-        <w:t xml:space="preserve">: </w:t>
+      <w:r>
+        <w:t xml:space="preserve">Unfortunately: </w:t>
       </w:r>
       <w:r>
         <w:rPr>
@@ -2155,64 +1671,21 @@
           <w:iCs/>
           <w:lang w:val="en-US"/>
         </w:rPr>
-        <w:t xml:space="preserve">"Team </w:t>
-      </w:r>
-      <w:proofErr w:type="spellStart"/>
-      <w:r>
-        <w:rPr>
-          <w:i/>
-          <w:iCs/>
-          <w:lang w:val="en-US"/>
-        </w:rPr>
-        <w:t>richt</w:t>
-      </w:r>
-      <w:proofErr w:type="spellEnd"/>
-      <w:r>
-        <w:rPr>
-          <w:i/>
-          <w:iCs/>
-          <w:lang w:val="en-US"/>
-        </w:rPr>
-        <w:t xml:space="preserve"> on-prem fallback-</w:t>
-      </w:r>
-      <w:proofErr w:type="spellStart"/>
-      <w:r>
-        <w:rPr>
-          <w:i/>
-          <w:iCs/>
-          <w:lang w:val="en-US"/>
-        </w:rPr>
-        <w:t>authenticatieserver</w:t>
-      </w:r>
-      <w:proofErr w:type="spellEnd"/>
-      <w:r>
-        <w:rPr>
-          <w:i/>
-          <w:iCs/>
-          <w:lang w:val="en-US"/>
-        </w:rPr>
-        <w:t xml:space="preserve"> in”</w:t>
-      </w:r>
-    </w:p>
-    <w:p>
-      <w:r>
-        <w:t xml:space="preserve">Nadien vraagt je teamlead naar een korte statusupdate: om te kunnen inschatten hoeveel tijd we nodig hebben en wilt de teamlead dus weten welke aannames er in het model zitten, welke problemen nog niet opgelost zijn, en hoeveel ervan nog verdere opvolging nodig hebben. Het kan zijn dat er wat tijdsnood is, rangschik de </w:t>
-      </w:r>
-      <w:proofErr w:type="spellStart"/>
-      <w:r>
-        <w:t>weaknesses</w:t>
-      </w:r>
-      <w:proofErr w:type="spellEnd"/>
-      <w:r>
-        <w:t xml:space="preserve"> op basis van </w:t>
-      </w:r>
-      <w:proofErr w:type="spellStart"/>
-      <w:r>
-        <w:t>dangerrating</w:t>
-      </w:r>
-      <w:proofErr w:type="spellEnd"/>
-      <w:r>
-        <w:t>.</w:t>
+        <w:t>"Team richt on-prem fallback-authenticatieserver in”</w:t>
+      </w:r>
+    </w:p>
+    <w:p>
+      <w:r>
+        <w:t xml:space="preserve">Nadien vraagt je teamlead naar een korte statusupdate: </w:t>
+      </w:r>
+      <w:r>
+        <w:t>om een inschatting te maken van de benodigde tijd</w:t>
+      </w:r>
+      <w:r>
+        <w:t xml:space="preserve">, </w:t>
+      </w:r>
+      <w:r>
+        <w:t>wilt de teamlead weten welke aannames er in het model zitten, welke problemen nog niet opgelost zijn, en hoeveel ervan nog verdere opvolging nodig hebben. Het kan zijn dat er wat tijdsnood is, rangschik de weaknesses op basis van dangerrating.</w:t>
       </w:r>
     </w:p>
     <w:p>
@@ -2226,15 +1699,25 @@
           <w:color w:val="FF0000"/>
           <w:sz w:val="40"/>
           <w:szCs w:val="40"/>
-        </w:rPr>
-      </w:pPr>
-      <w:r>
+          <w:lang w:val="en-US"/>
+        </w:rPr>
+      </w:pPr>
+      <w:r>
+        <w:rPr>
+          <w:lang w:val="en-US"/>
+        </w:rPr>
         <w:br/>
       </w:r>
       <w:r>
+        <w:rPr>
+          <w:lang w:val="en-US"/>
+        </w:rPr>
         <w:br/>
       </w:r>
       <w:r>
+        <w:rPr>
+          <w:lang w:val="en-US"/>
+        </w:rPr>
         <w:br/>
       </w:r>
       <w:r>
@@ -2242,67 +1725,26 @@
           <w:color w:val="FF0000"/>
           <w:sz w:val="40"/>
           <w:szCs w:val="40"/>
-        </w:rPr>
-        <w:t xml:space="preserve">→ </w:t>
-      </w:r>
-      <w:r>
+          <w:lang w:val="en-US"/>
+        </w:rPr>
+        <w:t>→ Hierna een user experience questionair</w:t>
+      </w:r>
+    </w:p>
+    <w:p>
+      <w:pPr>
         <w:rPr>
           <w:color w:val="FF0000"/>
           <w:sz w:val="40"/>
           <w:szCs w:val="40"/>
-        </w:rPr>
-        <w:t xml:space="preserve">Hierna een </w:t>
-      </w:r>
+          <w:lang w:val="en-US"/>
+        </w:rPr>
+      </w:pPr>
       <w:r>
         <w:rPr>
           <w:color w:val="FF0000"/>
           <w:sz w:val="40"/>
           <w:szCs w:val="40"/>
-        </w:rPr>
-        <w:t xml:space="preserve">user </w:t>
-      </w:r>
-      <w:proofErr w:type="spellStart"/>
-      <w:r>
-        <w:rPr>
-          <w:color w:val="FF0000"/>
-          <w:sz w:val="40"/>
-          <w:szCs w:val="40"/>
-        </w:rPr>
-        <w:t>experience</w:t>
-      </w:r>
-      <w:proofErr w:type="spellEnd"/>
-      <w:r>
-        <w:rPr>
-          <w:color w:val="FF0000"/>
-          <w:sz w:val="40"/>
-          <w:szCs w:val="40"/>
-        </w:rPr>
-        <w:t xml:space="preserve"> </w:t>
-      </w:r>
-      <w:proofErr w:type="spellStart"/>
-      <w:r>
-        <w:rPr>
-          <w:color w:val="FF0000"/>
-          <w:sz w:val="40"/>
-          <w:szCs w:val="40"/>
-        </w:rPr>
-        <w:t>questionair</w:t>
-      </w:r>
-      <w:proofErr w:type="spellEnd"/>
-    </w:p>
-    <w:p>
-      <w:pPr>
-        <w:rPr>
-          <w:color w:val="FF0000"/>
-          <w:sz w:val="40"/>
-          <w:szCs w:val="40"/>
-        </w:rPr>
-      </w:pPr>
-      <w:r>
-        <w:rPr>
-          <w:color w:val="FF0000"/>
-          <w:sz w:val="40"/>
-          <w:szCs w:val="40"/>
+          <w:lang w:val="en-US"/>
         </w:rPr>
         <w:br w:type="page"/>
       </w:r>
@@ -2314,6 +1756,7 @@
           <w:bCs/>
           <w:sz w:val="40"/>
           <w:szCs w:val="40"/>
+          <w:lang w:val="en-US"/>
         </w:rPr>
       </w:pPr>
       <w:r>
@@ -2322,6 +1765,7 @@
           <w:bCs/>
           <w:sz w:val="40"/>
           <w:szCs w:val="40"/>
+          <w:lang w:val="en-US"/>
         </w:rPr>
         <w:lastRenderedPageBreak/>
         <w:t>Story 2</w:t>
@@ -2330,7 +1774,7 @@
     <w:p>
       <w:r>
         <w:pict w14:anchorId="567D6411">
-          <v:rect id="_x0000_i1039" style="width:0;height:1.5pt" o:hralign="center" o:hrstd="t" o:hr="t" fillcolor="#a0a0a0" stroked="f"/>
+          <v:rect id="_x0000_i1033" style="width:0;height:1.5pt" o:hralign="center" o:hrstd="t" o:hr="t" fillcolor="#a0a0a0" stroked="f"/>
         </w:pict>
       </w:r>
     </w:p>
@@ -2338,196 +1782,90 @@
       <w:r>
         <w:t xml:space="preserve">Je zit in een softwareteam dat werkt aan een AI-systeem om fraude te detecteren. Er is al een begin gemaakt met een </w:t>
       </w:r>
-      <w:proofErr w:type="spellStart"/>
       <w:r>
         <w:rPr>
           <w:i/>
           <w:iCs/>
         </w:rPr>
-        <w:t>Fortunately</w:t>
-      </w:r>
-      <w:proofErr w:type="spellEnd"/>
+        <w:t>Fortunately–Unfortunately</w:t>
+      </w:r>
+      <w:r>
+        <w:t>-model, maar het is nog niet compleet en sommige onderdelen moeten verder uitgewerkt worden.</w:t>
+      </w:r>
+    </w:p>
+    <w:p>
+      <w:r>
+        <w:t xml:space="preserve">Voor je begint aan het verder uitwerken van de tree, wil je verkennen hoever ze voorlopig al staan. Hiervoor is het nuttig om te weten wat de voorlopige weaknesses </w:t>
+      </w:r>
+      <w:r>
+        <w:t xml:space="preserve">en </w:t>
+      </w:r>
+      <w:r>
+        <w:t>assumptions zijn die de teamgenoten al hebben gevonden</w:t>
+      </w:r>
+      <w:r>
+        <w:t>, maar ook welke nodes al onderzocht zijn maar nog verder onderzocht moeten worden</w:t>
+      </w:r>
+      <w:r>
+        <w:t>. Omdat je efficiënt wilt werken begin je natuurlijk met de gevaarlijkste weakness.</w:t>
+      </w:r>
+    </w:p>
+    <w:p>
+      <w:r>
+        <w:t>Tijdens je verkenning van de gevaarlijkste weakness merk je dat er nog iets ontbreekt — namelijk ‘</w:t>
+      </w:r>
       <w:r>
         <w:rPr>
           <w:i/>
           <w:iCs/>
         </w:rPr>
-        <w:t>–</w:t>
-      </w:r>
-      <w:proofErr w:type="spellStart"/>
+        <w:t>Toegangscontrole toegevoegd om zichtbaarheid van verklaringen te beperken’</w:t>
+      </w:r>
+      <w:r>
+        <w:t>. Zonder dit kan, zoals al aangehaald in de tree, er “</w:t>
+      </w:r>
       <w:r>
         <w:rPr>
           <w:i/>
           <w:iCs/>
         </w:rPr>
-        <w:t>Unfortunately</w:t>
-      </w:r>
-      <w:proofErr w:type="spellEnd"/>
-      <w:r>
-        <w:t>-model, maar het is nog niet compleet en sommige onderdelen moeten verder uitgewerkt worden.</w:t>
-      </w:r>
-    </w:p>
-    <w:p>
-      <w:r>
-        <w:t xml:space="preserve">Voor je begint aan het verder uitwerken van de tree, wil je verkennen hoever ze voorlopig al staan. Hiervoor is het nuttig om te weten wat de voorlopige </w:t>
-      </w:r>
-      <w:proofErr w:type="spellStart"/>
-      <w:r>
-        <w:t>weaknesses</w:t>
-      </w:r>
-      <w:proofErr w:type="spellEnd"/>
-      <w:r>
-        <w:t xml:space="preserve"> en </w:t>
-      </w:r>
-      <w:proofErr w:type="spellStart"/>
-      <w:r>
-        <w:t>assumptions</w:t>
-      </w:r>
-      <w:proofErr w:type="spellEnd"/>
-      <w:r>
-        <w:t xml:space="preserve"> zijn die de teamgenoten al hebben gevonden. Omdat je efficiënt wilt werken begin je natuurlijk met de gevaarlijkste </w:t>
-      </w:r>
-      <w:proofErr w:type="spellStart"/>
-      <w:r>
-        <w:t>weakness</w:t>
-      </w:r>
-      <w:proofErr w:type="spellEnd"/>
-      <w:r>
-        <w:t>.</w:t>
-      </w:r>
-    </w:p>
-    <w:p>
-      <w:r>
-        <w:t xml:space="preserve">Tijdens je verkenning van de gevaarlijkste </w:t>
-      </w:r>
-      <w:proofErr w:type="spellStart"/>
-      <w:r>
-        <w:t>weakness</w:t>
-      </w:r>
-      <w:proofErr w:type="spellEnd"/>
-      <w:r>
-        <w:t xml:space="preserve"> merk je dat er nog iets ontbreekt — namelijk ‘</w:t>
+        <w:t>gevoelige modellogica aan interne medewerkers”</w:t>
+      </w:r>
+      <w:r>
+        <w:t xml:space="preserve"> gelekt worde</w:t>
+      </w:r>
+      <w:r>
+        <w:t>n</w:t>
+      </w:r>
+      <w:r>
+        <w:t xml:space="preserve">. Voeg deze nog toe aan de correcte node. Als deze branch nu eindigt op een </w:t>
       </w:r>
       <w:r>
         <w:rPr>
           <w:i/>
           <w:iCs/>
         </w:rPr>
-        <w:t>Toegangscontrole toegevoegd om zichtbaarheid van verklaringen te beperken’</w:t>
-      </w:r>
-      <w:r>
-        <w:t>. Zonder dit kan, zoals al aangehaald in de tree, er “</w:t>
+        <w:t>fortunately</w:t>
+      </w:r>
+      <w:r>
+        <w:t xml:space="preserve"> node, mag deze laatste node als een assumption gezien worden. Zorg dat dit duidelijk is voor je collega’s.</w:t>
+      </w:r>
+    </w:p>
+    <w:p>
+      <w:r>
+        <w:t xml:space="preserve">Je ziet nog een branch dat je wilt bespreken met je collega’s in de volgende vergadering. In de branch zit namelijk een absurde veronderstelling. Buiten dat het absurd is, is dit zelfs nog niet eens een fortunately. Om deze branch duidelijk te bespreken, noteer je het verloop van de opeenvolgende nodes tot en met de node </w:t>
       </w:r>
       <w:r>
         <w:rPr>
           <w:i/>
           <w:iCs/>
         </w:rPr>
-        <w:t>gevoelige modellogica aan interne medewerkers”</w:t>
-      </w:r>
-      <w:r>
-        <w:t xml:space="preserve"> gelekt worden die dit niet moeten weten. Voeg deze nog toe aan de correcte node. Als deze </w:t>
-      </w:r>
-      <w:proofErr w:type="spellStart"/>
-      <w:r>
-        <w:t>branch</w:t>
-      </w:r>
-      <w:proofErr w:type="spellEnd"/>
-      <w:r>
-        <w:t xml:space="preserve"> nu eindigt op een </w:t>
-      </w:r>
-      <w:proofErr w:type="spellStart"/>
-      <w:r>
-        <w:rPr>
-          <w:i/>
-          <w:iCs/>
-        </w:rPr>
-        <w:t>fortunately</w:t>
-      </w:r>
-      <w:proofErr w:type="spellEnd"/>
-      <w:r>
-        <w:t xml:space="preserve"> node, mag deze laatste node als een </w:t>
-      </w:r>
-      <w:proofErr w:type="spellStart"/>
-      <w:r>
-        <w:t>assumption</w:t>
-      </w:r>
-      <w:proofErr w:type="spellEnd"/>
-      <w:r>
-        <w:t xml:space="preserve"> gezien worden. Zorg dat dit duidelijk is voor je collega’s.</w:t>
-      </w:r>
-    </w:p>
-    <w:p>
-      <w:r>
-        <w:t xml:space="preserve">Je ziet nog een </w:t>
-      </w:r>
-      <w:proofErr w:type="spellStart"/>
-      <w:r>
-        <w:t>branch</w:t>
-      </w:r>
-      <w:proofErr w:type="spellEnd"/>
-      <w:r>
-        <w:t xml:space="preserve"> dat je wilt bespreken met je collega’s in de volgende vergadering. In de </w:t>
-      </w:r>
-      <w:proofErr w:type="spellStart"/>
-      <w:r>
-        <w:t>branch</w:t>
-      </w:r>
-      <w:proofErr w:type="spellEnd"/>
-      <w:r>
-        <w:t xml:space="preserve"> zit namelijk een absurde veronderstelling. Buiten dat het absurd is, is dit zelfs nog niet eens een </w:t>
-      </w:r>
-      <w:proofErr w:type="spellStart"/>
-      <w:r>
-        <w:t>fortunately</w:t>
-      </w:r>
-      <w:proofErr w:type="spellEnd"/>
-      <w:r>
-        <w:t xml:space="preserve">. Om deze </w:t>
-      </w:r>
-      <w:proofErr w:type="spellStart"/>
-      <w:r>
-        <w:t>branch</w:t>
-      </w:r>
-      <w:proofErr w:type="spellEnd"/>
-      <w:r>
-        <w:t xml:space="preserve"> duidelijk te bespreken, noteer je het verloop van de opeenvolgende </w:t>
-      </w:r>
-      <w:proofErr w:type="spellStart"/>
-      <w:r>
-        <w:t>nodes</w:t>
-      </w:r>
-      <w:proofErr w:type="spellEnd"/>
-      <w:r>
-        <w:t xml:space="preserve"> tot en met de node </w:t>
-      </w:r>
-      <w:r>
-        <w:rPr>
-          <w:i/>
-          <w:iCs/>
-        </w:rPr>
         <w:t>‘Junior teamleden besluiten alle servers uit te schakelen om fraude te stoppen’.</w:t>
       </w:r>
     </w:p>
     <w:p>
       <w:r>
-        <w:t xml:space="preserve">Daarnaast is het nuttig om te bekijken wat er gebeurt als we het model simpelweg afstemmen om minder </w:t>
-      </w:r>
-      <w:proofErr w:type="spellStart"/>
-      <w:r>
-        <w:t>false</w:t>
-      </w:r>
-      <w:proofErr w:type="spellEnd"/>
-      <w:r>
-        <w:t xml:space="preserve"> </w:t>
-      </w:r>
-      <w:proofErr w:type="spellStart"/>
-      <w:r>
-        <w:t>negatives</w:t>
-      </w:r>
-      <w:proofErr w:type="spellEnd"/>
-      <w:r>
-        <w:t xml:space="preserve"> te hebben. Dit noteren in de tree, maakt het mogelijk om hierover te brainstormen binnen het team. Als dit nog niet in het model staat, kan je het toevoegen met de volgende structuur:</w:t>
+        <w:t>Daarnaast is het nuttig om te bekijken wat er gebeurt als we het model simpelweg afstemmen om minder false negatives te hebben. Dit noteren in de tree, maakt het mogelijk om hierover te brainstormen binnen het team. Als dit nog niet in het model staat, kan je het toevoegen met de volgende structuur:</w:t>
       </w:r>
     </w:p>
     <w:p>
@@ -2537,13 +1875,8 @@
           <w:numId w:val="4"/>
         </w:numPr>
       </w:pPr>
-      <w:proofErr w:type="spellStart"/>
-      <w:r>
-        <w:t>Fortunately</w:t>
-      </w:r>
-      <w:proofErr w:type="spellEnd"/>
-      <w:r>
-        <w:t xml:space="preserve">: </w:t>
+      <w:r>
+        <w:t xml:space="preserve">Fortunately: </w:t>
       </w:r>
       <w:r>
         <w:rPr>
@@ -2560,84 +1893,15 @@
           <w:numId w:val="4"/>
         </w:numPr>
       </w:pPr>
-      <w:proofErr w:type="spellStart"/>
-      <w:r>
-        <w:t>Unfortunately</w:t>
-      </w:r>
-      <w:proofErr w:type="spellEnd"/>
-      <w:r>
-        <w:t xml:space="preserve">: </w:t>
+      <w:r>
+        <w:t xml:space="preserve">Unfortunately: </w:t>
       </w:r>
       <w:r>
         <w:rPr>
           <w:i/>
           <w:iCs/>
         </w:rPr>
-        <w:t xml:space="preserve">"Het terugdringen van </w:t>
-      </w:r>
-      <w:proofErr w:type="spellStart"/>
-      <w:r>
-        <w:rPr>
-          <w:i/>
-          <w:iCs/>
-        </w:rPr>
-        <w:t>false</w:t>
-      </w:r>
-      <w:proofErr w:type="spellEnd"/>
-      <w:r>
-        <w:rPr>
-          <w:i/>
-          <w:iCs/>
-        </w:rPr>
-        <w:t xml:space="preserve"> </w:t>
-      </w:r>
-      <w:proofErr w:type="spellStart"/>
-      <w:r>
-        <w:rPr>
-          <w:i/>
-          <w:iCs/>
-        </w:rPr>
-        <w:t>negatives</w:t>
-      </w:r>
-      <w:proofErr w:type="spellEnd"/>
-      <w:r>
-        <w:rPr>
-          <w:i/>
-          <w:iCs/>
-        </w:rPr>
-        <w:t xml:space="preserve"> leidt tot meer </w:t>
-      </w:r>
-      <w:proofErr w:type="spellStart"/>
-      <w:r>
-        <w:rPr>
-          <w:i/>
-          <w:iCs/>
-        </w:rPr>
-        <w:t>false</w:t>
-      </w:r>
-      <w:proofErr w:type="spellEnd"/>
-      <w:r>
-        <w:rPr>
-          <w:i/>
-          <w:iCs/>
-        </w:rPr>
-        <w:t xml:space="preserve"> </w:t>
-      </w:r>
-      <w:proofErr w:type="spellStart"/>
-      <w:r>
-        <w:rPr>
-          <w:i/>
-          <w:iCs/>
-        </w:rPr>
-        <w:t>positives</w:t>
-      </w:r>
-      <w:proofErr w:type="spellEnd"/>
-      <w:r>
-        <w:rPr>
-          <w:i/>
-          <w:iCs/>
-        </w:rPr>
-        <w:t>"</w:t>
+        <w:t>"Het terugdringen van false negatives leidt tot meer false positives"</w:t>
       </w:r>
     </w:p>
     <w:p>
@@ -2647,36 +1911,15 @@
           <w:numId w:val="4"/>
         </w:numPr>
       </w:pPr>
-      <w:proofErr w:type="spellStart"/>
-      <w:r>
-        <w:t>Fortunately</w:t>
-      </w:r>
-      <w:proofErr w:type="spellEnd"/>
-      <w:r>
-        <w:t xml:space="preserve">: </w:t>
+      <w:r>
+        <w:t xml:space="preserve">Fortunately: </w:t>
       </w:r>
       <w:r>
         <w:rPr>
           <w:i/>
           <w:iCs/>
         </w:rPr>
-        <w:t>"</w:t>
-      </w:r>
-      <w:proofErr w:type="spellStart"/>
-      <w:r>
-        <w:rPr>
-          <w:i/>
-          <w:iCs/>
-        </w:rPr>
-        <w:t>Risicogebaseerde</w:t>
-      </w:r>
-      <w:proofErr w:type="spellEnd"/>
-      <w:r>
-        <w:rPr>
-          <w:i/>
-          <w:iCs/>
-        </w:rPr>
-        <w:t xml:space="preserve"> scoring helpt om urgente en laag-risico waarschuwingen te onderscheiden"</w:t>
+        <w:t>"Risicogebaseerde scoring helpt om urgente en laag-risico waarschuwingen te onderscheiden"</w:t>
       </w:r>
     </w:p>
     <w:p/>
@@ -2696,36 +1939,8 @@
           <w:sz w:val="40"/>
           <w:szCs w:val="40"/>
         </w:rPr>
-        <w:t xml:space="preserve">→ Hierna een user </w:t>
-      </w:r>
-      <w:proofErr w:type="spellStart"/>
-      <w:r>
-        <w:rPr>
-          <w:color w:val="FF0000"/>
-          <w:sz w:val="40"/>
-          <w:szCs w:val="40"/>
-        </w:rPr>
-        <w:t>experience</w:t>
-      </w:r>
-      <w:proofErr w:type="spellEnd"/>
-      <w:r>
-        <w:rPr>
-          <w:color w:val="FF0000"/>
-          <w:sz w:val="40"/>
-          <w:szCs w:val="40"/>
-        </w:rPr>
-        <w:t xml:space="preserve"> </w:t>
-      </w:r>
-      <w:proofErr w:type="spellStart"/>
-      <w:r>
-        <w:rPr>
-          <w:color w:val="FF0000"/>
-          <w:sz w:val="40"/>
-          <w:szCs w:val="40"/>
-        </w:rPr>
-        <w:t>questionair</w:t>
-      </w:r>
-      <w:proofErr w:type="spellEnd"/>
+        <w:t>→ Hierna een user experience questionair</w:t>
+      </w:r>
     </w:p>
     <w:p>
       <w:pPr>
@@ -2750,7 +1965,7 @@
     <w:p>
       <w:r>
         <w:pict w14:anchorId="595FFDA1">
-          <v:rect id="_x0000_i1041" style="width:0;height:1.5pt" o:hralign="center" o:hrstd="t" o:hr="t" fillcolor="#a0a0a0" stroked="f"/>
+          <v:rect id="_x0000_i1034" style="width:0;height:1.5pt" o:hralign="center" o:hrstd="t" o:hr="t" fillcolor="#a0a0a0" stroked="f"/>
         </w:pict>
       </w:r>
     </w:p>
@@ -2775,19 +1990,7 @@
         </w:numPr>
       </w:pPr>
       <w:r>
-        <w:t>Welke onderdelen van de</w:t>
-      </w:r>
-      <w:r>
-        <w:t xml:space="preserve"> geteste</w:t>
-      </w:r>
-      <w:r>
-        <w:t xml:space="preserve"> tree </w:t>
-      </w:r>
-      <w:r>
-        <w:t>software</w:t>
-      </w:r>
-      <w:r>
-        <w:t xml:space="preserve"> zouden volgens jou verbeterd kunnen worden?</w:t>
+        <w:t>Welke onderdelen van de geteste tree software zouden volgens jou verbeterd kunnen worden?</w:t>
       </w:r>
     </w:p>
     <w:p>
@@ -2799,18 +2002,7 @@
         </w:numPr>
       </w:pPr>
       <w:r>
-        <w:t xml:space="preserve">Heb je suggesties om features op een andere manier aan te pakken of een feature die nog nuttig kan zijn om de user </w:t>
-      </w:r>
-      <w:proofErr w:type="spellStart"/>
-      <w:r>
-        <w:t>experience</w:t>
-      </w:r>
-      <w:proofErr w:type="spellEnd"/>
-      <w:r>
-        <w:t xml:space="preserve"> te verbeteren</w:t>
-      </w:r>
-      <w:r>
-        <w:t>?</w:t>
+        <w:t>Heb je suggesties om features op een andere manier aan te pakken of een feature die nog nuttig kan zijn om de user experience te verbeteren?</w:t>
       </w:r>
     </w:p>
     <w:p>

</xml_diff>

<commit_message>
fixed small mistakes un user study
</commit_message>
<xml_diff>
--- a/userstudy_case.docx
+++ b/userstudy_case.docx
@@ -3241,7 +3241,7 @@
           <w:noProof/>
         </w:rPr>
         <w:drawing>
-          <wp:inline distT="0" distB="0" distL="0" distR="0" wp14:anchorId="459308C6" wp14:editId="22B66946">
+          <wp:inline distT="0" distB="0" distL="0" distR="0" wp14:anchorId="459308C6" wp14:editId="5D533B45">
             <wp:extent cx="5760720" cy="3239135"/>
             <wp:effectExtent l="0" t="0" r="0" b="0"/>
             <wp:docPr id="744949087" name="Afbeelding 1" descr="Afbeelding met tekst, schermopname, Lettertype, nummer&#10;&#10;Door AI gegenereerde inhoud is mogelijk onjuist."/>
@@ -3524,7 +3524,21 @@
           <w:b/>
           <w:bCs/>
         </w:rPr>
-        <w:t>Taak1:</w:t>
+        <w:t>Taak</w:t>
+      </w:r>
+      <w:r>
+        <w:rPr>
+          <w:b/>
+          <w:bCs/>
+        </w:rPr>
+        <w:t xml:space="preserve"> </w:t>
+      </w:r>
+      <w:r>
+        <w:rPr>
+          <w:b/>
+          <w:bCs/>
+        </w:rPr>
+        <w:t>1:</w:t>
       </w:r>
     </w:p>
     <w:p>
@@ -3836,7 +3850,21 @@
           <w:b/>
           <w:bCs/>
         </w:rPr>
-        <w:t>Taak3:</w:t>
+        <w:t>Taak</w:t>
+      </w:r>
+      <w:r>
+        <w:rPr>
+          <w:b/>
+          <w:bCs/>
+        </w:rPr>
+        <w:t xml:space="preserve"> </w:t>
+      </w:r>
+      <w:r>
+        <w:rPr>
+          <w:b/>
+          <w:bCs/>
+        </w:rPr>
+        <w:t>3:</w:t>
       </w:r>
     </w:p>
     <w:p>
@@ -7190,6 +7218,7 @@
   <w:style w:type="character" w:default="1" w:styleId="Standaardalinea-lettertype">
     <w:name w:val="Default Paragraph Font"/>
     <w:uiPriority w:val="1"/>
+    <w:semiHidden/>
     <w:unhideWhenUsed/>
   </w:style>
   <w:style w:type="table" w:default="1" w:styleId="Standaardtabel">

</xml_diff>

<commit_message>
administratie, verbeterde user study en searchbar springen tussen gezochte nodes
</commit_message>
<xml_diff>
--- a/userstudy_case.docx
+++ b/userstudy_case.docx
@@ -18,6 +18,7 @@
           <w14:ligatures w14:val="none"/>
         </w:rPr>
       </w:pPr>
+      <w:proofErr w:type="spellStart"/>
       <w:r>
         <w:rPr>
           <w:rFonts w:eastAsia="Times New Roman" w:cs="Times New Roman"/>
@@ -29,8 +30,9 @@
           <w:lang w:eastAsia="nl-BE"/>
           <w14:ligatures w14:val="none"/>
         </w:rPr>
-        <w:t>Informed Consent – User Study</w:t>
-      </w:r>
+        <w:t>Informed</w:t>
+      </w:r>
+      <w:proofErr w:type="spellEnd"/>
       <w:r>
         <w:rPr>
           <w:rFonts w:eastAsia="Times New Roman" w:cs="Times New Roman"/>
@@ -42,8 +44,9 @@
           <w:lang w:eastAsia="nl-BE"/>
           <w14:ligatures w14:val="none"/>
         </w:rPr>
-        <w:t xml:space="preserve"> </w:t>
-      </w:r>
+        <w:t xml:space="preserve"> Consent – User </w:t>
+      </w:r>
+      <w:proofErr w:type="spellStart"/>
       <w:r>
         <w:rPr>
           <w:rFonts w:eastAsia="Times New Roman" w:cs="Times New Roman"/>
@@ -55,35 +58,34 @@
           <w:lang w:eastAsia="nl-BE"/>
           <w14:ligatures w14:val="none"/>
         </w:rPr>
-        <w:t>“</w:t>
-      </w:r>
-      <w:r>
-        <w:rPr>
-          <w:rFonts w:eastAsia="Times New Roman" w:cs="Times New Roman"/>
-          <w:b/>
-          <w:bCs/>
-          <w:i/>
+        <w:t>Study</w:t>
+      </w:r>
+      <w:proofErr w:type="spellEnd"/>
+      <w:r>
+        <w:rPr>
+          <w:rFonts w:eastAsia="Times New Roman" w:cs="Times New Roman"/>
+          <w:b/>
+          <w:bCs/>
           <w:kern w:val="36"/>
           <w:sz w:val="40"/>
           <w:szCs w:val="40"/>
           <w:lang w:eastAsia="nl-BE"/>
           <w14:ligatures w14:val="none"/>
         </w:rPr>
-        <w:t xml:space="preserve">Ontwikkeling van een gebruiksvriendelijke </w:t>
-      </w:r>
-      <w:r>
-        <w:rPr>
-          <w:rFonts w:eastAsia="Times New Roman" w:cs="Times New Roman"/>
-          <w:b/>
-          <w:bCs/>
-          <w:i/>
+        <w:t xml:space="preserve"> </w:t>
+      </w:r>
+      <w:r>
+        <w:rPr>
+          <w:rFonts w:eastAsia="Times New Roman" w:cs="Times New Roman"/>
+          <w:b/>
+          <w:bCs/>
           <w:kern w:val="36"/>
           <w:sz w:val="40"/>
           <w:szCs w:val="40"/>
           <w:lang w:eastAsia="nl-BE"/>
           <w14:ligatures w14:val="none"/>
         </w:rPr>
-        <w:t xml:space="preserve">security </w:t>
+        <w:t>“</w:t>
       </w:r>
       <w:r>
         <w:rPr>
@@ -97,7 +99,7 @@
           <w:lang w:eastAsia="nl-BE"/>
           <w14:ligatures w14:val="none"/>
         </w:rPr>
-        <w:t xml:space="preserve">modellering applicatie </w:t>
+        <w:t xml:space="preserve">Ontwikkeling van een gebruiksvriendelijke </w:t>
       </w:r>
       <w:r>
         <w:rPr>
@@ -111,19 +113,107 @@
           <w:lang w:eastAsia="nl-BE"/>
           <w14:ligatures w14:val="none"/>
         </w:rPr>
-        <w:t>gebaseerd op fortunately/unfortunately methode</w:t>
-      </w:r>
-      <w:r>
-        <w:rPr>
-          <w:rFonts w:eastAsia="Times New Roman" w:cs="Times New Roman"/>
-          <w:b/>
-          <w:bCs/>
+        <w:t xml:space="preserve">security </w:t>
+      </w:r>
+      <w:r>
+        <w:rPr>
+          <w:rFonts w:eastAsia="Times New Roman" w:cs="Times New Roman"/>
+          <w:b/>
+          <w:bCs/>
+          <w:i/>
           <w:kern w:val="36"/>
           <w:sz w:val="40"/>
           <w:szCs w:val="40"/>
           <w:lang w:eastAsia="nl-BE"/>
           <w14:ligatures w14:val="none"/>
         </w:rPr>
+        <w:t xml:space="preserve">modellering applicatie </w:t>
+      </w:r>
+      <w:r>
+        <w:rPr>
+          <w:rFonts w:eastAsia="Times New Roman" w:cs="Times New Roman"/>
+          <w:b/>
+          <w:bCs/>
+          <w:i/>
+          <w:kern w:val="36"/>
+          <w:sz w:val="40"/>
+          <w:szCs w:val="40"/>
+          <w:lang w:eastAsia="nl-BE"/>
+          <w14:ligatures w14:val="none"/>
+        </w:rPr>
+        <w:t xml:space="preserve">gebaseerd op </w:t>
+      </w:r>
+      <w:proofErr w:type="spellStart"/>
+      <w:r>
+        <w:rPr>
+          <w:rFonts w:eastAsia="Times New Roman" w:cs="Times New Roman"/>
+          <w:b/>
+          <w:bCs/>
+          <w:i/>
+          <w:kern w:val="36"/>
+          <w:sz w:val="40"/>
+          <w:szCs w:val="40"/>
+          <w:lang w:eastAsia="nl-BE"/>
+          <w14:ligatures w14:val="none"/>
+        </w:rPr>
+        <w:t>fortunately</w:t>
+      </w:r>
+      <w:proofErr w:type="spellEnd"/>
+      <w:r>
+        <w:rPr>
+          <w:rFonts w:eastAsia="Times New Roman" w:cs="Times New Roman"/>
+          <w:b/>
+          <w:bCs/>
+          <w:i/>
+          <w:kern w:val="36"/>
+          <w:sz w:val="40"/>
+          <w:szCs w:val="40"/>
+          <w:lang w:eastAsia="nl-BE"/>
+          <w14:ligatures w14:val="none"/>
+        </w:rPr>
+        <w:t>/</w:t>
+      </w:r>
+      <w:proofErr w:type="spellStart"/>
+      <w:r>
+        <w:rPr>
+          <w:rFonts w:eastAsia="Times New Roman" w:cs="Times New Roman"/>
+          <w:b/>
+          <w:bCs/>
+          <w:i/>
+          <w:kern w:val="36"/>
+          <w:sz w:val="40"/>
+          <w:szCs w:val="40"/>
+          <w:lang w:eastAsia="nl-BE"/>
+          <w14:ligatures w14:val="none"/>
+        </w:rPr>
+        <w:t>unfortunately</w:t>
+      </w:r>
+      <w:proofErr w:type="spellEnd"/>
+      <w:r>
+        <w:rPr>
+          <w:rFonts w:eastAsia="Times New Roman" w:cs="Times New Roman"/>
+          <w:b/>
+          <w:bCs/>
+          <w:i/>
+          <w:kern w:val="36"/>
+          <w:sz w:val="40"/>
+          <w:szCs w:val="40"/>
+          <w:lang w:eastAsia="nl-BE"/>
+          <w14:ligatures w14:val="none"/>
+        </w:rPr>
+        <w:t xml:space="preserve"> methode</w:t>
+      </w:r>
+      <w:r>
+        <w:rPr>
+          <w:rFonts w:eastAsia="Times New Roman" w:cs="Times New Roman"/>
+          <w:b/>
+          <w:bCs/>
+          <w:kern w:val="36"/>
+          <w:sz w:val="40"/>
+          <w:szCs w:val="40"/>
+          <w:lang w:eastAsia="nl-BE"/>
+          <w14:ligatures w14:val="none"/>
+        </w:rPr>
         <w:t>”</w:t>
       </w:r>
     </w:p>
@@ -311,7 +401,47 @@
           <w:lang w:eastAsia="nl-BE"/>
           <w14:ligatures w14:val="none"/>
         </w:rPr>
-        <w:t>U wordt uitgenodigd om deel te nemen aan een studie die onderzoekt hoe softwaregebruikers security- en AI-risicoscenario’s analyseren met behulp van een “Fortunately–Unfortunately”-model. Uw deelname helpt ons om de bruikbaarheid, helderheid en efficiëntie van de software te evalueren en te verbeteren.</w:t>
+        <w:t>U wordt uitgenodigd om deel te nemen aan een studie die onderzoekt hoe softwaregebruikers security- en AI-risicoscenario’s analyseren met behulp van een “</w:t>
+      </w:r>
+      <w:proofErr w:type="spellStart"/>
+      <w:r>
+        <w:rPr>
+          <w:rFonts w:eastAsia="Times New Roman" w:cs="Times New Roman"/>
+          <w:kern w:val="0"/>
+          <w:lang w:eastAsia="nl-BE"/>
+          <w14:ligatures w14:val="none"/>
+        </w:rPr>
+        <w:t>Fortunately</w:t>
+      </w:r>
+      <w:proofErr w:type="spellEnd"/>
+      <w:r>
+        <w:rPr>
+          <w:rFonts w:eastAsia="Times New Roman" w:cs="Times New Roman"/>
+          <w:kern w:val="0"/>
+          <w:lang w:eastAsia="nl-BE"/>
+          <w14:ligatures w14:val="none"/>
+        </w:rPr>
+        <w:t>–</w:t>
+      </w:r>
+      <w:proofErr w:type="spellStart"/>
+      <w:r>
+        <w:rPr>
+          <w:rFonts w:eastAsia="Times New Roman" w:cs="Times New Roman"/>
+          <w:kern w:val="0"/>
+          <w:lang w:eastAsia="nl-BE"/>
+          <w14:ligatures w14:val="none"/>
+        </w:rPr>
+        <w:t>Unfortunately</w:t>
+      </w:r>
+      <w:proofErr w:type="spellEnd"/>
+      <w:r>
+        <w:rPr>
+          <w:rFonts w:eastAsia="Times New Roman" w:cs="Times New Roman"/>
+          <w:kern w:val="0"/>
+          <w:lang w:eastAsia="nl-BE"/>
+          <w14:ligatures w14:val="none"/>
+        </w:rPr>
+        <w:t>”-model. Uw deelname helpt ons om de bruikbaarheid, helderheid en efficiëntie van de software te evalueren en te verbeteren.</w:t>
       </w:r>
     </w:p>
     <w:p>
@@ -1845,6 +1975,7 @@
         </w:rPr>
         <w:t xml:space="preserve">Alle verzamelde gegevens zullen </w:t>
       </w:r>
+      <w:proofErr w:type="spellStart"/>
       <w:r>
         <w:rPr>
           <w:rFonts w:eastAsia="Times New Roman" w:cs="Times New Roman"/>
@@ -1856,6 +1987,7 @@
         </w:rPr>
         <w:t>gepseudonimiseerd</w:t>
       </w:r>
+      <w:proofErr w:type="spellEnd"/>
       <w:r>
         <w:rPr>
           <w:rFonts w:eastAsia="Times New Roman" w:cs="Times New Roman"/>
@@ -2325,7 +2457,27 @@
           <w:lang w:eastAsia="nl-BE"/>
           <w14:ligatures w14:val="none"/>
         </w:rPr>
-        <w:t>De data zal niet gelinked worden aan uw naam maar aan een ID zodat u later kan vragen deze data te verwijderen</w:t>
+        <w:t xml:space="preserve">De data zal niet </w:t>
+      </w:r>
+      <w:proofErr w:type="spellStart"/>
+      <w:r>
+        <w:rPr>
+          <w:rFonts w:eastAsia="Times New Roman" w:cs="Times New Roman"/>
+          <w:kern w:val="0"/>
+          <w:lang w:eastAsia="nl-BE"/>
+          <w14:ligatures w14:val="none"/>
+        </w:rPr>
+        <w:t>gelinked</w:t>
+      </w:r>
+      <w:proofErr w:type="spellEnd"/>
+      <w:r>
+        <w:rPr>
+          <w:rFonts w:eastAsia="Times New Roman" w:cs="Times New Roman"/>
+          <w:kern w:val="0"/>
+          <w:lang w:eastAsia="nl-BE"/>
+          <w14:ligatures w14:val="none"/>
+        </w:rPr>
+        <w:t xml:space="preserve"> worden aan uw naam maar aan een ID zodat u later kan vragen deze data te verwijderen</w:t>
       </w:r>
       <w:r>
         <w:rPr>
@@ -2603,7 +2755,30 @@
           <w14:ligatures w14:val="none"/>
         </w:rPr>
         <w:tab/>
-        <w:t>Handtekening:</w:t>
+      </w:r>
+      <w:proofErr w:type="spellStart"/>
+      <w:r>
+        <w:rPr>
+          <w:rFonts w:eastAsia="Times New Roman" w:cs="Times New Roman"/>
+          <w:b/>
+          <w:bCs/>
+          <w:kern w:val="0"/>
+          <w:lang w:val="en-US" w:eastAsia="nl-BE"/>
+          <w14:ligatures w14:val="none"/>
+        </w:rPr>
+        <w:t>Handtekening</w:t>
+      </w:r>
+      <w:proofErr w:type="spellEnd"/>
+      <w:r>
+        <w:rPr>
+          <w:rFonts w:eastAsia="Times New Roman" w:cs="Times New Roman"/>
+          <w:b/>
+          <w:bCs/>
+          <w:kern w:val="0"/>
+          <w:lang w:val="en-US" w:eastAsia="nl-BE"/>
+          <w14:ligatures w14:val="none"/>
+        </w:rPr>
+        <w:t>:</w:t>
       </w:r>
     </w:p>
     <w:p>
@@ -2648,6 +2823,7 @@
           <w:lang w:val="en-US"/>
         </w:rPr>
       </w:pPr>
+      <w:proofErr w:type="spellStart"/>
       <w:r>
         <w:rPr>
           <w:b/>
@@ -2657,30 +2833,53 @@
           <w:lang w:val="en-US"/>
         </w:rPr>
         <w:lastRenderedPageBreak/>
-        <w:t xml:space="preserve">Uitleg </w:t>
-      </w:r>
-      <w:r>
-        <w:rPr>
-          <w:b/>
-          <w:bCs/>
-          <w:i/>
-          <w:iCs/>
+        <w:t>Uitleg</w:t>
+      </w:r>
+      <w:proofErr w:type="spellEnd"/>
+      <w:r>
+        <w:rPr>
+          <w:b/>
+          <w:bCs/>
           <w:sz w:val="40"/>
           <w:szCs w:val="40"/>
           <w:lang w:val="en-US"/>
         </w:rPr>
-        <w:t>Fortunately–Unfortunately</w:t>
-      </w:r>
-      <w:r>
-        <w:rPr>
-          <w:b/>
-          <w:bCs/>
+        <w:t xml:space="preserve"> </w:t>
+      </w:r>
+      <w:r>
+        <w:rPr>
+          <w:b/>
+          <w:bCs/>
+          <w:i/>
+          <w:iCs/>
           <w:sz w:val="40"/>
           <w:szCs w:val="40"/>
           <w:lang w:val="en-US"/>
         </w:rPr>
-        <w:t>-methode</w:t>
-      </w:r>
+        <w:t>Fortunately–Unfortunately</w:t>
+      </w:r>
+      <w:r>
+        <w:rPr>
+          <w:b/>
+          <w:bCs/>
+          <w:sz w:val="40"/>
+          <w:szCs w:val="40"/>
+          <w:lang w:val="en-US"/>
+        </w:rPr>
+        <w:t>-</w:t>
+      </w:r>
+      <w:proofErr w:type="spellStart"/>
+      <w:r>
+        <w:rPr>
+          <w:b/>
+          <w:bCs/>
+          <w:sz w:val="40"/>
+          <w:szCs w:val="40"/>
+          <w:lang w:val="en-US"/>
+        </w:rPr>
+        <w:t>methode</w:t>
+      </w:r>
+      <w:proofErr w:type="spellEnd"/>
     </w:p>
     <w:p>
       <w:pPr>
@@ -2701,15 +2900,49 @@
       <w:r>
         <w:t xml:space="preserve">De </w:t>
       </w:r>
-      <w:r>
-        <w:rPr>
-          <w:i/>
-          <w:iCs/>
-        </w:rPr>
-        <w:t>Fortunately–Unfortunately</w:t>
-      </w:r>
-      <w:r>
-        <w:t>-methode komt oorspronkelijk uit improvisatietheater. Het is een techniek waarbij een verhaal zich afwisselend positief en negatief ontwikkelt. Elke nieuwe stap begint met “Fortunately…” (gelukkig/positieve tegenmaatregel) of “Unfortunately…” (helaas/risico’s) en verandert zo het verloop van het verhaal. Dit zorgt ervoor dat gebruikers verschillende scenario’s verkennen en onverwachte wendingen ontdekken.</w:t>
+      <w:proofErr w:type="spellStart"/>
+      <w:r>
+        <w:rPr>
+          <w:i/>
+          <w:iCs/>
+        </w:rPr>
+        <w:t>Fortunately</w:t>
+      </w:r>
+      <w:proofErr w:type="spellEnd"/>
+      <w:r>
+        <w:rPr>
+          <w:i/>
+          <w:iCs/>
+        </w:rPr>
+        <w:t>–</w:t>
+      </w:r>
+      <w:proofErr w:type="spellStart"/>
+      <w:r>
+        <w:rPr>
+          <w:i/>
+          <w:iCs/>
+        </w:rPr>
+        <w:t>Unfortunately</w:t>
+      </w:r>
+      <w:proofErr w:type="spellEnd"/>
+      <w:r>
+        <w:t>-methode komt oorspronkelijk uit improvisatietheater. Het is een techniek waarbij een verhaal zich afwisselend positief en negatief ontwikkelt. Elke nieuwe stap begint met “</w:t>
+      </w:r>
+      <w:proofErr w:type="spellStart"/>
+      <w:r>
+        <w:t>Fortunately</w:t>
+      </w:r>
+      <w:proofErr w:type="spellEnd"/>
+      <w:r>
+        <w:t>…” (gelukkig/positieve tegenmaatregel) of “</w:t>
+      </w:r>
+      <w:proofErr w:type="spellStart"/>
+      <w:r>
+        <w:t>Unfortunately</w:t>
+      </w:r>
+      <w:proofErr w:type="spellEnd"/>
+      <w:r>
+        <w:t>…” (helaas/risico’s) en verandert zo het verloop van het verhaal. Dit zorgt ervoor dat gebruikers verschillende scenario’s verkennen en onverwachte wendingen ontdekken.</w:t>
       </w:r>
     </w:p>
     <w:p>
@@ -3241,7 +3474,7 @@
           <w:noProof/>
         </w:rPr>
         <w:drawing>
-          <wp:inline distT="0" distB="0" distL="0" distR="0" wp14:anchorId="459308C6" wp14:editId="5D533B45">
+          <wp:inline distT="0" distB="0" distL="0" distR="0" wp14:anchorId="459308C6" wp14:editId="3DBC840E">
             <wp:extent cx="5760720" cy="3239135"/>
             <wp:effectExtent l="0" t="0" r="0" b="0"/>
             <wp:docPr id="744949087" name="Afbeelding 1" descr="Afbeelding met tekst, schermopname, Lettertype, nummer&#10;&#10;Door AI gegenereerde inhoud is mogelijk onjuist."/>
@@ -3302,11 +3535,28 @@
         <w:t>E</w:t>
       </w:r>
       <w:r>
-        <w:t>en unfortunately-node zonder fortunately kinderen</w:t>
+        <w:t xml:space="preserve">en </w:t>
+      </w:r>
+      <w:proofErr w:type="spellStart"/>
+      <w:r>
+        <w:t>unfortunately</w:t>
+      </w:r>
+      <w:proofErr w:type="spellEnd"/>
+      <w:r>
+        <w:t xml:space="preserve">-node zonder </w:t>
+      </w:r>
+      <w:proofErr w:type="spellStart"/>
+      <w:r>
+        <w:t>fortunately</w:t>
+      </w:r>
+      <w:proofErr w:type="spellEnd"/>
+      <w:r>
+        <w:t xml:space="preserve"> kinderen</w:t>
       </w:r>
       <w:r>
         <w:t xml:space="preserve"> is een </w:t>
       </w:r>
+      <w:proofErr w:type="spellStart"/>
       <w:r>
         <w:rPr>
           <w:b/>
@@ -3314,6 +3564,7 @@
         </w:rPr>
         <w:t>Weakness</w:t>
       </w:r>
+      <w:proofErr w:type="spellEnd"/>
       <w:r>
         <w:rPr>
           <w:b/>
@@ -3339,14 +3590,31 @@
         </w:numPr>
       </w:pPr>
       <w:r>
-        <w:t xml:space="preserve">Een unfortunately-node met bestaande uitwerkingen (kinderen), maar die nog moet worden herbekeken of verder verfijnd, wordt aangeduid als een </w:t>
-      </w:r>
-      <w:r>
-        <w:rPr>
-          <w:b/>
-          <w:bCs/>
-        </w:rPr>
-        <w:t>Weakness Under Review</w:t>
+        <w:t xml:space="preserve">Een </w:t>
+      </w:r>
+      <w:proofErr w:type="spellStart"/>
+      <w:r>
+        <w:t>unfortunately</w:t>
+      </w:r>
+      <w:proofErr w:type="spellEnd"/>
+      <w:r>
+        <w:t xml:space="preserve">-node met bestaande uitwerkingen (kinderen), maar die nog moet worden herbekeken of verder verfijnd, wordt aangeduid als een </w:t>
+      </w:r>
+      <w:proofErr w:type="spellStart"/>
+      <w:r>
+        <w:rPr>
+          <w:b/>
+          <w:bCs/>
+        </w:rPr>
+        <w:t>Weakness</w:t>
+      </w:r>
+      <w:proofErr w:type="spellEnd"/>
+      <w:r>
+        <w:rPr>
+          <w:b/>
+          <w:bCs/>
+        </w:rPr>
+        <w:t xml:space="preserve"> Under Review</w:t>
       </w:r>
       <w:r>
         <w:t>.</w:t>
@@ -3363,14 +3631,40 @@
         </w:numPr>
       </w:pPr>
       <w:r>
-        <w:t xml:space="preserve">Een fortunately-node met kinderen, maar waarvan de uitwerking nog bevestigd moet worden, krijgt de status van een </w:t>
-      </w:r>
-      <w:r>
-        <w:rPr>
-          <w:b/>
-          <w:bCs/>
-        </w:rPr>
-        <w:t>Assumption Under Review</w:t>
+        <w:t xml:space="preserve">Een </w:t>
+      </w:r>
+      <w:proofErr w:type="spellStart"/>
+      <w:r>
+        <w:t>fortunately</w:t>
+      </w:r>
+      <w:proofErr w:type="spellEnd"/>
+      <w:r>
+        <w:t xml:space="preserve">-node met kinderen, maar waarvan de uitwerking </w:t>
+      </w:r>
+      <w:r>
+        <w:t xml:space="preserve">nog </w:t>
+      </w:r>
+      <w:r>
+        <w:t>herbekeken of verfijnd worden</w:t>
+      </w:r>
+      <w:r>
+        <w:t xml:space="preserve">, krijgt de status van een </w:t>
+      </w:r>
+      <w:proofErr w:type="spellStart"/>
+      <w:r>
+        <w:rPr>
+          <w:b/>
+          <w:bCs/>
+        </w:rPr>
+        <w:t>Assumption</w:t>
+      </w:r>
+      <w:proofErr w:type="spellEnd"/>
+      <w:r>
+        <w:rPr>
+          <w:b/>
+          <w:bCs/>
+        </w:rPr>
+        <w:t xml:space="preserve"> Under Review</w:t>
       </w:r>
       <w:r>
         <w:t>.</w:t>
@@ -3387,15 +3681,53 @@
         </w:numPr>
       </w:pPr>
       <w:r>
-        <w:t xml:space="preserve">Een fortunately-node waarvan de uitwerking volledig is bevestigd en die geen kinderen heeft, krijgt de status van een </w:t>
-      </w:r>
-      <w:r>
-        <w:rPr>
-          <w:b/>
-          <w:bCs/>
-        </w:rPr>
-        <w:t>Verified Assumption</w:t>
-      </w:r>
+        <w:t xml:space="preserve">Een </w:t>
+      </w:r>
+      <w:proofErr w:type="spellStart"/>
+      <w:r>
+        <w:t>fortunately</w:t>
+      </w:r>
+      <w:proofErr w:type="spellEnd"/>
+      <w:r>
+        <w:t xml:space="preserve">-node waarvan de uitwerking </w:t>
+      </w:r>
+      <w:r>
+        <w:t>in orde is</w:t>
+      </w:r>
+      <w:r>
+        <w:t xml:space="preserve"> en d</w:t>
+      </w:r>
+      <w:r>
+        <w:t>us ook</w:t>
+      </w:r>
+      <w:r>
+        <w:t xml:space="preserve"> geen kinderen heeft, krijgt de status van een </w:t>
+      </w:r>
+      <w:proofErr w:type="spellStart"/>
+      <w:r>
+        <w:rPr>
+          <w:b/>
+          <w:bCs/>
+        </w:rPr>
+        <w:t>Verified</w:t>
+      </w:r>
+      <w:proofErr w:type="spellEnd"/>
+      <w:r>
+        <w:rPr>
+          <w:b/>
+          <w:bCs/>
+        </w:rPr>
+        <w:t xml:space="preserve"> </w:t>
+      </w:r>
+      <w:proofErr w:type="spellStart"/>
+      <w:r>
+        <w:rPr>
+          <w:b/>
+          <w:bCs/>
+        </w:rPr>
+        <w:t>Assumption</w:t>
+      </w:r>
+      <w:proofErr w:type="spellEnd"/>
       <w:r>
         <w:t>.</w:t>
       </w:r>
@@ -3414,15 +3746,43 @@
         <w:lastRenderedPageBreak/>
         <w:t xml:space="preserve">De </w:t>
       </w:r>
-      <w:r>
-        <w:rPr>
-          <w:b/>
-          <w:bCs/>
-        </w:rPr>
-        <w:t>danger rating</w:t>
-      </w:r>
-      <w:r>
-        <w:t xml:space="preserve"> is een classificatie van een unfortunately-node om het niveau van gevaar uit te drukken. In de basissoftware moet dit handmatig in de tekst worden geschreven. In de aangepaste software is hiervoor een hulpmiddel voorzien, dat gebaseerd is op twee factoren: impact en likelihood.</w:t>
+      <w:proofErr w:type="spellStart"/>
+      <w:r>
+        <w:rPr>
+          <w:b/>
+          <w:bCs/>
+        </w:rPr>
+        <w:t>danger</w:t>
+      </w:r>
+      <w:proofErr w:type="spellEnd"/>
+      <w:r>
+        <w:rPr>
+          <w:b/>
+          <w:bCs/>
+        </w:rPr>
+        <w:t xml:space="preserve"> rating</w:t>
+      </w:r>
+      <w:r>
+        <w:t xml:space="preserve"> is een classificatie van een </w:t>
+      </w:r>
+      <w:proofErr w:type="spellStart"/>
+      <w:r>
+        <w:t>unfortunately</w:t>
+      </w:r>
+      <w:proofErr w:type="spellEnd"/>
+      <w:r>
+        <w:t xml:space="preserve">-node om het niveau van gevaar uit te drukken. </w:t>
+      </w:r>
+      <w:r>
+        <w:t xml:space="preserve">Het is een relatief getal dat bijvoorbeeld berekend kan worden op basis van </w:t>
+      </w:r>
+      <w:proofErr w:type="spellStart"/>
+      <w:r>
+        <w:t>likelihood</w:t>
+      </w:r>
+      <w:proofErr w:type="spellEnd"/>
+      <w:r>
+        <w:t xml:space="preserve"> en impact.</w:t>
       </w:r>
     </w:p>
     <w:p>
@@ -3435,7 +3795,13 @@
         </w:rPr>
       </w:pPr>
       <w:r>
-        <w:t>Je zal aan de hand van twee scenario’s beide varianten van de software testen. Open nu de aangepaste software</w:t>
+        <w:t xml:space="preserve">Je zal aan de hand van twee scenario’s beide varianten van de software testen. Open nu de </w:t>
+      </w:r>
+      <w:r>
+        <w:t>uitgebreide</w:t>
+      </w:r>
+      <w:r>
+        <w:t xml:space="preserve"> software</w:t>
       </w:r>
       <w:r>
         <w:t>/</w:t>
@@ -3496,13 +3862,31 @@
       <w:r>
         <w:t xml:space="preserve"> een </w:t>
       </w:r>
-      <w:r>
-        <w:rPr>
-          <w:i/>
-          <w:iCs/>
-        </w:rPr>
-        <w:t>Fortunately–Unfortunately</w:t>
-      </w:r>
+      <w:proofErr w:type="spellStart"/>
+      <w:r>
+        <w:rPr>
+          <w:i/>
+          <w:iCs/>
+        </w:rPr>
+        <w:t>Fortunately</w:t>
+      </w:r>
+      <w:proofErr w:type="spellEnd"/>
+      <w:r>
+        <w:rPr>
+          <w:i/>
+          <w:iCs/>
+        </w:rPr>
+        <w:t>–</w:t>
+      </w:r>
+      <w:proofErr w:type="spellStart"/>
+      <w:r>
+        <w:rPr>
+          <w:i/>
+          <w:iCs/>
+        </w:rPr>
+        <w:t>Unfortunately</w:t>
+      </w:r>
+      <w:proofErr w:type="spellEnd"/>
       <w:r>
         <w:t>-model.</w:t>
       </w:r>
@@ -3545,6 +3929,7 @@
       <w:r>
         <w:t xml:space="preserve">Bij het controleren van de tree merk je dat er nog een </w:t>
       </w:r>
+      <w:proofErr w:type="spellStart"/>
       <w:r>
         <w:rPr>
           <w:i/>
@@ -3552,8 +3937,17 @@
         </w:rPr>
         <w:t>unfortunate</w:t>
       </w:r>
-      <w:r>
-        <w:t xml:space="preserve"> ontbreekt: een weakness/risico dat nog niet in het model is opgenomen, namelijk </w:t>
+      <w:proofErr w:type="spellEnd"/>
+      <w:r>
+        <w:t xml:space="preserve"> ontbreekt: een </w:t>
+      </w:r>
+      <w:proofErr w:type="spellStart"/>
+      <w:r>
+        <w:t>weakness</w:t>
+      </w:r>
+      <w:proofErr w:type="spellEnd"/>
+      <w:r>
+        <w:t xml:space="preserve">/risico dat nog niet in het model is opgenomen, namelijk </w:t>
       </w:r>
       <w:r>
         <w:rPr>
@@ -3576,50 +3970,121 @@
         <w:t xml:space="preserve">. </w:t>
       </w:r>
       <w:r>
-        <w:t>Alle unfortunate nodes zijn nu toegevoegd aan deze tak.</w:t>
+        <w:t xml:space="preserve">“Dit was de laatste </w:t>
+      </w:r>
+      <w:proofErr w:type="spellStart"/>
+      <w:r>
+        <w:t>unfortunately</w:t>
+      </w:r>
+      <w:proofErr w:type="spellEnd"/>
+      <w:r>
+        <w:t xml:space="preserve"> node in deze tak</w:t>
+      </w:r>
+      <w:r>
+        <w:t xml:space="preserve">. Omdat deze </w:t>
+      </w:r>
+      <w:proofErr w:type="spellStart"/>
+      <w:r>
+        <w:t>unfortunately</w:t>
+      </w:r>
+      <w:proofErr w:type="spellEnd"/>
+      <w:r>
+        <w:t xml:space="preserve"> node gezien wordt als </w:t>
+      </w:r>
+      <w:r>
+        <w:rPr>
+          <w:i/>
+          <w:iCs/>
+        </w:rPr>
+        <w:t>“</w:t>
+      </w:r>
+      <w:proofErr w:type="spellStart"/>
+      <w:r>
+        <w:rPr>
+          <w:i/>
+          <w:iCs/>
+        </w:rPr>
+        <w:t>Not</w:t>
+      </w:r>
+      <w:proofErr w:type="spellEnd"/>
+      <w:r>
+        <w:rPr>
+          <w:i/>
+          <w:iCs/>
+        </w:rPr>
+        <w:t xml:space="preserve"> Important”</w:t>
+      </w:r>
+      <w:r>
+        <w:t xml:space="preserve"> mag je deze status erbij zetten en mag de bovenliggende </w:t>
+      </w:r>
+      <w:proofErr w:type="spellStart"/>
+      <w:r>
+        <w:t>unfortunately</w:t>
+      </w:r>
+      <w:proofErr w:type="spellEnd"/>
+      <w:r>
+        <w:t xml:space="preserve">-node beschouwd worden als </w:t>
+      </w:r>
+      <w:r>
+        <w:rPr>
+          <w:i/>
+          <w:iCs/>
+        </w:rPr>
+        <w:t>“</w:t>
+      </w:r>
+      <w:proofErr w:type="spellStart"/>
+      <w:r>
+        <w:rPr>
+          <w:i/>
+          <w:iCs/>
+        </w:rPr>
+        <w:t>Verified</w:t>
+      </w:r>
+      <w:proofErr w:type="spellEnd"/>
+      <w:r>
+        <w:rPr>
+          <w:i/>
+          <w:iCs/>
+        </w:rPr>
+        <w:t>”</w:t>
+      </w:r>
+      <w:r>
+        <w:rPr>
+          <w:i/>
+          <w:iCs/>
+        </w:rPr>
+        <w:t>.</w:t>
+      </w:r>
+    </w:p>
+    <w:p>
+      <w:pPr>
+        <w:rPr>
+          <w:b/>
+          <w:bCs/>
+        </w:rPr>
+      </w:pPr>
+      <w:r>
+        <w:rPr>
+          <w:b/>
+          <w:bCs/>
+        </w:rPr>
+        <w:t>Taak 2:</w:t>
+      </w:r>
+    </w:p>
+    <w:p>
+      <w:pPr>
+        <w:rPr>
+          <w:i/>
+          <w:iCs/>
+        </w:rPr>
+      </w:pPr>
+      <w:r>
+        <w:t>Er wordt nu binnen het team verder nagedacht over een authenticatieprovider.</w:t>
       </w:r>
       <w:r>
         <w:t xml:space="preserve"> </w:t>
       </w:r>
       <w:r>
-        <w:t xml:space="preserve">Markeer/noteer dit </w:t>
-      </w:r>
-      <w:r>
-        <w:t>bij</w:t>
-      </w:r>
-      <w:r>
-        <w:t xml:space="preserve"> de laatste node zodat dit duidelijk is.</w:t>
-      </w:r>
-    </w:p>
-    <w:p>
-      <w:pPr>
-        <w:rPr>
-          <w:b/>
-          <w:bCs/>
-        </w:rPr>
-      </w:pPr>
-      <w:r>
-        <w:rPr>
-          <w:b/>
-          <w:bCs/>
-        </w:rPr>
-        <w:t>Taak 2:</w:t>
-      </w:r>
-    </w:p>
-    <w:p>
-      <w:pPr>
-        <w:rPr>
-          <w:i/>
-          <w:iCs/>
-        </w:rPr>
-      </w:pPr>
-      <w:r>
-        <w:t>Er wordt nu binnen het team verder nagedacht over een authenticatieprovider.</w:t>
-      </w:r>
-      <w:r>
-        <w:t xml:space="preserve"> </w:t>
-      </w:r>
-      <w:r>
         <w:t>Zoek de correcte plaats in de tree</w:t>
       </w:r>
       <w:r>
@@ -3653,7 +4118,15 @@
         <w:t xml:space="preserve"> en voeg</w:t>
       </w:r>
       <w:r>
-        <w:t xml:space="preserve"> de volgende nodes toe</w:t>
+        <w:t xml:space="preserve"> de volgende </w:t>
+      </w:r>
+      <w:proofErr w:type="spellStart"/>
+      <w:r>
+        <w:t>nodes</w:t>
+      </w:r>
+      <w:proofErr w:type="spellEnd"/>
+      <w:r>
+        <w:t xml:space="preserve"> toe</w:t>
       </w:r>
       <w:r>
         <w:t>:</w:t>
@@ -3691,7 +4164,43 @@
           <w:iCs/>
           <w:lang w:val="en-US"/>
         </w:rPr>
-        <w:t>Team richt on-prem fallback-authenticatieserver in</w:t>
+        <w:t xml:space="preserve">Team </w:t>
+      </w:r>
+      <w:proofErr w:type="spellStart"/>
+      <w:r>
+        <w:rPr>
+          <w:i/>
+          <w:iCs/>
+          <w:lang w:val="en-US"/>
+        </w:rPr>
+        <w:t>richt</w:t>
+      </w:r>
+      <w:proofErr w:type="spellEnd"/>
+      <w:r>
+        <w:rPr>
+          <w:i/>
+          <w:iCs/>
+          <w:lang w:val="en-US"/>
+        </w:rPr>
+        <w:t xml:space="preserve"> on-prem fallback-</w:t>
+      </w:r>
+      <w:proofErr w:type="spellStart"/>
+      <w:r>
+        <w:rPr>
+          <w:i/>
+          <w:iCs/>
+          <w:lang w:val="en-US"/>
+        </w:rPr>
+        <w:t>authenticatieserver</w:t>
+      </w:r>
+      <w:proofErr w:type="spellEnd"/>
+      <w:r>
+        <w:rPr>
+          <w:i/>
+          <w:iCs/>
+          <w:lang w:val="en-US"/>
+        </w:rPr>
+        <w:t xml:space="preserve"> in</w:t>
       </w:r>
       <w:r>
         <w:rPr>
@@ -3734,8 +4243,36 @@
           <w:iCs/>
           <w:lang w:val="en-US"/>
         </w:rPr>
-        <w:t>On-prem fallback synchroniseert credentials vertraagd</w:t>
-      </w:r>
+        <w:t xml:space="preserve">On-prem fallback </w:t>
+      </w:r>
+      <w:proofErr w:type="spellStart"/>
+      <w:r>
+        <w:rPr>
+          <w:i/>
+          <w:iCs/>
+          <w:lang w:val="en-US"/>
+        </w:rPr>
+        <w:t>synchroniseert</w:t>
+      </w:r>
+      <w:proofErr w:type="spellEnd"/>
+      <w:r>
+        <w:rPr>
+          <w:i/>
+          <w:iCs/>
+          <w:lang w:val="en-US"/>
+        </w:rPr>
+        <w:t xml:space="preserve"> credentials </w:t>
+      </w:r>
+      <w:proofErr w:type="spellStart"/>
+      <w:r>
+        <w:rPr>
+          <w:i/>
+          <w:iCs/>
+          <w:lang w:val="en-US"/>
+        </w:rPr>
+        <w:t>vertraagd</w:t>
+      </w:r>
+      <w:proofErr w:type="spellEnd"/>
       <w:r>
         <w:rPr>
           <w:i/>
@@ -3757,11 +4294,19 @@
           <w:lang w:val="en-US"/>
         </w:rPr>
       </w:pPr>
-      <w:r>
-        <w:rPr>
-          <w:lang w:val="en-US"/>
-        </w:rPr>
-        <w:t>Likelyhood: 4</w:t>
+      <w:proofErr w:type="spellStart"/>
+      <w:r>
+        <w:rPr>
+          <w:lang w:val="en-US"/>
+        </w:rPr>
+        <w:t>Likelyhood</w:t>
+      </w:r>
+      <w:proofErr w:type="spellEnd"/>
+      <w:r>
+        <w:rPr>
+          <w:lang w:val="en-US"/>
+        </w:rPr>
+        <w:t>: 4</w:t>
       </w:r>
     </w:p>
     <w:p>
@@ -3813,8 +4358,13 @@
           <w:iCs/>
         </w:rPr>
       </w:pPr>
-      <w:r>
-        <w:t xml:space="preserve">Fortunately: </w:t>
+      <w:proofErr w:type="spellStart"/>
+      <w:r>
+        <w:t>Fortunately</w:t>
+      </w:r>
+      <w:proofErr w:type="spellEnd"/>
+      <w:r>
+        <w:t xml:space="preserve">: </w:t>
       </w:r>
       <w:r>
         <w:rPr>
@@ -3892,12 +4442,32 @@
       <w:r>
         <w:t xml:space="preserve">De </w:t>
       </w:r>
-      <w:r>
-        <w:t xml:space="preserve">verified </w:t>
-      </w:r>
-      <w:r>
-        <w:t>assumptions die het model bevat.</w:t>
-      </w:r>
+      <w:proofErr w:type="spellStart"/>
+      <w:r>
+        <w:t>verified</w:t>
+      </w:r>
+      <w:proofErr w:type="spellEnd"/>
+      <w:r>
+        <w:t xml:space="preserve"> </w:t>
+      </w:r>
+      <w:proofErr w:type="spellStart"/>
+      <w:r>
+        <w:t>assumptions</w:t>
+      </w:r>
+      <w:proofErr w:type="spellEnd"/>
+      <w:r>
+        <w:t xml:space="preserve"> die het model bevat.</w:t>
+      </w:r>
+    </w:p>
+    <w:p>
+      <w:pPr>
+        <w:pStyle w:val="Lijstalinea"/>
+      </w:pPr>
+    </w:p>
+    <w:p>
+      <w:pPr>
+        <w:pStyle w:val="Lijstalinea"/>
+      </w:pPr>
     </w:p>
     <w:p>
       <w:pPr>
@@ -3908,11 +4478,25 @@
         </w:numPr>
       </w:pPr>
       <w:r>
-        <w:t>De weaknesses.</w:t>
-      </w:r>
-      <w:r>
-        <w:t xml:space="preserve"> Rangschik deze op basis van de dangerrating</w:t>
-      </w:r>
+        <w:lastRenderedPageBreak/>
+        <w:t xml:space="preserve">De </w:t>
+      </w:r>
+      <w:proofErr w:type="spellStart"/>
+      <w:r>
+        <w:t>weaknesses</w:t>
+      </w:r>
+      <w:proofErr w:type="spellEnd"/>
+      <w:r>
+        <w:t>.</w:t>
+      </w:r>
+      <w:r>
+        <w:t xml:space="preserve"> Rangschik deze op basis van de </w:t>
+      </w:r>
+      <w:proofErr w:type="spellStart"/>
+      <w:r>
+        <w:t>dangerrating</w:t>
+      </w:r>
+      <w:proofErr w:type="spellEnd"/>
       <w:r>
         <w:t xml:space="preserve"> van hoogste naar laagste rating</w:t>
       </w:r>
@@ -3920,6 +4504,11 @@
         <w:t>.</w:t>
       </w:r>
     </w:p>
+    <w:p/>
+    <w:p/>
+    <w:p/>
+    <w:p/>
+    <w:p/>
     <w:p>
       <w:pPr>
         <w:pStyle w:val="Lijstalinea"/>
@@ -3929,11 +4518,37 @@
         </w:numPr>
       </w:pPr>
       <w:r>
-        <w:t>Hoeveel weaknesses under review or nog aanwezig zijn</w:t>
+        <w:t xml:space="preserve">Hoeveel </w:t>
+      </w:r>
+      <w:proofErr w:type="spellStart"/>
+      <w:r>
+        <w:t>weaknesses</w:t>
+      </w:r>
+      <w:proofErr w:type="spellEnd"/>
+      <w:r>
+        <w:t xml:space="preserve"> </w:t>
+      </w:r>
+      <w:proofErr w:type="spellStart"/>
+      <w:r>
+        <w:t>under</w:t>
+      </w:r>
+      <w:proofErr w:type="spellEnd"/>
+      <w:r>
+        <w:t xml:space="preserve"> review or nog aanwezig zijn</w:t>
       </w:r>
       <w:r>
         <w:t>.</w:t>
       </w:r>
+    </w:p>
+    <w:p>
+      <w:pPr>
+        <w:pStyle w:val="Lijstalinea"/>
+      </w:pPr>
+    </w:p>
+    <w:p>
+      <w:pPr>
+        <w:pStyle w:val="Lijstalinea"/>
+      </w:pPr>
     </w:p>
     <w:p>
       <w:pPr>
@@ -3944,9 +4559,29 @@
         </w:numPr>
       </w:pPr>
       <w:r>
-        <w:t>De assumptions under review.</w:t>
-      </w:r>
-    </w:p>
+        <w:t xml:space="preserve">De </w:t>
+      </w:r>
+      <w:proofErr w:type="spellStart"/>
+      <w:r>
+        <w:t>assumptions</w:t>
+      </w:r>
+      <w:proofErr w:type="spellEnd"/>
+      <w:r>
+        <w:t xml:space="preserve"> </w:t>
+      </w:r>
+      <w:proofErr w:type="spellStart"/>
+      <w:r>
+        <w:t>under</w:t>
+      </w:r>
+      <w:proofErr w:type="spellEnd"/>
+      <w:r>
+        <w:t xml:space="preserve"> review.</w:t>
+      </w:r>
+    </w:p>
+    <w:p/>
+    <w:p/>
+    <w:p/>
+    <w:p/>
     <w:p>
       <w:pPr>
         <w:rPr>
@@ -3968,35 +4603,6 @@
           <w:bCs/>
         </w:rPr>
         <w:t>Taak 4:</w:t>
-      </w:r>
-    </w:p>
-    <w:p>
-      <w:r>
-        <w:t xml:space="preserve">Tot slot moeten de verantwoordelijkheden verdeeld worden binnen het team. Selecteer daarom twee elementen in het model </w:t>
-      </w:r>
-      <w:r>
-        <w:t>die klaar zijn voor implementatie</w:t>
-      </w:r>
-      <w:r>
-        <w:t xml:space="preserve"> (die dus eindigen op een verified assumption)</w:t>
-      </w:r>
-      <w:r>
-        <w:t xml:space="preserve">, </w:t>
-      </w:r>
-      <w:r>
-        <w:t xml:space="preserve">en </w:t>
-      </w:r>
-      <w:r>
-        <w:t xml:space="preserve">vat aan de hand van </w:t>
-      </w:r>
-      <w:r>
-        <w:t xml:space="preserve">informatie uit </w:t>
-      </w:r>
-      <w:r>
-        <w:t>de applicatie samen</w:t>
-      </w:r>
-      <w:r>
-        <w:t xml:space="preserve"> hoe deze geïmplementeerd moeten worden.</w:t>
       </w:r>
     </w:p>
     <w:p>
@@ -4009,21 +4615,80 @@
         </w:rPr>
       </w:pPr>
       <w:r>
-        <w:rPr>
-          <w:lang w:val="en-US"/>
-        </w:rPr>
+        <w:t xml:space="preserve">Tot slot moeten de verantwoordelijkheden </w:t>
+      </w:r>
+      <w:r>
+        <w:t>verdeeld</w:t>
+      </w:r>
+      <w:r>
+        <w:t xml:space="preserve"> worden binnen het team. </w:t>
+      </w:r>
+      <w:r>
+        <w:t xml:space="preserve">Selecteer twee elementen in de tree die eindigen op een </w:t>
+      </w:r>
+      <w:proofErr w:type="spellStart"/>
+      <w:r>
+        <w:rPr>
+          <w:i/>
+          <w:iCs/>
+        </w:rPr>
+        <w:t>verified</w:t>
+      </w:r>
+      <w:proofErr w:type="spellEnd"/>
+      <w:r>
+        <w:rPr>
+          <w:i/>
+          <w:iCs/>
+        </w:rPr>
+        <w:t xml:space="preserve"> </w:t>
+      </w:r>
+      <w:proofErr w:type="spellStart"/>
+      <w:r>
+        <w:rPr>
+          <w:i/>
+          <w:iCs/>
+        </w:rPr>
+        <w:t>assumption</w:t>
+      </w:r>
+      <w:proofErr w:type="spellEnd"/>
+      <w:r>
+        <w:t xml:space="preserve"> (groene </w:t>
+      </w:r>
+      <w:proofErr w:type="spellStart"/>
+      <w:r>
+        <w:t>eindnode</w:t>
+      </w:r>
+      <w:proofErr w:type="spellEnd"/>
+      <w:r>
+        <w:t>).</w:t>
+      </w:r>
+      <w:r>
         <w:br/>
-      </w:r>
-      <w:r>
-        <w:rPr>
-          <w:lang w:val="en-US"/>
-        </w:rPr>
+        <w:t xml:space="preserve">Gebruik de volledige </w:t>
+      </w:r>
+      <w:proofErr w:type="spellStart"/>
+      <w:r>
+        <w:t>fortunately</w:t>
+      </w:r>
+      <w:proofErr w:type="spellEnd"/>
+      <w:r>
+        <w:t>/</w:t>
+      </w:r>
+      <w:proofErr w:type="spellStart"/>
+      <w:r>
+        <w:t>unfortunately</w:t>
+      </w:r>
+      <w:proofErr w:type="spellEnd"/>
+      <w:r>
+        <w:t>-keten om samen te vatten welke stappen nodig zijn voor implementatie.</w:t>
+      </w:r>
+      <w:r>
         <w:br/>
       </w:r>
       <w:r>
-        <w:rPr>
-          <w:lang w:val="en-US"/>
-        </w:rPr>
+        <w:br/>
+      </w:r>
+      <w:r>
         <w:br/>
       </w:r>
       <w:r>
@@ -4033,8 +4698,9 @@
           <w:szCs w:val="40"/>
           <w:lang w:val="en-US"/>
         </w:rPr>
-        <w:t>→ Hierna een user experience questionair</w:t>
-      </w:r>
+        <w:t xml:space="preserve">→ Hierna </w:t>
+      </w:r>
+      <w:proofErr w:type="spellStart"/>
       <w:r>
         <w:rPr>
           <w:color w:val="FF0000"/>
@@ -4042,6 +4708,36 @@
           <w:szCs w:val="40"/>
           <w:lang w:val="en-US"/>
         </w:rPr>
+        <w:t>een</w:t>
+      </w:r>
+      <w:proofErr w:type="spellEnd"/>
+      <w:r>
+        <w:rPr>
+          <w:color w:val="FF0000"/>
+          <w:sz w:val="40"/>
+          <w:szCs w:val="40"/>
+          <w:lang w:val="en-US"/>
+        </w:rPr>
+        <w:t xml:space="preserve"> user experience </w:t>
+      </w:r>
+      <w:proofErr w:type="spellStart"/>
+      <w:r>
+        <w:rPr>
+          <w:color w:val="FF0000"/>
+          <w:sz w:val="40"/>
+          <w:szCs w:val="40"/>
+          <w:lang w:val="en-US"/>
+        </w:rPr>
+        <w:t>questionair</w:t>
+      </w:r>
+      <w:proofErr w:type="spellEnd"/>
+      <w:r>
+        <w:rPr>
+          <w:color w:val="FF0000"/>
+          <w:sz w:val="40"/>
+          <w:szCs w:val="40"/>
+          <w:lang w:val="en-US"/>
+        </w:rPr>
         <w:br w:type="page"/>
       </w:r>
     </w:p>
@@ -4078,13 +4774,31 @@
       <w:r>
         <w:t xml:space="preserve">Je zit in een softwareteam dat werkt aan een AI-systeem om fraude te detecteren. Er is al een begin gemaakt met een </w:t>
       </w:r>
-      <w:r>
-        <w:rPr>
-          <w:i/>
-          <w:iCs/>
-        </w:rPr>
-        <w:t>Fortunately–Unfortunately</w:t>
-      </w:r>
+      <w:proofErr w:type="spellStart"/>
+      <w:r>
+        <w:rPr>
+          <w:i/>
+          <w:iCs/>
+        </w:rPr>
+        <w:t>Fortunately</w:t>
+      </w:r>
+      <w:proofErr w:type="spellEnd"/>
+      <w:r>
+        <w:rPr>
+          <w:i/>
+          <w:iCs/>
+        </w:rPr>
+        <w:t>–</w:t>
+      </w:r>
+      <w:proofErr w:type="spellStart"/>
+      <w:r>
+        <w:rPr>
+          <w:i/>
+          <w:iCs/>
+        </w:rPr>
+        <w:t>Unfortunately</w:t>
+      </w:r>
+      <w:proofErr w:type="spellEnd"/>
       <w:r>
         <w:t>-model, maar het is nog niet compleet en sommige onderdelen moeten verder uitgewerkt worden.</w:t>
       </w:r>
@@ -4138,6 +4852,34 @@
     </w:p>
     <w:p>
       <w:pPr>
+        <w:rPr>
+          <w:lang w:val="en-US"/>
+        </w:rPr>
+      </w:pPr>
+    </w:p>
+    <w:p>
+      <w:pPr>
+        <w:rPr>
+          <w:lang w:val="en-US"/>
+        </w:rPr>
+      </w:pPr>
+    </w:p>
+    <w:p>
+      <w:pPr>
+        <w:rPr>
+          <w:lang w:val="en-US"/>
+        </w:rPr>
+      </w:pPr>
+    </w:p>
+    <w:p>
+      <w:pPr>
+        <w:rPr>
+          <w:lang w:val="en-US"/>
+        </w:rPr>
+      </w:pPr>
+    </w:p>
+    <w:p>
+      <w:pPr>
         <w:pStyle w:val="Lijstalinea"/>
         <w:numPr>
           <w:ilvl w:val="0"/>
@@ -4169,26 +4911,50 @@
     <w:p>
       <w:pPr>
         <w:pStyle w:val="Lijstalinea"/>
-        <w:numPr>
-          <w:ilvl w:val="0"/>
-          <w:numId w:val="12"/>
-        </w:numPr>
-        <w:rPr>
-          <w:lang w:val="en-US"/>
-        </w:rPr>
-      </w:pPr>
-      <w:r>
-        <w:rPr>
-          <w:lang w:val="en-US"/>
-        </w:rPr>
-        <w:t>De weaknesses under review</w:t>
-      </w:r>
-      <w:r>
-        <w:rPr>
-          <w:lang w:val="en-US"/>
-        </w:rPr>
-        <w:t>.</w:t>
-      </w:r>
+        <w:rPr>
+          <w:lang w:val="en-US"/>
+        </w:rPr>
+      </w:pPr>
+    </w:p>
+    <w:p>
+      <w:pPr>
+        <w:pStyle w:val="Lijstalinea"/>
+        <w:rPr>
+          <w:lang w:val="en-US"/>
+        </w:rPr>
+      </w:pPr>
+    </w:p>
+    <w:p>
+      <w:pPr>
+        <w:pStyle w:val="Lijstalinea"/>
+        <w:rPr>
+          <w:lang w:val="en-US"/>
+        </w:rPr>
+      </w:pPr>
+    </w:p>
+    <w:p>
+      <w:pPr>
+        <w:pStyle w:val="Lijstalinea"/>
+        <w:rPr>
+          <w:lang w:val="en-US"/>
+        </w:rPr>
+      </w:pPr>
+    </w:p>
+    <w:p>
+      <w:pPr>
+        <w:pStyle w:val="Lijstalinea"/>
+        <w:rPr>
+          <w:lang w:val="en-US"/>
+        </w:rPr>
+      </w:pPr>
+    </w:p>
+    <w:p>
+      <w:pPr>
+        <w:pStyle w:val="Lijstalinea"/>
+        <w:rPr>
+          <w:lang w:val="en-US"/>
+        </w:rPr>
+      </w:pPr>
     </w:p>
     <w:p>
       <w:pPr>
@@ -4205,7 +4971,7 @@
         <w:rPr>
           <w:lang w:val="en-US"/>
         </w:rPr>
-        <w:t>Hoeveel assumptions under review er zijn</w:t>
+        <w:t>De weaknesses under review</w:t>
       </w:r>
       <w:r>
         <w:rPr>
@@ -4213,6 +4979,41 @@
         </w:rPr>
         <w:t>.</w:t>
       </w:r>
+    </w:p>
+    <w:p>
+      <w:pPr>
+        <w:rPr>
+          <w:lang w:val="en-US"/>
+        </w:rPr>
+      </w:pPr>
+    </w:p>
+    <w:p>
+      <w:pPr>
+        <w:rPr>
+          <w:lang w:val="en-US"/>
+        </w:rPr>
+      </w:pPr>
+    </w:p>
+    <w:p>
+      <w:pPr>
+        <w:rPr>
+          <w:lang w:val="en-US"/>
+        </w:rPr>
+      </w:pPr>
+    </w:p>
+    <w:p>
+      <w:pPr>
+        <w:rPr>
+          <w:lang w:val="en-US"/>
+        </w:rPr>
+      </w:pPr>
+    </w:p>
+    <w:p>
+      <w:pPr>
+        <w:rPr>
+          <w:lang w:val="en-US"/>
+        </w:rPr>
+      </w:pPr>
     </w:p>
     <w:p>
       <w:pPr>
@@ -4225,25 +5026,110 @@
           <w:lang w:val="en-US"/>
         </w:rPr>
       </w:pPr>
-      <w:r>
-        <w:rPr>
-          <w:lang w:val="en-US"/>
-        </w:rPr>
-        <w:t>De gevaarlijkste weakness.</w:t>
-      </w:r>
-    </w:p>
-    <w:p>
-      <w:pPr>
-        <w:rPr>
-          <w:b/>
-          <w:bCs/>
-        </w:rPr>
-      </w:pPr>
-      <w:r>
-        <w:rPr>
-          <w:b/>
-          <w:bCs/>
-        </w:rPr>
+      <w:proofErr w:type="spellStart"/>
+      <w:r>
+        <w:rPr>
+          <w:lang w:val="en-US"/>
+        </w:rPr>
+        <w:t>Hoeveel</w:t>
+      </w:r>
+      <w:proofErr w:type="spellEnd"/>
+      <w:r>
+        <w:rPr>
+          <w:lang w:val="en-US"/>
+        </w:rPr>
+        <w:t xml:space="preserve"> assumptions under review er </w:t>
+      </w:r>
+      <w:proofErr w:type="spellStart"/>
+      <w:r>
+        <w:rPr>
+          <w:lang w:val="en-US"/>
+        </w:rPr>
+        <w:t>zijn</w:t>
+      </w:r>
+      <w:proofErr w:type="spellEnd"/>
+      <w:r>
+        <w:rPr>
+          <w:lang w:val="en-US"/>
+        </w:rPr>
+        <w:t>.</w:t>
+      </w:r>
+    </w:p>
+    <w:p>
+      <w:pPr>
+        <w:pStyle w:val="Lijstalinea"/>
+        <w:rPr>
+          <w:lang w:val="en-US"/>
+        </w:rPr>
+      </w:pPr>
+    </w:p>
+    <w:p>
+      <w:pPr>
+        <w:pStyle w:val="Lijstalinea"/>
+        <w:rPr>
+          <w:lang w:val="en-US"/>
+        </w:rPr>
+      </w:pPr>
+    </w:p>
+    <w:p>
+      <w:pPr>
+        <w:pStyle w:val="Lijstalinea"/>
+        <w:numPr>
+          <w:ilvl w:val="0"/>
+          <w:numId w:val="12"/>
+        </w:numPr>
+        <w:rPr>
+          <w:lang w:val="en-US"/>
+        </w:rPr>
+      </w:pPr>
+      <w:r>
+        <w:rPr>
+          <w:lang w:val="en-US"/>
+        </w:rPr>
+        <w:t xml:space="preserve">De </w:t>
+      </w:r>
+      <w:proofErr w:type="spellStart"/>
+      <w:r>
+        <w:rPr>
+          <w:lang w:val="en-US"/>
+        </w:rPr>
+        <w:t>gevaarlijkste</w:t>
+      </w:r>
+      <w:proofErr w:type="spellEnd"/>
+      <w:r>
+        <w:rPr>
+          <w:lang w:val="en-US"/>
+        </w:rPr>
+        <w:t xml:space="preserve"> weakness.</w:t>
+      </w:r>
+    </w:p>
+    <w:p>
+      <w:pPr>
+        <w:rPr>
+          <w:lang w:val="en-US"/>
+        </w:rPr>
+      </w:pPr>
+    </w:p>
+    <w:p>
+      <w:pPr>
+        <w:rPr>
+          <w:lang w:val="en-US"/>
+        </w:rPr>
+      </w:pPr>
+    </w:p>
+    <w:p>
+      <w:pPr>
+        <w:rPr>
+          <w:b/>
+          <w:bCs/>
+        </w:rPr>
+      </w:pPr>
+      <w:r>
+        <w:rPr>
+          <w:b/>
+          <w:bCs/>
+        </w:rPr>
+        <w:lastRenderedPageBreak/>
         <w:t>Taak 2:</w:t>
       </w:r>
     </w:p>
@@ -4252,7 +5138,15 @@
         <w:t>Bij de</w:t>
       </w:r>
       <w:r>
-        <w:t xml:space="preserve"> gevaarlijkste weakness merk je dat er nog iets ontbreekt. Zonder dit kan, zoals al aangehaald in de tree, er “</w:t>
+        <w:t xml:space="preserve"> gevaarlijkste </w:t>
+      </w:r>
+      <w:proofErr w:type="spellStart"/>
+      <w:r>
+        <w:t>weakness</w:t>
+      </w:r>
+      <w:proofErr w:type="spellEnd"/>
+      <w:r>
+        <w:t xml:space="preserve"> merk je dat er nog iets ontbreekt. Zonder dit kan, zoals al aangehaald in de tree, er “</w:t>
       </w:r>
       <w:r>
         <w:rPr>
@@ -4276,12 +5170,19 @@
       <w:r>
         <w:t xml:space="preserve">ontbrekende </w:t>
       </w:r>
+      <w:proofErr w:type="spellStart"/>
       <w:r>
         <w:t>nodes</w:t>
       </w:r>
-      <w:r>
-        <w:t xml:space="preserve"> toe aan deze weakness</w:t>
-      </w:r>
+      <w:proofErr w:type="spellEnd"/>
+      <w:r>
+        <w:t xml:space="preserve"> toe aan deze </w:t>
+      </w:r>
+      <w:proofErr w:type="spellStart"/>
+      <w:r>
+        <w:t>weakness</w:t>
+      </w:r>
+      <w:proofErr w:type="spellEnd"/>
       <w:r>
         <w:t>.</w:t>
       </w:r>
@@ -4306,7 +5207,23 @@
           <w:i/>
           <w:iCs/>
         </w:rPr>
-        <w:t>Toegang wordt beperkt tot geverifieerde accounts [Assumption Under Review]</w:t>
+        <w:t>Toegang wordt beperkt tot geverifieerde accounts [</w:t>
+      </w:r>
+      <w:proofErr w:type="spellStart"/>
+      <w:r>
+        <w:rPr>
+          <w:i/>
+          <w:iCs/>
+        </w:rPr>
+        <w:t>Assumption</w:t>
+      </w:r>
+      <w:proofErr w:type="spellEnd"/>
+      <w:r>
+        <w:rPr>
+          <w:i/>
+          <w:iCs/>
+        </w:rPr>
+        <w:t xml:space="preserve"> Under Review]</w:t>
       </w:r>
       <w:r>
         <w:rPr>
@@ -4350,8 +5267,17 @@
           <w:i/>
           <w:iCs/>
         </w:rPr>
-        <w:t>[Weakness</w:t>
-      </w:r>
+        <w:t>[</w:t>
+      </w:r>
+      <w:proofErr w:type="spellStart"/>
+      <w:r>
+        <w:rPr>
+          <w:i/>
+          <w:iCs/>
+        </w:rPr>
+        <w:t>Weakness</w:t>
+      </w:r>
+      <w:proofErr w:type="spellEnd"/>
       <w:r>
         <w:rPr>
           <w:i/>
@@ -4382,8 +5308,13 @@
           <w:numId w:val="3"/>
         </w:numPr>
       </w:pPr>
-      <w:r>
-        <w:t>Likelyhood: 5</w:t>
+      <w:proofErr w:type="spellStart"/>
+      <w:r>
+        <w:t>Likelyhood</w:t>
+      </w:r>
+      <w:proofErr w:type="spellEnd"/>
+      <w:r>
+        <w:t>: 5</w:t>
       </w:r>
     </w:p>
     <w:p>
@@ -4406,8 +5337,13 @@
           <w:numId w:val="3"/>
         </w:numPr>
       </w:pPr>
-      <w:r>
-        <w:t>Danger rating: 5*2 =&gt; 10</w:t>
+      <w:proofErr w:type="spellStart"/>
+      <w:r>
+        <w:t>Danger</w:t>
+      </w:r>
+      <w:proofErr w:type="spellEnd"/>
+      <w:r>
+        <w:t xml:space="preserve"> rating: 5*2 =&gt; 10</w:t>
       </w:r>
     </w:p>
     <w:p>
@@ -4427,7 +5363,79 @@
           <w:iCs/>
           <w:lang w:val="en-US"/>
         </w:rPr>
-        <w:t>“Self-service accountbeheer vermindert werklast voor IT-support [Verified Assumption]</w:t>
+        <w:t xml:space="preserve">“Self-service </w:t>
+      </w:r>
+      <w:proofErr w:type="spellStart"/>
+      <w:r>
+        <w:rPr>
+          <w:i/>
+          <w:iCs/>
+          <w:lang w:val="en-US"/>
+        </w:rPr>
+        <w:t>accountbeheer</w:t>
+      </w:r>
+      <w:proofErr w:type="spellEnd"/>
+      <w:r>
+        <w:rPr>
+          <w:i/>
+          <w:iCs/>
+          <w:lang w:val="en-US"/>
+        </w:rPr>
+        <w:t xml:space="preserve"> </w:t>
+      </w:r>
+      <w:proofErr w:type="spellStart"/>
+      <w:r>
+        <w:rPr>
+          <w:i/>
+          <w:iCs/>
+          <w:lang w:val="en-US"/>
+        </w:rPr>
+        <w:t>vermindert</w:t>
+      </w:r>
+      <w:proofErr w:type="spellEnd"/>
+      <w:r>
+        <w:rPr>
+          <w:i/>
+          <w:iCs/>
+          <w:lang w:val="en-US"/>
+        </w:rPr>
+        <w:t xml:space="preserve"> </w:t>
+      </w:r>
+      <w:proofErr w:type="spellStart"/>
+      <w:r>
+        <w:rPr>
+          <w:i/>
+          <w:iCs/>
+          <w:lang w:val="en-US"/>
+        </w:rPr>
+        <w:t>werklast</w:t>
+      </w:r>
+      <w:proofErr w:type="spellEnd"/>
+      <w:r>
+        <w:rPr>
+          <w:i/>
+          <w:iCs/>
+          <w:lang w:val="en-US"/>
+        </w:rPr>
+        <w:t xml:space="preserve"> </w:t>
+      </w:r>
+      <w:proofErr w:type="spellStart"/>
+      <w:r>
+        <w:rPr>
+          <w:i/>
+          <w:iCs/>
+          <w:lang w:val="en-US"/>
+        </w:rPr>
+        <w:t>voor</w:t>
+      </w:r>
+      <w:proofErr w:type="spellEnd"/>
+      <w:r>
+        <w:rPr>
+          <w:i/>
+          <w:iCs/>
+          <w:lang w:val="en-US"/>
+        </w:rPr>
+        <w:t xml:space="preserve"> IT-support [Verified Assumption]</w:t>
       </w:r>
       <w:r>
         <w:rPr>
@@ -4446,7 +5454,60 @@
         <w:t xml:space="preserve"> </w:t>
       </w:r>
       <w:r>
-        <w:t>Alles voor deze piste is toegevoegd. Noteer of markeer dat de laatste node een verified assumption is.</w:t>
+        <w:t xml:space="preserve">Alles voor deze piste is toegevoegd. Noteer of markeer </w:t>
+      </w:r>
+      <w:r>
+        <w:t xml:space="preserve">bij de laatste </w:t>
+      </w:r>
+      <w:proofErr w:type="spellStart"/>
+      <w:r>
+        <w:t>fortunately</w:t>
+      </w:r>
+      <w:proofErr w:type="spellEnd"/>
+      <w:r>
+        <w:t xml:space="preserve"> node dat dit een </w:t>
+      </w:r>
+      <w:r>
+        <w:rPr>
+          <w:i/>
+          <w:iCs/>
+        </w:rPr>
+        <w:t>“</w:t>
+      </w:r>
+      <w:proofErr w:type="spellStart"/>
+      <w:r>
+        <w:rPr>
+          <w:i/>
+          <w:iCs/>
+        </w:rPr>
+        <w:t>Verified</w:t>
+      </w:r>
+      <w:proofErr w:type="spellEnd"/>
+      <w:r>
+        <w:rPr>
+          <w:i/>
+          <w:iCs/>
+        </w:rPr>
+        <w:t xml:space="preserve"> </w:t>
+      </w:r>
+      <w:proofErr w:type="spellStart"/>
+      <w:r>
+        <w:rPr>
+          <w:i/>
+          <w:iCs/>
+        </w:rPr>
+        <w:t>Assumption</w:t>
+      </w:r>
+      <w:proofErr w:type="spellEnd"/>
+      <w:r>
+        <w:rPr>
+          <w:i/>
+          <w:iCs/>
+        </w:rPr>
+        <w:t xml:space="preserve">” </w:t>
+      </w:r>
+      <w:r>
+        <w:t>is.</w:t>
       </w:r>
     </w:p>
     <w:p>
@@ -4472,7 +5533,13 @@
         <w:t>tak</w:t>
       </w:r>
       <w:r>
-        <w:t xml:space="preserve"> dat je wilt bespreken met je collega’s in de volgende vergadering</w:t>
+        <w:t xml:space="preserve"> </w:t>
+      </w:r>
+      <w:r>
+        <w:t>die</w:t>
+      </w:r>
+      <w:r>
+        <w:t xml:space="preserve"> je wilt bespreken met je collega’s in de volgende vergadering</w:t>
       </w:r>
       <w:r>
         <w:t xml:space="preserve">, namelijk </w:t>
@@ -4507,55 +5574,104 @@
         <w:t xml:space="preserve"> ook</w:t>
       </w:r>
       <w:r>
-        <w:t xml:space="preserve"> geen</w:t>
-      </w:r>
-      <w:r>
-        <w:t xml:space="preserve"> fortunately.</w:t>
-      </w:r>
-      <w:r>
         <w:t xml:space="preserve"> </w:t>
       </w:r>
       <w:r>
-        <w:t>Zoek de node op en documenteer de keten van nodes vanaf de root tot aan deze specifieke node</w:t>
+        <w:t xml:space="preserve">niet onder de classificatie van een </w:t>
+      </w:r>
+      <w:proofErr w:type="spellStart"/>
+      <w:r>
+        <w:t>fortunately</w:t>
+      </w:r>
+      <w:proofErr w:type="spellEnd"/>
+      <w:r>
+        <w:t xml:space="preserve"> node</w:t>
       </w:r>
       <w:r>
         <w:t>.</w:t>
       </w:r>
-    </w:p>
-    <w:p>
-      <w:pPr>
-        <w:rPr>
-          <w:b/>
-          <w:bCs/>
-        </w:rPr>
-      </w:pPr>
-      <w:r>
-        <w:rPr>
-          <w:b/>
-          <w:bCs/>
-        </w:rPr>
-        <w:br w:type="page"/>
-      </w:r>
-    </w:p>
-    <w:p>
-      <w:pPr>
-        <w:rPr>
-          <w:b/>
-          <w:bCs/>
-        </w:rPr>
-      </w:pPr>
-      <w:r>
-        <w:rPr>
-          <w:b/>
-          <w:bCs/>
-        </w:rPr>
-        <w:lastRenderedPageBreak/>
+      <w:r>
+        <w:t xml:space="preserve"> </w:t>
+      </w:r>
+      <w:r>
+        <w:t>Omdat je dit eerst wil bespreken, wil je nog geen aanpassingen doen</w:t>
+      </w:r>
+      <w:r>
+        <w:t>.</w:t>
+      </w:r>
+      <w:r>
+        <w:t xml:space="preserve"> </w:t>
+      </w:r>
+      <w:r>
+        <w:t>Zoek</w:t>
+      </w:r>
+      <w:r>
+        <w:t xml:space="preserve"> wel</w:t>
+      </w:r>
+      <w:r>
+        <w:t xml:space="preserve"> de node op en documenteer de keten van </w:t>
+      </w:r>
+      <w:proofErr w:type="spellStart"/>
+      <w:r>
+        <w:t>nodes</w:t>
+      </w:r>
+      <w:proofErr w:type="spellEnd"/>
+      <w:r>
+        <w:t xml:space="preserve"> vanaf de root tot aan deze specifieke node</w:t>
+      </w:r>
+      <w:r>
+        <w:t>.</w:t>
+      </w:r>
+    </w:p>
+    <w:p>
+      <w:pPr>
+        <w:rPr>
+          <w:b/>
+          <w:bCs/>
+        </w:rPr>
+      </w:pPr>
+      <w:r>
+        <w:rPr>
+          <w:b/>
+          <w:bCs/>
+        </w:rPr>
         <w:t>Taak 4:</w:t>
       </w:r>
     </w:p>
     <w:p>
       <w:r>
-        <w:t xml:space="preserve">Daarnaast is het nuttig om te bekijken wat er gebeurt als we het model simpelweg afstemmen om minder false negatives te hebben. Dit noteren in de tree, maakt het mogelijk om hierover te brainstormen binnen het team. </w:t>
+        <w:t xml:space="preserve">Daarnaast </w:t>
+      </w:r>
+      <w:r>
+        <w:t>vraag je je af</w:t>
+      </w:r>
+      <w:r>
+        <w:t xml:space="preserve"> wat er gebeurt als we het </w:t>
+      </w:r>
+      <w:r>
+        <w:t>AI fraudedetectiesysteem</w:t>
+      </w:r>
+      <w:r>
+        <w:t xml:space="preserve"> </w:t>
+      </w:r>
+      <w:r>
+        <w:t xml:space="preserve">simpelweg afstemmen om minder </w:t>
+      </w:r>
+      <w:proofErr w:type="spellStart"/>
+      <w:r>
+        <w:t>false</w:t>
+      </w:r>
+      <w:proofErr w:type="spellEnd"/>
+      <w:r>
+        <w:t xml:space="preserve"> </w:t>
+      </w:r>
+      <w:proofErr w:type="spellStart"/>
+      <w:r>
+        <w:t>negatives</w:t>
+      </w:r>
+      <w:proofErr w:type="spellEnd"/>
+      <w:r>
+        <w:t xml:space="preserve"> te hebben. Dit noteren in de tree, maakt het mogelijk om hierover te brainstormen binnen het team. </w:t>
       </w:r>
       <w:r>
         <w:t xml:space="preserve">Zoek de node </w:t>
@@ -4572,7 +5688,39 @@
           <w:i/>
           <w:iCs/>
         </w:rPr>
-        <w:t>Hoge false positives blokkeren legitieme gebruikers</w:t>
+        <w:t xml:space="preserve">Hoge </w:t>
+      </w:r>
+      <w:proofErr w:type="spellStart"/>
+      <w:r>
+        <w:rPr>
+          <w:i/>
+          <w:iCs/>
+        </w:rPr>
+        <w:t>false</w:t>
+      </w:r>
+      <w:proofErr w:type="spellEnd"/>
+      <w:r>
+        <w:rPr>
+          <w:i/>
+          <w:iCs/>
+        </w:rPr>
+        <w:t xml:space="preserve"> </w:t>
+      </w:r>
+      <w:proofErr w:type="spellStart"/>
+      <w:r>
+        <w:rPr>
+          <w:i/>
+          <w:iCs/>
+        </w:rPr>
+        <w:t>positives</w:t>
+      </w:r>
+      <w:proofErr w:type="spellEnd"/>
+      <w:r>
+        <w:rPr>
+          <w:i/>
+          <w:iCs/>
+        </w:rPr>
+        <w:t xml:space="preserve"> blokkeren legitieme gebruikers</w:t>
       </w:r>
       <w:r>
         <w:rPr>
@@ -4585,7 +5733,15 @@
         <w:t>en voeg onder</w:t>
       </w:r>
       <w:r>
-        <w:t>staande nodes onder elkaar toe</w:t>
+        <w:t xml:space="preserve">staande </w:t>
+      </w:r>
+      <w:proofErr w:type="spellStart"/>
+      <w:r>
+        <w:t>nodes</w:t>
+      </w:r>
+      <w:proofErr w:type="spellEnd"/>
+      <w:r>
+        <w:t xml:space="preserve"> onder elkaar toe</w:t>
       </w:r>
       <w:r>
         <w:t>:</w:t>
@@ -4598,8 +5754,13 @@
           <w:numId w:val="4"/>
         </w:numPr>
       </w:pPr>
-      <w:r>
-        <w:t xml:space="preserve">Fortunately: </w:t>
+      <w:proofErr w:type="spellStart"/>
+      <w:r>
+        <w:t>Fortunately</w:t>
+      </w:r>
+      <w:proofErr w:type="spellEnd"/>
+      <w:r>
+        <w:t xml:space="preserve">: </w:t>
       </w:r>
       <w:r>
         <w:rPr>
@@ -4616,15 +5777,84 @@
           <w:numId w:val="4"/>
         </w:numPr>
       </w:pPr>
-      <w:r>
-        <w:t xml:space="preserve">Unfortunately: </w:t>
-      </w:r>
-      <w:r>
-        <w:rPr>
-          <w:i/>
-          <w:iCs/>
-        </w:rPr>
-        <w:t>"Het terugdringen van false negatives leidt tot meer false positives"</w:t>
+      <w:proofErr w:type="spellStart"/>
+      <w:r>
+        <w:t>Unfortunately</w:t>
+      </w:r>
+      <w:proofErr w:type="spellEnd"/>
+      <w:r>
+        <w:t xml:space="preserve">: </w:t>
+      </w:r>
+      <w:r>
+        <w:rPr>
+          <w:i/>
+          <w:iCs/>
+        </w:rPr>
+        <w:t xml:space="preserve">"Het terugdringen van </w:t>
+      </w:r>
+      <w:proofErr w:type="spellStart"/>
+      <w:r>
+        <w:rPr>
+          <w:i/>
+          <w:iCs/>
+        </w:rPr>
+        <w:t>false</w:t>
+      </w:r>
+      <w:proofErr w:type="spellEnd"/>
+      <w:r>
+        <w:rPr>
+          <w:i/>
+          <w:iCs/>
+        </w:rPr>
+        <w:t xml:space="preserve"> </w:t>
+      </w:r>
+      <w:proofErr w:type="spellStart"/>
+      <w:r>
+        <w:rPr>
+          <w:i/>
+          <w:iCs/>
+        </w:rPr>
+        <w:t>negatives</w:t>
+      </w:r>
+      <w:proofErr w:type="spellEnd"/>
+      <w:r>
+        <w:rPr>
+          <w:i/>
+          <w:iCs/>
+        </w:rPr>
+        <w:t xml:space="preserve"> leidt tot meer </w:t>
+      </w:r>
+      <w:proofErr w:type="spellStart"/>
+      <w:r>
+        <w:rPr>
+          <w:i/>
+          <w:iCs/>
+        </w:rPr>
+        <w:t>false</w:t>
+      </w:r>
+      <w:proofErr w:type="spellEnd"/>
+      <w:r>
+        <w:rPr>
+          <w:i/>
+          <w:iCs/>
+        </w:rPr>
+        <w:t xml:space="preserve"> </w:t>
+      </w:r>
+      <w:proofErr w:type="spellStart"/>
+      <w:r>
+        <w:rPr>
+          <w:i/>
+          <w:iCs/>
+        </w:rPr>
+        <w:t>positives</w:t>
+      </w:r>
+      <w:proofErr w:type="spellEnd"/>
+      <w:r>
+        <w:rPr>
+          <w:i/>
+          <w:iCs/>
+        </w:rPr>
+        <w:t>"</w:t>
       </w:r>
     </w:p>
     <w:p>
@@ -4634,15 +5864,36 @@
           <w:numId w:val="4"/>
         </w:numPr>
       </w:pPr>
-      <w:r>
-        <w:t xml:space="preserve">Fortunately: </w:t>
-      </w:r>
-      <w:r>
-        <w:rPr>
-          <w:i/>
-          <w:iCs/>
-        </w:rPr>
-        <w:t>"Risicogebaseerde scoring helpt om urgente en laag-risico waarschuwingen te onderscheiden"</w:t>
+      <w:proofErr w:type="spellStart"/>
+      <w:r>
+        <w:t>Fortunately</w:t>
+      </w:r>
+      <w:proofErr w:type="spellEnd"/>
+      <w:r>
+        <w:t xml:space="preserve">: </w:t>
+      </w:r>
+      <w:r>
+        <w:rPr>
+          <w:i/>
+          <w:iCs/>
+        </w:rPr>
+        <w:t>"</w:t>
+      </w:r>
+      <w:proofErr w:type="spellStart"/>
+      <w:r>
+        <w:rPr>
+          <w:i/>
+          <w:iCs/>
+        </w:rPr>
+        <w:t>Risicogebaseerde</w:t>
+      </w:r>
+      <w:proofErr w:type="spellEnd"/>
+      <w:r>
+        <w:rPr>
+          <w:i/>
+          <w:iCs/>
+        </w:rPr>
+        <w:t xml:space="preserve"> scoring helpt om urgente en laag-risico waarschuwingen te onderscheiden"</w:t>
       </w:r>
     </w:p>
     <w:p>
@@ -4659,8 +5910,36 @@
           <w:sz w:val="40"/>
           <w:szCs w:val="40"/>
         </w:rPr>
-        <w:t>→ Hierna een user experience questionair</w:t>
-      </w:r>
+        <w:t xml:space="preserve">→ Hierna een user </w:t>
+      </w:r>
+      <w:proofErr w:type="spellStart"/>
+      <w:r>
+        <w:rPr>
+          <w:color w:val="FF0000"/>
+          <w:sz w:val="40"/>
+          <w:szCs w:val="40"/>
+        </w:rPr>
+        <w:t>experience</w:t>
+      </w:r>
+      <w:proofErr w:type="spellEnd"/>
+      <w:r>
+        <w:rPr>
+          <w:color w:val="FF0000"/>
+          <w:sz w:val="40"/>
+          <w:szCs w:val="40"/>
+        </w:rPr>
+        <w:t xml:space="preserve"> </w:t>
+      </w:r>
+      <w:proofErr w:type="spellStart"/>
+      <w:r>
+        <w:rPr>
+          <w:color w:val="FF0000"/>
+          <w:sz w:val="40"/>
+          <w:szCs w:val="40"/>
+        </w:rPr>
+        <w:t>questionair</w:t>
+      </w:r>
+      <w:proofErr w:type="spellEnd"/>
     </w:p>
     <w:p>
       <w:pPr>
@@ -4707,6 +5986,24 @@
           <v:rect id="_x0000_i1028" style="width:0;height:1.5pt" o:hralign="center" o:hrstd="t" o:hr="t" fillcolor="#a0a0a0" stroked="f"/>
         </w:pict>
       </w:r>
+    </w:p>
+    <w:p>
+      <w:r>
+        <w:t xml:space="preserve">Aan de hand van de volgende vragen, is het doel de toevoegingen ten op </w:t>
+      </w:r>
+      <w:proofErr w:type="spellStart"/>
+      <w:r>
+        <w:t>zichte</w:t>
+      </w:r>
+      <w:proofErr w:type="spellEnd"/>
+      <w:r>
+        <w:t xml:space="preserve"> van de basissoftware te bespreken.</w:t>
+      </w:r>
+    </w:p>
+    <w:p>
+      <w:pPr>
+        <w:pStyle w:val="Lijstalinea"/>
+      </w:pPr>
     </w:p>
     <w:p>
       <w:pPr>
@@ -4715,142 +6012,67 @@
           <w:ilvl w:val="0"/>
           <w:numId w:val="5"/>
         </w:numPr>
-      </w:pPr>
-      <w:r>
-        <w:t>Rankschik de features van meest nuttig (1) naar minst nuttig (</w:t>
-      </w:r>
-      <w:r>
-        <w:t>8</w:t>
-      </w:r>
-      <w:r>
-        <w:t>)</w:t>
-      </w:r>
-      <w:r>
+        <w:rPr>
+          <w:lang w:val="en-US"/>
+        </w:rPr>
+      </w:pPr>
+      <w:r>
+        <w:rPr>
+          <w:lang w:val="en-US"/>
+        </w:rPr>
+        <w:t xml:space="preserve">Was de Fortunately-Unfortunately </w:t>
+      </w:r>
+      <w:proofErr w:type="spellStart"/>
+      <w:r>
+        <w:rPr>
+          <w:lang w:val="en-US"/>
+        </w:rPr>
+        <w:t>methode</w:t>
+      </w:r>
+      <w:proofErr w:type="spellEnd"/>
+      <w:r>
+        <w:rPr>
+          <w:lang w:val="en-US"/>
+        </w:rPr>
+        <w:t xml:space="preserve"> </w:t>
+      </w:r>
+      <w:proofErr w:type="spellStart"/>
+      <w:r>
+        <w:rPr>
+          <w:lang w:val="en-US"/>
+        </w:rPr>
+        <w:t>duidelijk</w:t>
+      </w:r>
+      <w:proofErr w:type="spellEnd"/>
+      <w:r>
+        <w:rPr>
+          <w:lang w:val="en-US"/>
+        </w:rPr>
         <w:t>?</w:t>
       </w:r>
     </w:p>
     <w:p>
       <w:pPr>
-        <w:spacing w:line="240" w:lineRule="auto"/>
-        <w:ind w:firstLine="708"/>
-      </w:pPr>
-      <w:r>
-        <w:t>[    ]</w:t>
-      </w:r>
-      <w:r>
-        <w:tab/>
-      </w:r>
-      <w:r>
-        <w:t>Klassifisering adhv het schild icoon</w:t>
-      </w:r>
-    </w:p>
-    <w:p>
-      <w:pPr>
-        <w:spacing w:line="240" w:lineRule="auto"/>
-        <w:ind w:left="708"/>
-      </w:pPr>
-      <w:r>
-        <w:t>[    ]</w:t>
-      </w:r>
-      <w:r>
-        <w:tab/>
-      </w:r>
-      <w:r>
-        <w:t>Weergave van soort node adhv kleur</w:t>
-      </w:r>
-    </w:p>
-    <w:p>
-      <w:pPr>
-        <w:spacing w:line="240" w:lineRule="auto"/>
-        <w:ind w:firstLine="708"/>
-      </w:pPr>
-      <w:r>
-        <w:t>[    ]</w:t>
-      </w:r>
-      <w:r>
-        <w:tab/>
-      </w:r>
-      <w:r>
-        <w:t>Filtering op basis van de status van de node</w:t>
-      </w:r>
-    </w:p>
-    <w:p>
-      <w:pPr>
-        <w:spacing w:line="240" w:lineRule="auto"/>
-        <w:ind w:firstLine="708"/>
-      </w:pPr>
-      <w:r>
-        <w:t>[    ]</w:t>
-      </w:r>
-      <w:r>
-        <w:tab/>
-        <w:t>Notitie van altijd nodes per bepaalde status</w:t>
-      </w:r>
-    </w:p>
-    <w:p>
-      <w:pPr>
-        <w:spacing w:line="240" w:lineRule="auto"/>
-        <w:ind w:firstLine="708"/>
-      </w:pPr>
-      <w:r>
-        <w:t>[    ]</w:t>
-      </w:r>
-      <w:r>
-        <w:tab/>
-      </w:r>
-      <w:r>
-        <w:t>Rangschikking op basis van dangerrating binnen de filtering</w:t>
-      </w:r>
-    </w:p>
-    <w:p>
-      <w:pPr>
-        <w:spacing w:line="240" w:lineRule="auto"/>
-        <w:ind w:firstLine="708"/>
-      </w:pPr>
-      <w:r>
-        <w:t>[    ]</w:t>
-      </w:r>
-      <w:r>
-        <w:tab/>
-      </w:r>
-      <w:r>
-        <w:t>Klikken van node in filtering balk highlight node</w:t>
-      </w:r>
-    </w:p>
-    <w:p>
-      <w:pPr>
-        <w:spacing w:line="240" w:lineRule="auto"/>
-        <w:ind w:firstLine="708"/>
-      </w:pPr>
-      <w:r>
-        <w:t>[    ]</w:t>
-      </w:r>
-      <w:r>
-        <w:tab/>
-      </w:r>
-      <w:r>
-        <w:t>Samenvatting van root tot aan geduide node</w:t>
-      </w:r>
-    </w:p>
-    <w:p>
-      <w:pPr>
-        <w:spacing w:line="240" w:lineRule="auto"/>
-        <w:ind w:firstLine="708"/>
-      </w:pPr>
-      <w:r>
-        <w:t>[    ]</w:t>
-      </w:r>
-      <w:r>
-        <w:tab/>
-      </w:r>
-      <w:r>
-        <w:t>Tooltips bij hoveren</w:t>
-      </w:r>
-    </w:p>
-    <w:p>
-      <w:pPr>
-        <w:spacing w:line="240" w:lineRule="auto"/>
-        <w:ind w:firstLine="708"/>
+        <w:pStyle w:val="Lijstalinea"/>
+        <w:rPr>
+          <w:lang w:val="en-US"/>
+        </w:rPr>
+      </w:pPr>
+    </w:p>
+    <w:p>
+      <w:pPr>
+        <w:pStyle w:val="Lijstalinea"/>
+        <w:rPr>
+          <w:lang w:val="en-US"/>
+        </w:rPr>
+      </w:pPr>
+    </w:p>
+    <w:p>
+      <w:pPr>
+        <w:pStyle w:val="Lijstalinea"/>
+        <w:rPr>
+          <w:lang w:val="en-US"/>
+        </w:rPr>
       </w:pPr>
     </w:p>
     <w:p>
@@ -4862,12 +6084,179 @@
         </w:numPr>
       </w:pPr>
       <w:r>
-        <w:t>Welke onderdelen van de geteste tree software zouden volgens jou verbeterd kunnen worden?</w:t>
-      </w:r>
-    </w:p>
-    <w:p>
-      <w:pPr>
-        <w:pStyle w:val="Lijstalinea"/>
+        <w:t>Rankschik de features van meest nuttig (1) naar minst nuttig (</w:t>
+      </w:r>
+      <w:r>
+        <w:t>8</w:t>
+      </w:r>
+      <w:r>
+        <w:t>)</w:t>
+      </w:r>
+      <w:r>
+        <w:t>?</w:t>
+      </w:r>
+      <w:r>
+        <w:t xml:space="preserve"> Als je een feature niet opgemerkt hebt, mag je deze een score van -1 geven.</w:t>
+      </w:r>
+    </w:p>
+    <w:p>
+      <w:pPr>
+        <w:spacing w:line="240" w:lineRule="auto"/>
+        <w:ind w:firstLine="708"/>
+      </w:pPr>
+      <w:r>
+        <w:t>[    ]</w:t>
+      </w:r>
+      <w:r>
+        <w:tab/>
+      </w:r>
+      <w:r>
+        <w:t>Classificering</w:t>
+      </w:r>
+      <w:r>
+        <w:t xml:space="preserve"> </w:t>
+      </w:r>
+      <w:r>
+        <w:t>door</w:t>
+      </w:r>
+      <w:r>
+        <w:t xml:space="preserve"> het schild icoon</w:t>
+      </w:r>
+    </w:p>
+    <w:p>
+      <w:pPr>
+        <w:spacing w:line="240" w:lineRule="auto"/>
+        <w:ind w:left="708"/>
+      </w:pPr>
+      <w:r>
+        <w:t>[    ]</w:t>
+      </w:r>
+      <w:r>
+        <w:tab/>
+      </w:r>
+      <w:r>
+        <w:t xml:space="preserve">Weergave van soort node </w:t>
+      </w:r>
+      <w:r>
+        <w:t>door de</w:t>
+      </w:r>
+      <w:r>
+        <w:t xml:space="preserve"> kleur</w:t>
+      </w:r>
+    </w:p>
+    <w:p>
+      <w:pPr>
+        <w:spacing w:line="240" w:lineRule="auto"/>
+        <w:ind w:firstLine="708"/>
+      </w:pPr>
+      <w:r>
+        <w:t>[    ]</w:t>
+      </w:r>
+      <w:r>
+        <w:tab/>
+      </w:r>
+      <w:r>
+        <w:t>Filtering op basis van de status van de node</w:t>
+      </w:r>
+    </w:p>
+    <w:p>
+      <w:pPr>
+        <w:spacing w:line="240" w:lineRule="auto"/>
+        <w:ind w:firstLine="708"/>
+      </w:pPr>
+      <w:r>
+        <w:t>[    ]</w:t>
+      </w:r>
+      <w:r>
+        <w:tab/>
+        <w:t xml:space="preserve">Notitie van altijd </w:t>
+      </w:r>
+      <w:proofErr w:type="spellStart"/>
+      <w:r>
+        <w:t>nodes</w:t>
+      </w:r>
+      <w:proofErr w:type="spellEnd"/>
+      <w:r>
+        <w:t xml:space="preserve"> per bepaalde status</w:t>
+      </w:r>
+    </w:p>
+    <w:p>
+      <w:pPr>
+        <w:spacing w:line="240" w:lineRule="auto"/>
+        <w:ind w:firstLine="708"/>
+      </w:pPr>
+      <w:r>
+        <w:t>[    ]</w:t>
+      </w:r>
+      <w:r>
+        <w:tab/>
+      </w:r>
+      <w:r>
+        <w:t xml:space="preserve">Rangschikking op basis van </w:t>
+      </w:r>
+      <w:proofErr w:type="spellStart"/>
+      <w:r>
+        <w:t>dangerrating</w:t>
+      </w:r>
+      <w:proofErr w:type="spellEnd"/>
+      <w:r>
+        <w:t xml:space="preserve"> binnen de filtering</w:t>
+      </w:r>
+    </w:p>
+    <w:p>
+      <w:pPr>
+        <w:spacing w:line="240" w:lineRule="auto"/>
+        <w:ind w:firstLine="708"/>
+      </w:pPr>
+      <w:r>
+        <w:t>[    ]</w:t>
+      </w:r>
+      <w:r>
+        <w:tab/>
+      </w:r>
+      <w:r>
+        <w:t>Klikken van node in filtering balk highlight node</w:t>
+      </w:r>
+    </w:p>
+    <w:p>
+      <w:pPr>
+        <w:spacing w:line="240" w:lineRule="auto"/>
+        <w:ind w:firstLine="708"/>
+      </w:pPr>
+      <w:r>
+        <w:t>[    ]</w:t>
+      </w:r>
+      <w:r>
+        <w:tab/>
+      </w:r>
+      <w:r>
+        <w:t>Samenvatting van root tot aan geduide node</w:t>
+      </w:r>
+    </w:p>
+    <w:p>
+      <w:pPr>
+        <w:spacing w:line="240" w:lineRule="auto"/>
+        <w:ind w:firstLine="708"/>
+      </w:pPr>
+      <w:r>
+        <w:t>[    ]</w:t>
+      </w:r>
+      <w:r>
+        <w:tab/>
+      </w:r>
+      <w:r>
+        <w:t xml:space="preserve">Tooltips bij </w:t>
+      </w:r>
+      <w:proofErr w:type="spellStart"/>
+      <w:r>
+        <w:t>hoveren</w:t>
+      </w:r>
+      <w:proofErr w:type="spellEnd"/>
+    </w:p>
+    <w:p>
+      <w:pPr>
+        <w:spacing w:line="240" w:lineRule="auto"/>
+        <w:ind w:firstLine="708"/>
       </w:pPr>
     </w:p>
     <w:p>
@@ -4879,8 +6268,47 @@
         </w:numPr>
       </w:pPr>
       <w:r>
-        <w:t>Heb je suggesties om features op een andere manier aan te pakken of een feature die nog nuttig kan zijn om de user experience te verbeteren?</w:t>
-      </w:r>
+        <w:t xml:space="preserve">Welke onderdelen van de </w:t>
+      </w:r>
+      <w:r>
+        <w:t>uitgebreide</w:t>
+      </w:r>
+      <w:r>
+        <w:t xml:space="preserve"> tree</w:t>
+      </w:r>
+      <w:r>
+        <w:t xml:space="preserve"> software zouden volgens jou verbeterd kunnen worden?</w:t>
+      </w:r>
+    </w:p>
+    <w:p>
+      <w:pPr>
+        <w:pStyle w:val="Lijstalinea"/>
+      </w:pPr>
+    </w:p>
+    <w:p>
+      <w:pPr>
+        <w:pStyle w:val="Lijstalinea"/>
+      </w:pPr>
+    </w:p>
+    <w:p>
+      <w:pPr>
+        <w:pStyle w:val="Lijstalinea"/>
+      </w:pPr>
+    </w:p>
+    <w:p>
+      <w:pPr>
+        <w:pStyle w:val="Lijstalinea"/>
+      </w:pPr>
+    </w:p>
+    <w:p>
+      <w:pPr>
+        <w:pStyle w:val="Lijstalinea"/>
+      </w:pPr>
+    </w:p>
+    <w:p>
+      <w:pPr>
+        <w:pStyle w:val="Lijstalinea"/>
+      </w:pPr>
     </w:p>
     <w:p>
       <w:pPr>
@@ -4896,14 +6324,31 @@
         </w:numPr>
       </w:pPr>
       <w:r>
-        <w:t xml:space="preserve">In welke </w:t>
-      </w:r>
-      <w:r>
-        <w:t xml:space="preserve">versie van de </w:t>
-      </w:r>
-      <w:r>
-        <w:t>software vond je het makkelijker om een scenario te analyseren? Waarom?</w:t>
-      </w:r>
+        <w:t xml:space="preserve">Heb je suggesties om features op een andere manier aan te pakken of een feature die nog nuttig kan zijn om de user </w:t>
+      </w:r>
+      <w:proofErr w:type="spellStart"/>
+      <w:r>
+        <w:t>experience</w:t>
+      </w:r>
+      <w:proofErr w:type="spellEnd"/>
+      <w:r>
+        <w:t xml:space="preserve"> te verbeteren?</w:t>
+      </w:r>
+    </w:p>
+    <w:p>
+      <w:pPr>
+        <w:pStyle w:val="Lijstalinea"/>
+      </w:pPr>
+    </w:p>
+    <w:p>
+      <w:pPr>
+        <w:pStyle w:val="Lijstalinea"/>
+      </w:pPr>
+    </w:p>
+    <w:p>
+      <w:pPr>
+        <w:pStyle w:val="Lijstalinea"/>
+      </w:pPr>
     </w:p>
     <w:p/>
     <w:p>
@@ -4915,14 +6360,26 @@
         </w:numPr>
       </w:pPr>
       <w:r>
-        <w:t>Welke versie zou je in een echte situatie verkiezen en waarom?</w:t>
-      </w:r>
-    </w:p>
-    <w:p>
-      <w:pPr>
-        <w:pStyle w:val="Lijstalinea"/>
-      </w:pPr>
-    </w:p>
+        <w:lastRenderedPageBreak/>
+        <w:t xml:space="preserve">In welke </w:t>
+      </w:r>
+      <w:r>
+        <w:t xml:space="preserve">versie van de </w:t>
+      </w:r>
+      <w:r>
+        <w:t xml:space="preserve">software vond je het makkelijker </w:t>
+      </w:r>
+      <w:r>
+        <w:t>om de taken uit te voeren</w:t>
+      </w:r>
+      <w:r>
+        <w:t>? Waarom?</w:t>
+      </w:r>
+    </w:p>
+    <w:p/>
+    <w:p/>
+    <w:p/>
+    <w:p/>
     <w:p>
       <w:pPr>
         <w:pStyle w:val="Lijstalinea"/>
@@ -4930,23 +6387,10 @@
           <w:ilvl w:val="0"/>
           <w:numId w:val="5"/>
         </w:numPr>
-        <w:rPr>
-          <w:lang w:val="en-US"/>
-        </w:rPr>
-      </w:pPr>
-      <w:r>
-        <w:rPr>
-          <w:lang w:val="en-US"/>
-        </w:rPr>
-        <w:t>Was de Fortunately-Unfortunately methode duidelijk?</w:t>
-      </w:r>
-    </w:p>
-    <w:p>
-      <w:pPr>
-        <w:rPr>
-          <w:lang w:val="en-US"/>
-        </w:rPr>
-      </w:pPr>
+      </w:pPr>
+      <w:r>
+        <w:t>Welke versie zou je in een echte situatie verkiezen en waarom?</w:t>
+      </w:r>
     </w:p>
     <w:sectPr>
       <w:pgSz w:w="11906" w:h="16838"/>
@@ -6265,7 +7709,7 @@
         <w:ind w:left="720" w:hanging="360"/>
       </w:pPr>
     </w:lvl>
-    <w:lvl w:ilvl="1" w:tplc="08130019" w:tentative="1">
+    <w:lvl w:ilvl="1" w:tplc="08130019">
       <w:start w:val="1"/>
       <w:numFmt w:val="lowerLetter"/>
       <w:lvlText w:val="%2."/>
@@ -7218,7 +8662,6 @@
   <w:style w:type="character" w:default="1" w:styleId="Standaardalinea-lettertype">
     <w:name w:val="Default Paragraph Font"/>
     <w:uiPriority w:val="1"/>
-    <w:semiHidden/>
     <w:unhideWhenUsed/>
   </w:style>
   <w:style w:type="table" w:default="1" w:styleId="Standaardtabel">

</xml_diff>

<commit_message>
kleine verandering in userstudy
</commit_message>
<xml_diff>
--- a/userstudy_case.docx
+++ b/userstudy_case.docx
@@ -548,63 +548,6 @@
           <w14:ligatures w14:val="none"/>
         </w:rPr>
         <w:t>Evalueert u de software via een korte vragenlijst.</w:t>
-      </w:r>
-    </w:p>
-    <w:p>
-      <w:pPr>
-        <w:numPr>
-          <w:ilvl w:val="0"/>
-          <w:numId w:val="6"/>
-        </w:numPr>
-        <w:spacing w:before="100" w:beforeAutospacing="1" w:after="100" w:afterAutospacing="1" w:line="240" w:lineRule="auto"/>
-        <w:rPr>
-          <w:rFonts w:eastAsia="Times New Roman" w:cs="Times New Roman"/>
-          <w:kern w:val="0"/>
-          <w:lang w:eastAsia="nl-BE"/>
-          <w14:ligatures w14:val="none"/>
-        </w:rPr>
-      </w:pPr>
-      <w:r>
-        <w:rPr>
-          <w:rFonts w:eastAsia="Times New Roman" w:cs="Times New Roman"/>
-          <w:kern w:val="0"/>
-          <w:lang w:eastAsia="nl-BE"/>
-          <w14:ligatures w14:val="none"/>
-        </w:rPr>
-        <w:t xml:space="preserve">De totale duur bedraagt ongeveer </w:t>
-      </w:r>
-      <w:r>
-        <w:rPr>
-          <w:rFonts w:eastAsia="Times New Roman" w:cs="Times New Roman"/>
-          <w:b/>
-          <w:bCs/>
-          <w:color w:val="FF0000"/>
-          <w:kern w:val="0"/>
-          <w:lang w:eastAsia="nl-BE"/>
-          <w14:ligatures w14:val="none"/>
-        </w:rPr>
-        <w:t>NOG WAT TE TESTEN ADHV TREE GROOTTE</w:t>
-      </w:r>
-      <w:r>
-        <w:rPr>
-          <w:rFonts w:eastAsia="Times New Roman" w:cs="Times New Roman"/>
-          <w:b/>
-          <w:bCs/>
-          <w:color w:val="FF0000"/>
-          <w:kern w:val="0"/>
-          <w:lang w:eastAsia="nl-BE"/>
-          <w14:ligatures w14:val="none"/>
-        </w:rPr>
-        <w:t xml:space="preserve"> (zoals bespreken mik ik op een uurtje)</w:t>
-      </w:r>
-      <w:r>
-        <w:rPr>
-          <w:rFonts w:eastAsia="Times New Roman" w:cs="Times New Roman"/>
-          <w:kern w:val="0"/>
-          <w:lang w:eastAsia="nl-BE"/>
-          <w14:ligatures w14:val="none"/>
-        </w:rPr>
-        <w:t>.</w:t>
       </w:r>
     </w:p>
     <w:p>
@@ -3437,7 +3380,7 @@
                     <pic:cNvPicPr/>
                   </pic:nvPicPr>
                   <pic:blipFill>
-                    <a:blip r:embed="rId5">
+                    <a:blip r:embed="rId6">
                       <a:extLst>
                         <a:ext uri="{28A0092B-C50C-407E-A947-70E740481C1C}">
                           <a14:useLocalDpi xmlns:a14="http://schemas.microsoft.com/office/drawing/2010/main" val="0"/>
@@ -3474,7 +3417,7 @@
           <w:noProof/>
         </w:rPr>
         <w:drawing>
-          <wp:inline distT="0" distB="0" distL="0" distR="0" wp14:anchorId="459308C6" wp14:editId="3DBC840E">
+          <wp:inline distT="0" distB="0" distL="0" distR="0" wp14:anchorId="459308C6" wp14:editId="6FCCB65B">
             <wp:extent cx="5760720" cy="3239135"/>
             <wp:effectExtent l="0" t="0" r="0" b="0"/>
             <wp:docPr id="744949087" name="Afbeelding 1" descr="Afbeelding met tekst, schermopname, Lettertype, nummer&#10;&#10;Door AI gegenereerde inhoud is mogelijk onjuist."/>
@@ -3489,7 +3432,7 @@
                     <pic:cNvPicPr/>
                   </pic:nvPicPr>
                   <pic:blipFill>
-                    <a:blip r:embed="rId6" cstate="print">
+                    <a:blip r:embed="rId7" cstate="print">
                       <a:extLst>
                         <a:ext uri="{28A0092B-C50C-407E-A947-70E740481C1C}">
                           <a14:useLocalDpi xmlns:a14="http://schemas.microsoft.com/office/drawing/2010/main" val="0"/>
@@ -3787,6 +3730,11 @@
     </w:p>
     <w:p>
       <w:pPr>
+        <w:ind w:left="720"/>
+      </w:pPr>
+    </w:p>
+    <w:p>
+      <w:pPr>
         <w:rPr>
           <w:b/>
           <w:bCs/>
@@ -3807,7 +3755,10 @@
         <w:t>/</w:t>
       </w:r>
       <w:r>
-        <w:t>standaardsoftware.</w:t>
+        <w:t>standaardsoftware</w:t>
+      </w:r>
+      <w:r>
+        <w:t xml:space="preserve"> en bekijk de software even. Begin hierna aan het eerste scenario.</w:t>
       </w:r>
       <w:r>
         <w:rPr>
@@ -4606,137 +4557,229 @@
       </w:r>
     </w:p>
     <w:p>
+      <w:r>
+        <w:t xml:space="preserve">Tot slot moeten de verantwoordelijkheden </w:t>
+      </w:r>
+      <w:r>
+        <w:t>verdeeld</w:t>
+      </w:r>
+      <w:r>
+        <w:t xml:space="preserve"> worden binnen het team. </w:t>
+      </w:r>
+      <w:r>
+        <w:t xml:space="preserve">Selecteer twee elementen in de tree die eindigen op een </w:t>
+      </w:r>
+      <w:proofErr w:type="spellStart"/>
+      <w:r>
+        <w:rPr>
+          <w:i/>
+          <w:iCs/>
+        </w:rPr>
+        <w:t>verified</w:t>
+      </w:r>
+      <w:proofErr w:type="spellEnd"/>
+      <w:r>
+        <w:rPr>
+          <w:i/>
+          <w:iCs/>
+        </w:rPr>
+        <w:t xml:space="preserve"> </w:t>
+      </w:r>
+      <w:proofErr w:type="spellStart"/>
+      <w:r>
+        <w:rPr>
+          <w:i/>
+          <w:iCs/>
+        </w:rPr>
+        <w:t>assumption</w:t>
+      </w:r>
+      <w:proofErr w:type="spellEnd"/>
+      <w:r>
+        <w:t xml:space="preserve"> (groene </w:t>
+      </w:r>
+      <w:proofErr w:type="spellStart"/>
+      <w:r>
+        <w:t>eindnode</w:t>
+      </w:r>
+      <w:proofErr w:type="spellEnd"/>
+      <w:r>
+        <w:t>).</w:t>
+      </w:r>
+      <w:r>
+        <w:br/>
+        <w:t xml:space="preserve">Gebruik de volledige </w:t>
+      </w:r>
+      <w:proofErr w:type="spellStart"/>
+      <w:r>
+        <w:t>fortunately</w:t>
+      </w:r>
+      <w:proofErr w:type="spellEnd"/>
+      <w:r>
+        <w:t>/</w:t>
+      </w:r>
+      <w:proofErr w:type="spellStart"/>
+      <w:r>
+        <w:t>unfortunately</w:t>
+      </w:r>
+      <w:proofErr w:type="spellEnd"/>
+      <w:r>
+        <w:t>-keten om samen te vatten welke stappen nodig zijn voor implementatie.</w:t>
+      </w:r>
+    </w:p>
+    <w:p/>
+    <w:p/>
+    <w:p>
+      <w:pPr>
+        <w:rPr>
+          <w:b/>
+          <w:bCs/>
+          <w:sz w:val="40"/>
+          <w:szCs w:val="40"/>
+        </w:rPr>
+      </w:pPr>
+      <w:r>
+        <w:rPr>
+          <w:b/>
+          <w:bCs/>
+          <w:sz w:val="40"/>
+          <w:szCs w:val="40"/>
+        </w:rPr>
+        <w:t>U</w:t>
+      </w:r>
+      <w:r>
+        <w:rPr>
+          <w:b/>
+          <w:bCs/>
+          <w:sz w:val="40"/>
+          <w:szCs w:val="40"/>
+        </w:rPr>
+        <w:t xml:space="preserve">ser </w:t>
+      </w:r>
+      <w:proofErr w:type="spellStart"/>
+      <w:r>
+        <w:rPr>
+          <w:b/>
+          <w:bCs/>
+          <w:sz w:val="40"/>
+          <w:szCs w:val="40"/>
+        </w:rPr>
+        <w:t>experience</w:t>
+      </w:r>
+      <w:proofErr w:type="spellEnd"/>
+      <w:r>
+        <w:rPr>
+          <w:b/>
+          <w:bCs/>
+          <w:sz w:val="40"/>
+          <w:szCs w:val="40"/>
+        </w:rPr>
+        <w:t xml:space="preserve"> </w:t>
+      </w:r>
+      <w:proofErr w:type="spellStart"/>
+      <w:r>
+        <w:rPr>
+          <w:b/>
+          <w:bCs/>
+          <w:sz w:val="40"/>
+          <w:szCs w:val="40"/>
+        </w:rPr>
+        <w:t>questionair</w:t>
+      </w:r>
+      <w:proofErr w:type="spellEnd"/>
+    </w:p>
+    <w:p>
+      <w:pPr>
+        <w:rPr>
+          <w:b/>
+          <w:bCs/>
+        </w:rPr>
+      </w:pPr>
+      <w:r>
+        <w:pict w14:anchorId="2A591EE9">
+          <v:rect id="_x0000_i1029" style="width:0;height:1.5pt" o:hralign="center" o:hrstd="t" o:hr="t" fillcolor="#a0a0a0" stroked="f"/>
+        </w:pict>
+      </w:r>
+    </w:p>
+    <w:p>
       <w:pPr>
         <w:rPr>
           <w:color w:val="FF0000"/>
           <w:sz w:val="40"/>
           <w:szCs w:val="40"/>
-          <w:lang w:val="en-US"/>
-        </w:rPr>
-      </w:pPr>
-      <w:r>
-        <w:t xml:space="preserve">Tot slot moeten de verantwoordelijkheden </w:t>
-      </w:r>
-      <w:r>
-        <w:t>verdeeld</w:t>
-      </w:r>
-      <w:r>
-        <w:t xml:space="preserve"> worden binnen het team. </w:t>
-      </w:r>
-      <w:r>
-        <w:t xml:space="preserve">Selecteer twee elementen in de tree die eindigen op een </w:t>
-      </w:r>
-      <w:proofErr w:type="spellStart"/>
-      <w:r>
-        <w:rPr>
-          <w:i/>
-          <w:iCs/>
-        </w:rPr>
-        <w:t>verified</w:t>
-      </w:r>
-      <w:proofErr w:type="spellEnd"/>
-      <w:r>
-        <w:rPr>
-          <w:i/>
-          <w:iCs/>
-        </w:rPr>
+        </w:rPr>
+      </w:pPr>
+      <w:r>
+        <w:t>Vul na het</w:t>
+      </w:r>
+      <w:r>
+        <w:t xml:space="preserve"> oplossen van de taken de user </w:t>
+      </w:r>
+      <w:proofErr w:type="spellStart"/>
+      <w:r>
+        <w:t>experience</w:t>
+      </w:r>
+      <w:proofErr w:type="spellEnd"/>
+      <w:r>
         <w:t xml:space="preserve"> </w:t>
       </w:r>
       <w:proofErr w:type="spellStart"/>
       <w:r>
-        <w:rPr>
-          <w:i/>
-          <w:iCs/>
-        </w:rPr>
-        <w:t>assumption</w:t>
-      </w:r>
-      <w:proofErr w:type="spellEnd"/>
-      <w:r>
-        <w:t xml:space="preserve"> (groene </w:t>
-      </w:r>
-      <w:proofErr w:type="spellStart"/>
-      <w:r>
-        <w:t>eindnode</w:t>
-      </w:r>
-      <w:proofErr w:type="spellEnd"/>
-      <w:r>
-        <w:t>).</w:t>
-      </w:r>
-      <w:r>
-        <w:br/>
-        <w:t xml:space="preserve">Gebruik de volledige </w:t>
-      </w:r>
-      <w:proofErr w:type="spellStart"/>
-      <w:r>
-        <w:t>fortunately</w:t>
-      </w:r>
-      <w:proofErr w:type="spellEnd"/>
+        <w:t>questionair</w:t>
+      </w:r>
+      <w:proofErr w:type="spellEnd"/>
+      <w:r>
+        <w:t xml:space="preserve"> in. </w:t>
+      </w:r>
+      <w:r>
+        <w:t>Wanneer je hiermee klaar bent,</w:t>
+      </w:r>
+      <w:r>
+        <w:t xml:space="preserve"> mag je de </w:t>
+      </w:r>
+      <w:r>
+        <w:t>uitgebreide</w:t>
+      </w:r>
+      <w:r>
+        <w:t xml:space="preserve"> software</w:t>
+      </w:r>
       <w:r>
         <w:t>/</w:t>
       </w:r>
-      <w:proofErr w:type="spellStart"/>
-      <w:r>
-        <w:t>unfortunately</w:t>
-      </w:r>
-      <w:proofErr w:type="spellEnd"/>
-      <w:r>
-        <w:t>-keten om samen te vatten welke stappen nodig zijn voor implementatie.</w:t>
-      </w:r>
-      <w:r>
-        <w:br/>
-      </w:r>
-      <w:r>
-        <w:br/>
-      </w:r>
-      <w:r>
-        <w:br/>
+      <w:r>
+        <w:t>standaardsoftware</w:t>
+      </w:r>
+      <w:r>
+        <w:t xml:space="preserve"> open</w:t>
+      </w:r>
+      <w:r>
+        <w:t>en</w:t>
+      </w:r>
+      <w:r>
+        <w:t xml:space="preserve"> en</w:t>
+      </w:r>
+      <w:r>
+        <w:t xml:space="preserve"> kort de</w:t>
+      </w:r>
+      <w:r>
+        <w:t xml:space="preserve"> software </w:t>
+      </w:r>
+      <w:r>
+        <w:t>bekijken</w:t>
+      </w:r>
+      <w:r>
+        <w:t xml:space="preserve">. Begin hierna aan het </w:t>
+      </w:r>
+      <w:r>
+        <w:t>tweede</w:t>
+      </w:r>
+      <w:r>
+        <w:t xml:space="preserve"> scenario.</w:t>
       </w:r>
       <w:r>
         <w:rPr>
           <w:color w:val="FF0000"/>
           <w:sz w:val="40"/>
           <w:szCs w:val="40"/>
-          <w:lang w:val="en-US"/>
-        </w:rPr>
-        <w:t xml:space="preserve">→ Hierna </w:t>
-      </w:r>
-      <w:proofErr w:type="spellStart"/>
-      <w:r>
-        <w:rPr>
-          <w:color w:val="FF0000"/>
-          <w:sz w:val="40"/>
-          <w:szCs w:val="40"/>
-          <w:lang w:val="en-US"/>
-        </w:rPr>
-        <w:t>een</w:t>
-      </w:r>
-      <w:proofErr w:type="spellEnd"/>
-      <w:r>
-        <w:rPr>
-          <w:color w:val="FF0000"/>
-          <w:sz w:val="40"/>
-          <w:szCs w:val="40"/>
-          <w:lang w:val="en-US"/>
-        </w:rPr>
-        <w:t xml:space="preserve"> user experience </w:t>
-      </w:r>
-      <w:proofErr w:type="spellStart"/>
-      <w:r>
-        <w:rPr>
-          <w:color w:val="FF0000"/>
-          <w:sz w:val="40"/>
-          <w:szCs w:val="40"/>
-          <w:lang w:val="en-US"/>
-        </w:rPr>
-        <w:t>questionair</w:t>
-      </w:r>
-      <w:proofErr w:type="spellEnd"/>
-      <w:r>
-        <w:rPr>
-          <w:color w:val="FF0000"/>
-          <w:sz w:val="40"/>
-          <w:szCs w:val="40"/>
-          <w:lang w:val="en-US"/>
         </w:rPr>
         <w:br w:type="page"/>
       </w:r>
@@ -5899,57 +5942,63 @@
     <w:p>
       <w:pPr>
         <w:rPr>
-          <w:color w:val="FF0000"/>
+          <w:b/>
+          <w:bCs/>
           <w:sz w:val="40"/>
           <w:szCs w:val="40"/>
         </w:rPr>
       </w:pPr>
-      <w:r>
-        <w:rPr>
-          <w:color w:val="FF0000"/>
+    </w:p>
+    <w:p>
+      <w:pPr>
+        <w:rPr>
+          <w:b/>
+          <w:bCs/>
           <w:sz w:val="40"/>
           <w:szCs w:val="40"/>
         </w:rPr>
-        <w:t xml:space="preserve">→ Hierna een user </w:t>
-      </w:r>
-      <w:proofErr w:type="spellStart"/>
-      <w:r>
-        <w:rPr>
-          <w:color w:val="FF0000"/>
+      </w:pPr>
+    </w:p>
+    <w:p>
+      <w:pPr>
+        <w:rPr>
+          <w:b/>
+          <w:bCs/>
           <w:sz w:val="40"/>
           <w:szCs w:val="40"/>
         </w:rPr>
-        <w:t>experience</w:t>
-      </w:r>
-      <w:proofErr w:type="spellEnd"/>
-      <w:r>
-        <w:rPr>
-          <w:color w:val="FF0000"/>
+      </w:pPr>
+      <w:r>
+        <w:rPr>
+          <w:b/>
+          <w:bCs/>
           <w:sz w:val="40"/>
           <w:szCs w:val="40"/>
         </w:rPr>
-        <w:t xml:space="preserve"> </w:t>
-      </w:r>
-      <w:proofErr w:type="spellStart"/>
-      <w:r>
-        <w:rPr>
-          <w:color w:val="FF0000"/>
+        <w:lastRenderedPageBreak/>
+        <w:t xml:space="preserve">User </w:t>
+      </w:r>
+      <w:proofErr w:type="spellStart"/>
+      <w:r>
+        <w:rPr>
+          <w:b/>
+          <w:bCs/>
           <w:sz w:val="40"/>
           <w:szCs w:val="40"/>
         </w:rPr>
-        <w:t>questionair</w:t>
-      </w:r>
-      <w:proofErr w:type="spellEnd"/>
-    </w:p>
-    <w:p>
-      <w:pPr>
+        <w:t>experience</w:t>
+      </w:r>
+      <w:proofErr w:type="spellEnd"/>
+      <w:r>
         <w:rPr>
           <w:b/>
           <w:bCs/>
           <w:sz w:val="40"/>
           <w:szCs w:val="40"/>
         </w:rPr>
-      </w:pPr>
+        <w:t xml:space="preserve"> </w:t>
+      </w:r>
+      <w:proofErr w:type="spellStart"/>
       <w:r>
         <w:rPr>
           <w:b/>
@@ -5957,9 +6006,57 @@
           <w:sz w:val="40"/>
           <w:szCs w:val="40"/>
         </w:rPr>
-        <w:br w:type="page"/>
-      </w:r>
-    </w:p>
+        <w:t>questionair</w:t>
+      </w:r>
+      <w:proofErr w:type="spellEnd"/>
+    </w:p>
+    <w:p>
+      <w:pPr>
+        <w:rPr>
+          <w:b/>
+          <w:bCs/>
+        </w:rPr>
+      </w:pPr>
+      <w:r>
+        <w:pict w14:anchorId="1EB823B3">
+          <v:rect id="_x0000_i1034" style="width:0;height:1.5pt" o:hralign="center" o:hrstd="t" o:hr="t" fillcolor="#a0a0a0" stroked="f"/>
+        </w:pict>
+      </w:r>
+    </w:p>
+    <w:p>
+      <w:r>
+        <w:t>Vul na het</w:t>
+      </w:r>
+      <w:r>
+        <w:t xml:space="preserve"> oplossen van de taken de user </w:t>
+      </w:r>
+      <w:proofErr w:type="spellStart"/>
+      <w:r>
+        <w:t>experience</w:t>
+      </w:r>
+      <w:proofErr w:type="spellEnd"/>
+      <w:r>
+        <w:t xml:space="preserve"> </w:t>
+      </w:r>
+      <w:proofErr w:type="spellStart"/>
+      <w:r>
+        <w:t>questionair</w:t>
+      </w:r>
+      <w:proofErr w:type="spellEnd"/>
+      <w:r>
+        <w:t xml:space="preserve"> in</w:t>
+      </w:r>
+      <w:r>
+        <w:t xml:space="preserve">. </w:t>
+      </w:r>
+      <w:r>
+        <w:t>Wanneer je hiermee klaar bent,</w:t>
+      </w:r>
+      <w:r>
+        <w:t xml:space="preserve"> mag je de open vragen beantwoorden.</w:t>
+      </w:r>
+    </w:p>
+    <w:p/>
     <w:p>
       <w:pPr>
         <w:rPr>
@@ -5976,7 +6073,6 @@
           <w:sz w:val="40"/>
           <w:szCs w:val="40"/>
         </w:rPr>
-        <w:lastRenderedPageBreak/>
         <w:t>Open vragen</w:t>
       </w:r>
     </w:p>
@@ -6078,185 +6174,9 @@
     <w:p>
       <w:pPr>
         <w:pStyle w:val="Lijstalinea"/>
-        <w:numPr>
-          <w:ilvl w:val="0"/>
-          <w:numId w:val="5"/>
-        </w:numPr>
-      </w:pPr>
-      <w:r>
-        <w:t>Rankschik de features van meest nuttig (1) naar minst nuttig (</w:t>
-      </w:r>
-      <w:r>
-        <w:t>8</w:t>
-      </w:r>
-      <w:r>
-        <w:t>)</w:t>
-      </w:r>
-      <w:r>
-        <w:t>?</w:t>
-      </w:r>
-      <w:r>
-        <w:t xml:space="preserve"> Als je een feature niet opgemerkt hebt, mag je deze een score van -1 geven.</w:t>
-      </w:r>
-    </w:p>
-    <w:p>
-      <w:pPr>
-        <w:spacing w:line="240" w:lineRule="auto"/>
-        <w:ind w:firstLine="708"/>
-      </w:pPr>
-      <w:r>
-        <w:t>[    ]</w:t>
-      </w:r>
-      <w:r>
-        <w:tab/>
-      </w:r>
-      <w:r>
-        <w:t>Classificering</w:t>
-      </w:r>
-      <w:r>
-        <w:t xml:space="preserve"> </w:t>
-      </w:r>
-      <w:r>
-        <w:t>door</w:t>
-      </w:r>
-      <w:r>
-        <w:t xml:space="preserve"> het schild icoon</w:t>
-      </w:r>
-    </w:p>
-    <w:p>
-      <w:pPr>
-        <w:spacing w:line="240" w:lineRule="auto"/>
-        <w:ind w:left="708"/>
-      </w:pPr>
-      <w:r>
-        <w:t>[    ]</w:t>
-      </w:r>
-      <w:r>
-        <w:tab/>
-      </w:r>
-      <w:r>
-        <w:t xml:space="preserve">Weergave van soort node </w:t>
-      </w:r>
-      <w:r>
-        <w:t>door de</w:t>
-      </w:r>
-      <w:r>
-        <w:t xml:space="preserve"> kleur</w:t>
-      </w:r>
-    </w:p>
-    <w:p>
-      <w:pPr>
-        <w:spacing w:line="240" w:lineRule="auto"/>
-        <w:ind w:firstLine="708"/>
-      </w:pPr>
-      <w:r>
-        <w:t>[    ]</w:t>
-      </w:r>
-      <w:r>
-        <w:tab/>
-      </w:r>
-      <w:r>
-        <w:t>Filtering op basis van de status van de node</w:t>
-      </w:r>
-    </w:p>
-    <w:p>
-      <w:pPr>
-        <w:spacing w:line="240" w:lineRule="auto"/>
-        <w:ind w:firstLine="708"/>
-      </w:pPr>
-      <w:r>
-        <w:t>[    ]</w:t>
-      </w:r>
-      <w:r>
-        <w:tab/>
-        <w:t xml:space="preserve">Notitie van altijd </w:t>
-      </w:r>
-      <w:proofErr w:type="spellStart"/>
-      <w:r>
-        <w:t>nodes</w:t>
-      </w:r>
-      <w:proofErr w:type="spellEnd"/>
-      <w:r>
-        <w:t xml:space="preserve"> per bepaalde status</w:t>
-      </w:r>
-    </w:p>
-    <w:p>
-      <w:pPr>
-        <w:spacing w:line="240" w:lineRule="auto"/>
-        <w:ind w:firstLine="708"/>
-      </w:pPr>
-      <w:r>
-        <w:t>[    ]</w:t>
-      </w:r>
-      <w:r>
-        <w:tab/>
-      </w:r>
-      <w:r>
-        <w:t xml:space="preserve">Rangschikking op basis van </w:t>
-      </w:r>
-      <w:proofErr w:type="spellStart"/>
-      <w:r>
-        <w:t>dangerrating</w:t>
-      </w:r>
-      <w:proofErr w:type="spellEnd"/>
-      <w:r>
-        <w:t xml:space="preserve"> binnen de filtering</w:t>
-      </w:r>
-    </w:p>
-    <w:p>
-      <w:pPr>
-        <w:spacing w:line="240" w:lineRule="auto"/>
-        <w:ind w:firstLine="708"/>
-      </w:pPr>
-      <w:r>
-        <w:t>[    ]</w:t>
-      </w:r>
-      <w:r>
-        <w:tab/>
-      </w:r>
-      <w:r>
-        <w:t>Klikken van node in filtering balk highlight node</w:t>
-      </w:r>
-    </w:p>
-    <w:p>
-      <w:pPr>
-        <w:spacing w:line="240" w:lineRule="auto"/>
-        <w:ind w:firstLine="708"/>
-      </w:pPr>
-      <w:r>
-        <w:t>[    ]</w:t>
-      </w:r>
-      <w:r>
-        <w:tab/>
-      </w:r>
-      <w:r>
-        <w:t>Samenvatting van root tot aan geduide node</w:t>
-      </w:r>
-    </w:p>
-    <w:p>
-      <w:pPr>
-        <w:spacing w:line="240" w:lineRule="auto"/>
-        <w:ind w:firstLine="708"/>
-      </w:pPr>
-      <w:r>
-        <w:t>[    ]</w:t>
-      </w:r>
-      <w:r>
-        <w:tab/>
-      </w:r>
-      <w:r>
-        <w:t xml:space="preserve">Tooltips bij </w:t>
-      </w:r>
-      <w:proofErr w:type="spellStart"/>
-      <w:r>
-        <w:t>hoveren</w:t>
-      </w:r>
-      <w:proofErr w:type="spellEnd"/>
-    </w:p>
-    <w:p>
-      <w:pPr>
-        <w:spacing w:line="240" w:lineRule="auto"/>
-        <w:ind w:firstLine="708"/>
+        <w:rPr>
+          <w:lang w:val="en-US"/>
+        </w:rPr>
       </w:pPr>
     </w:p>
     <w:p>
@@ -6268,51 +6188,179 @@
         </w:numPr>
       </w:pPr>
       <w:r>
-        <w:t xml:space="preserve">Welke onderdelen van de </w:t>
-      </w:r>
-      <w:r>
-        <w:t>uitgebreide</w:t>
-      </w:r>
-      <w:r>
-        <w:t xml:space="preserve"> tree</w:t>
-      </w:r>
-      <w:r>
-        <w:t xml:space="preserve"> software zouden volgens jou verbeterd kunnen worden?</w:t>
-      </w:r>
-    </w:p>
-    <w:p>
-      <w:pPr>
-        <w:pStyle w:val="Lijstalinea"/>
-      </w:pPr>
-    </w:p>
-    <w:p>
-      <w:pPr>
-        <w:pStyle w:val="Lijstalinea"/>
-      </w:pPr>
-    </w:p>
-    <w:p>
-      <w:pPr>
-        <w:pStyle w:val="Lijstalinea"/>
-      </w:pPr>
-    </w:p>
-    <w:p>
-      <w:pPr>
-        <w:pStyle w:val="Lijstalinea"/>
-      </w:pPr>
-    </w:p>
-    <w:p>
-      <w:pPr>
-        <w:pStyle w:val="Lijstalinea"/>
-      </w:pPr>
-    </w:p>
-    <w:p>
-      <w:pPr>
-        <w:pStyle w:val="Lijstalinea"/>
-      </w:pPr>
-    </w:p>
-    <w:p>
-      <w:pPr>
-        <w:pStyle w:val="Lijstalinea"/>
+        <w:t>Rankschik de features van meest nuttig (1) naar minst nuttig (</w:t>
+      </w:r>
+      <w:r>
+        <w:t>8</w:t>
+      </w:r>
+      <w:r>
+        <w:t>)</w:t>
+      </w:r>
+      <w:r>
+        <w:t>?</w:t>
+      </w:r>
+      <w:r>
+        <w:t xml:space="preserve"> Als je een feature niet opgemerkt hebt, mag je deze een score van -1 geven.</w:t>
+      </w:r>
+    </w:p>
+    <w:p>
+      <w:pPr>
+        <w:spacing w:line="240" w:lineRule="auto"/>
+        <w:ind w:firstLine="708"/>
+      </w:pPr>
+      <w:r>
+        <w:t>[    ]</w:t>
+      </w:r>
+      <w:r>
+        <w:tab/>
+      </w:r>
+      <w:r>
+        <w:t>Classificering</w:t>
+      </w:r>
+      <w:r>
+        <w:t xml:space="preserve"> </w:t>
+      </w:r>
+      <w:r>
+        <w:t>door</w:t>
+      </w:r>
+      <w:r>
+        <w:t xml:space="preserve"> het schild icoon</w:t>
+      </w:r>
+    </w:p>
+    <w:p>
+      <w:pPr>
+        <w:spacing w:line="240" w:lineRule="auto"/>
+        <w:ind w:left="708"/>
+      </w:pPr>
+      <w:r>
+        <w:t>[    ]</w:t>
+      </w:r>
+      <w:r>
+        <w:tab/>
+      </w:r>
+      <w:r>
+        <w:t xml:space="preserve">Weergave van soort node </w:t>
+      </w:r>
+      <w:r>
+        <w:t>door de</w:t>
+      </w:r>
+      <w:r>
+        <w:t xml:space="preserve"> kleur</w:t>
+      </w:r>
+    </w:p>
+    <w:p>
+      <w:pPr>
+        <w:spacing w:line="240" w:lineRule="auto"/>
+        <w:ind w:firstLine="708"/>
+      </w:pPr>
+      <w:r>
+        <w:t>[    ]</w:t>
+      </w:r>
+      <w:r>
+        <w:tab/>
+      </w:r>
+      <w:r>
+        <w:t>Filtering op basis van de status van de node</w:t>
+      </w:r>
+    </w:p>
+    <w:p>
+      <w:pPr>
+        <w:spacing w:line="240" w:lineRule="auto"/>
+        <w:ind w:firstLine="708"/>
+      </w:pPr>
+      <w:r>
+        <w:t>[    ]</w:t>
+      </w:r>
+      <w:r>
+        <w:tab/>
+        <w:t xml:space="preserve">Notitie van altijd </w:t>
+      </w:r>
+      <w:proofErr w:type="spellStart"/>
+      <w:r>
+        <w:t>nodes</w:t>
+      </w:r>
+      <w:proofErr w:type="spellEnd"/>
+      <w:r>
+        <w:t xml:space="preserve"> per bepaalde status</w:t>
+      </w:r>
+    </w:p>
+    <w:p>
+      <w:pPr>
+        <w:spacing w:line="240" w:lineRule="auto"/>
+        <w:ind w:firstLine="708"/>
+      </w:pPr>
+      <w:r>
+        <w:t>[    ]</w:t>
+      </w:r>
+      <w:r>
+        <w:tab/>
+      </w:r>
+      <w:r>
+        <w:t xml:space="preserve">Rangschikking op basis van </w:t>
+      </w:r>
+      <w:proofErr w:type="spellStart"/>
+      <w:r>
+        <w:t>dangerrating</w:t>
+      </w:r>
+      <w:proofErr w:type="spellEnd"/>
+      <w:r>
+        <w:t xml:space="preserve"> binnen de filtering</w:t>
+      </w:r>
+    </w:p>
+    <w:p>
+      <w:pPr>
+        <w:spacing w:line="240" w:lineRule="auto"/>
+        <w:ind w:firstLine="708"/>
+      </w:pPr>
+      <w:r>
+        <w:t>[    ]</w:t>
+      </w:r>
+      <w:r>
+        <w:tab/>
+      </w:r>
+      <w:r>
+        <w:t>Klikken van node in filtering balk highlight node</w:t>
+      </w:r>
+    </w:p>
+    <w:p>
+      <w:pPr>
+        <w:spacing w:line="240" w:lineRule="auto"/>
+        <w:ind w:firstLine="708"/>
+      </w:pPr>
+      <w:r>
+        <w:t>[    ]</w:t>
+      </w:r>
+      <w:r>
+        <w:tab/>
+      </w:r>
+      <w:r>
+        <w:t>Samenvatting van root tot aan geduide node</w:t>
+      </w:r>
+    </w:p>
+    <w:p>
+      <w:pPr>
+        <w:spacing w:line="240" w:lineRule="auto"/>
+        <w:ind w:firstLine="708"/>
+      </w:pPr>
+      <w:r>
+        <w:t>[    ]</w:t>
+      </w:r>
+      <w:r>
+        <w:tab/>
+      </w:r>
+      <w:r>
+        <w:t xml:space="preserve">Tooltips bij </w:t>
+      </w:r>
+      <w:proofErr w:type="spellStart"/>
+      <w:r>
+        <w:t>hoveren</w:t>
+      </w:r>
+      <w:proofErr w:type="spellEnd"/>
+    </w:p>
+    <w:p>
+      <w:pPr>
+        <w:spacing w:line="240" w:lineRule="auto"/>
+        <w:ind w:firstLine="708"/>
       </w:pPr>
     </w:p>
     <w:p>
@@ -6324,15 +6372,16 @@
         </w:numPr>
       </w:pPr>
       <w:r>
-        <w:t xml:space="preserve">Heb je suggesties om features op een andere manier aan te pakken of een feature die nog nuttig kan zijn om de user </w:t>
-      </w:r>
-      <w:proofErr w:type="spellStart"/>
-      <w:r>
-        <w:t>experience</w:t>
-      </w:r>
-      <w:proofErr w:type="spellEnd"/>
-      <w:r>
-        <w:t xml:space="preserve"> te verbeteren?</w:t>
+        <w:t xml:space="preserve">Welke onderdelen van de </w:t>
+      </w:r>
+      <w:r>
+        <w:t>uitgebreide</w:t>
+      </w:r>
+      <w:r>
+        <w:t xml:space="preserve"> tree</w:t>
+      </w:r>
+      <w:r>
+        <w:t xml:space="preserve"> software zouden volgens jou verbeterd kunnen worden?</w:t>
       </w:r>
     </w:p>
     <w:p>
@@ -6350,7 +6399,11 @@
         <w:pStyle w:val="Lijstalinea"/>
       </w:pPr>
     </w:p>
-    <w:p/>
+    <w:p>
+      <w:pPr>
+        <w:pStyle w:val="Lijstalinea"/>
+      </w:pPr>
+    </w:p>
     <w:p>
       <w:pPr>
         <w:pStyle w:val="Lijstalinea"/>
@@ -6361,6 +6414,62 @@
       </w:pPr>
       <w:r>
         <w:lastRenderedPageBreak/>
+        <w:t xml:space="preserve">Heb je suggesties om features op een andere manier aan te pakken of een feature die nog nuttig kan zijn om de user </w:t>
+      </w:r>
+      <w:proofErr w:type="spellStart"/>
+      <w:r>
+        <w:t>experience</w:t>
+      </w:r>
+      <w:proofErr w:type="spellEnd"/>
+      <w:r>
+        <w:t xml:space="preserve"> te verbeteren?</w:t>
+      </w:r>
+    </w:p>
+    <w:p>
+      <w:pPr>
+        <w:pStyle w:val="Lijstalinea"/>
+      </w:pPr>
+    </w:p>
+    <w:p>
+      <w:pPr>
+        <w:pStyle w:val="Lijstalinea"/>
+      </w:pPr>
+    </w:p>
+    <w:p>
+      <w:pPr>
+        <w:pStyle w:val="Lijstalinea"/>
+      </w:pPr>
+    </w:p>
+    <w:p>
+      <w:pPr>
+        <w:pStyle w:val="Lijstalinea"/>
+      </w:pPr>
+    </w:p>
+    <w:p>
+      <w:pPr>
+        <w:pStyle w:val="Lijstalinea"/>
+      </w:pPr>
+    </w:p>
+    <w:p>
+      <w:pPr>
+        <w:pStyle w:val="Lijstalinea"/>
+      </w:pPr>
+    </w:p>
+    <w:p>
+      <w:pPr>
+        <w:pStyle w:val="Lijstalinea"/>
+      </w:pPr>
+    </w:p>
+    <w:p/>
+    <w:p>
+      <w:pPr>
+        <w:pStyle w:val="Lijstalinea"/>
+        <w:numPr>
+          <w:ilvl w:val="0"/>
+          <w:numId w:val="5"/>
+        </w:numPr>
+      </w:pPr>
+      <w:r>
         <w:t xml:space="preserve">In welke </w:t>
       </w:r>
       <w:r>
@@ -6376,6 +6485,8 @@
         <w:t>? Waarom?</w:t>
       </w:r>
     </w:p>
+    <w:p/>
+    <w:p/>
     <w:p/>
     <w:p/>
     <w:p/>
@@ -9291,4 +9402,16 @@
     </a:ext>
   </a:extLst>
 </a:theme>
+</file>
+
+<file path=customXml/item1.xml><?xml version="1.0" encoding="utf-8"?>
+<b:Sources xmlns:b="http://schemas.openxmlformats.org/officeDocument/2006/bibliography" xmlns="http://schemas.openxmlformats.org/officeDocument/2006/bibliography" SelectedStyle="\APASixthEditionOfficeOnline.xsl" StyleName="APA" Version="6"/>
+</file>
+
+<file path=customXml/itemProps1.xml><?xml version="1.0" encoding="utf-8"?>
+<ds:datastoreItem xmlns:ds="http://schemas.openxmlformats.org/officeDocument/2006/customXml" ds:itemID="{A21EE8AA-C673-47A6-8755-E99BFE0B230F}">
+  <ds:schemaRefs>
+    <ds:schemaRef ds:uri="http://schemas.openxmlformats.org/officeDocument/2006/bibliography"/>
+  </ds:schemaRefs>
+</ds:datastoreItem>
 </file>
</xml_diff>

<commit_message>
aanpassing aan beschrijving van sommige vragen
</commit_message>
<xml_diff>
--- a/userstudy_case.docx
+++ b/userstudy_case.docx
@@ -18,7 +18,6 @@
           <w14:ligatures w14:val="none"/>
         </w:rPr>
       </w:pPr>
-      <w:proofErr w:type="spellStart"/>
       <w:r>
         <w:rPr>
           <w:rFonts w:eastAsia="Times New Roman" w:cs="Times New Roman"/>
@@ -30,9 +29,8 @@
           <w:lang w:eastAsia="nl-BE"/>
           <w14:ligatures w14:val="none"/>
         </w:rPr>
-        <w:t>Informed</w:t>
-      </w:r>
-      <w:proofErr w:type="spellEnd"/>
+        <w:t>Informed Consent – User Study</w:t>
+      </w:r>
       <w:r>
         <w:rPr>
           <w:rFonts w:eastAsia="Times New Roman" w:cs="Times New Roman"/>
@@ -44,9 +42,8 @@
           <w:lang w:eastAsia="nl-BE"/>
           <w14:ligatures w14:val="none"/>
         </w:rPr>
-        <w:t xml:space="preserve"> Consent – User </w:t>
-      </w:r>
-      <w:proofErr w:type="spellStart"/>
+        <w:t xml:space="preserve"> </w:t>
+      </w:r>
       <w:r>
         <w:rPr>
           <w:rFonts w:eastAsia="Times New Roman" w:cs="Times New Roman"/>
@@ -58,34 +55,35 @@
           <w:lang w:eastAsia="nl-BE"/>
           <w14:ligatures w14:val="none"/>
         </w:rPr>
-        <w:t>Study</w:t>
-      </w:r>
-      <w:proofErr w:type="spellEnd"/>
-      <w:r>
-        <w:rPr>
-          <w:rFonts w:eastAsia="Times New Roman" w:cs="Times New Roman"/>
-          <w:b/>
-          <w:bCs/>
+        <w:t>“</w:t>
+      </w:r>
+      <w:r>
+        <w:rPr>
+          <w:rFonts w:eastAsia="Times New Roman" w:cs="Times New Roman"/>
+          <w:b/>
+          <w:bCs/>
+          <w:i/>
           <w:kern w:val="36"/>
           <w:sz w:val="40"/>
           <w:szCs w:val="40"/>
           <w:lang w:eastAsia="nl-BE"/>
           <w14:ligatures w14:val="none"/>
         </w:rPr>
-        <w:t xml:space="preserve"> </w:t>
-      </w:r>
-      <w:r>
-        <w:rPr>
-          <w:rFonts w:eastAsia="Times New Roman" w:cs="Times New Roman"/>
-          <w:b/>
-          <w:bCs/>
+        <w:t xml:space="preserve">Ontwikkeling van een gebruiksvriendelijke </w:t>
+      </w:r>
+      <w:r>
+        <w:rPr>
+          <w:rFonts w:eastAsia="Times New Roman" w:cs="Times New Roman"/>
+          <w:b/>
+          <w:bCs/>
+          <w:i/>
           <w:kern w:val="36"/>
           <w:sz w:val="40"/>
           <w:szCs w:val="40"/>
           <w:lang w:eastAsia="nl-BE"/>
           <w14:ligatures w14:val="none"/>
         </w:rPr>
-        <w:t>“</w:t>
+        <w:t xml:space="preserve">security </w:t>
       </w:r>
       <w:r>
         <w:rPr>
@@ -99,7 +97,7 @@
           <w:lang w:eastAsia="nl-BE"/>
           <w14:ligatures w14:val="none"/>
         </w:rPr>
-        <w:t xml:space="preserve">Ontwikkeling van een gebruiksvriendelijke </w:t>
+        <w:t xml:space="preserve">modellering applicatie </w:t>
       </w:r>
       <w:r>
         <w:rPr>
@@ -113,107 +111,19 @@
           <w:lang w:eastAsia="nl-BE"/>
           <w14:ligatures w14:val="none"/>
         </w:rPr>
-        <w:t xml:space="preserve">security </w:t>
-      </w:r>
-      <w:r>
-        <w:rPr>
-          <w:rFonts w:eastAsia="Times New Roman" w:cs="Times New Roman"/>
-          <w:b/>
-          <w:bCs/>
-          <w:i/>
+        <w:t>gebaseerd op fortunately/unfortunately methode</w:t>
+      </w:r>
+      <w:r>
+        <w:rPr>
+          <w:rFonts w:eastAsia="Times New Roman" w:cs="Times New Roman"/>
+          <w:b/>
+          <w:bCs/>
           <w:kern w:val="36"/>
           <w:sz w:val="40"/>
           <w:szCs w:val="40"/>
           <w:lang w:eastAsia="nl-BE"/>
           <w14:ligatures w14:val="none"/>
         </w:rPr>
-        <w:t xml:space="preserve">modellering applicatie </w:t>
-      </w:r>
-      <w:r>
-        <w:rPr>
-          <w:rFonts w:eastAsia="Times New Roman" w:cs="Times New Roman"/>
-          <w:b/>
-          <w:bCs/>
-          <w:i/>
-          <w:kern w:val="36"/>
-          <w:sz w:val="40"/>
-          <w:szCs w:val="40"/>
-          <w:lang w:eastAsia="nl-BE"/>
-          <w14:ligatures w14:val="none"/>
-        </w:rPr>
-        <w:t xml:space="preserve">gebaseerd op </w:t>
-      </w:r>
-      <w:proofErr w:type="spellStart"/>
-      <w:r>
-        <w:rPr>
-          <w:rFonts w:eastAsia="Times New Roman" w:cs="Times New Roman"/>
-          <w:b/>
-          <w:bCs/>
-          <w:i/>
-          <w:kern w:val="36"/>
-          <w:sz w:val="40"/>
-          <w:szCs w:val="40"/>
-          <w:lang w:eastAsia="nl-BE"/>
-          <w14:ligatures w14:val="none"/>
-        </w:rPr>
-        <w:t>fortunately</w:t>
-      </w:r>
-      <w:proofErr w:type="spellEnd"/>
-      <w:r>
-        <w:rPr>
-          <w:rFonts w:eastAsia="Times New Roman" w:cs="Times New Roman"/>
-          <w:b/>
-          <w:bCs/>
-          <w:i/>
-          <w:kern w:val="36"/>
-          <w:sz w:val="40"/>
-          <w:szCs w:val="40"/>
-          <w:lang w:eastAsia="nl-BE"/>
-          <w14:ligatures w14:val="none"/>
-        </w:rPr>
-        <w:t>/</w:t>
-      </w:r>
-      <w:proofErr w:type="spellStart"/>
-      <w:r>
-        <w:rPr>
-          <w:rFonts w:eastAsia="Times New Roman" w:cs="Times New Roman"/>
-          <w:b/>
-          <w:bCs/>
-          <w:i/>
-          <w:kern w:val="36"/>
-          <w:sz w:val="40"/>
-          <w:szCs w:val="40"/>
-          <w:lang w:eastAsia="nl-BE"/>
-          <w14:ligatures w14:val="none"/>
-        </w:rPr>
-        <w:t>unfortunately</w:t>
-      </w:r>
-      <w:proofErr w:type="spellEnd"/>
-      <w:r>
-        <w:rPr>
-          <w:rFonts w:eastAsia="Times New Roman" w:cs="Times New Roman"/>
-          <w:b/>
-          <w:bCs/>
-          <w:i/>
-          <w:kern w:val="36"/>
-          <w:sz w:val="40"/>
-          <w:szCs w:val="40"/>
-          <w:lang w:eastAsia="nl-BE"/>
-          <w14:ligatures w14:val="none"/>
-        </w:rPr>
-        <w:t xml:space="preserve"> methode</w:t>
-      </w:r>
-      <w:r>
-        <w:rPr>
-          <w:rFonts w:eastAsia="Times New Roman" w:cs="Times New Roman"/>
-          <w:b/>
-          <w:bCs/>
-          <w:kern w:val="36"/>
-          <w:sz w:val="40"/>
-          <w:szCs w:val="40"/>
-          <w:lang w:eastAsia="nl-BE"/>
-          <w14:ligatures w14:val="none"/>
-        </w:rPr>
         <w:t>”</w:t>
       </w:r>
     </w:p>
@@ -401,47 +311,7 @@
           <w:lang w:eastAsia="nl-BE"/>
           <w14:ligatures w14:val="none"/>
         </w:rPr>
-        <w:t>U wordt uitgenodigd om deel te nemen aan een studie die onderzoekt hoe softwaregebruikers security- en AI-risicoscenario’s analyseren met behulp van een “</w:t>
-      </w:r>
-      <w:proofErr w:type="spellStart"/>
-      <w:r>
-        <w:rPr>
-          <w:rFonts w:eastAsia="Times New Roman" w:cs="Times New Roman"/>
-          <w:kern w:val="0"/>
-          <w:lang w:eastAsia="nl-BE"/>
-          <w14:ligatures w14:val="none"/>
-        </w:rPr>
-        <w:t>Fortunately</w:t>
-      </w:r>
-      <w:proofErr w:type="spellEnd"/>
-      <w:r>
-        <w:rPr>
-          <w:rFonts w:eastAsia="Times New Roman" w:cs="Times New Roman"/>
-          <w:kern w:val="0"/>
-          <w:lang w:eastAsia="nl-BE"/>
-          <w14:ligatures w14:val="none"/>
-        </w:rPr>
-        <w:t>–</w:t>
-      </w:r>
-      <w:proofErr w:type="spellStart"/>
-      <w:r>
-        <w:rPr>
-          <w:rFonts w:eastAsia="Times New Roman" w:cs="Times New Roman"/>
-          <w:kern w:val="0"/>
-          <w:lang w:eastAsia="nl-BE"/>
-          <w14:ligatures w14:val="none"/>
-        </w:rPr>
-        <w:t>Unfortunately</w:t>
-      </w:r>
-      <w:proofErr w:type="spellEnd"/>
-      <w:r>
-        <w:rPr>
-          <w:rFonts w:eastAsia="Times New Roman" w:cs="Times New Roman"/>
-          <w:kern w:val="0"/>
-          <w:lang w:eastAsia="nl-BE"/>
-          <w14:ligatures w14:val="none"/>
-        </w:rPr>
-        <w:t>”-model. Uw deelname helpt ons om de bruikbaarheid, helderheid en efficiëntie van de software te evalueren en te verbeteren.</w:t>
+        <w:t>U wordt uitgenodigd om deel te nemen aan een studie die onderzoekt hoe softwaregebruikers security- en AI-risicoscenario’s analyseren met behulp van een “Fortunately–Unfortunately”-model. Uw deelname helpt ons om de bruikbaarheid, helderheid en efficiëntie van de software te evalueren en te verbeteren.</w:t>
       </w:r>
     </w:p>
     <w:p>
@@ -1918,7 +1788,6 @@
         </w:rPr>
         <w:t xml:space="preserve">Alle verzamelde gegevens zullen </w:t>
       </w:r>
-      <w:proofErr w:type="spellStart"/>
       <w:r>
         <w:rPr>
           <w:rFonts w:eastAsia="Times New Roman" w:cs="Times New Roman"/>
@@ -1930,7 +1799,6 @@
         </w:rPr>
         <w:t>gepseudonimiseerd</w:t>
       </w:r>
-      <w:proofErr w:type="spellEnd"/>
       <w:r>
         <w:rPr>
           <w:rFonts w:eastAsia="Times New Roman" w:cs="Times New Roman"/>
@@ -2400,27 +2268,7 @@
           <w:lang w:eastAsia="nl-BE"/>
           <w14:ligatures w14:val="none"/>
         </w:rPr>
-        <w:t xml:space="preserve">De data zal niet </w:t>
-      </w:r>
-      <w:proofErr w:type="spellStart"/>
-      <w:r>
-        <w:rPr>
-          <w:rFonts w:eastAsia="Times New Roman" w:cs="Times New Roman"/>
-          <w:kern w:val="0"/>
-          <w:lang w:eastAsia="nl-BE"/>
-          <w14:ligatures w14:val="none"/>
-        </w:rPr>
-        <w:t>gelinked</w:t>
-      </w:r>
-      <w:proofErr w:type="spellEnd"/>
-      <w:r>
-        <w:rPr>
-          <w:rFonts w:eastAsia="Times New Roman" w:cs="Times New Roman"/>
-          <w:kern w:val="0"/>
-          <w:lang w:eastAsia="nl-BE"/>
-          <w14:ligatures w14:val="none"/>
-        </w:rPr>
-        <w:t xml:space="preserve"> worden aan uw naam maar aan een ID zodat u later kan vragen deze data te verwijderen</w:t>
+        <w:t>De data zal niet gelinked worden aan uw naam maar aan een ID zodat u later kan vragen deze data te verwijderen</w:t>
       </w:r>
       <w:r>
         <w:rPr>
@@ -2698,30 +2546,7 @@
           <w14:ligatures w14:val="none"/>
         </w:rPr>
         <w:tab/>
-      </w:r>
-      <w:proofErr w:type="spellStart"/>
-      <w:r>
-        <w:rPr>
-          <w:rFonts w:eastAsia="Times New Roman" w:cs="Times New Roman"/>
-          <w:b/>
-          <w:bCs/>
-          <w:kern w:val="0"/>
-          <w:lang w:val="en-US" w:eastAsia="nl-BE"/>
-          <w14:ligatures w14:val="none"/>
-        </w:rPr>
-        <w:t>Handtekening</w:t>
-      </w:r>
-      <w:proofErr w:type="spellEnd"/>
-      <w:r>
-        <w:rPr>
-          <w:rFonts w:eastAsia="Times New Roman" w:cs="Times New Roman"/>
-          <w:b/>
-          <w:bCs/>
-          <w:kern w:val="0"/>
-          <w:lang w:val="en-US" w:eastAsia="nl-BE"/>
-          <w14:ligatures w14:val="none"/>
-        </w:rPr>
-        <w:t>:</w:t>
+        <w:t>Handtekening:</w:t>
       </w:r>
     </w:p>
     <w:p>
@@ -2766,7 +2591,6 @@
           <w:lang w:val="en-US"/>
         </w:rPr>
       </w:pPr>
-      <w:proofErr w:type="spellStart"/>
       <w:r>
         <w:rPr>
           <w:b/>
@@ -2776,53 +2600,30 @@
           <w:lang w:val="en-US"/>
         </w:rPr>
         <w:lastRenderedPageBreak/>
-        <w:t>Uitleg</w:t>
-      </w:r>
-      <w:proofErr w:type="spellEnd"/>
-      <w:r>
-        <w:rPr>
-          <w:b/>
-          <w:bCs/>
+        <w:t xml:space="preserve">Uitleg </w:t>
+      </w:r>
+      <w:r>
+        <w:rPr>
+          <w:b/>
+          <w:bCs/>
+          <w:i/>
+          <w:iCs/>
           <w:sz w:val="40"/>
           <w:szCs w:val="40"/>
           <w:lang w:val="en-US"/>
         </w:rPr>
-        <w:t xml:space="preserve"> </w:t>
-      </w:r>
-      <w:r>
-        <w:rPr>
-          <w:b/>
-          <w:bCs/>
-          <w:i/>
-          <w:iCs/>
+        <w:t>Fortunately–Unfortunately</w:t>
+      </w:r>
+      <w:r>
+        <w:rPr>
+          <w:b/>
+          <w:bCs/>
           <w:sz w:val="40"/>
           <w:szCs w:val="40"/>
           <w:lang w:val="en-US"/>
         </w:rPr>
-        <w:t>Fortunately–Unfortunately</w:t>
-      </w:r>
-      <w:r>
-        <w:rPr>
-          <w:b/>
-          <w:bCs/>
-          <w:sz w:val="40"/>
-          <w:szCs w:val="40"/>
-          <w:lang w:val="en-US"/>
-        </w:rPr>
-        <w:t>-</w:t>
-      </w:r>
-      <w:proofErr w:type="spellStart"/>
-      <w:r>
-        <w:rPr>
-          <w:b/>
-          <w:bCs/>
-          <w:sz w:val="40"/>
-          <w:szCs w:val="40"/>
-          <w:lang w:val="en-US"/>
-        </w:rPr>
-        <w:t>methode</w:t>
-      </w:r>
-      <w:proofErr w:type="spellEnd"/>
+        <w:t>-methode</w:t>
+      </w:r>
     </w:p>
     <w:p>
       <w:pPr>
@@ -2843,49 +2644,15 @@
       <w:r>
         <w:t xml:space="preserve">De </w:t>
       </w:r>
-      <w:proofErr w:type="spellStart"/>
-      <w:r>
-        <w:rPr>
-          <w:i/>
-          <w:iCs/>
-        </w:rPr>
-        <w:t>Fortunately</w:t>
-      </w:r>
-      <w:proofErr w:type="spellEnd"/>
-      <w:r>
-        <w:rPr>
-          <w:i/>
-          <w:iCs/>
-        </w:rPr>
-        <w:t>–</w:t>
-      </w:r>
-      <w:proofErr w:type="spellStart"/>
-      <w:r>
-        <w:rPr>
-          <w:i/>
-          <w:iCs/>
-        </w:rPr>
-        <w:t>Unfortunately</w:t>
-      </w:r>
-      <w:proofErr w:type="spellEnd"/>
-      <w:r>
-        <w:t>-methode komt oorspronkelijk uit improvisatietheater. Het is een techniek waarbij een verhaal zich afwisselend positief en negatief ontwikkelt. Elke nieuwe stap begint met “</w:t>
-      </w:r>
-      <w:proofErr w:type="spellStart"/>
-      <w:r>
-        <w:t>Fortunately</w:t>
-      </w:r>
-      <w:proofErr w:type="spellEnd"/>
-      <w:r>
-        <w:t>…” (gelukkig/positieve tegenmaatregel) of “</w:t>
-      </w:r>
-      <w:proofErr w:type="spellStart"/>
-      <w:r>
-        <w:t>Unfortunately</w:t>
-      </w:r>
-      <w:proofErr w:type="spellEnd"/>
-      <w:r>
-        <w:t>…” (helaas/risico’s) en verandert zo het verloop van het verhaal. Dit zorgt ervoor dat gebruikers verschillende scenario’s verkennen en onverwachte wendingen ontdekken.</w:t>
+      <w:r>
+        <w:rPr>
+          <w:i/>
+          <w:iCs/>
+        </w:rPr>
+        <w:t>Fortunately–Unfortunately</w:t>
+      </w:r>
+      <w:r>
+        <w:t>-methode komt oorspronkelijk uit improvisatietheater. Het is een techniek waarbij een verhaal zich afwisselend positief en negatief ontwikkelt. Elke nieuwe stap begint met “Fortunately…” (gelukkig/positieve tegenmaatregel) of “Unfortunately…” (helaas/risico’s) en verandert zo het verloop van het verhaal. Dit zorgt ervoor dat gebruikers verschillende scenario’s verkennen en onverwachte wendingen ontdekken.</w:t>
       </w:r>
     </w:p>
     <w:p>
@@ -3417,7 +3184,7 @@
           <w:noProof/>
         </w:rPr>
         <w:drawing>
-          <wp:inline distT="0" distB="0" distL="0" distR="0" wp14:anchorId="459308C6" wp14:editId="6FCCB65B">
+          <wp:inline distT="0" distB="0" distL="0" distR="0" wp14:anchorId="459308C6" wp14:editId="3A86028B">
             <wp:extent cx="5760720" cy="3239135"/>
             <wp:effectExtent l="0" t="0" r="0" b="0"/>
             <wp:docPr id="744949087" name="Afbeelding 1" descr="Afbeelding met tekst, schermopname, Lettertype, nummer&#10;&#10;Door AI gegenereerde inhoud is mogelijk onjuist."/>
@@ -3478,28 +3245,11 @@
         <w:t>E</w:t>
       </w:r>
       <w:r>
-        <w:t xml:space="preserve">en </w:t>
-      </w:r>
-      <w:proofErr w:type="spellStart"/>
-      <w:r>
-        <w:t>unfortunately</w:t>
-      </w:r>
-      <w:proofErr w:type="spellEnd"/>
-      <w:r>
-        <w:t xml:space="preserve">-node zonder </w:t>
-      </w:r>
-      <w:proofErr w:type="spellStart"/>
-      <w:r>
-        <w:t>fortunately</w:t>
-      </w:r>
-      <w:proofErr w:type="spellEnd"/>
-      <w:r>
-        <w:t xml:space="preserve"> kinderen</w:t>
+        <w:t>en unfortunately-node zonder fortunately kinderen</w:t>
       </w:r>
       <w:r>
         <w:t xml:space="preserve"> is een </w:t>
       </w:r>
-      <w:proofErr w:type="spellStart"/>
       <w:r>
         <w:rPr>
           <w:b/>
@@ -3507,7 +3257,6 @@
         </w:rPr>
         <w:t>Weakness</w:t>
       </w:r>
-      <w:proofErr w:type="spellEnd"/>
       <w:r>
         <w:rPr>
           <w:b/>
@@ -3533,31 +3282,14 @@
         </w:numPr>
       </w:pPr>
       <w:r>
-        <w:t xml:space="preserve">Een </w:t>
-      </w:r>
-      <w:proofErr w:type="spellStart"/>
-      <w:r>
-        <w:t>unfortunately</w:t>
-      </w:r>
-      <w:proofErr w:type="spellEnd"/>
-      <w:r>
-        <w:t xml:space="preserve">-node met bestaande uitwerkingen (kinderen), maar die nog moet worden herbekeken of verder verfijnd, wordt aangeduid als een </w:t>
-      </w:r>
-      <w:proofErr w:type="spellStart"/>
-      <w:r>
-        <w:rPr>
-          <w:b/>
-          <w:bCs/>
-        </w:rPr>
-        <w:t>Weakness</w:t>
-      </w:r>
-      <w:proofErr w:type="spellEnd"/>
-      <w:r>
-        <w:rPr>
-          <w:b/>
-          <w:bCs/>
-        </w:rPr>
-        <w:t xml:space="preserve"> Under Review</w:t>
+        <w:t xml:space="preserve">Een unfortunately-node met bestaande uitwerkingen (kinderen), maar die nog moet worden herbekeken of verder verfijnd, wordt aangeduid als een </w:t>
+      </w:r>
+      <w:r>
+        <w:rPr>
+          <w:b/>
+          <w:bCs/>
+        </w:rPr>
+        <w:t>Weakness Under Review</w:t>
       </w:r>
       <w:r>
         <w:t>.</w:t>
@@ -3574,15 +3306,7 @@
         </w:numPr>
       </w:pPr>
       <w:r>
-        <w:t xml:space="preserve">Een </w:t>
-      </w:r>
-      <w:proofErr w:type="spellStart"/>
-      <w:r>
-        <w:t>fortunately</w:t>
-      </w:r>
-      <w:proofErr w:type="spellEnd"/>
-      <w:r>
-        <w:t xml:space="preserve">-node met kinderen, maar waarvan de uitwerking </w:t>
+        <w:t xml:space="preserve">Een fortunately-node met kinderen, maar waarvan de uitwerking </w:t>
       </w:r>
       <w:r>
         <w:t xml:space="preserve">nog </w:t>
@@ -3593,21 +3317,12 @@
       <w:r>
         <w:t xml:space="preserve">, krijgt de status van een </w:t>
       </w:r>
-      <w:proofErr w:type="spellStart"/>
-      <w:r>
-        <w:rPr>
-          <w:b/>
-          <w:bCs/>
-        </w:rPr>
-        <w:t>Assumption</w:t>
-      </w:r>
-      <w:proofErr w:type="spellEnd"/>
-      <w:r>
-        <w:rPr>
-          <w:b/>
-          <w:bCs/>
-        </w:rPr>
-        <w:t xml:space="preserve"> Under Review</w:t>
+      <w:r>
+        <w:rPr>
+          <w:b/>
+          <w:bCs/>
+        </w:rPr>
+        <w:t>Assumption Under Review</w:t>
       </w:r>
       <w:r>
         <w:t>.</w:t>
@@ -3624,15 +3339,7 @@
         </w:numPr>
       </w:pPr>
       <w:r>
-        <w:t xml:space="preserve">Een </w:t>
-      </w:r>
-      <w:proofErr w:type="spellStart"/>
-      <w:r>
-        <w:t>fortunately</w:t>
-      </w:r>
-      <w:proofErr w:type="spellEnd"/>
-      <w:r>
-        <w:t xml:space="preserve">-node waarvan de uitwerking </w:t>
+        <w:t xml:space="preserve">Een fortunately-node waarvan de uitwerking </w:t>
       </w:r>
       <w:r>
         <w:t>in orde is</w:t>
@@ -3646,31 +3353,13 @@
       <w:r>
         <w:t xml:space="preserve"> geen kinderen heeft, krijgt de status van een </w:t>
       </w:r>
-      <w:proofErr w:type="spellStart"/>
-      <w:r>
-        <w:rPr>
-          <w:b/>
-          <w:bCs/>
-        </w:rPr>
-        <w:t>Verified</w:t>
-      </w:r>
-      <w:proofErr w:type="spellEnd"/>
-      <w:r>
-        <w:rPr>
-          <w:b/>
-          <w:bCs/>
-        </w:rPr>
-        <w:t xml:space="preserve"> </w:t>
-      </w:r>
-      <w:proofErr w:type="spellStart"/>
-      <w:r>
-        <w:rPr>
-          <w:b/>
-          <w:bCs/>
-        </w:rPr>
-        <w:t>Assumption</w:t>
-      </w:r>
-      <w:proofErr w:type="spellEnd"/>
+      <w:r>
+        <w:rPr>
+          <w:b/>
+          <w:bCs/>
+        </w:rPr>
+        <w:t>Verified Assumption</w:t>
+      </w:r>
       <w:r>
         <w:t>.</w:t>
       </w:r>
@@ -3689,43 +3378,18 @@
         <w:lastRenderedPageBreak/>
         <w:t xml:space="preserve">De </w:t>
       </w:r>
-      <w:proofErr w:type="spellStart"/>
-      <w:r>
-        <w:rPr>
-          <w:b/>
-          <w:bCs/>
-        </w:rPr>
-        <w:t>danger</w:t>
-      </w:r>
-      <w:proofErr w:type="spellEnd"/>
-      <w:r>
-        <w:rPr>
-          <w:b/>
-          <w:bCs/>
-        </w:rPr>
-        <w:t xml:space="preserve"> rating</w:t>
-      </w:r>
-      <w:r>
-        <w:t xml:space="preserve"> is een classificatie van een </w:t>
-      </w:r>
-      <w:proofErr w:type="spellStart"/>
-      <w:r>
-        <w:t>unfortunately</w:t>
-      </w:r>
-      <w:proofErr w:type="spellEnd"/>
-      <w:r>
-        <w:t xml:space="preserve">-node om het niveau van gevaar uit te drukken. </w:t>
-      </w:r>
-      <w:r>
-        <w:t xml:space="preserve">Het is een relatief getal dat bijvoorbeeld berekend kan worden op basis van </w:t>
-      </w:r>
-      <w:proofErr w:type="spellStart"/>
-      <w:r>
-        <w:t>likelihood</w:t>
-      </w:r>
-      <w:proofErr w:type="spellEnd"/>
-      <w:r>
-        <w:t xml:space="preserve"> en impact.</w:t>
+      <w:r>
+        <w:rPr>
+          <w:b/>
+          <w:bCs/>
+        </w:rPr>
+        <w:t>danger rating</w:t>
+      </w:r>
+      <w:r>
+        <w:t xml:space="preserve"> is een classificatie van een unfortunately-node om het niveau van gevaar uit te drukken. </w:t>
+      </w:r>
+      <w:r>
+        <w:t>Het is een relatief getal dat bijvoorbeeld berekend kan worden op basis van likelihood en impact.</w:t>
       </w:r>
     </w:p>
     <w:p>
@@ -3743,19 +3407,10 @@
         </w:rPr>
       </w:pPr>
       <w:r>
-        <w:t xml:space="preserve">Je zal aan de hand van twee scenario’s beide varianten van de software testen. Open nu de </w:t>
-      </w:r>
-      <w:r>
-        <w:t>uitgebreide</w:t>
-      </w:r>
-      <w:r>
-        <w:t xml:space="preserve"> software</w:t>
-      </w:r>
-      <w:r>
-        <w:t>/</w:t>
-      </w:r>
-      <w:r>
-        <w:t>standaardsoftware</w:t>
+        <w:t xml:space="preserve">Je zal aan de hand van twee scenario’s beide varianten van de software testen. Open nu </w:t>
+      </w:r>
+      <w:r>
+        <w:t>versie 1/versie 2 van de software</w:t>
       </w:r>
       <w:r>
         <w:t xml:space="preserve"> en bekijk de software even. Begin hierna aan het eerste scenario.</w:t>
@@ -3813,31 +3468,13 @@
       <w:r>
         <w:t xml:space="preserve"> een </w:t>
       </w:r>
-      <w:proofErr w:type="spellStart"/>
-      <w:r>
-        <w:rPr>
-          <w:i/>
-          <w:iCs/>
-        </w:rPr>
-        <w:t>Fortunately</w:t>
-      </w:r>
-      <w:proofErr w:type="spellEnd"/>
-      <w:r>
-        <w:rPr>
-          <w:i/>
-          <w:iCs/>
-        </w:rPr>
-        <w:t>–</w:t>
-      </w:r>
-      <w:proofErr w:type="spellStart"/>
-      <w:r>
-        <w:rPr>
-          <w:i/>
-          <w:iCs/>
-        </w:rPr>
-        <w:t>Unfortunately</w:t>
-      </w:r>
-      <w:proofErr w:type="spellEnd"/>
+      <w:r>
+        <w:rPr>
+          <w:i/>
+          <w:iCs/>
+        </w:rPr>
+        <w:t>Fortunately–Unfortunately</w:t>
+      </w:r>
       <w:r>
         <w:t>-model.</w:t>
       </w:r>
@@ -3880,7 +3517,6 @@
       <w:r>
         <w:t xml:space="preserve">Bij het controleren van de tree merk je dat er nog een </w:t>
       </w:r>
-      <w:proofErr w:type="spellStart"/>
       <w:r>
         <w:rPr>
           <w:i/>
@@ -3888,17 +3524,8 @@
         </w:rPr>
         <w:t>unfortunate</w:t>
       </w:r>
-      <w:proofErr w:type="spellEnd"/>
-      <w:r>
-        <w:t xml:space="preserve"> ontbreekt: een </w:t>
-      </w:r>
-      <w:proofErr w:type="spellStart"/>
-      <w:r>
-        <w:t>weakness</w:t>
-      </w:r>
-      <w:proofErr w:type="spellEnd"/>
-      <w:r>
-        <w:t xml:space="preserve">/risico dat nog niet in het model is opgenomen, namelijk </w:t>
+      <w:r>
+        <w:t xml:space="preserve"> ontbreekt: een weakness/risico dat nog niet in het model is opgenomen, namelijk </w:t>
       </w:r>
       <w:r>
         <w:rPr>
@@ -3921,26 +3548,10 @@
         <w:t xml:space="preserve">. </w:t>
       </w:r>
       <w:r>
-        <w:t xml:space="preserve">“Dit was de laatste </w:t>
-      </w:r>
-      <w:proofErr w:type="spellStart"/>
-      <w:r>
-        <w:t>unfortunately</w:t>
-      </w:r>
-      <w:proofErr w:type="spellEnd"/>
-      <w:r>
-        <w:t xml:space="preserve"> node in deze tak</w:t>
-      </w:r>
-      <w:r>
-        <w:t xml:space="preserve">. Omdat deze </w:t>
-      </w:r>
-      <w:proofErr w:type="spellStart"/>
-      <w:r>
-        <w:t>unfortunately</w:t>
-      </w:r>
-      <w:proofErr w:type="spellEnd"/>
-      <w:r>
-        <w:t xml:space="preserve"> node gezien wordt als </w:t>
+        <w:t>“Dit was de laatste unfortunately node in deze tak</w:t>
+      </w:r>
+      <w:r>
+        <w:t xml:space="preserve">. Omdat deze unfortunately node gezien wordt als </w:t>
       </w:r>
       <w:r>
         <w:rPr>
@@ -3949,32 +3560,118 @@
         </w:rPr>
         <w:t>“</w:t>
       </w:r>
-      <w:proofErr w:type="spellStart"/>
-      <w:r>
-        <w:rPr>
-          <w:i/>
-          <w:iCs/>
-        </w:rPr>
-        <w:t>Not</w:t>
-      </w:r>
-      <w:proofErr w:type="spellEnd"/>
-      <w:r>
-        <w:rPr>
-          <w:i/>
-          <w:iCs/>
-        </w:rPr>
-        <w:t xml:space="preserve"> Important”</w:t>
-      </w:r>
-      <w:r>
-        <w:t xml:space="preserve"> mag je deze status erbij zetten en mag de bovenliggende </w:t>
-      </w:r>
-      <w:proofErr w:type="spellStart"/>
-      <w:r>
-        <w:t>unfortunately</w:t>
-      </w:r>
-      <w:proofErr w:type="spellEnd"/>
-      <w:r>
-        <w:t xml:space="preserve">-node beschouwd worden als </w:t>
+      <w:r>
+        <w:rPr>
+          <w:i/>
+          <w:iCs/>
+        </w:rPr>
+        <w:t>Low</w:t>
+      </w:r>
+      <w:r>
+        <w:rPr>
+          <w:i/>
+          <w:iCs/>
+        </w:rPr>
+        <w:t xml:space="preserve"> Important</w:t>
+      </w:r>
+      <w:r>
+        <w:rPr>
+          <w:i/>
+          <w:iCs/>
+        </w:rPr>
+        <w:t>s</w:t>
+      </w:r>
+      <w:r>
+        <w:rPr>
+          <w:i/>
+          <w:iCs/>
+        </w:rPr>
+        <w:t>”</w:t>
+      </w:r>
+      <w:r>
+        <w:t xml:space="preserve"> mag je deze status erbij zetten en mag de bovenliggende fortunately-node beschouwd worden als</w:t>
+      </w:r>
+      <w:r>
+        <w:t xml:space="preserve"> een</w:t>
+      </w:r>
+      <w:r>
+        <w:t xml:space="preserve"> </w:t>
+      </w:r>
+      <w:r>
+        <w:rPr>
+          <w:i/>
+          <w:iCs/>
+        </w:rPr>
+        <w:t>“Verified</w:t>
+      </w:r>
+      <w:r>
+        <w:rPr>
+          <w:i/>
+          <w:iCs/>
+        </w:rPr>
+        <w:t xml:space="preserve"> Assumption</w:t>
+      </w:r>
+      <w:r>
+        <w:rPr>
+          <w:i/>
+          <w:iCs/>
+        </w:rPr>
+        <w:t>”</w:t>
+      </w:r>
+      <w:r>
+        <w:rPr>
+          <w:i/>
+          <w:iCs/>
+        </w:rPr>
+        <w:t>.</w:t>
+      </w:r>
+      <w:r>
+        <w:rPr>
+          <w:i/>
+          <w:iCs/>
+        </w:rPr>
+        <w:t xml:space="preserve"> </w:t>
+      </w:r>
+      <w:r>
+        <w:t>Noteer/markeer dit bij deze laatste fortunately-node</w:t>
+      </w:r>
+      <w:r>
+        <w:t>.</w:t>
+      </w:r>
+    </w:p>
+    <w:p>
+      <w:pPr>
+        <w:rPr>
+          <w:b/>
+          <w:bCs/>
+        </w:rPr>
+      </w:pPr>
+      <w:r>
+        <w:rPr>
+          <w:b/>
+          <w:bCs/>
+        </w:rPr>
+        <w:t>Taak 2:</w:t>
+      </w:r>
+    </w:p>
+    <w:p>
+      <w:pPr>
+        <w:rPr>
+          <w:i/>
+          <w:iCs/>
+        </w:rPr>
+      </w:pPr>
+      <w:r>
+        <w:t>Er wordt nu binnen het team verder nagedacht over een authenticatieprovider.</w:t>
+      </w:r>
+      <w:r>
+        <w:t xml:space="preserve"> </w:t>
+      </w:r>
+      <w:r>
+        <w:t>Zoek de correcte plaats in de tree</w:t>
+      </w:r>
+      <w:r>
+        <w:t xml:space="preserve"> (namelijk: </w:t>
       </w:r>
       <w:r>
         <w:rPr>
@@ -3983,15 +3680,13 @@
         </w:rPr>
         <w:t>“</w:t>
       </w:r>
-      <w:proofErr w:type="spellStart"/>
-      <w:r>
-        <w:rPr>
-          <w:i/>
-          <w:iCs/>
-        </w:rPr>
-        <w:t>Verified</w:t>
-      </w:r>
-      <w:proofErr w:type="spellEnd"/>
+      <w:r>
+        <w:rPr>
+          <w:i/>
+          <w:iCs/>
+        </w:rPr>
+        <w:t>Provider-storingen kunnen alle werknemers buitensluiten</w:t>
+      </w:r>
       <w:r>
         <w:rPr>
           <w:i/>
@@ -4000,82 +3695,17 @@
         <w:t>”</w:t>
       </w:r>
       <w:r>
-        <w:rPr>
-          <w:i/>
-          <w:iCs/>
-        </w:rPr>
-        <w:t>.</w:t>
-      </w:r>
-    </w:p>
-    <w:p>
-      <w:pPr>
-        <w:rPr>
-          <w:b/>
-          <w:bCs/>
-        </w:rPr>
-      </w:pPr>
-      <w:r>
-        <w:rPr>
-          <w:b/>
-          <w:bCs/>
-        </w:rPr>
-        <w:t>Taak 2:</w:t>
-      </w:r>
-    </w:p>
-    <w:p>
-      <w:pPr>
-        <w:rPr>
-          <w:i/>
-          <w:iCs/>
-        </w:rPr>
-      </w:pPr>
-      <w:r>
-        <w:t>Er wordt nu binnen het team verder nagedacht over een authenticatieprovider.</w:t>
-      </w:r>
-      <w:r>
-        <w:t xml:space="preserve"> </w:t>
-      </w:r>
-      <w:r>
-        <w:t>Zoek de correcte plaats in de tree</w:t>
-      </w:r>
-      <w:r>
-        <w:t xml:space="preserve"> (namelijk: </w:t>
-      </w:r>
-      <w:r>
-        <w:rPr>
-          <w:i/>
-          <w:iCs/>
-        </w:rPr>
-        <w:t>“</w:t>
-      </w:r>
-      <w:r>
-        <w:rPr>
-          <w:i/>
-          <w:iCs/>
-        </w:rPr>
-        <w:t>Provider-storingen kunnen alle werknemers buitensluiten</w:t>
-      </w:r>
-      <w:r>
-        <w:rPr>
-          <w:i/>
-          <w:iCs/>
-        </w:rPr>
-        <w:t>”</w:t>
-      </w:r>
-      <w:r>
         <w:t>)</w:t>
       </w:r>
       <w:r>
         <w:t xml:space="preserve"> en voeg</w:t>
       </w:r>
       <w:r>
-        <w:t xml:space="preserve"> de volgende </w:t>
-      </w:r>
-      <w:proofErr w:type="spellStart"/>
-      <w:r>
-        <w:t>nodes</w:t>
-      </w:r>
-      <w:proofErr w:type="spellEnd"/>
+        <w:t xml:space="preserve"> de volgende nodes</w:t>
+      </w:r>
+      <w:r>
+        <w:t xml:space="preserve"> onder elkaar</w:t>
+      </w:r>
       <w:r>
         <w:t xml:space="preserve"> toe</w:t>
       </w:r>
@@ -4115,43 +3745,7 @@
           <w:iCs/>
           <w:lang w:val="en-US"/>
         </w:rPr>
-        <w:t xml:space="preserve">Team </w:t>
-      </w:r>
-      <w:proofErr w:type="spellStart"/>
-      <w:r>
-        <w:rPr>
-          <w:i/>
-          <w:iCs/>
-          <w:lang w:val="en-US"/>
-        </w:rPr>
-        <w:t>richt</w:t>
-      </w:r>
-      <w:proofErr w:type="spellEnd"/>
-      <w:r>
-        <w:rPr>
-          <w:i/>
-          <w:iCs/>
-          <w:lang w:val="en-US"/>
-        </w:rPr>
-        <w:t xml:space="preserve"> on-prem fallback-</w:t>
-      </w:r>
-      <w:proofErr w:type="spellStart"/>
-      <w:r>
-        <w:rPr>
-          <w:i/>
-          <w:iCs/>
-          <w:lang w:val="en-US"/>
-        </w:rPr>
-        <w:t>authenticatieserver</w:t>
-      </w:r>
-      <w:proofErr w:type="spellEnd"/>
-      <w:r>
-        <w:rPr>
-          <w:i/>
-          <w:iCs/>
-          <w:lang w:val="en-US"/>
-        </w:rPr>
-        <w:t xml:space="preserve"> in</w:t>
+        <w:t>Team richt on-prem fallback-authenticatieserver in</w:t>
       </w:r>
       <w:r>
         <w:rPr>
@@ -4194,36 +3788,8 @@
           <w:iCs/>
           <w:lang w:val="en-US"/>
         </w:rPr>
-        <w:t xml:space="preserve">On-prem fallback </w:t>
-      </w:r>
-      <w:proofErr w:type="spellStart"/>
-      <w:r>
-        <w:rPr>
-          <w:i/>
-          <w:iCs/>
-          <w:lang w:val="en-US"/>
-        </w:rPr>
-        <w:t>synchroniseert</w:t>
-      </w:r>
-      <w:proofErr w:type="spellEnd"/>
-      <w:r>
-        <w:rPr>
-          <w:i/>
-          <w:iCs/>
-          <w:lang w:val="en-US"/>
-        </w:rPr>
-        <w:t xml:space="preserve"> credentials </w:t>
-      </w:r>
-      <w:proofErr w:type="spellStart"/>
-      <w:r>
-        <w:rPr>
-          <w:i/>
-          <w:iCs/>
-          <w:lang w:val="en-US"/>
-        </w:rPr>
-        <w:t>vertraagd</w:t>
-      </w:r>
-      <w:proofErr w:type="spellEnd"/>
+        <w:t>On-prem fallback synchroniseert credentials vertraagd</w:t>
+      </w:r>
       <w:r>
         <w:rPr>
           <w:i/>
@@ -4245,19 +3811,11 @@
           <w:lang w:val="en-US"/>
         </w:rPr>
       </w:pPr>
-      <w:proofErr w:type="spellStart"/>
       <w:r>
         <w:rPr>
           <w:lang w:val="en-US"/>
         </w:rPr>
-        <w:t>Likelyhood</w:t>
-      </w:r>
-      <w:proofErr w:type="spellEnd"/>
-      <w:r>
-        <w:rPr>
-          <w:lang w:val="en-US"/>
-        </w:rPr>
-        <w:t>: 4</w:t>
+        <w:t>Likelyhood: 4</w:t>
       </w:r>
     </w:p>
     <w:p>
@@ -4309,13 +3867,8 @@
           <w:iCs/>
         </w:rPr>
       </w:pPr>
-      <w:proofErr w:type="spellStart"/>
-      <w:r>
-        <w:t>Fortunately</w:t>
-      </w:r>
-      <w:proofErr w:type="spellEnd"/>
-      <w:r>
-        <w:t xml:space="preserve">: </w:t>
+      <w:r>
+        <w:t xml:space="preserve">Fortunately: </w:t>
       </w:r>
       <w:r>
         <w:rPr>
@@ -4379,9 +3932,17 @@
         <w:t>om een inschatting te maken van de benodigde tijd</w:t>
       </w:r>
       <w:r>
-        <w:t>. Zoek de volgende informatie:</w:t>
-      </w:r>
-    </w:p>
+        <w:t>. Zoek de volgende informatie</w:t>
+      </w:r>
+      <w:r>
+        <w:t xml:space="preserve"> (je mag bij het opsommen stoppen na de eerste 4 woorden van de node)</w:t>
+      </w:r>
+      <w:r>
+        <w:t>:</w:t>
+      </w:r>
+    </w:p>
+    <w:p/>
+    <w:p/>
     <w:p>
       <w:pPr>
         <w:pStyle w:val="Lijstalinea"/>
@@ -4393,23 +3954,40 @@
       <w:r>
         <w:t xml:space="preserve">De </w:t>
       </w:r>
-      <w:proofErr w:type="spellStart"/>
-      <w:r>
-        <w:t>verified</w:t>
-      </w:r>
-      <w:proofErr w:type="spellEnd"/>
-      <w:r>
-        <w:t xml:space="preserve"> </w:t>
-      </w:r>
-      <w:proofErr w:type="spellStart"/>
-      <w:r>
-        <w:t>assumptions</w:t>
-      </w:r>
-      <w:proofErr w:type="spellEnd"/>
-      <w:r>
-        <w:t xml:space="preserve"> die het model bevat.</w:t>
-      </w:r>
-    </w:p>
+      <w:r>
+        <w:t xml:space="preserve">verified </w:t>
+      </w:r>
+      <w:r>
+        <w:t>assumption</w:t>
+      </w:r>
+      <w:r>
+        <w:t xml:space="preserve"> nodes </w:t>
+      </w:r>
+      <w:r>
+        <w:t>die het model bevat.</w:t>
+      </w:r>
+    </w:p>
+    <w:p>
+      <w:pPr>
+        <w:pStyle w:val="Lijstalinea"/>
+      </w:pPr>
+    </w:p>
+    <w:p>
+      <w:pPr>
+        <w:pStyle w:val="Lijstalinea"/>
+      </w:pPr>
+    </w:p>
+    <w:p>
+      <w:pPr>
+        <w:pStyle w:val="Lijstalinea"/>
+      </w:pPr>
+    </w:p>
+    <w:p>
+      <w:pPr>
+        <w:pStyle w:val="Lijstalinea"/>
+      </w:pPr>
+    </w:p>
+    <w:p/>
     <w:p>
       <w:pPr>
         <w:pStyle w:val="Lijstalinea"/>
@@ -4429,25 +4007,85 @@
         </w:numPr>
       </w:pPr>
       <w:r>
-        <w:lastRenderedPageBreak/>
-        <w:t xml:space="preserve">De </w:t>
-      </w:r>
-      <w:proofErr w:type="spellStart"/>
-      <w:r>
-        <w:t>weaknesses</w:t>
-      </w:r>
-      <w:proofErr w:type="spellEnd"/>
+        <w:t>De</w:t>
+      </w:r>
+      <w:r>
+        <w:t xml:space="preserve"> 3</w:t>
+      </w:r>
+      <w:r>
+        <w:t xml:space="preserve"> </w:t>
+      </w:r>
+      <w:r>
+        <w:t xml:space="preserve"> </w:t>
+      </w:r>
+      <w:r>
+        <w:t>“</w:t>
+      </w:r>
+      <w:r>
+        <w:t>weaknes</w:t>
+      </w:r>
+      <w:r>
+        <w:t>s</w:t>
+      </w:r>
+      <w:r>
+        <w:t xml:space="preserve"> under review</w:t>
+      </w:r>
+      <w:r>
+        <w:t>”</w:t>
+      </w:r>
+      <w:r>
+        <w:t xml:space="preserve"> </w:t>
+      </w:r>
+      <w:r>
+        <w:t xml:space="preserve">nodes </w:t>
+      </w:r>
+      <w:r>
+        <w:t>met de hoogste danger rating</w:t>
+      </w:r>
       <w:r>
         <w:t>.</w:t>
       </w:r>
-      <w:r>
-        <w:t xml:space="preserve"> Rangschik deze op basis van de </w:t>
-      </w:r>
-      <w:proofErr w:type="spellStart"/>
-      <w:r>
-        <w:t>dangerrating</w:t>
-      </w:r>
-      <w:proofErr w:type="spellEnd"/>
+    </w:p>
+    <w:p>
+      <w:pPr>
+        <w:ind w:left="360"/>
+      </w:pPr>
+    </w:p>
+    <w:p>
+      <w:pPr>
+        <w:ind w:left="360"/>
+      </w:pPr>
+    </w:p>
+    <w:p>
+      <w:pPr>
+        <w:ind w:left="360"/>
+      </w:pPr>
+    </w:p>
+    <w:p>
+      <w:pPr>
+        <w:pStyle w:val="Lijstalinea"/>
+      </w:pPr>
+    </w:p>
+    <w:p>
+      <w:pPr>
+        <w:pStyle w:val="Lijstalinea"/>
+        <w:numPr>
+          <w:ilvl w:val="0"/>
+          <w:numId w:val="11"/>
+        </w:numPr>
+      </w:pPr>
+      <w:r>
+        <w:t>De weakness</w:t>
+      </w:r>
+      <w:r>
+        <w:t xml:space="preserve"> nodes</w:t>
+      </w:r>
+      <w:r>
+        <w:t>.</w:t>
+      </w:r>
+      <w:r>
+        <w:t xml:space="preserve"> Rangschik deze op basis van de dangerrating</w:t>
+      </w:r>
       <w:r>
         <w:t xml:space="preserve"> van hoogste naar laagste rating</w:t>
       </w:r>
@@ -4463,42 +4101,6 @@
     <w:p>
       <w:pPr>
         <w:pStyle w:val="Lijstalinea"/>
-        <w:numPr>
-          <w:ilvl w:val="0"/>
-          <w:numId w:val="11"/>
-        </w:numPr>
-      </w:pPr>
-      <w:r>
-        <w:t xml:space="preserve">Hoeveel </w:t>
-      </w:r>
-      <w:proofErr w:type="spellStart"/>
-      <w:r>
-        <w:t>weaknesses</w:t>
-      </w:r>
-      <w:proofErr w:type="spellEnd"/>
-      <w:r>
-        <w:t xml:space="preserve"> </w:t>
-      </w:r>
-      <w:proofErr w:type="spellStart"/>
-      <w:r>
-        <w:t>under</w:t>
-      </w:r>
-      <w:proofErr w:type="spellEnd"/>
-      <w:r>
-        <w:t xml:space="preserve"> review or nog aanwezig zijn</w:t>
-      </w:r>
-      <w:r>
-        <w:t>.</w:t>
-      </w:r>
-    </w:p>
-    <w:p>
-      <w:pPr>
-        <w:pStyle w:val="Lijstalinea"/>
-      </w:pPr>
-    </w:p>
-    <w:p>
-      <w:pPr>
-        <w:pStyle w:val="Lijstalinea"/>
       </w:pPr>
     </w:p>
     <w:p>
@@ -4510,23 +4112,90 @@
         </w:numPr>
       </w:pPr>
       <w:r>
-        <w:t xml:space="preserve">De </w:t>
-      </w:r>
-      <w:proofErr w:type="spellStart"/>
-      <w:r>
-        <w:t>assumptions</w:t>
-      </w:r>
-      <w:proofErr w:type="spellEnd"/>
+        <w:t>Hoeveel</w:t>
+      </w:r>
       <w:r>
         <w:t xml:space="preserve"> </w:t>
       </w:r>
-      <w:proofErr w:type="spellStart"/>
-      <w:r>
-        <w:t>under</w:t>
-      </w:r>
-      <w:proofErr w:type="spellEnd"/>
-      <w:r>
-        <w:t xml:space="preserve"> review.</w:t>
+      <w:r>
+        <w:t>“</w:t>
+      </w:r>
+      <w:r>
+        <w:t>assumption under review</w:t>
+      </w:r>
+      <w:r>
+        <w:t>” nodes er zijn</w:t>
+      </w:r>
+      <w:r>
+        <w:t>.</w:t>
+      </w:r>
+    </w:p>
+    <w:p/>
+    <w:p>
+      <w:pPr>
+        <w:rPr>
+          <w:b/>
+          <w:bCs/>
+        </w:rPr>
+      </w:pPr>
+    </w:p>
+    <w:p>
+      <w:pPr>
+        <w:rPr>
+          <w:b/>
+          <w:bCs/>
+        </w:rPr>
+      </w:pPr>
+      <w:r>
+        <w:rPr>
+          <w:b/>
+          <w:bCs/>
+        </w:rPr>
+        <w:t>Taak 4:</w:t>
+      </w:r>
+    </w:p>
+    <w:p>
+      <w:r>
+        <w:t xml:space="preserve">Tot slot moeten de verantwoordelijkheden </w:t>
+      </w:r>
+      <w:r>
+        <w:t>verdeeld</w:t>
+      </w:r>
+      <w:r>
+        <w:t xml:space="preserve"> worden binnen het team. </w:t>
+      </w:r>
+      <w:r>
+        <w:t xml:space="preserve">Selecteer twee elementen in de tree die eindigen op een </w:t>
+      </w:r>
+      <w:r>
+        <w:t>“</w:t>
+      </w:r>
+      <w:r>
+        <w:rPr>
+          <w:i/>
+          <w:iCs/>
+        </w:rPr>
+        <w:t>verified assumption</w:t>
+      </w:r>
+      <w:r>
+        <w:rPr>
+          <w:i/>
+          <w:iCs/>
+        </w:rPr>
+        <w:t>”</w:t>
+      </w:r>
+      <w:r>
+        <w:t>.</w:t>
+      </w:r>
+      <w:r>
+        <w:br/>
+        <w:t>Gebruik de volledige fortunately/unfortunately-keten</w:t>
+      </w:r>
+      <w:r>
+        <w:t xml:space="preserve"> (keten vanaf root node tot huidige node)</w:t>
+      </w:r>
+      <w:r>
+        <w:t xml:space="preserve"> om samen te vatten welke stappen nodig zijn voor implementatie.</w:t>
       </w:r>
     </w:p>
     <w:p/>
@@ -4538,101 +4207,6 @@
         <w:rPr>
           <w:b/>
           <w:bCs/>
-        </w:rPr>
-      </w:pPr>
-    </w:p>
-    <w:p>
-      <w:pPr>
-        <w:rPr>
-          <w:b/>
-          <w:bCs/>
-        </w:rPr>
-      </w:pPr>
-      <w:r>
-        <w:rPr>
-          <w:b/>
-          <w:bCs/>
-        </w:rPr>
-        <w:t>Taak 4:</w:t>
-      </w:r>
-    </w:p>
-    <w:p>
-      <w:r>
-        <w:t xml:space="preserve">Tot slot moeten de verantwoordelijkheden </w:t>
-      </w:r>
-      <w:r>
-        <w:t>verdeeld</w:t>
-      </w:r>
-      <w:r>
-        <w:t xml:space="preserve"> worden binnen het team. </w:t>
-      </w:r>
-      <w:r>
-        <w:t xml:space="preserve">Selecteer twee elementen in de tree die eindigen op een </w:t>
-      </w:r>
-      <w:proofErr w:type="spellStart"/>
-      <w:r>
-        <w:rPr>
-          <w:i/>
-          <w:iCs/>
-        </w:rPr>
-        <w:t>verified</w:t>
-      </w:r>
-      <w:proofErr w:type="spellEnd"/>
-      <w:r>
-        <w:rPr>
-          <w:i/>
-          <w:iCs/>
-        </w:rPr>
-        <w:t xml:space="preserve"> </w:t>
-      </w:r>
-      <w:proofErr w:type="spellStart"/>
-      <w:r>
-        <w:rPr>
-          <w:i/>
-          <w:iCs/>
-        </w:rPr>
-        <w:t>assumption</w:t>
-      </w:r>
-      <w:proofErr w:type="spellEnd"/>
-      <w:r>
-        <w:t xml:space="preserve"> (groene </w:t>
-      </w:r>
-      <w:proofErr w:type="spellStart"/>
-      <w:r>
-        <w:t>eindnode</w:t>
-      </w:r>
-      <w:proofErr w:type="spellEnd"/>
-      <w:r>
-        <w:t>).</w:t>
-      </w:r>
-      <w:r>
-        <w:br/>
-        <w:t xml:space="preserve">Gebruik de volledige </w:t>
-      </w:r>
-      <w:proofErr w:type="spellStart"/>
-      <w:r>
-        <w:t>fortunately</w:t>
-      </w:r>
-      <w:proofErr w:type="spellEnd"/>
-      <w:r>
-        <w:t>/</w:t>
-      </w:r>
-      <w:proofErr w:type="spellStart"/>
-      <w:r>
-        <w:t>unfortunately</w:t>
-      </w:r>
-      <w:proofErr w:type="spellEnd"/>
-      <w:r>
-        <w:t>-keten om samen te vatten welke stappen nodig zijn voor implementatie.</w:t>
-      </w:r>
-    </w:p>
-    <w:p/>
-    <w:p/>
-    <w:p>
-      <w:pPr>
-        <w:rPr>
-          <w:b/>
-          <w:bCs/>
           <w:sz w:val="40"/>
           <w:szCs w:val="40"/>
         </w:rPr>
@@ -4644,48 +4218,8 @@
           <w:sz w:val="40"/>
           <w:szCs w:val="40"/>
         </w:rPr>
-        <w:t>U</w:t>
-      </w:r>
-      <w:r>
-        <w:rPr>
-          <w:b/>
-          <w:bCs/>
-          <w:sz w:val="40"/>
-          <w:szCs w:val="40"/>
-        </w:rPr>
-        <w:t xml:space="preserve">ser </w:t>
-      </w:r>
-      <w:proofErr w:type="spellStart"/>
-      <w:r>
-        <w:rPr>
-          <w:b/>
-          <w:bCs/>
-          <w:sz w:val="40"/>
-          <w:szCs w:val="40"/>
-        </w:rPr>
-        <w:t>experience</w:t>
-      </w:r>
-      <w:proofErr w:type="spellEnd"/>
-      <w:r>
-        <w:rPr>
-          <w:b/>
-          <w:bCs/>
-          <w:sz w:val="40"/>
-          <w:szCs w:val="40"/>
-        </w:rPr>
-        <w:t xml:space="preserve"> </w:t>
-      </w:r>
-      <w:proofErr w:type="spellStart"/>
-      <w:r>
-        <w:rPr>
-          <w:b/>
-          <w:bCs/>
-          <w:sz w:val="40"/>
-          <w:szCs w:val="40"/>
-        </w:rPr>
-        <w:t>questionair</w:t>
-      </w:r>
-      <w:proofErr w:type="spellEnd"/>
+        <w:t>User experience questionair</w:t>
+      </w:r>
     </w:p>
     <w:p>
       <w:pPr>
@@ -4696,7 +4230,7 @@
       </w:pPr>
       <w:r>
         <w:pict w14:anchorId="2A591EE9">
-          <v:rect id="_x0000_i1029" style="width:0;height:1.5pt" o:hralign="center" o:hrstd="t" o:hr="t" fillcolor="#a0a0a0" stroked="f"/>
+          <v:rect id="_x0000_i1027" style="width:0;height:1.5pt" o:hralign="center" o:hrstd="t" o:hr="t" fillcolor="#a0a0a0" stroked="f"/>
         </w:pict>
       </w:r>
     </w:p>
@@ -4712,68 +4246,19 @@
         <w:t>Vul na het</w:t>
       </w:r>
       <w:r>
-        <w:t xml:space="preserve"> oplossen van de taken de user </w:t>
-      </w:r>
-      <w:proofErr w:type="spellStart"/>
-      <w:r>
-        <w:t>experience</w:t>
-      </w:r>
-      <w:proofErr w:type="spellEnd"/>
-      <w:r>
-        <w:t xml:space="preserve"> </w:t>
-      </w:r>
-      <w:proofErr w:type="spellStart"/>
-      <w:r>
-        <w:t>questionair</w:t>
-      </w:r>
-      <w:proofErr w:type="spellEnd"/>
-      <w:r>
-        <w:t xml:space="preserve"> in. </w:t>
+        <w:t xml:space="preserve"> oplossen van de taken de user experience questionair in. </w:t>
       </w:r>
       <w:r>
         <w:t>Wanneer je hiermee klaar bent,</w:t>
       </w:r>
       <w:r>
-        <w:t xml:space="preserve"> mag je de </w:t>
-      </w:r>
-      <w:r>
-        <w:t>uitgebreide</w:t>
-      </w:r>
-      <w:r>
-        <w:t xml:space="preserve"> software</w:t>
-      </w:r>
-      <w:r>
-        <w:t>/</w:t>
-      </w:r>
-      <w:r>
-        <w:t>standaardsoftware</w:t>
-      </w:r>
-      <w:r>
-        <w:t xml:space="preserve"> open</w:t>
-      </w:r>
-      <w:r>
-        <w:t>en</w:t>
-      </w:r>
-      <w:r>
-        <w:t xml:space="preserve"> en</w:t>
-      </w:r>
-      <w:r>
-        <w:t xml:space="preserve"> kort de</w:t>
-      </w:r>
-      <w:r>
-        <w:t xml:space="preserve"> software </w:t>
-      </w:r>
-      <w:r>
-        <w:t>bekijken</w:t>
-      </w:r>
-      <w:r>
-        <w:t xml:space="preserve">. Begin hierna aan het </w:t>
-      </w:r>
-      <w:r>
-        <w:t>tweede</w:t>
-      </w:r>
-      <w:r>
-        <w:t xml:space="preserve"> scenario.</w:t>
+        <w:t xml:space="preserve"> mag je </w:t>
+      </w:r>
+      <w:r>
+        <w:t>versie 1/versie 2 van de software openen</w:t>
+      </w:r>
+      <w:r>
+        <w:t xml:space="preserve"> en kort de software bekijken. Begin hierna aan het tweede scenario.</w:t>
       </w:r>
       <w:r>
         <w:rPr>
@@ -4791,7 +4276,6 @@
           <w:bCs/>
           <w:sz w:val="40"/>
           <w:szCs w:val="40"/>
-          <w:lang w:val="en-US"/>
         </w:rPr>
       </w:pPr>
       <w:r>
@@ -4800,7 +4284,6 @@
           <w:bCs/>
           <w:sz w:val="40"/>
           <w:szCs w:val="40"/>
-          <w:lang w:val="en-US"/>
         </w:rPr>
         <w:lastRenderedPageBreak/>
         <w:t>Story 2</w:t>
@@ -4809,7 +4292,7 @@
     <w:p>
       <w:r>
         <w:pict w14:anchorId="567D6411">
-          <v:rect id="_x0000_i1027" style="width:0;height:1.5pt" o:hralign="center" o:hrstd="t" o:hr="t" fillcolor="#a0a0a0" stroked="f"/>
+          <v:rect id="_x0000_i1028" style="width:0;height:1.5pt" o:hralign="center" o:hrstd="t" o:hr="t" fillcolor="#a0a0a0" stroked="f"/>
         </w:pict>
       </w:r>
     </w:p>
@@ -4817,31 +4300,13 @@
       <w:r>
         <w:t xml:space="preserve">Je zit in een softwareteam dat werkt aan een AI-systeem om fraude te detecteren. Er is al een begin gemaakt met een </w:t>
       </w:r>
-      <w:proofErr w:type="spellStart"/>
-      <w:r>
-        <w:rPr>
-          <w:i/>
-          <w:iCs/>
-        </w:rPr>
-        <w:t>Fortunately</w:t>
-      </w:r>
-      <w:proofErr w:type="spellEnd"/>
-      <w:r>
-        <w:rPr>
-          <w:i/>
-          <w:iCs/>
-        </w:rPr>
-        <w:t>–</w:t>
-      </w:r>
-      <w:proofErr w:type="spellStart"/>
-      <w:r>
-        <w:rPr>
-          <w:i/>
-          <w:iCs/>
-        </w:rPr>
-        <w:t>Unfortunately</w:t>
-      </w:r>
-      <w:proofErr w:type="spellEnd"/>
+      <w:r>
+        <w:rPr>
+          <w:i/>
+          <w:iCs/>
+        </w:rPr>
+        <w:t>Fortunately–Unfortunately</w:t>
+      </w:r>
       <w:r>
         <w:t>-model, maar het is nog niet compleet en sommige onderdelen moeten verder uitgewerkt worden.</w:t>
       </w:r>
@@ -4884,14 +4349,39 @@
         <w:rPr>
           <w:lang w:val="en-US"/>
         </w:rPr>
-        <w:t>De weaknesses</w:t>
+        <w:t xml:space="preserve">De </w:t>
       </w:r>
       <w:r>
         <w:rPr>
           <w:lang w:val="en-US"/>
         </w:rPr>
+        <w:t>“</w:t>
+      </w:r>
+      <w:r>
+        <w:rPr>
+          <w:lang w:val="en-US"/>
+        </w:rPr>
+        <w:t>weakness</w:t>
+      </w:r>
+      <w:r>
+        <w:rPr>
+          <w:lang w:val="en-US"/>
+        </w:rPr>
+        <w:t>” nodes</w:t>
+      </w:r>
+      <w:r>
+        <w:rPr>
+          <w:lang w:val="en-US"/>
+        </w:rPr>
         <w:t>.</w:t>
       </w:r>
+    </w:p>
+    <w:p>
+      <w:pPr>
+        <w:rPr>
+          <w:lang w:val="en-US"/>
+        </w:rPr>
+      </w:pPr>
     </w:p>
     <w:p>
       <w:pPr>
@@ -4942,14 +4432,48 @@
         <w:rPr>
           <w:lang w:val="en-US"/>
         </w:rPr>
-        <w:t xml:space="preserve"> verified assumptions</w:t>
+        <w:t xml:space="preserve"> </w:t>
       </w:r>
       <w:r>
         <w:rPr>
           <w:lang w:val="en-US"/>
         </w:rPr>
+        <w:t>“</w:t>
+      </w:r>
+      <w:r>
+        <w:rPr>
+          <w:lang w:val="en-US"/>
+        </w:rPr>
+        <w:t>verified assumption</w:t>
+      </w:r>
+      <w:r>
+        <w:rPr>
+          <w:lang w:val="en-US"/>
+        </w:rPr>
+        <w:t>” nodes</w:t>
+      </w:r>
+      <w:r>
+        <w:rPr>
+          <w:lang w:val="en-US"/>
+        </w:rPr>
         <w:t>.</w:t>
       </w:r>
+    </w:p>
+    <w:p>
+      <w:pPr>
+        <w:pStyle w:val="Lijstalinea"/>
+        <w:rPr>
+          <w:lang w:val="en-US"/>
+        </w:rPr>
+      </w:pPr>
+    </w:p>
+    <w:p>
+      <w:pPr>
+        <w:pStyle w:val="Lijstalinea"/>
+        <w:rPr>
+          <w:lang w:val="en-US"/>
+        </w:rPr>
+      </w:pPr>
     </w:p>
     <w:p>
       <w:pPr>
@@ -5006,58 +4530,32 @@
           <w:ilvl w:val="0"/>
           <w:numId w:val="12"/>
         </w:numPr>
-        <w:rPr>
-          <w:lang w:val="en-US"/>
-        </w:rPr>
-      </w:pPr>
-      <w:r>
-        <w:rPr>
-          <w:lang w:val="en-US"/>
-        </w:rPr>
-        <w:t>De weaknesses under review</w:t>
-      </w:r>
-      <w:r>
-        <w:rPr>
-          <w:lang w:val="en-US"/>
-        </w:rPr>
+      </w:pPr>
+      <w:r>
+        <w:t>De</w:t>
+      </w:r>
+      <w:r>
+        <w:t xml:space="preserve"> </w:t>
+      </w:r>
+      <w:r>
+        <w:t>“</w:t>
+      </w:r>
+      <w:r>
+        <w:t>weakness under review</w:t>
+      </w:r>
+      <w:r>
+        <w:t>” node</w:t>
+      </w:r>
+      <w:r>
+        <w:t xml:space="preserve"> met de hoogste danger rating</w:t>
+      </w:r>
+      <w:r>
         <w:t>.</w:t>
       </w:r>
     </w:p>
-    <w:p>
-      <w:pPr>
-        <w:rPr>
-          <w:lang w:val="en-US"/>
-        </w:rPr>
-      </w:pPr>
-    </w:p>
-    <w:p>
-      <w:pPr>
-        <w:rPr>
-          <w:lang w:val="en-US"/>
-        </w:rPr>
-      </w:pPr>
-    </w:p>
-    <w:p>
-      <w:pPr>
-        <w:rPr>
-          <w:lang w:val="en-US"/>
-        </w:rPr>
-      </w:pPr>
-    </w:p>
-    <w:p>
-      <w:pPr>
-        <w:rPr>
-          <w:lang w:val="en-US"/>
-        </w:rPr>
-      </w:pPr>
-    </w:p>
-    <w:p>
-      <w:pPr>
-        <w:rPr>
-          <w:lang w:val="en-US"/>
-        </w:rPr>
-      </w:pPr>
-    </w:p>
+    <w:p/>
+    <w:p/>
+    <w:p/>
     <w:p>
       <w:pPr>
         <w:pStyle w:val="Lijstalinea"/>
@@ -5069,32 +4567,40 @@
           <w:lang w:val="en-US"/>
         </w:rPr>
       </w:pPr>
-      <w:proofErr w:type="spellStart"/>
       <w:r>
         <w:rPr>
           <w:lang w:val="en-US"/>
         </w:rPr>
-        <w:t>Hoeveel</w:t>
-      </w:r>
-      <w:proofErr w:type="spellEnd"/>
+        <w:t xml:space="preserve">Hoeveel </w:t>
+      </w:r>
       <w:r>
         <w:rPr>
           <w:lang w:val="en-US"/>
         </w:rPr>
-        <w:t xml:space="preserve"> assumptions under review er </w:t>
-      </w:r>
-      <w:proofErr w:type="spellStart"/>
+        <w:t>“</w:t>
+      </w:r>
       <w:r>
         <w:rPr>
           <w:lang w:val="en-US"/>
         </w:rPr>
-        <w:t>zijn</w:t>
-      </w:r>
-      <w:proofErr w:type="spellEnd"/>
+        <w:t>assumption under review</w:t>
+      </w:r>
       <w:r>
         <w:rPr>
           <w:lang w:val="en-US"/>
         </w:rPr>
+        <w:t>” nodes</w:t>
+      </w:r>
+      <w:r>
+        <w:rPr>
+          <w:lang w:val="en-US"/>
+        </w:rPr>
+        <w:t xml:space="preserve"> er zijn</w:t>
+      </w:r>
+      <w:r>
+        <w:rPr>
+          <w:lang w:val="en-US"/>
+        </w:rPr>
         <w:t>.</w:t>
       </w:r>
     </w:p>
@@ -5108,43 +4614,10 @@
     </w:p>
     <w:p>
       <w:pPr>
-        <w:pStyle w:val="Lijstalinea"/>
         <w:rPr>
           <w:lang w:val="en-US"/>
         </w:rPr>
       </w:pPr>
-    </w:p>
-    <w:p>
-      <w:pPr>
-        <w:pStyle w:val="Lijstalinea"/>
-        <w:numPr>
-          <w:ilvl w:val="0"/>
-          <w:numId w:val="12"/>
-        </w:numPr>
-        <w:rPr>
-          <w:lang w:val="en-US"/>
-        </w:rPr>
-      </w:pPr>
-      <w:r>
-        <w:rPr>
-          <w:lang w:val="en-US"/>
-        </w:rPr>
-        <w:t xml:space="preserve">De </w:t>
-      </w:r>
-      <w:proofErr w:type="spellStart"/>
-      <w:r>
-        <w:rPr>
-          <w:lang w:val="en-US"/>
-        </w:rPr>
-        <w:t>gevaarlijkste</w:t>
-      </w:r>
-      <w:proofErr w:type="spellEnd"/>
-      <w:r>
-        <w:rPr>
-          <w:lang w:val="en-US"/>
-        </w:rPr>
-        <w:t xml:space="preserve"> weakness.</w:t>
-      </w:r>
     </w:p>
     <w:p>
       <w:pPr>
@@ -5181,15 +4654,7 @@
         <w:t>Bij de</w:t>
       </w:r>
       <w:r>
-        <w:t xml:space="preserve"> gevaarlijkste </w:t>
-      </w:r>
-      <w:proofErr w:type="spellStart"/>
-      <w:r>
-        <w:t>weakness</w:t>
-      </w:r>
-      <w:proofErr w:type="spellEnd"/>
-      <w:r>
-        <w:t xml:space="preserve"> merk je dat er nog iets ontbreekt. Zonder dit kan, zoals al aangehaald in de tree, er “</w:t>
+        <w:t xml:space="preserve"> gevaarlijkste weakness merk je dat er nog iets ontbreekt. Zonder dit kan, zoals al aangehaald in de tree, er “</w:t>
       </w:r>
       <w:r>
         <w:rPr>
@@ -5213,19 +4678,18 @@
       <w:r>
         <w:t xml:space="preserve">ontbrekende </w:t>
       </w:r>
-      <w:proofErr w:type="spellStart"/>
       <w:r>
         <w:t>nodes</w:t>
       </w:r>
-      <w:proofErr w:type="spellEnd"/>
-      <w:r>
-        <w:t xml:space="preserve"> toe aan deze </w:t>
-      </w:r>
-      <w:proofErr w:type="spellStart"/>
-      <w:r>
-        <w:t>weakness</w:t>
-      </w:r>
-      <w:proofErr w:type="spellEnd"/>
+      <w:r>
+        <w:t xml:space="preserve"> </w:t>
+      </w:r>
+      <w:r>
+        <w:t xml:space="preserve">onder elkaar </w:t>
+      </w:r>
+      <w:r>
+        <w:t>toe aan deze weakness</w:t>
+      </w:r>
       <w:r>
         <w:t>.</w:t>
       </w:r>
@@ -5250,23 +4714,7 @@
           <w:i/>
           <w:iCs/>
         </w:rPr>
-        <w:t>Toegang wordt beperkt tot geverifieerde accounts [</w:t>
-      </w:r>
-      <w:proofErr w:type="spellStart"/>
-      <w:r>
-        <w:rPr>
-          <w:i/>
-          <w:iCs/>
-        </w:rPr>
-        <w:t>Assumption</w:t>
-      </w:r>
-      <w:proofErr w:type="spellEnd"/>
-      <w:r>
-        <w:rPr>
-          <w:i/>
-          <w:iCs/>
-        </w:rPr>
-        <w:t xml:space="preserve"> Under Review]</w:t>
+        <w:t>Toegang wordt beperkt tot geverifieerde accounts [Assumption Under Review]</w:t>
       </w:r>
       <w:r>
         <w:rPr>
@@ -5310,17 +4758,8 @@
           <w:i/>
           <w:iCs/>
         </w:rPr>
-        <w:t>[</w:t>
-      </w:r>
-      <w:proofErr w:type="spellStart"/>
-      <w:r>
-        <w:rPr>
-          <w:i/>
-          <w:iCs/>
-        </w:rPr>
-        <w:t>Weakness</w:t>
-      </w:r>
-      <w:proofErr w:type="spellEnd"/>
+        <w:t>[Weakness</w:t>
+      </w:r>
       <w:r>
         <w:rPr>
           <w:i/>
@@ -5351,13 +4790,8 @@
           <w:numId w:val="3"/>
         </w:numPr>
       </w:pPr>
-      <w:proofErr w:type="spellStart"/>
-      <w:r>
-        <w:t>Likelyhood</w:t>
-      </w:r>
-      <w:proofErr w:type="spellEnd"/>
-      <w:r>
-        <w:t>: 5</w:t>
+      <w:r>
+        <w:t>Likelyhood: 5</w:t>
       </w:r>
     </w:p>
     <w:p>
@@ -5380,13 +4814,8 @@
           <w:numId w:val="3"/>
         </w:numPr>
       </w:pPr>
-      <w:proofErr w:type="spellStart"/>
-      <w:r>
-        <w:t>Danger</w:t>
-      </w:r>
-      <w:proofErr w:type="spellEnd"/>
-      <w:r>
-        <w:t xml:space="preserve"> rating: 5*2 =&gt; 10</w:t>
+      <w:r>
+        <w:t>Danger rating: 5*2 =&gt; 10</w:t>
       </w:r>
     </w:p>
     <w:p>
@@ -5406,109 +4835,174 @@
           <w:iCs/>
           <w:lang w:val="en-US"/>
         </w:rPr>
-        <w:t xml:space="preserve">“Self-service </w:t>
-      </w:r>
-      <w:proofErr w:type="spellStart"/>
+        <w:t>“Self-service accountbeheer vermindert werklast voor IT-support [Verified Assumption]</w:t>
+      </w:r>
       <w:r>
         <w:rPr>
           <w:i/>
           <w:iCs/>
           <w:lang w:val="en-US"/>
         </w:rPr>
-        <w:t>accountbeheer</w:t>
-      </w:r>
-      <w:proofErr w:type="spellEnd"/>
-      <w:r>
-        <w:rPr>
-          <w:i/>
-          <w:iCs/>
+        <w:t>”</w:t>
+      </w:r>
+    </w:p>
+    <w:p>
+      <w:r>
+        <w:rPr>
           <w:lang w:val="en-US"/>
         </w:rPr>
         <w:t xml:space="preserve"> </w:t>
       </w:r>
-      <w:proofErr w:type="spellStart"/>
-      <w:r>
-        <w:rPr>
-          <w:i/>
-          <w:iCs/>
-          <w:lang w:val="en-US"/>
-        </w:rPr>
-        <w:t>vermindert</w:t>
-      </w:r>
-      <w:proofErr w:type="spellEnd"/>
-      <w:r>
-        <w:rPr>
-          <w:i/>
-          <w:iCs/>
-          <w:lang w:val="en-US"/>
-        </w:rPr>
+      <w:r>
+        <w:t xml:space="preserve">Alles voor deze piste is toegevoegd. Noteer of markeer </w:t>
+      </w:r>
+      <w:r>
+        <w:t xml:space="preserve">bij de laatste fortunately node dat dit een </w:t>
+      </w:r>
+      <w:r>
+        <w:rPr>
+          <w:i/>
+          <w:iCs/>
+        </w:rPr>
+        <w:t xml:space="preserve">“Verified Assumption” </w:t>
+      </w:r>
+      <w:r>
+        <w:t>is.</w:t>
+      </w:r>
+    </w:p>
+    <w:p>
+      <w:pPr>
+        <w:rPr>
+          <w:b/>
+          <w:bCs/>
+        </w:rPr>
+      </w:pPr>
+      <w:r>
+        <w:rPr>
+          <w:b/>
+          <w:bCs/>
+        </w:rPr>
+        <w:t>Taak 3:</w:t>
+      </w:r>
+    </w:p>
+    <w:p>
+      <w:r>
+        <w:t xml:space="preserve">Je ziet nog een </w:t>
+      </w:r>
+      <w:r>
+        <w:t>tak</w:t>
+      </w:r>
+      <w:r>
         <w:t xml:space="preserve"> </w:t>
       </w:r>
-      <w:proofErr w:type="spellStart"/>
-      <w:r>
-        <w:rPr>
-          <w:i/>
-          <w:iCs/>
-          <w:lang w:val="en-US"/>
-        </w:rPr>
-        <w:t>werklast</w:t>
-      </w:r>
-      <w:proofErr w:type="spellEnd"/>
-      <w:r>
-        <w:rPr>
-          <w:i/>
-          <w:iCs/>
-          <w:lang w:val="en-US"/>
-        </w:rPr>
+      <w:r>
+        <w:t>die</w:t>
+      </w:r>
+      <w:r>
+        <w:t xml:space="preserve"> je wilt bespreken met je collega’s in de volgende vergadering</w:t>
+      </w:r>
+      <w:r>
+        <w:t xml:space="preserve">, namelijk </w:t>
+      </w:r>
+      <w:r>
+        <w:t>“</w:t>
+      </w:r>
+      <w:r>
+        <w:rPr>
+          <w:i/>
+          <w:iCs/>
+        </w:rPr>
+        <w:t>Junior teamleden besluiten alle servers uit te schakelen om fraude te stoppen</w:t>
+      </w:r>
+      <w:r>
+        <w:rPr>
+          <w:i/>
+          <w:iCs/>
+        </w:rPr>
+        <w:t>”</w:t>
+      </w:r>
+      <w:r>
+        <w:t xml:space="preserve">. </w:t>
+      </w:r>
+      <w:r>
+        <w:t>Deze node is incorrect en</w:t>
+      </w:r>
+      <w:r>
+        <w:t xml:space="preserve"> hoort</w:t>
+      </w:r>
+      <w:r>
+        <w:t xml:space="preserve"> ook</w:t>
+      </w:r>
+      <w:r>
         <w:t xml:space="preserve"> </w:t>
       </w:r>
-      <w:proofErr w:type="spellStart"/>
-      <w:r>
-        <w:rPr>
-          <w:i/>
-          <w:iCs/>
-          <w:lang w:val="en-US"/>
-        </w:rPr>
-        <w:t>voor</w:t>
-      </w:r>
-      <w:proofErr w:type="spellEnd"/>
-      <w:r>
-        <w:rPr>
-          <w:i/>
-          <w:iCs/>
-          <w:lang w:val="en-US"/>
-        </w:rPr>
-        <w:t xml:space="preserve"> IT-support [Verified Assumption]</w:t>
-      </w:r>
-      <w:r>
-        <w:rPr>
-          <w:i/>
-          <w:iCs/>
-          <w:lang w:val="en-US"/>
-        </w:rPr>
-        <w:t>”</w:t>
-      </w:r>
-    </w:p>
-    <w:p>
-      <w:r>
-        <w:rPr>
-          <w:lang w:val="en-US"/>
-        </w:rPr>
+      <w:r>
+        <w:t>niet onder de classificatie van een fortunately node</w:t>
+      </w:r>
+      <w:r>
+        <w:t>.</w:t>
+      </w:r>
+      <w:r>
         <w:t xml:space="preserve"> </w:t>
       </w:r>
       <w:r>
-        <w:t xml:space="preserve">Alles voor deze piste is toegevoegd. Noteer of markeer </w:t>
-      </w:r>
-      <w:r>
-        <w:t xml:space="preserve">bij de laatste </w:t>
-      </w:r>
-      <w:proofErr w:type="spellStart"/>
-      <w:r>
-        <w:t>fortunately</w:t>
-      </w:r>
-      <w:proofErr w:type="spellEnd"/>
-      <w:r>
-        <w:t xml:space="preserve"> node dat dit een </w:t>
+        <w:t>Omdat je dit eerst wil bespreken, wil je nog geen aanpassingen doen</w:t>
+      </w:r>
+      <w:r>
+        <w:t>.</w:t>
+      </w:r>
+      <w:r>
+        <w:t xml:space="preserve"> </w:t>
+      </w:r>
+      <w:r>
+        <w:t>Zoek</w:t>
+      </w:r>
+      <w:r>
+        <w:t xml:space="preserve"> wel</w:t>
+      </w:r>
+      <w:r>
+        <w:t xml:space="preserve"> de node op en documenteer de keten van nodes vanaf de root tot aan deze specifieke node</w:t>
+      </w:r>
+      <w:r>
+        <w:t>.</w:t>
+      </w:r>
+    </w:p>
+    <w:p>
+      <w:pPr>
+        <w:rPr>
+          <w:b/>
+          <w:bCs/>
+        </w:rPr>
+      </w:pPr>
+      <w:r>
+        <w:rPr>
+          <w:b/>
+          <w:bCs/>
+        </w:rPr>
+        <w:t>Taak 4:</w:t>
+      </w:r>
+    </w:p>
+    <w:p>
+      <w:r>
+        <w:t xml:space="preserve">Daarnaast </w:t>
+      </w:r>
+      <w:r>
+        <w:t>vraag je je af</w:t>
+      </w:r>
+      <w:r>
+        <w:t xml:space="preserve"> wat er gebeurt als we het </w:t>
+      </w:r>
+      <w:r>
+        <w:t>AI fraudedetectiesysteem</w:t>
+      </w:r>
+      <w:r>
+        <w:t xml:space="preserve"> </w:t>
+      </w:r>
+      <w:r>
+        <w:t xml:space="preserve">simpelweg afstemmen om minder false negatives te hebben. Dit noteren in de tree, maakt het mogelijk om hierover te brainstormen binnen het team. </w:t>
+      </w:r>
+      <w:r>
+        <w:t xml:space="preserve">Zoek de node </w:t>
       </w:r>
       <w:r>
         <w:rPr>
@@ -5517,31 +5011,13 @@
         </w:rPr>
         <w:t>“</w:t>
       </w:r>
-      <w:proofErr w:type="spellStart"/>
-      <w:r>
-        <w:rPr>
-          <w:i/>
-          <w:iCs/>
-        </w:rPr>
-        <w:t>Verified</w:t>
-      </w:r>
-      <w:proofErr w:type="spellEnd"/>
-      <w:r>
-        <w:rPr>
-          <w:i/>
-          <w:iCs/>
-        </w:rPr>
-        <w:t xml:space="preserve"> </w:t>
-      </w:r>
-      <w:proofErr w:type="spellStart"/>
-      <w:r>
-        <w:rPr>
-          <w:i/>
-          <w:iCs/>
-        </w:rPr>
-        <w:t>Assumption</w:t>
-      </w:r>
-      <w:proofErr w:type="spellEnd"/>
+      <w:r>
+        <w:rPr>
+          <w:i/>
+          <w:iCs/>
+        </w:rPr>
+        <w:t>Hoge false positives blokkeren legitieme gebruikers</w:t>
+      </w:r>
       <w:r>
         <w:rPr>
           <w:i/>
@@ -5550,241 +5026,10 @@
         <w:t xml:space="preserve">” </w:t>
       </w:r>
       <w:r>
-        <w:t>is.</w:t>
-      </w:r>
-    </w:p>
-    <w:p>
-      <w:pPr>
-        <w:rPr>
-          <w:b/>
-          <w:bCs/>
-        </w:rPr>
-      </w:pPr>
-      <w:r>
-        <w:rPr>
-          <w:b/>
-          <w:bCs/>
-        </w:rPr>
-        <w:t>Taak 3:</w:t>
-      </w:r>
-    </w:p>
-    <w:p>
-      <w:r>
-        <w:t xml:space="preserve">Je ziet nog een </w:t>
-      </w:r>
-      <w:r>
-        <w:t>tak</w:t>
-      </w:r>
-      <w:r>
-        <w:t xml:space="preserve"> </w:t>
-      </w:r>
-      <w:r>
-        <w:t>die</w:t>
-      </w:r>
-      <w:r>
-        <w:t xml:space="preserve"> je wilt bespreken met je collega’s in de volgende vergadering</w:t>
-      </w:r>
-      <w:r>
-        <w:t xml:space="preserve">, namelijk </w:t>
-      </w:r>
-      <w:r>
-        <w:t>“</w:t>
-      </w:r>
-      <w:r>
-        <w:rPr>
-          <w:i/>
-          <w:iCs/>
-        </w:rPr>
-        <w:t>Junior teamleden besluiten alle servers uit te schakelen om fraude te stoppen</w:t>
-      </w:r>
-      <w:r>
-        <w:rPr>
-          <w:i/>
-          <w:iCs/>
-        </w:rPr>
-        <w:t>”</w:t>
-      </w:r>
-      <w:r>
-        <w:t xml:space="preserve">. </w:t>
-      </w:r>
-      <w:r>
-        <w:t>Deze node is incorrect en</w:t>
-      </w:r>
-      <w:r>
-        <w:t xml:space="preserve"> hoort</w:t>
-      </w:r>
-      <w:r>
-        <w:t xml:space="preserve"> ook</w:t>
-      </w:r>
-      <w:r>
-        <w:t xml:space="preserve"> </w:t>
-      </w:r>
-      <w:r>
-        <w:t xml:space="preserve">niet onder de classificatie van een </w:t>
-      </w:r>
-      <w:proofErr w:type="spellStart"/>
-      <w:r>
-        <w:t>fortunately</w:t>
-      </w:r>
-      <w:proofErr w:type="spellEnd"/>
-      <w:r>
-        <w:t xml:space="preserve"> node</w:t>
-      </w:r>
-      <w:r>
-        <w:t>.</w:t>
-      </w:r>
-      <w:r>
-        <w:t xml:space="preserve"> </w:t>
-      </w:r>
-      <w:r>
-        <w:t>Omdat je dit eerst wil bespreken, wil je nog geen aanpassingen doen</w:t>
-      </w:r>
-      <w:r>
-        <w:t>.</w:t>
-      </w:r>
-      <w:r>
-        <w:t xml:space="preserve"> </w:t>
-      </w:r>
-      <w:r>
-        <w:t>Zoek</w:t>
-      </w:r>
-      <w:r>
-        <w:t xml:space="preserve"> wel</w:t>
-      </w:r>
-      <w:r>
-        <w:t xml:space="preserve"> de node op en documenteer de keten van </w:t>
-      </w:r>
-      <w:proofErr w:type="spellStart"/>
-      <w:r>
-        <w:t>nodes</w:t>
-      </w:r>
-      <w:proofErr w:type="spellEnd"/>
-      <w:r>
-        <w:t xml:space="preserve"> vanaf de root tot aan deze specifieke node</w:t>
-      </w:r>
-      <w:r>
-        <w:t>.</w:t>
-      </w:r>
-    </w:p>
-    <w:p>
-      <w:pPr>
-        <w:rPr>
-          <w:b/>
-          <w:bCs/>
-        </w:rPr>
-      </w:pPr>
-      <w:r>
-        <w:rPr>
-          <w:b/>
-          <w:bCs/>
-        </w:rPr>
-        <w:t>Taak 4:</w:t>
-      </w:r>
-    </w:p>
-    <w:p>
-      <w:r>
-        <w:t xml:space="preserve">Daarnaast </w:t>
-      </w:r>
-      <w:r>
-        <w:t>vraag je je af</w:t>
-      </w:r>
-      <w:r>
-        <w:t xml:space="preserve"> wat er gebeurt als we het </w:t>
-      </w:r>
-      <w:r>
-        <w:t>AI fraudedetectiesysteem</w:t>
-      </w:r>
-      <w:r>
-        <w:t xml:space="preserve"> </w:t>
-      </w:r>
-      <w:r>
-        <w:t xml:space="preserve">simpelweg afstemmen om minder </w:t>
-      </w:r>
-      <w:proofErr w:type="spellStart"/>
-      <w:r>
-        <w:t>false</w:t>
-      </w:r>
-      <w:proofErr w:type="spellEnd"/>
-      <w:r>
-        <w:t xml:space="preserve"> </w:t>
-      </w:r>
-      <w:proofErr w:type="spellStart"/>
-      <w:r>
-        <w:t>negatives</w:t>
-      </w:r>
-      <w:proofErr w:type="spellEnd"/>
-      <w:r>
-        <w:t xml:space="preserve"> te hebben. Dit noteren in de tree, maakt het mogelijk om hierover te brainstormen binnen het team. </w:t>
-      </w:r>
-      <w:r>
-        <w:t xml:space="preserve">Zoek de node </w:t>
-      </w:r>
-      <w:r>
-        <w:rPr>
-          <w:i/>
-          <w:iCs/>
-        </w:rPr>
-        <w:t>“</w:t>
-      </w:r>
-      <w:r>
-        <w:rPr>
-          <w:i/>
-          <w:iCs/>
-        </w:rPr>
-        <w:t xml:space="preserve">Hoge </w:t>
-      </w:r>
-      <w:proofErr w:type="spellStart"/>
-      <w:r>
-        <w:rPr>
-          <w:i/>
-          <w:iCs/>
-        </w:rPr>
-        <w:t>false</w:t>
-      </w:r>
-      <w:proofErr w:type="spellEnd"/>
-      <w:r>
-        <w:rPr>
-          <w:i/>
-          <w:iCs/>
-        </w:rPr>
-        <w:t xml:space="preserve"> </w:t>
-      </w:r>
-      <w:proofErr w:type="spellStart"/>
-      <w:r>
-        <w:rPr>
-          <w:i/>
-          <w:iCs/>
-        </w:rPr>
-        <w:t>positives</w:t>
-      </w:r>
-      <w:proofErr w:type="spellEnd"/>
-      <w:r>
-        <w:rPr>
-          <w:i/>
-          <w:iCs/>
-        </w:rPr>
-        <w:t xml:space="preserve"> blokkeren legitieme gebruikers</w:t>
-      </w:r>
-      <w:r>
-        <w:rPr>
-          <w:i/>
-          <w:iCs/>
-        </w:rPr>
-        <w:t xml:space="preserve">” </w:t>
-      </w:r>
-      <w:r>
         <w:t>en voeg onder</w:t>
       </w:r>
       <w:r>
-        <w:t xml:space="preserve">staande </w:t>
-      </w:r>
-      <w:proofErr w:type="spellStart"/>
-      <w:r>
-        <w:t>nodes</w:t>
-      </w:r>
-      <w:proofErr w:type="spellEnd"/>
-      <w:r>
-        <w:t xml:space="preserve"> onder elkaar toe</w:t>
+        <w:t>staande nodes onder elkaar toe</w:t>
       </w:r>
       <w:r>
         <w:t>:</w:t>
@@ -5797,20 +5042,29 @@
           <w:numId w:val="4"/>
         </w:numPr>
       </w:pPr>
-      <w:proofErr w:type="spellStart"/>
-      <w:r>
-        <w:t>Fortunately</w:t>
-      </w:r>
-      <w:proofErr w:type="spellEnd"/>
-      <w:r>
-        <w:t xml:space="preserve">: </w:t>
-      </w:r>
-      <w:r>
-        <w:rPr>
-          <w:i/>
-          <w:iCs/>
-        </w:rPr>
-        <w:t>"Model afgestemd om gemiste fraude te verminderen"</w:t>
+      <w:r>
+        <w:t xml:space="preserve">Fortunately: </w:t>
+      </w:r>
+      <w:r>
+        <w:rPr>
+          <w:i/>
+          <w:iCs/>
+        </w:rPr>
+        <w:t>"Model afgestemd om gemiste fraude te verminderen</w:t>
+      </w:r>
+      <w:r>
+        <w:rPr>
+          <w:i/>
+          <w:iCs/>
+        </w:rPr>
+        <w:t xml:space="preserve"> [Assumption Under Review]</w:t>
+      </w:r>
+      <w:r>
+        <w:rPr>
+          <w:i/>
+          <w:iCs/>
+        </w:rPr>
+        <w:t>"</w:t>
       </w:r>
     </w:p>
     <w:p>
@@ -5820,78 +5074,23 @@
           <w:numId w:val="4"/>
         </w:numPr>
       </w:pPr>
-      <w:proofErr w:type="spellStart"/>
-      <w:r>
-        <w:t>Unfortunately</w:t>
-      </w:r>
-      <w:proofErr w:type="spellEnd"/>
-      <w:r>
-        <w:t xml:space="preserve">: </w:t>
-      </w:r>
-      <w:r>
-        <w:rPr>
-          <w:i/>
-          <w:iCs/>
-        </w:rPr>
-        <w:t xml:space="preserve">"Het terugdringen van </w:t>
-      </w:r>
-      <w:proofErr w:type="spellStart"/>
-      <w:r>
-        <w:rPr>
-          <w:i/>
-          <w:iCs/>
-        </w:rPr>
-        <w:t>false</w:t>
-      </w:r>
-      <w:proofErr w:type="spellEnd"/>
-      <w:r>
-        <w:rPr>
-          <w:i/>
-          <w:iCs/>
-        </w:rPr>
-        <w:t xml:space="preserve"> </w:t>
-      </w:r>
-      <w:proofErr w:type="spellStart"/>
-      <w:r>
-        <w:rPr>
-          <w:i/>
-          <w:iCs/>
-        </w:rPr>
-        <w:t>negatives</w:t>
-      </w:r>
-      <w:proofErr w:type="spellEnd"/>
-      <w:r>
-        <w:rPr>
-          <w:i/>
-          <w:iCs/>
-        </w:rPr>
-        <w:t xml:space="preserve"> leidt tot meer </w:t>
-      </w:r>
-      <w:proofErr w:type="spellStart"/>
-      <w:r>
-        <w:rPr>
-          <w:i/>
-          <w:iCs/>
-        </w:rPr>
-        <w:t>false</w:t>
-      </w:r>
-      <w:proofErr w:type="spellEnd"/>
-      <w:r>
-        <w:rPr>
-          <w:i/>
-          <w:iCs/>
-        </w:rPr>
-        <w:t xml:space="preserve"> </w:t>
-      </w:r>
-      <w:proofErr w:type="spellStart"/>
-      <w:r>
-        <w:rPr>
-          <w:i/>
-          <w:iCs/>
-        </w:rPr>
-        <w:t>positives</w:t>
-      </w:r>
-      <w:proofErr w:type="spellEnd"/>
+      <w:r>
+        <w:t xml:space="preserve">Unfortunately: </w:t>
+      </w:r>
+      <w:r>
+        <w:rPr>
+          <w:i/>
+          <w:iCs/>
+        </w:rPr>
+        <w:t>"Het terugdringen van false negatives leidt tot meer false positives</w:t>
+      </w:r>
+      <w:r>
+        <w:rPr>
+          <w:i/>
+          <w:iCs/>
+        </w:rPr>
+        <w:t xml:space="preserve"> [Weakness]</w:t>
+      </w:r>
       <w:r>
         <w:rPr>
           <w:i/>
@@ -5902,43 +5101,59 @@
     </w:p>
     <w:p>
       <w:pPr>
+        <w:pStyle w:val="Lijstalinea"/>
         <w:numPr>
-          <w:ilvl w:val="0"/>
+          <w:ilvl w:val="1"/>
           <w:numId w:val="4"/>
         </w:numPr>
       </w:pPr>
-      <w:proofErr w:type="spellStart"/>
-      <w:r>
-        <w:t>Fortunately</w:t>
-      </w:r>
-      <w:proofErr w:type="spellEnd"/>
-      <w:r>
-        <w:t xml:space="preserve">: </w:t>
-      </w:r>
-      <w:r>
-        <w:rPr>
-          <w:i/>
-          <w:iCs/>
-        </w:rPr>
-        <w:t>"</w:t>
-      </w:r>
-      <w:proofErr w:type="spellStart"/>
-      <w:r>
-        <w:rPr>
-          <w:i/>
-          <w:iCs/>
-        </w:rPr>
-        <w:t>Risicogebaseerde</w:t>
-      </w:r>
-      <w:proofErr w:type="spellEnd"/>
-      <w:r>
-        <w:rPr>
-          <w:i/>
-          <w:iCs/>
-        </w:rPr>
-        <w:t xml:space="preserve"> scoring helpt om urgente en laag-risico waarschuwingen te onderscheiden"</w:t>
-      </w:r>
-    </w:p>
+      <w:r>
+        <w:t>Likelyhood: 5</w:t>
+      </w:r>
+    </w:p>
+    <w:p>
+      <w:pPr>
+        <w:pStyle w:val="Lijstalinea"/>
+        <w:numPr>
+          <w:ilvl w:val="1"/>
+          <w:numId w:val="4"/>
+        </w:numPr>
+      </w:pPr>
+      <w:r>
+        <w:t xml:space="preserve">Impact: </w:t>
+      </w:r>
+      <w:r>
+        <w:t>1</w:t>
+      </w:r>
+    </w:p>
+    <w:p>
+      <w:pPr>
+        <w:pStyle w:val="Lijstalinea"/>
+        <w:numPr>
+          <w:ilvl w:val="1"/>
+          <w:numId w:val="4"/>
+        </w:numPr>
+      </w:pPr>
+      <w:r>
+        <w:t>Danger rating: 5*</w:t>
+      </w:r>
+      <w:r>
+        <w:t>1</w:t>
+      </w:r>
+      <w:r>
+        <w:t xml:space="preserve"> =&gt; </w:t>
+      </w:r>
+      <w:r>
+        <w:t>5</w:t>
+      </w:r>
+    </w:p>
+    <w:p>
+      <w:pPr>
+        <w:pStyle w:val="Lijstalinea"/>
+        <w:ind w:left="1440"/>
+      </w:pPr>
+    </w:p>
+    <w:p/>
     <w:p>
       <w:pPr>
         <w:rPr>
@@ -5946,19 +5161,49 @@
           <w:bCs/>
           <w:sz w:val="40"/>
           <w:szCs w:val="40"/>
-        </w:rPr>
-      </w:pPr>
-    </w:p>
-    <w:p>
-      <w:pPr>
+          <w:lang w:val="en-GB"/>
+        </w:rPr>
+      </w:pPr>
+      <w:r>
         <w:rPr>
           <w:b/>
           <w:bCs/>
           <w:sz w:val="40"/>
           <w:szCs w:val="40"/>
-        </w:rPr>
-      </w:pPr>
-    </w:p>
+          <w:lang w:val="en-GB"/>
+        </w:rPr>
+        <w:lastRenderedPageBreak/>
+        <w:t>User experience questionair</w:t>
+      </w:r>
+    </w:p>
+    <w:p>
+      <w:pPr>
+        <w:rPr>
+          <w:b/>
+          <w:bCs/>
+        </w:rPr>
+      </w:pPr>
+      <w:r>
+        <w:pict w14:anchorId="1EB823B3">
+          <v:rect id="_x0000_i1029" style="width:0;height:1.5pt" o:hralign="center" o:hrstd="t" o:hr="t" fillcolor="#a0a0a0" stroked="f"/>
+        </w:pict>
+      </w:r>
+    </w:p>
+    <w:p>
+      <w:r>
+        <w:t>Vul na het</w:t>
+      </w:r>
+      <w:r>
+        <w:t xml:space="preserve"> oplossen van de taken de user experience questionair in. </w:t>
+      </w:r>
+      <w:r>
+        <w:t>Wanneer je hiermee klaar bent,</w:t>
+      </w:r>
+      <w:r>
+        <w:t xml:space="preserve"> mag je de open vragen beantwoorden.</w:t>
+      </w:r>
+    </w:p>
+    <w:p/>
     <w:p>
       <w:pPr>
         <w:rPr>
@@ -5975,125 +5220,19 @@
           <w:sz w:val="40"/>
           <w:szCs w:val="40"/>
         </w:rPr>
-        <w:lastRenderedPageBreak/>
-        <w:t xml:space="preserve">User </w:t>
-      </w:r>
-      <w:proofErr w:type="spellStart"/>
-      <w:r>
-        <w:rPr>
-          <w:b/>
-          <w:bCs/>
-          <w:sz w:val="40"/>
-          <w:szCs w:val="40"/>
-        </w:rPr>
-        <w:t>experience</w:t>
-      </w:r>
-      <w:proofErr w:type="spellEnd"/>
-      <w:r>
-        <w:rPr>
-          <w:b/>
-          <w:bCs/>
-          <w:sz w:val="40"/>
-          <w:szCs w:val="40"/>
-        </w:rPr>
-        <w:t xml:space="preserve"> </w:t>
-      </w:r>
-      <w:proofErr w:type="spellStart"/>
-      <w:r>
-        <w:rPr>
-          <w:b/>
-          <w:bCs/>
-          <w:sz w:val="40"/>
-          <w:szCs w:val="40"/>
-        </w:rPr>
-        <w:t>questionair</w:t>
-      </w:r>
-      <w:proofErr w:type="spellEnd"/>
-    </w:p>
-    <w:p>
-      <w:pPr>
-        <w:rPr>
-          <w:b/>
-          <w:bCs/>
-        </w:rPr>
-      </w:pPr>
-      <w:r>
-        <w:pict w14:anchorId="1EB823B3">
-          <v:rect id="_x0000_i1034" style="width:0;height:1.5pt" o:hralign="center" o:hrstd="t" o:hr="t" fillcolor="#a0a0a0" stroked="f"/>
+        <w:t>Open vragen</w:t>
+      </w:r>
+    </w:p>
+    <w:p>
+      <w:r>
+        <w:pict w14:anchorId="595FFDA1">
+          <v:rect id="_x0000_i1030" style="width:0;height:1.5pt" o:hralign="center" o:hrstd="t" o:hr="t" fillcolor="#a0a0a0" stroked="f"/>
         </w:pict>
       </w:r>
     </w:p>
     <w:p>
       <w:r>
-        <w:t>Vul na het</w:t>
-      </w:r>
-      <w:r>
-        <w:t xml:space="preserve"> oplossen van de taken de user </w:t>
-      </w:r>
-      <w:proofErr w:type="spellStart"/>
-      <w:r>
-        <w:t>experience</w:t>
-      </w:r>
-      <w:proofErr w:type="spellEnd"/>
-      <w:r>
-        <w:t xml:space="preserve"> </w:t>
-      </w:r>
-      <w:proofErr w:type="spellStart"/>
-      <w:r>
-        <w:t>questionair</w:t>
-      </w:r>
-      <w:proofErr w:type="spellEnd"/>
-      <w:r>
-        <w:t xml:space="preserve"> in</w:t>
-      </w:r>
-      <w:r>
-        <w:t xml:space="preserve">. </w:t>
-      </w:r>
-      <w:r>
-        <w:t>Wanneer je hiermee klaar bent,</w:t>
-      </w:r>
-      <w:r>
-        <w:t xml:space="preserve"> mag je de open vragen beantwoorden.</w:t>
-      </w:r>
-    </w:p>
-    <w:p/>
-    <w:p>
-      <w:pPr>
-        <w:rPr>
-          <w:b/>
-          <w:bCs/>
-          <w:sz w:val="40"/>
-          <w:szCs w:val="40"/>
-        </w:rPr>
-      </w:pPr>
-      <w:r>
-        <w:rPr>
-          <w:b/>
-          <w:bCs/>
-          <w:sz w:val="40"/>
-          <w:szCs w:val="40"/>
-        </w:rPr>
-        <w:t>Open vragen</w:t>
-      </w:r>
-    </w:p>
-    <w:p>
-      <w:r>
-        <w:pict w14:anchorId="595FFDA1">
-          <v:rect id="_x0000_i1028" style="width:0;height:1.5pt" o:hralign="center" o:hrstd="t" o:hr="t" fillcolor="#a0a0a0" stroked="f"/>
-        </w:pict>
-      </w:r>
-    </w:p>
-    <w:p>
-      <w:r>
-        <w:t xml:space="preserve">Aan de hand van de volgende vragen, is het doel de toevoegingen ten op </w:t>
-      </w:r>
-      <w:proofErr w:type="spellStart"/>
-      <w:r>
-        <w:t>zichte</w:t>
-      </w:r>
-      <w:proofErr w:type="spellEnd"/>
-      <w:r>
-        <w:t xml:space="preserve"> van de basissoftware te bespreken.</w:t>
+        <w:t>Aan de hand van de volgende vragen, is het doel de toevoegingen ten op zichte van de basissoftware te bespreken.</w:t>
       </w:r>
     </w:p>
     <w:p>
@@ -6116,35 +5255,7 @@
         <w:rPr>
           <w:lang w:val="en-US"/>
         </w:rPr>
-        <w:t xml:space="preserve">Was de Fortunately-Unfortunately </w:t>
-      </w:r>
-      <w:proofErr w:type="spellStart"/>
-      <w:r>
-        <w:rPr>
-          <w:lang w:val="en-US"/>
-        </w:rPr>
-        <w:t>methode</w:t>
-      </w:r>
-      <w:proofErr w:type="spellEnd"/>
-      <w:r>
-        <w:rPr>
-          <w:lang w:val="en-US"/>
-        </w:rPr>
-        <w:t xml:space="preserve"> </w:t>
-      </w:r>
-      <w:proofErr w:type="spellStart"/>
-      <w:r>
-        <w:rPr>
-          <w:lang w:val="en-US"/>
-        </w:rPr>
-        <w:t>duidelijk</w:t>
-      </w:r>
-      <w:proofErr w:type="spellEnd"/>
-      <w:r>
-        <w:rPr>
-          <w:lang w:val="en-US"/>
-        </w:rPr>
-        <w:t>?</w:t>
+        <w:t>Was de Fortunately-Unfortunately methode duidelijk?</w:t>
       </w:r>
     </w:p>
     <w:p>
@@ -6273,15 +5384,7 @@
       </w:r>
       <w:r>
         <w:tab/>
-        <w:t xml:space="preserve">Notitie van altijd </w:t>
-      </w:r>
-      <w:proofErr w:type="spellStart"/>
-      <w:r>
-        <w:t>nodes</w:t>
-      </w:r>
-      <w:proofErr w:type="spellEnd"/>
-      <w:r>
-        <w:t xml:space="preserve"> per bepaalde status</w:t>
+        <w:t>Notitie van altijd nodes per bepaalde status</w:t>
       </w:r>
     </w:p>
     <w:p>
@@ -6296,15 +5399,7 @@
         <w:tab/>
       </w:r>
       <w:r>
-        <w:t xml:space="preserve">Rangschikking op basis van </w:t>
-      </w:r>
-      <w:proofErr w:type="spellStart"/>
-      <w:r>
-        <w:t>dangerrating</w:t>
-      </w:r>
-      <w:proofErr w:type="spellEnd"/>
-      <w:r>
-        <w:t xml:space="preserve"> binnen de filtering</w:t>
+        <w:t>Rangschikking op basis van dangerrating binnen de filtering</w:t>
       </w:r>
     </w:p>
     <w:p>
@@ -6349,13 +5444,8 @@
         <w:tab/>
       </w:r>
       <w:r>
-        <w:t xml:space="preserve">Tooltips bij </w:t>
-      </w:r>
-      <w:proofErr w:type="spellStart"/>
-      <w:r>
-        <w:t>hoveren</w:t>
-      </w:r>
-      <w:proofErr w:type="spellEnd"/>
+        <w:t>Tooltips bij hoveren</w:t>
+      </w:r>
     </w:p>
     <w:p>
       <w:pPr>
@@ -6372,13 +5462,10 @@
         </w:numPr>
       </w:pPr>
       <w:r>
-        <w:t xml:space="preserve">Welke onderdelen van de </w:t>
-      </w:r>
-      <w:r>
-        <w:t>uitgebreide</w:t>
-      </w:r>
-      <w:r>
-        <w:t xml:space="preserve"> tree</w:t>
+        <w:t xml:space="preserve">Welke onderdelen van </w:t>
+      </w:r>
+      <w:r>
+        <w:t>versie 1/versie 2 van de</w:t>
       </w:r>
       <w:r>
         <w:t xml:space="preserve"> software zouden volgens jou verbeterd kunnen worden?</w:t>
@@ -6414,15 +5501,7 @@
       </w:pPr>
       <w:r>
         <w:lastRenderedPageBreak/>
-        <w:t xml:space="preserve">Heb je suggesties om features op een andere manier aan te pakken of een feature die nog nuttig kan zijn om de user </w:t>
-      </w:r>
-      <w:proofErr w:type="spellStart"/>
-      <w:r>
-        <w:t>experience</w:t>
-      </w:r>
-      <w:proofErr w:type="spellEnd"/>
-      <w:r>
-        <w:t xml:space="preserve"> te verbeteren?</w:t>
+        <w:t>Heb je suggesties om features op een andere manier aan te pakken of een feature die nog nuttig kan zijn om de user experience te verbeteren?</w:t>
       </w:r>
     </w:p>
     <w:p>
@@ -6879,7 +5958,7 @@
         <w:ind w:left="720" w:hanging="360"/>
       </w:pPr>
     </w:lvl>
-    <w:lvl w:ilvl="1" w:tentative="1">
+    <w:lvl w:ilvl="1">
       <w:start w:val="1"/>
       <w:numFmt w:val="decimal"/>
       <w:lvlText w:val="%2."/>
@@ -7361,6 +6440,95 @@
     </w:lvl>
   </w:abstractNum>
   <w:abstractNum w:abstractNumId="7" w15:restartNumberingAfterBreak="0">
+    <w:nsid w:val="47281678"/>
+    <w:multiLevelType w:val="hybridMultilevel"/>
+    <w:tmpl w:val="201E6470"/>
+    <w:lvl w:ilvl="0" w:tplc="0813000F">
+      <w:start w:val="2"/>
+      <w:numFmt w:val="decimal"/>
+      <w:lvlText w:val="%1."/>
+      <w:lvlJc w:val="left"/>
+      <w:pPr>
+        <w:ind w:left="720" w:hanging="360"/>
+      </w:pPr>
+      <w:rPr>
+        <w:rFonts w:hint="default"/>
+      </w:rPr>
+    </w:lvl>
+    <w:lvl w:ilvl="1" w:tplc="08130019" w:tentative="1">
+      <w:start w:val="1"/>
+      <w:numFmt w:val="lowerLetter"/>
+      <w:lvlText w:val="%2."/>
+      <w:lvlJc w:val="left"/>
+      <w:pPr>
+        <w:ind w:left="1440" w:hanging="360"/>
+      </w:pPr>
+    </w:lvl>
+    <w:lvl w:ilvl="2" w:tplc="0813001B" w:tentative="1">
+      <w:start w:val="1"/>
+      <w:numFmt w:val="lowerRoman"/>
+      <w:lvlText w:val="%3."/>
+      <w:lvlJc w:val="right"/>
+      <w:pPr>
+        <w:ind w:left="2160" w:hanging="180"/>
+      </w:pPr>
+    </w:lvl>
+    <w:lvl w:ilvl="3" w:tplc="0813000F" w:tentative="1">
+      <w:start w:val="1"/>
+      <w:numFmt w:val="decimal"/>
+      <w:lvlText w:val="%4."/>
+      <w:lvlJc w:val="left"/>
+      <w:pPr>
+        <w:ind w:left="2880" w:hanging="360"/>
+      </w:pPr>
+    </w:lvl>
+    <w:lvl w:ilvl="4" w:tplc="08130019" w:tentative="1">
+      <w:start w:val="1"/>
+      <w:numFmt w:val="lowerLetter"/>
+      <w:lvlText w:val="%5."/>
+      <w:lvlJc w:val="left"/>
+      <w:pPr>
+        <w:ind w:left="3600" w:hanging="360"/>
+      </w:pPr>
+    </w:lvl>
+    <w:lvl w:ilvl="5" w:tplc="0813001B" w:tentative="1">
+      <w:start w:val="1"/>
+      <w:numFmt w:val="lowerRoman"/>
+      <w:lvlText w:val="%6."/>
+      <w:lvlJc w:val="right"/>
+      <w:pPr>
+        <w:ind w:left="4320" w:hanging="180"/>
+      </w:pPr>
+    </w:lvl>
+    <w:lvl w:ilvl="6" w:tplc="0813000F" w:tentative="1">
+      <w:start w:val="1"/>
+      <w:numFmt w:val="decimal"/>
+      <w:lvlText w:val="%7."/>
+      <w:lvlJc w:val="left"/>
+      <w:pPr>
+        <w:ind w:left="5040" w:hanging="360"/>
+      </w:pPr>
+    </w:lvl>
+    <w:lvl w:ilvl="7" w:tplc="08130019" w:tentative="1">
+      <w:start w:val="1"/>
+      <w:numFmt w:val="lowerLetter"/>
+      <w:lvlText w:val="%8."/>
+      <w:lvlJc w:val="left"/>
+      <w:pPr>
+        <w:ind w:left="5760" w:hanging="360"/>
+      </w:pPr>
+    </w:lvl>
+    <w:lvl w:ilvl="8" w:tplc="0813001B" w:tentative="1">
+      <w:start w:val="1"/>
+      <w:numFmt w:val="lowerRoman"/>
+      <w:lvlText w:val="%9."/>
+      <w:lvlJc w:val="right"/>
+      <w:pPr>
+        <w:ind w:left="6480" w:hanging="180"/>
+      </w:pPr>
+    </w:lvl>
+  </w:abstractNum>
+  <w:abstractNum w:abstractNumId="8" w15:restartNumberingAfterBreak="0">
     <w:nsid w:val="4C505EE6"/>
     <w:multiLevelType w:val="multilevel"/>
     <w:tmpl w:val="CD8C0404"/>
@@ -7509,7 +6677,7 @@
       </w:rPr>
     </w:lvl>
   </w:abstractNum>
-  <w:abstractNum w:abstractNumId="8" w15:restartNumberingAfterBreak="0">
+  <w:abstractNum w:abstractNumId="9" w15:restartNumberingAfterBreak="0">
     <w:nsid w:val="595561D0"/>
     <w:multiLevelType w:val="multilevel"/>
     <w:tmpl w:val="52FE5DC4"/>
@@ -7658,7 +6826,7 @@
       </w:rPr>
     </w:lvl>
   </w:abstractNum>
-  <w:abstractNum w:abstractNumId="9" w15:restartNumberingAfterBreak="0">
+  <w:abstractNum w:abstractNumId="10" w15:restartNumberingAfterBreak="0">
     <w:nsid w:val="5B8C5BD4"/>
     <w:multiLevelType w:val="multilevel"/>
     <w:tmpl w:val="1C02C7F8"/>
@@ -7807,7 +6975,7 @@
       </w:rPr>
     </w:lvl>
   </w:abstractNum>
-  <w:abstractNum w:abstractNumId="10" w15:restartNumberingAfterBreak="0">
+  <w:abstractNum w:abstractNumId="11" w15:restartNumberingAfterBreak="0">
     <w:nsid w:val="5ED42C02"/>
     <w:multiLevelType w:val="hybridMultilevel"/>
     <w:tmpl w:val="28D279AC"/>
@@ -7893,7 +7061,7 @@
       </w:pPr>
     </w:lvl>
   </w:abstractNum>
-  <w:abstractNum w:abstractNumId="11" w15:restartNumberingAfterBreak="0">
+  <w:abstractNum w:abstractNumId="12" w15:restartNumberingAfterBreak="0">
     <w:nsid w:val="6ABC7822"/>
     <w:multiLevelType w:val="multilevel"/>
     <w:tmpl w:val="16ECD3CC"/>
@@ -8042,7 +7210,7 @@
       </w:rPr>
     </w:lvl>
   </w:abstractNum>
-  <w:abstractNum w:abstractNumId="12" w15:restartNumberingAfterBreak="0">
+  <w:abstractNum w:abstractNumId="13" w15:restartNumberingAfterBreak="0">
     <w:nsid w:val="72410411"/>
     <w:multiLevelType w:val="hybridMultilevel"/>
     <w:tmpl w:val="6A583CEE"/>
@@ -8129,7 +7297,7 @@
     </w:lvl>
   </w:abstractNum>
   <w:num w:numId="1" w16cid:durableId="1597056493">
-    <w:abstractNumId w:val="11"/>
+    <w:abstractNumId w:val="12"/>
   </w:num>
   <w:num w:numId="2" w16cid:durableId="572853758">
     <w:abstractNumId w:val="5"/>
@@ -8144,16 +7312,16 @@
     <w:abstractNumId w:val="0"/>
   </w:num>
   <w:num w:numId="6" w16cid:durableId="1382703639">
-    <w:abstractNumId w:val="8"/>
+    <w:abstractNumId w:val="9"/>
   </w:num>
   <w:num w:numId="7" w16cid:durableId="37903986">
-    <w:abstractNumId w:val="9"/>
+    <w:abstractNumId w:val="10"/>
   </w:num>
   <w:num w:numId="8" w16cid:durableId="2097021643">
     <w:abstractNumId w:val="1"/>
   </w:num>
   <w:num w:numId="9" w16cid:durableId="678240155">
-    <w:abstractNumId w:val="7"/>
+    <w:abstractNumId w:val="8"/>
   </w:num>
   <w:num w:numId="10" w16cid:durableId="2037274023">
     <w:abstractNumId w:val="6"/>
@@ -8162,10 +7330,13 @@
     <w:abstractNumId w:val="4"/>
   </w:num>
   <w:num w:numId="12" w16cid:durableId="376242538">
-    <w:abstractNumId w:val="10"/>
+    <w:abstractNumId w:val="11"/>
   </w:num>
   <w:num w:numId="13" w16cid:durableId="374088945">
-    <w:abstractNumId w:val="12"/>
+    <w:abstractNumId w:val="13"/>
+  </w:num>
+  <w:num w:numId="14" w16cid:durableId="1307390238">
+    <w:abstractNumId w:val="7"/>
   </w:num>
 </w:numbering>
 </file>
@@ -8773,6 +7944,7 @@
   <w:style w:type="character" w:default="1" w:styleId="Standaardalinea-lettertype">
     <w:name w:val="Default Paragraph Font"/>
     <w:uiPriority w:val="1"/>
+    <w:semiHidden/>
     <w:unhideWhenUsed/>
   </w:style>
   <w:style w:type="table" w:default="1" w:styleId="Standaardtabel">

</xml_diff>

<commit_message>
last changes to userstudy added to rep
</commit_message>
<xml_diff>
--- a/userstudy_case.docx
+++ b/userstudy_case.docx
@@ -495,6 +495,198 @@
         </w:rPr>
         <w:lastRenderedPageBreak/>
         <w:t>Demografische gegevens</w:t>
+      </w:r>
+    </w:p>
+    <w:p>
+      <w:pPr>
+        <w:spacing w:before="100" w:beforeAutospacing="1" w:after="100" w:afterAutospacing="1" w:line="240" w:lineRule="auto"/>
+        <w:rPr>
+          <w:rFonts w:eastAsia="Times New Roman" w:cs="Times New Roman"/>
+          <w:b/>
+          <w:bCs/>
+          <w:kern w:val="0"/>
+          <w:lang w:eastAsia="nl-BE"/>
+          <w14:ligatures w14:val="none"/>
+        </w:rPr>
+      </w:pPr>
+      <w:r>
+        <w:rPr>
+          <w:rFonts w:eastAsia="Times New Roman" w:cs="Times New Roman"/>
+          <w:b/>
+          <w:bCs/>
+          <w:kern w:val="0"/>
+          <w:lang w:eastAsia="nl-BE"/>
+          <w14:ligatures w14:val="none"/>
+        </w:rPr>
+        <w:t>Naam:</w:t>
+      </w:r>
+      <w:r>
+        <w:rPr>
+          <w:rFonts w:eastAsia="Times New Roman" w:cs="Times New Roman"/>
+          <w:b/>
+          <w:bCs/>
+          <w:i/>
+          <w:iCs/>
+          <w:kern w:val="0"/>
+          <w:u w:val="single"/>
+          <w:lang w:eastAsia="nl-BE"/>
+          <w14:ligatures w14:val="none"/>
+        </w:rPr>
+        <w:t xml:space="preserve"> </w:t>
+      </w:r>
+      <w:r>
+        <w:rPr>
+          <w:rFonts w:eastAsia="Times New Roman" w:cs="Times New Roman"/>
+          <w:b/>
+          <w:bCs/>
+          <w:i/>
+          <w:iCs/>
+          <w:kern w:val="0"/>
+          <w:u w:val="single"/>
+          <w:lang w:eastAsia="nl-BE"/>
+          <w14:ligatures w14:val="none"/>
+        </w:rPr>
+        <w:tab/>
+      </w:r>
+      <w:r>
+        <w:rPr>
+          <w:rFonts w:eastAsia="Times New Roman" w:cs="Times New Roman"/>
+          <w:b/>
+          <w:bCs/>
+          <w:i/>
+          <w:iCs/>
+          <w:kern w:val="0"/>
+          <w:u w:val="single"/>
+          <w:lang w:eastAsia="nl-BE"/>
+          <w14:ligatures w14:val="none"/>
+        </w:rPr>
+        <w:tab/>
+      </w:r>
+      <w:r>
+        <w:rPr>
+          <w:rFonts w:eastAsia="Times New Roman" w:cs="Times New Roman"/>
+          <w:b/>
+          <w:bCs/>
+          <w:i/>
+          <w:iCs/>
+          <w:kern w:val="0"/>
+          <w:u w:val="single"/>
+          <w:lang w:eastAsia="nl-BE"/>
+          <w14:ligatures w14:val="none"/>
+        </w:rPr>
+        <w:tab/>
+      </w:r>
+      <w:r>
+        <w:rPr>
+          <w:rFonts w:eastAsia="Times New Roman" w:cs="Times New Roman"/>
+          <w:b/>
+          <w:bCs/>
+          <w:i/>
+          <w:iCs/>
+          <w:kern w:val="0"/>
+          <w:u w:val="single"/>
+          <w:lang w:eastAsia="nl-BE"/>
+          <w14:ligatures w14:val="none"/>
+        </w:rPr>
+        <w:tab/>
+      </w:r>
+      <w:r>
+        <w:rPr>
+          <w:rFonts w:eastAsia="Times New Roman" w:cs="Times New Roman"/>
+          <w:b/>
+          <w:bCs/>
+          <w:i/>
+          <w:iCs/>
+          <w:kern w:val="0"/>
+          <w:u w:val="single"/>
+          <w:lang w:eastAsia="nl-BE"/>
+          <w14:ligatures w14:val="none"/>
+        </w:rPr>
+        <w:tab/>
+      </w:r>
+      <w:r>
+        <w:rPr>
+          <w:rFonts w:eastAsia="Times New Roman" w:cs="Times New Roman"/>
+          <w:b/>
+          <w:bCs/>
+          <w:i/>
+          <w:iCs/>
+          <w:kern w:val="0"/>
+          <w:u w:val="single"/>
+          <w:lang w:eastAsia="nl-BE"/>
+          <w14:ligatures w14:val="none"/>
+        </w:rPr>
+        <w:tab/>
+      </w:r>
+      <w:r>
+        <w:rPr>
+          <w:rFonts w:eastAsia="Times New Roman" w:cs="Times New Roman"/>
+          <w:b/>
+          <w:bCs/>
+          <w:i/>
+          <w:iCs/>
+          <w:kern w:val="0"/>
+          <w:u w:val="single"/>
+          <w:lang w:eastAsia="nl-BE"/>
+          <w14:ligatures w14:val="none"/>
+        </w:rPr>
+        <w:tab/>
+      </w:r>
+      <w:r>
+        <w:rPr>
+          <w:rFonts w:eastAsia="Times New Roman" w:cs="Times New Roman"/>
+          <w:b/>
+          <w:bCs/>
+          <w:i/>
+          <w:iCs/>
+          <w:kern w:val="0"/>
+          <w:u w:val="single"/>
+          <w:lang w:eastAsia="nl-BE"/>
+          <w14:ligatures w14:val="none"/>
+        </w:rPr>
+        <w:tab/>
+      </w:r>
+      <w:r>
+        <w:rPr>
+          <w:rFonts w:eastAsia="Times New Roman" w:cs="Times New Roman"/>
+          <w:b/>
+          <w:bCs/>
+          <w:i/>
+          <w:iCs/>
+          <w:kern w:val="0"/>
+          <w:u w:val="single"/>
+          <w:lang w:eastAsia="nl-BE"/>
+          <w14:ligatures w14:val="none"/>
+        </w:rPr>
+        <w:tab/>
+      </w:r>
+      <w:r>
+        <w:rPr>
+          <w:rFonts w:eastAsia="Times New Roman" w:cs="Times New Roman"/>
+          <w:b/>
+          <w:bCs/>
+          <w:i/>
+          <w:iCs/>
+          <w:kern w:val="0"/>
+          <w:u w:val="single"/>
+          <w:lang w:eastAsia="nl-BE"/>
+          <w14:ligatures w14:val="none"/>
+        </w:rPr>
+        <w:tab/>
+      </w:r>
+      <w:r>
+        <w:rPr>
+          <w:rFonts w:eastAsia="Times New Roman" w:cs="Times New Roman"/>
+          <w:b/>
+          <w:bCs/>
+          <w:i/>
+          <w:iCs/>
+          <w:kern w:val="0"/>
+          <w:u w:val="single"/>
+          <w:lang w:eastAsia="nl-BE"/>
+          <w14:ligatures w14:val="none"/>
+        </w:rPr>
+        <w:tab/>
       </w:r>
     </w:p>
     <w:p>
@@ -3184,7 +3376,7 @@
           <w:noProof/>
         </w:rPr>
         <w:drawing>
-          <wp:inline distT="0" distB="0" distL="0" distR="0" wp14:anchorId="459308C6" wp14:editId="3A86028B">
+          <wp:inline distT="0" distB="0" distL="0" distR="0" wp14:anchorId="459308C6" wp14:editId="0DABD9B2">
             <wp:extent cx="5760720" cy="3239135"/>
             <wp:effectExtent l="0" t="0" r="0" b="0"/>
             <wp:docPr id="744949087" name="Afbeelding 1" descr="Afbeelding met tekst, schermopname, Lettertype, nummer&#10;&#10;Door AI gegenereerde inhoud is mogelijk onjuist."/>
@@ -3413,7 +3605,43 @@
         <w:t>versie 1/versie 2 van de software</w:t>
       </w:r>
       <w:r>
-        <w:t xml:space="preserve"> en bekijk de software even. Begin hierna aan het eerste scenario.</w:t>
+        <w:t xml:space="preserve"> </w:t>
+      </w:r>
+      <w:r>
+        <w:t xml:space="preserve">en </w:t>
+      </w:r>
+      <w:r>
+        <w:t>laad</w:t>
+      </w:r>
+      <w:r>
+        <w:t xml:space="preserve"> story 1</w:t>
+      </w:r>
+      <w:r>
+        <w:t>/story 2</w:t>
+      </w:r>
+      <w:r>
+        <w:t>.</w:t>
+      </w:r>
+      <w:r>
+        <w:t xml:space="preserve"> </w:t>
+      </w:r>
+      <w:r>
+        <w:t>B</w:t>
+      </w:r>
+      <w:r>
+        <w:t>ekijk de software even</w:t>
+      </w:r>
+      <w:r>
+        <w:t xml:space="preserve"> en b</w:t>
+      </w:r>
+      <w:r>
+        <w:t>egin hierna aan het eerste</w:t>
+      </w:r>
+      <w:r>
+        <w:t>/tweede</w:t>
+      </w:r>
+      <w:r>
+        <w:t xml:space="preserve"> scenario.</w:t>
       </w:r>
       <w:r>
         <w:rPr>
@@ -3935,7 +4163,13 @@
         <w:t>. Zoek de volgende informatie</w:t>
       </w:r>
       <w:r>
-        <w:t xml:space="preserve"> (je mag bij het opsommen stoppen na de eerste 4 woorden van de node)</w:t>
+        <w:t xml:space="preserve"> (je mag bij het opsommen stoppen na de eerste </w:t>
+      </w:r>
+      <w:r>
+        <w:t>3</w:t>
+      </w:r>
+      <w:r>
+        <w:t xml:space="preserve"> woorden van de node)</w:t>
       </w:r>
       <w:r>
         <w:t>:</w:t>
@@ -4063,6 +4297,11 @@
     </w:p>
     <w:p>
       <w:pPr>
+        <w:ind w:left="360"/>
+      </w:pPr>
+    </w:p>
+    <w:p>
+      <w:pPr>
         <w:pStyle w:val="Lijstalinea"/>
       </w:pPr>
     </w:p>
@@ -4130,7 +4369,23 @@
         <w:t>.</w:t>
       </w:r>
     </w:p>
-    <w:p/>
+    <w:p>
+      <w:pPr>
+        <w:ind w:left="360" w:firstLine="348"/>
+      </w:pPr>
+      <w:r>
+        <w:t>_____</w:t>
+      </w:r>
+    </w:p>
+    <w:p>
+      <w:pPr>
+        <w:ind w:left="360"/>
+        <w:rPr>
+          <w:b/>
+          <w:bCs/>
+        </w:rPr>
+      </w:pPr>
+    </w:p>
     <w:p>
       <w:pPr>
         <w:rPr>
@@ -4165,7 +4420,34 @@
         <w:t xml:space="preserve"> worden binnen het team. </w:t>
       </w:r>
       <w:r>
-        <w:t xml:space="preserve">Selecteer twee elementen in de tree die eindigen op een </w:t>
+        <w:t>Kies</w:t>
+      </w:r>
+      <w:r>
+        <w:t xml:space="preserve"> </w:t>
+      </w:r>
+      <w:r>
+        <w:t>een</w:t>
+      </w:r>
+      <w:r>
+        <w:t xml:space="preserve"> </w:t>
+      </w:r>
+      <w:r>
+        <w:t>branch</w:t>
+      </w:r>
+      <w:r>
+        <w:t xml:space="preserve"> in de tree </w:t>
+      </w:r>
+      <w:r>
+        <w:t>dat</w:t>
+      </w:r>
+      <w:r>
+        <w:t xml:space="preserve"> eindig</w:t>
+      </w:r>
+      <w:r>
+        <w:t xml:space="preserve">t </w:t>
+      </w:r>
+      <w:r>
+        <w:t xml:space="preserve">op een </w:t>
       </w:r>
       <w:r>
         <w:t>“</w:t>
@@ -4198,10 +4480,6 @@
         <w:t xml:space="preserve"> om samen te vatten welke stappen nodig zijn voor implementatie.</w:t>
       </w:r>
     </w:p>
-    <w:p/>
-    <w:p/>
-    <w:p/>
-    <w:p/>
     <w:p>
       <w:pPr>
         <w:rPr>
@@ -4218,6 +4496,7 @@
           <w:sz w:val="40"/>
           <w:szCs w:val="40"/>
         </w:rPr>
+        <w:lastRenderedPageBreak/>
         <w:t>User experience questionair</w:t>
       </w:r>
     </w:p>
@@ -4235,6 +4514,47 @@
       </w:r>
     </w:p>
     <w:p>
+      <w:r>
+        <w:t>Vul na het</w:t>
+      </w:r>
+      <w:r>
+        <w:t xml:space="preserve"> oplossen van de taken de user experience questionair in. </w:t>
+      </w:r>
+      <w:r>
+        <w:t>Wanneer je hiermee klaar bent,</w:t>
+      </w:r>
+      <w:r>
+        <w:t xml:space="preserve"> mag je </w:t>
+      </w:r>
+      <w:r>
+        <w:t>versie 1/versie 2 van de software openen</w:t>
+      </w:r>
+      <w:r>
+        <w:t xml:space="preserve"> en </w:t>
+      </w:r>
+      <w:r>
+        <w:t>story 1/story 2</w:t>
+      </w:r>
+      <w:r>
+        <w:t xml:space="preserve"> inladen</w:t>
+      </w:r>
+      <w:r>
+        <w:t xml:space="preserve">. Begin </w:t>
+      </w:r>
+      <w:r>
+        <w:t xml:space="preserve">met de software even te bekijken en start </w:t>
+      </w:r>
+      <w:r>
+        <w:t xml:space="preserve">hierna aan het </w:t>
+      </w:r>
+      <w:r>
+        <w:t>eerste/</w:t>
+      </w:r>
+      <w:r>
+        <w:t>tweede scenario.</w:t>
+      </w:r>
+    </w:p>
+    <w:p>
       <w:pPr>
         <w:rPr>
           <w:color w:val="FF0000"/>
@@ -4243,29 +4563,153 @@
         </w:rPr>
       </w:pPr>
       <w:r>
-        <w:t>Vul na het</w:t>
-      </w:r>
-      <w:r>
-        <w:t xml:space="preserve"> oplossen van de taken de user experience questionair in. </w:t>
-      </w:r>
-      <w:r>
-        <w:t>Wanneer je hiermee klaar bent,</w:t>
-      </w:r>
-      <w:r>
-        <w:t xml:space="preserve"> mag je </w:t>
-      </w:r>
-      <w:r>
-        <w:t>versie 1/versie 2 van de software openen</w:t>
-      </w:r>
-      <w:r>
-        <w:t xml:space="preserve"> en kort de software bekijken. Begin hierna aan het tweede scenario.</w:t>
-      </w:r>
-      <w:r>
-        <w:rPr>
+        <w:rPr>
+          <w:noProof/>
           <w:color w:val="FF0000"/>
           <w:sz w:val="40"/>
           <w:szCs w:val="40"/>
         </w:rPr>
+        <w:drawing>
+          <wp:anchor distT="0" distB="0" distL="114300" distR="114300" simplePos="0" relativeHeight="251669504" behindDoc="1" locked="0" layoutInCell="1" allowOverlap="1" wp14:anchorId="4AA84E1C" wp14:editId="5A9D7521">
+            <wp:simplePos x="0" y="0"/>
+            <wp:positionH relativeFrom="margin">
+              <wp:align>center</wp:align>
+            </wp:positionH>
+            <wp:positionV relativeFrom="paragraph">
+              <wp:posOffset>2620010</wp:posOffset>
+            </wp:positionV>
+            <wp:extent cx="3860800" cy="4742373"/>
+            <wp:effectExtent l="0" t="0" r="6350" b="1270"/>
+            <wp:wrapTight wrapText="bothSides">
+              <wp:wrapPolygon edited="0">
+                <wp:start x="0" y="0"/>
+                <wp:lineTo x="0" y="21519"/>
+                <wp:lineTo x="21529" y="21519"/>
+                <wp:lineTo x="21529" y="0"/>
+                <wp:lineTo x="0" y="0"/>
+              </wp:wrapPolygon>
+            </wp:wrapTight>
+            <wp:docPr id="925991702" name="Afbeelding 1" descr="Afbeelding met tekst, schermopname, menu, document&#10;&#10;Door AI gegenereerde inhoud is mogelijk onjuist."/>
+            <wp:cNvGraphicFramePr>
+              <a:graphicFrameLocks xmlns:a="http://schemas.openxmlformats.org/drawingml/2006/main" noChangeAspect="1"/>
+            </wp:cNvGraphicFramePr>
+            <a:graphic xmlns:a="http://schemas.openxmlformats.org/drawingml/2006/main">
+              <a:graphicData uri="http://schemas.openxmlformats.org/drawingml/2006/picture">
+                <pic:pic xmlns:pic="http://schemas.openxmlformats.org/drawingml/2006/picture">
+                  <pic:nvPicPr>
+                    <pic:cNvPr id="925991702" name="Afbeelding 1" descr="Afbeelding met tekst, schermopname, menu, document&#10;&#10;Door AI gegenereerde inhoud is mogelijk onjuist."/>
+                    <pic:cNvPicPr/>
+                  </pic:nvPicPr>
+                  <pic:blipFill>
+                    <a:blip r:embed="rId8">
+                      <a:extLst>
+                        <a:ext uri="{28A0092B-C50C-407E-A947-70E740481C1C}">
+                          <a14:useLocalDpi xmlns:a14="http://schemas.microsoft.com/office/drawing/2010/main" val="0"/>
+                        </a:ext>
+                      </a:extLst>
+                    </a:blip>
+                    <a:stretch>
+                      <a:fillRect/>
+                    </a:stretch>
+                  </pic:blipFill>
+                  <pic:spPr>
+                    <a:xfrm>
+                      <a:off x="0" y="0"/>
+                      <a:ext cx="3860800" cy="4742373"/>
+                    </a:xfrm>
+                    <a:prstGeom prst="rect">
+                      <a:avLst/>
+                    </a:prstGeom>
+                  </pic:spPr>
+                </pic:pic>
+              </a:graphicData>
+            </a:graphic>
+            <wp14:sizeRelH relativeFrom="margin">
+              <wp14:pctWidth>0</wp14:pctWidth>
+            </wp14:sizeRelH>
+            <wp14:sizeRelV relativeFrom="margin">
+              <wp14:pctHeight>0</wp14:pctHeight>
+            </wp14:sizeRelV>
+          </wp:anchor>
+        </w:drawing>
+      </w:r>
+      <w:r>
+        <w:rPr>
+          <w:noProof/>
+          <w:color w:val="FF0000"/>
+          <w:sz w:val="40"/>
+          <w:szCs w:val="40"/>
+        </w:rPr>
+        <w:drawing>
+          <wp:anchor distT="0" distB="0" distL="114300" distR="114300" simplePos="0" relativeHeight="251668480" behindDoc="1" locked="0" layoutInCell="1" allowOverlap="1" wp14:anchorId="31B7342D" wp14:editId="77C58870">
+            <wp:simplePos x="0" y="0"/>
+            <wp:positionH relativeFrom="margin">
+              <wp:align>center</wp:align>
+            </wp:positionH>
+            <wp:positionV relativeFrom="paragraph">
+              <wp:posOffset>12700</wp:posOffset>
+            </wp:positionV>
+            <wp:extent cx="3740785" cy="2552700"/>
+            <wp:effectExtent l="0" t="0" r="0" b="0"/>
+            <wp:wrapTight wrapText="bothSides">
+              <wp:wrapPolygon edited="0">
+                <wp:start x="0" y="0"/>
+                <wp:lineTo x="0" y="21439"/>
+                <wp:lineTo x="21450" y="21439"/>
+                <wp:lineTo x="21450" y="0"/>
+                <wp:lineTo x="0" y="0"/>
+              </wp:wrapPolygon>
+            </wp:wrapTight>
+            <wp:docPr id="573775687" name="Afbeelding 1" descr="Afbeelding met tekst, schermopname, Lettertype, document&#10;&#10;Door AI gegenereerde inhoud is mogelijk onjuist."/>
+            <wp:cNvGraphicFramePr>
+              <a:graphicFrameLocks xmlns:a="http://schemas.openxmlformats.org/drawingml/2006/main" noChangeAspect="1"/>
+            </wp:cNvGraphicFramePr>
+            <a:graphic xmlns:a="http://schemas.openxmlformats.org/drawingml/2006/main">
+              <a:graphicData uri="http://schemas.openxmlformats.org/drawingml/2006/picture">
+                <pic:pic xmlns:pic="http://schemas.openxmlformats.org/drawingml/2006/picture">
+                  <pic:nvPicPr>
+                    <pic:cNvPr id="573775687" name="Afbeelding 1" descr="Afbeelding met tekst, schermopname, Lettertype, document&#10;&#10;Door AI gegenereerde inhoud is mogelijk onjuist."/>
+                    <pic:cNvPicPr/>
+                  </pic:nvPicPr>
+                  <pic:blipFill>
+                    <a:blip r:embed="rId9">
+                      <a:extLst>
+                        <a:ext uri="{28A0092B-C50C-407E-A947-70E740481C1C}">
+                          <a14:useLocalDpi xmlns:a14="http://schemas.microsoft.com/office/drawing/2010/main" val="0"/>
+                        </a:ext>
+                      </a:extLst>
+                    </a:blip>
+                    <a:stretch>
+                      <a:fillRect/>
+                    </a:stretch>
+                  </pic:blipFill>
+                  <pic:spPr>
+                    <a:xfrm>
+                      <a:off x="0" y="0"/>
+                      <a:ext cx="3740785" cy="2552700"/>
+                    </a:xfrm>
+                    <a:prstGeom prst="rect">
+                      <a:avLst/>
+                    </a:prstGeom>
+                  </pic:spPr>
+                </pic:pic>
+              </a:graphicData>
+            </a:graphic>
+            <wp14:sizeRelH relativeFrom="margin">
+              <wp14:pctWidth>0</wp14:pctWidth>
+            </wp14:sizeRelH>
+            <wp14:sizeRelV relativeFrom="margin">
+              <wp14:pctHeight>0</wp14:pctHeight>
+            </wp14:sizeRelV>
+          </wp:anchor>
+        </w:drawing>
+      </w:r>
+      <w:r>
+        <w:rPr>
+          <w:color w:val="FF0000"/>
+          <w:sz w:val="40"/>
+          <w:szCs w:val="40"/>
+        </w:rPr>
         <w:br w:type="page"/>
       </w:r>
     </w:p>
@@ -4331,7 +4775,13 @@
         <w:t xml:space="preserve">Voor je begint aan het verder uitwerken van de tree, wil je verkennen hoever ze voorlopig al staan. </w:t>
       </w:r>
       <w:r>
-        <w:t>Lijst de volgende informatie op:</w:t>
+        <w:t>Lijst de volgende informatie op</w:t>
+      </w:r>
+      <w:r>
+        <w:t xml:space="preserve"> (je mag bij het opsommen stoppen na de eerste 3 woorden van de node)</w:t>
+      </w:r>
+      <w:r>
+        <w:t>:</w:t>
       </w:r>
     </w:p>
     <w:p>
@@ -4556,6 +5006,8 @@
     <w:p/>
     <w:p/>
     <w:p/>
+    <w:p/>
+    <w:p/>
     <w:p>
       <w:pPr>
         <w:pStyle w:val="Lijstalinea"/>
@@ -4611,27 +5063,12 @@
           <w:lang w:val="en-US"/>
         </w:rPr>
       </w:pPr>
-    </w:p>
-    <w:p>
-      <w:pPr>
+      <w:r>
         <w:rPr>
           <w:lang w:val="en-US"/>
         </w:rPr>
-      </w:pPr>
-    </w:p>
-    <w:p>
-      <w:pPr>
-        <w:rPr>
-          <w:lang w:val="en-US"/>
-        </w:rPr>
-      </w:pPr>
-    </w:p>
-    <w:p>
-      <w:pPr>
-        <w:rPr>
-          <w:lang w:val="en-US"/>
-        </w:rPr>
-      </w:pPr>
+        <w:t>____</w:t>
+      </w:r>
     </w:p>
     <w:p>
       <w:pPr>
@@ -5203,6 +5640,81 @@
         <w:t xml:space="preserve"> mag je de open vragen beantwoorden.</w:t>
       </w:r>
     </w:p>
+    <w:p>
+      <w:r>
+        <w:rPr>
+          <w:noProof/>
+        </w:rPr>
+        <w:drawing>
+          <wp:anchor distT="0" distB="0" distL="114300" distR="114300" simplePos="0" relativeHeight="251670528" behindDoc="1" locked="0" layoutInCell="1" allowOverlap="1" wp14:anchorId="74189814" wp14:editId="1B405369">
+            <wp:simplePos x="0" y="0"/>
+            <wp:positionH relativeFrom="margin">
+              <wp:align>center</wp:align>
+            </wp:positionH>
+            <wp:positionV relativeFrom="paragraph">
+              <wp:posOffset>7832</wp:posOffset>
+            </wp:positionV>
+            <wp:extent cx="3666490" cy="4504055"/>
+            <wp:effectExtent l="0" t="0" r="0" b="0"/>
+            <wp:wrapTight wrapText="bothSides">
+              <wp:wrapPolygon edited="0">
+                <wp:start x="0" y="0"/>
+                <wp:lineTo x="0" y="21469"/>
+                <wp:lineTo x="21435" y="21469"/>
+                <wp:lineTo x="21435" y="0"/>
+                <wp:lineTo x="0" y="0"/>
+              </wp:wrapPolygon>
+            </wp:wrapTight>
+            <wp:docPr id="1542490116" name="Afbeelding 1" descr="Afbeelding met tekst, schermopname, menu, document&#10;&#10;Door AI gegenereerde inhoud is mogelijk onjuist."/>
+            <wp:cNvGraphicFramePr>
+              <a:graphicFrameLocks xmlns:a="http://schemas.openxmlformats.org/drawingml/2006/main" noChangeAspect="1"/>
+            </wp:cNvGraphicFramePr>
+            <a:graphic xmlns:a="http://schemas.openxmlformats.org/drawingml/2006/main">
+              <a:graphicData uri="http://schemas.openxmlformats.org/drawingml/2006/picture">
+                <pic:pic xmlns:pic="http://schemas.openxmlformats.org/drawingml/2006/picture">
+                  <pic:nvPicPr>
+                    <pic:cNvPr id="1542490116" name="Afbeelding 1" descr="Afbeelding met tekst, schermopname, menu, document&#10;&#10;Door AI gegenereerde inhoud is mogelijk onjuist."/>
+                    <pic:cNvPicPr/>
+                  </pic:nvPicPr>
+                  <pic:blipFill>
+                    <a:blip r:embed="rId8">
+                      <a:extLst>
+                        <a:ext uri="{28A0092B-C50C-407E-A947-70E740481C1C}">
+                          <a14:useLocalDpi xmlns:a14="http://schemas.microsoft.com/office/drawing/2010/main" val="0"/>
+                        </a:ext>
+                      </a:extLst>
+                    </a:blip>
+                    <a:stretch>
+                      <a:fillRect/>
+                    </a:stretch>
+                  </pic:blipFill>
+                  <pic:spPr>
+                    <a:xfrm>
+                      <a:off x="0" y="0"/>
+                      <a:ext cx="3666490" cy="4504055"/>
+                    </a:xfrm>
+                    <a:prstGeom prst="rect">
+                      <a:avLst/>
+                    </a:prstGeom>
+                  </pic:spPr>
+                </pic:pic>
+              </a:graphicData>
+            </a:graphic>
+            <wp14:sizeRelH relativeFrom="margin">
+              <wp14:pctWidth>0</wp14:pctWidth>
+            </wp14:sizeRelH>
+            <wp14:sizeRelV relativeFrom="margin">
+              <wp14:pctHeight>0</wp14:pctHeight>
+            </wp14:sizeRelV>
+          </wp:anchor>
+        </w:drawing>
+      </w:r>
+    </w:p>
+    <w:p>
+      <w:r>
+        <w:br w:type="page"/>
+      </w:r>
+    </w:p>
     <w:p/>
     <w:p>
       <w:pPr>
@@ -5384,7 +5896,13 @@
       </w:r>
       <w:r>
         <w:tab/>
-        <w:t>Notitie van altijd nodes per bepaalde status</w:t>
+        <w:t xml:space="preserve">Notitie van </w:t>
+      </w:r>
+      <w:r>
+        <w:t>aantal</w:t>
+      </w:r>
+      <w:r>
+        <w:t xml:space="preserve"> nodes per bepaalde status</w:t>
       </w:r>
     </w:p>
     <w:p>
@@ -5414,7 +5932,16 @@
         <w:tab/>
       </w:r>
       <w:r>
-        <w:t>Klikken van node in filtering balk highlight node</w:t>
+        <w:t>Klikken van node in filtering balk highlight</w:t>
+      </w:r>
+      <w:r>
+        <w:t xml:space="preserve"> de</w:t>
+      </w:r>
+      <w:r>
+        <w:t xml:space="preserve"> node</w:t>
+      </w:r>
+      <w:r>
+        <w:t xml:space="preserve"> in de tree</w:t>
       </w:r>
     </w:p>
     <w:p>
@@ -5500,7 +6027,6 @@
         </w:numPr>
       </w:pPr>
       <w:r>
-        <w:lastRenderedPageBreak/>
         <w:t>Heb je suggesties om features op een andere manier aan te pakken of een feature die nog nuttig kan zijn om de user experience te verbeteren?</w:t>
       </w:r>
     </w:p>

</xml_diff>

<commit_message>
fixed some merge conflicts
</commit_message>
<xml_diff>
--- a/userstudy_case.docx
+++ b/userstudy_case.docx
@@ -625,6 +625,198 @@
         </w:rPr>
         <w:lastRenderedPageBreak/>
         <w:t>Demografische gegevens</w:t>
+      </w:r>
+    </w:p>
+    <w:p>
+      <w:pPr>
+        <w:spacing w:before="100" w:beforeAutospacing="1" w:after="100" w:afterAutospacing="1" w:line="240" w:lineRule="auto"/>
+        <w:rPr>
+          <w:rFonts w:eastAsia="Times New Roman" w:cs="Times New Roman"/>
+          <w:b/>
+          <w:bCs/>
+          <w:kern w:val="0"/>
+          <w:lang w:eastAsia="nl-BE"/>
+          <w14:ligatures w14:val="none"/>
+        </w:rPr>
+      </w:pPr>
+      <w:r>
+        <w:rPr>
+          <w:rFonts w:eastAsia="Times New Roman" w:cs="Times New Roman"/>
+          <w:b/>
+          <w:bCs/>
+          <w:kern w:val="0"/>
+          <w:lang w:eastAsia="nl-BE"/>
+          <w14:ligatures w14:val="none"/>
+        </w:rPr>
+        <w:t>Naam:</w:t>
+      </w:r>
+      <w:r>
+        <w:rPr>
+          <w:rFonts w:eastAsia="Times New Roman" w:cs="Times New Roman"/>
+          <w:b/>
+          <w:bCs/>
+          <w:i/>
+          <w:iCs/>
+          <w:kern w:val="0"/>
+          <w:u w:val="single"/>
+          <w:lang w:eastAsia="nl-BE"/>
+          <w14:ligatures w14:val="none"/>
+        </w:rPr>
+        <w:t xml:space="preserve"> </w:t>
+      </w:r>
+      <w:r>
+        <w:rPr>
+          <w:rFonts w:eastAsia="Times New Roman" w:cs="Times New Roman"/>
+          <w:b/>
+          <w:bCs/>
+          <w:i/>
+          <w:iCs/>
+          <w:kern w:val="0"/>
+          <w:u w:val="single"/>
+          <w:lang w:eastAsia="nl-BE"/>
+          <w14:ligatures w14:val="none"/>
+        </w:rPr>
+        <w:tab/>
+      </w:r>
+      <w:r>
+        <w:rPr>
+          <w:rFonts w:eastAsia="Times New Roman" w:cs="Times New Roman"/>
+          <w:b/>
+          <w:bCs/>
+          <w:i/>
+          <w:iCs/>
+          <w:kern w:val="0"/>
+          <w:u w:val="single"/>
+          <w:lang w:eastAsia="nl-BE"/>
+          <w14:ligatures w14:val="none"/>
+        </w:rPr>
+        <w:tab/>
+      </w:r>
+      <w:r>
+        <w:rPr>
+          <w:rFonts w:eastAsia="Times New Roman" w:cs="Times New Roman"/>
+          <w:b/>
+          <w:bCs/>
+          <w:i/>
+          <w:iCs/>
+          <w:kern w:val="0"/>
+          <w:u w:val="single"/>
+          <w:lang w:eastAsia="nl-BE"/>
+          <w14:ligatures w14:val="none"/>
+        </w:rPr>
+        <w:tab/>
+      </w:r>
+      <w:r>
+        <w:rPr>
+          <w:rFonts w:eastAsia="Times New Roman" w:cs="Times New Roman"/>
+          <w:b/>
+          <w:bCs/>
+          <w:i/>
+          <w:iCs/>
+          <w:kern w:val="0"/>
+          <w:u w:val="single"/>
+          <w:lang w:eastAsia="nl-BE"/>
+          <w14:ligatures w14:val="none"/>
+        </w:rPr>
+        <w:tab/>
+      </w:r>
+      <w:r>
+        <w:rPr>
+          <w:rFonts w:eastAsia="Times New Roman" w:cs="Times New Roman"/>
+          <w:b/>
+          <w:bCs/>
+          <w:i/>
+          <w:iCs/>
+          <w:kern w:val="0"/>
+          <w:u w:val="single"/>
+          <w:lang w:eastAsia="nl-BE"/>
+          <w14:ligatures w14:val="none"/>
+        </w:rPr>
+        <w:tab/>
+      </w:r>
+      <w:r>
+        <w:rPr>
+          <w:rFonts w:eastAsia="Times New Roman" w:cs="Times New Roman"/>
+          <w:b/>
+          <w:bCs/>
+          <w:i/>
+          <w:iCs/>
+          <w:kern w:val="0"/>
+          <w:u w:val="single"/>
+          <w:lang w:eastAsia="nl-BE"/>
+          <w14:ligatures w14:val="none"/>
+        </w:rPr>
+        <w:tab/>
+      </w:r>
+      <w:r>
+        <w:rPr>
+          <w:rFonts w:eastAsia="Times New Roman" w:cs="Times New Roman"/>
+          <w:b/>
+          <w:bCs/>
+          <w:i/>
+          <w:iCs/>
+          <w:kern w:val="0"/>
+          <w:u w:val="single"/>
+          <w:lang w:eastAsia="nl-BE"/>
+          <w14:ligatures w14:val="none"/>
+        </w:rPr>
+        <w:tab/>
+      </w:r>
+      <w:r>
+        <w:rPr>
+          <w:rFonts w:eastAsia="Times New Roman" w:cs="Times New Roman"/>
+          <w:b/>
+          <w:bCs/>
+          <w:i/>
+          <w:iCs/>
+          <w:kern w:val="0"/>
+          <w:u w:val="single"/>
+          <w:lang w:eastAsia="nl-BE"/>
+          <w14:ligatures w14:val="none"/>
+        </w:rPr>
+        <w:tab/>
+      </w:r>
+      <w:r>
+        <w:rPr>
+          <w:rFonts w:eastAsia="Times New Roman" w:cs="Times New Roman"/>
+          <w:b/>
+          <w:bCs/>
+          <w:i/>
+          <w:iCs/>
+          <w:kern w:val="0"/>
+          <w:u w:val="single"/>
+          <w:lang w:eastAsia="nl-BE"/>
+          <w14:ligatures w14:val="none"/>
+        </w:rPr>
+        <w:tab/>
+      </w:r>
+      <w:r>
+        <w:rPr>
+          <w:rFonts w:eastAsia="Times New Roman" w:cs="Times New Roman"/>
+          <w:b/>
+          <w:bCs/>
+          <w:i/>
+          <w:iCs/>
+          <w:kern w:val="0"/>
+          <w:u w:val="single"/>
+          <w:lang w:eastAsia="nl-BE"/>
+          <w14:ligatures w14:val="none"/>
+        </w:rPr>
+        <w:tab/>
+      </w:r>
+      <w:r>
+        <w:rPr>
+          <w:rFonts w:eastAsia="Times New Roman" w:cs="Times New Roman"/>
+          <w:b/>
+          <w:bCs/>
+          <w:i/>
+          <w:iCs/>
+          <w:kern w:val="0"/>
+          <w:u w:val="single"/>
+          <w:lang w:eastAsia="nl-BE"/>
+          <w14:ligatures w14:val="none"/>
+        </w:rPr>
+        <w:tab/>
       </w:r>
     </w:p>
     <w:p>
@@ -3417,7 +3609,7 @@
           <w:noProof/>
         </w:rPr>
         <w:drawing>
-          <wp:inline distT="0" distB="0" distL="0" distR="0" wp14:anchorId="459308C6" wp14:editId="413914EE">
+          <wp:inline distT="0" distB="0" distL="0" distR="0" wp14:anchorId="459308C6" wp14:editId="765E9237">
             <wp:extent cx="5760720" cy="3239135"/>
             <wp:effectExtent l="0" t="0" r="0" b="0"/>
             <wp:docPr id="744949087" name="Afbeelding 1" descr="Afbeelding met tekst, schermopname, Lettertype, nummer&#10;&#10;Door AI gegenereerde inhoud is mogelijk onjuist."/>
@@ -3734,30 +3926,10 @@
       </w:pPr>
     </w:p>
     <w:p>
-      <w:pPr>
-        <w:rPr>
-          <w:b/>
-          <w:bCs/>
-          <w:sz w:val="40"/>
-          <w:szCs w:val="40"/>
-        </w:rPr>
-      </w:pPr>
-      <w:r>
-        <w:t xml:space="preserve">Je zal aan de hand van twee scenario’s beide varianten van de software testen. Open nu </w:t>
-      </w:r>
-      <w:r>
-        <w:t>versie 1/versie 2 van de software</w:t>
-      </w:r>
-      <w:r>
-        <w:t xml:space="preserve"> en bekijk de software even. Begin hierna aan het eerste scenario.</w:t>
-      </w:r>
-      <w:r>
-        <w:rPr>
-          <w:b/>
-          <w:bCs/>
-          <w:sz w:val="40"/>
-          <w:szCs w:val="40"/>
-        </w:rPr>
+      <w:r>
+        <w:t>Je zal aan de hand van twee scenario's beide varianten van de software testen. Open nu versie 1/versie 2 van de software en laad story 1/story 2. Bekijk de software even en begin hierna aan het eerste/tweede scenario.</w:t>
+      </w:r>
+      <w:r>
         <w:br w:type="page"/>
       </w:r>
     </w:p>
@@ -4419,25 +4591,9 @@
     </w:p>
     <w:p>
       <w:r>
-        <w:t>Nadien vraagt je teamlead naar een korte statusupdate</w:t>
-      </w:r>
-      <w:r>
-        <w:t xml:space="preserve"> </w:t>
-      </w:r>
-      <w:r>
-        <w:t>om een inschatting te maken van de benodigde tijd</w:t>
-      </w:r>
-      <w:r>
-        <w:t>. Zoek de volgende informatie</w:t>
-      </w:r>
-      <w:r>
-        <w:t xml:space="preserve"> (je mag bij het opsommen stoppen na de eerste 4 woorden van de node)</w:t>
-      </w:r>
-      <w:r>
-        <w:t>:</w:t>
-      </w:r>
-    </w:p>
-    <w:p/>
+        <w:t>Nadien vraagt je teamlead naar een korte statusupdate om een inschatting te maken van de benodigde tijd. Zoek de volgende informatie (je mag bij het opsommen stoppen na de eerste 3 woorden van de node):</w:t>
+      </w:r>
+    </w:p>
     <w:p/>
     <w:p>
       <w:pPr>
@@ -4448,6 +4604,7 @@
         </w:numPr>
       </w:pPr>
       <w:r>
+        <w:lastRenderedPageBreak/>
         <w:t xml:space="preserve">De </w:t>
       </w:r>
       <w:proofErr w:type="spellStart"/>
@@ -4726,54 +4883,31 @@
     </w:p>
     <w:p>
       <w:r>
-        <w:t xml:space="preserve">Tot slot moeten de verantwoordelijkheden </w:t>
-      </w:r>
-      <w:r>
-        <w:t>verdeeld</w:t>
-      </w:r>
-      <w:r>
-        <w:t xml:space="preserve"> worden binnen het team. </w:t>
-      </w:r>
-      <w:r>
-        <w:t xml:space="preserve">Selecteer twee elementen in de tree die eindigen op een </w:t>
-      </w:r>
-      <w:r>
-        <w:t>“</w:t>
-      </w:r>
-      <w:proofErr w:type="spellStart"/>
-      <w:r>
-        <w:rPr>
-          <w:i/>
-          <w:iCs/>
-        </w:rPr>
+        <w:t xml:space="preserve">Tot slot moeten de verantwoordelijkheden verdeeld worden binnen het team. Kies een </w:t>
+      </w:r>
+      <w:proofErr w:type="spellStart"/>
+      <w:r>
+        <w:t>branch</w:t>
+      </w:r>
+      <w:proofErr w:type="spellEnd"/>
+      <w:r>
+        <w:t xml:space="preserve"> in de tree dat eindigt op een "</w:t>
+      </w:r>
+      <w:proofErr w:type="spellStart"/>
+      <w:r>
         <w:t>verified</w:t>
       </w:r>
       <w:proofErr w:type="spellEnd"/>
       <w:r>
-        <w:rPr>
-          <w:i/>
-          <w:iCs/>
-        </w:rPr>
         <w:t xml:space="preserve"> </w:t>
       </w:r>
       <w:proofErr w:type="spellStart"/>
       <w:r>
-        <w:rPr>
-          <w:i/>
-          <w:iCs/>
-        </w:rPr>
         <w:t>assumption</w:t>
       </w:r>
       <w:proofErr w:type="spellEnd"/>
       <w:r>
-        <w:rPr>
-          <w:i/>
-          <w:iCs/>
-        </w:rPr>
-        <w:t>”</w:t>
-      </w:r>
-      <w:r>
-        <w:t>.</w:t>
+        <w:t>".</w:t>
       </w:r>
       <w:r>
         <w:br/>
@@ -4878,10 +5012,7 @@
         </w:rPr>
       </w:pPr>
       <w:r>
-        <w:t>Vul na het</w:t>
-      </w:r>
-      <w:r>
-        <w:t xml:space="preserve"> oplossen van de taken de user </w:t>
+        <w:t xml:space="preserve">Vul na het oplossen van de taken de user </w:t>
       </w:r>
       <w:proofErr w:type="spellStart"/>
       <w:r>
@@ -4897,19 +5028,7 @@
       </w:r>
       <w:proofErr w:type="spellEnd"/>
       <w:r>
-        <w:t xml:space="preserve"> in. </w:t>
-      </w:r>
-      <w:r>
-        <w:t>Wanneer je hiermee klaar bent,</w:t>
-      </w:r>
-      <w:r>
-        <w:t xml:space="preserve"> mag je </w:t>
-      </w:r>
-      <w:r>
-        <w:t>versie 1/versie 2 van de software openen</w:t>
-      </w:r>
-      <w:r>
-        <w:t xml:space="preserve"> en kort de software bekijken. Begin hierna aan het tweede scenario.</w:t>
+        <w:t xml:space="preserve"> in. Wanneer je hiermee klaar bent, mag je versie 1/versie 2 van de software openen en story 1/story 2 inladen. Begin met de software even te bekijken en start hierna aan het eerste/tweede scenario.</w:t>
       </w:r>
       <w:r>
         <w:rPr>
@@ -4997,10 +5116,10 @@
     </w:p>
     <w:p>
       <w:r>
-        <w:t xml:space="preserve">Voor je begint aan het verder uitwerken van de tree, wil je verkennen hoever ze voorlopig al staan. </w:t>
-      </w:r>
-      <w:r>
-        <w:t>Lijst de volgende informatie op:</w:t>
+        <w:t>Voor je begint aan het verder uitwerken van de tree, wil je verkennen hoever ze voorlopig al staan. Lijst de volgende informatie op (je mag bij het opsommen stoppen na de eerste 3 woorden van de node)</w:t>
+      </w:r>
+      <w:r>
+        <w:t>:</w:t>
       </w:r>
     </w:p>
     <w:p>
@@ -5010,76 +5129,35 @@
           <w:ilvl w:val="0"/>
           <w:numId w:val="12"/>
         </w:numPr>
-        <w:rPr>
-          <w:lang w:val="en-US"/>
-        </w:rPr>
-      </w:pPr>
-      <w:r>
-        <w:rPr>
-          <w:lang w:val="en-US"/>
-        </w:rPr>
+      </w:pPr>
+      <w:r>
         <w:t xml:space="preserve">De </w:t>
       </w:r>
       <w:r>
-        <w:rPr>
-          <w:lang w:val="en-US"/>
-        </w:rPr>
         <w:t>“</w:t>
       </w:r>
-      <w:r>
-        <w:rPr>
-          <w:lang w:val="en-US"/>
-        </w:rPr>
+      <w:proofErr w:type="spellStart"/>
+      <w:r>
         <w:t>weakness</w:t>
       </w:r>
-      <w:r>
-        <w:rPr>
-          <w:lang w:val="en-US"/>
-        </w:rPr>
-        <w:t>” nodes</w:t>
-      </w:r>
-      <w:r>
-        <w:rPr>
-          <w:lang w:val="en-US"/>
-        </w:rPr>
+      <w:proofErr w:type="spellEnd"/>
+      <w:r>
+        <w:t xml:space="preserve">” </w:t>
+      </w:r>
+      <w:proofErr w:type="spellStart"/>
+      <w:r>
+        <w:t>nodes</w:t>
+      </w:r>
+      <w:proofErr w:type="spellEnd"/>
+      <w:r>
         <w:t>.</w:t>
       </w:r>
     </w:p>
-    <w:p>
-      <w:pPr>
-        <w:rPr>
-          <w:lang w:val="en-US"/>
-        </w:rPr>
-      </w:pPr>
-    </w:p>
-    <w:p>
-      <w:pPr>
-        <w:rPr>
-          <w:lang w:val="en-US"/>
-        </w:rPr>
-      </w:pPr>
-    </w:p>
-    <w:p>
-      <w:pPr>
-        <w:rPr>
-          <w:lang w:val="en-US"/>
-        </w:rPr>
-      </w:pPr>
-    </w:p>
-    <w:p>
-      <w:pPr>
-        <w:rPr>
-          <w:lang w:val="en-US"/>
-        </w:rPr>
-      </w:pPr>
-    </w:p>
-    <w:p>
-      <w:pPr>
-        <w:rPr>
-          <w:lang w:val="en-US"/>
-        </w:rPr>
-      </w:pPr>
-    </w:p>
+    <w:p/>
+    <w:p/>
+    <w:p/>
+    <w:p/>
+    <w:p/>
     <w:p>
       <w:pPr>
         <w:pStyle w:val="Lijstalinea"/>
@@ -5317,13 +5395,12 @@
           <w:lang w:val="en-US"/>
         </w:rPr>
       </w:pPr>
-    </w:p>
-    <w:p>
-      <w:pPr>
+      <w:r>
         <w:rPr>
           <w:lang w:val="en-US"/>
         </w:rPr>
-      </w:pPr>
+        <w:t>____</w:t>
+      </w:r>
     </w:p>
     <w:p>
       <w:pPr>
@@ -6497,7 +6574,13 @@
       </w:r>
       <w:r>
         <w:tab/>
-        <w:t xml:space="preserve">Notitie van altijd </w:t>
+        <w:t xml:space="preserve">Notitie van </w:t>
+      </w:r>
+      <w:r>
+        <w:t>aantal</w:t>
+      </w:r>
+      <w:r>
+        <w:t xml:space="preserve"> </w:t>
       </w:r>
       <w:proofErr w:type="spellStart"/>
       <w:r>
@@ -6546,7 +6629,22 @@
         <w:tab/>
       </w:r>
       <w:r>
-        <w:t>Klikken van node in filtering balk highlight node</w:t>
+        <w:t>Klikken van node in filtering balk highlight</w:t>
+      </w:r>
+      <w:r>
+        <w:t xml:space="preserve"> </w:t>
+      </w:r>
+      <w:r>
+        <w:t>de</w:t>
+      </w:r>
+      <w:r>
+        <w:t xml:space="preserve"> node</w:t>
+      </w:r>
+      <w:r>
+        <w:t xml:space="preserve"> </w:t>
+      </w:r>
+      <w:r>
+        <w:t>in de tree</w:t>
       </w:r>
     </w:p>
     <w:p>
@@ -9137,7 +9235,6 @@
   <w:style w:type="character" w:default="1" w:styleId="Standaardalinea-lettertype">
     <w:name w:val="Default Paragraph Font"/>
     <w:uiPriority w:val="1"/>
-    <w:semiHidden/>
     <w:unhideWhenUsed/>
   </w:style>
   <w:style w:type="table" w:default="1" w:styleId="Standaardtabel">

</xml_diff>

<commit_message>
added all answers to the open question into one file
</commit_message>
<xml_diff>
--- a/userstudy_case.docx
+++ b/userstudy_case.docx
@@ -18,7 +18,6 @@
           <w14:ligatures w14:val="none"/>
         </w:rPr>
       </w:pPr>
-      <w:proofErr w:type="spellStart"/>
       <w:r>
         <w:rPr>
           <w:rFonts w:eastAsia="Times New Roman" w:cs="Times New Roman"/>
@@ -30,9 +29,8 @@
           <w:lang w:eastAsia="nl-BE"/>
           <w14:ligatures w14:val="none"/>
         </w:rPr>
-        <w:t>Informed</w:t>
-      </w:r>
-      <w:proofErr w:type="spellEnd"/>
+        <w:t>Informed Consent – User Study</w:t>
+      </w:r>
       <w:r>
         <w:rPr>
           <w:rFonts w:eastAsia="Times New Roman" w:cs="Times New Roman"/>
@@ -44,9 +42,8 @@
           <w:lang w:eastAsia="nl-BE"/>
           <w14:ligatures w14:val="none"/>
         </w:rPr>
-        <w:t xml:space="preserve"> Consent – User </w:t>
-      </w:r>
-      <w:proofErr w:type="spellStart"/>
+        <w:t xml:space="preserve"> </w:t>
+      </w:r>
       <w:r>
         <w:rPr>
           <w:rFonts w:eastAsia="Times New Roman" w:cs="Times New Roman"/>
@@ -58,34 +55,35 @@
           <w:lang w:eastAsia="nl-BE"/>
           <w14:ligatures w14:val="none"/>
         </w:rPr>
-        <w:t>Study</w:t>
-      </w:r>
-      <w:proofErr w:type="spellEnd"/>
-      <w:r>
-        <w:rPr>
-          <w:rFonts w:eastAsia="Times New Roman" w:cs="Times New Roman"/>
-          <w:b/>
-          <w:bCs/>
+        <w:t>“</w:t>
+      </w:r>
+      <w:r>
+        <w:rPr>
+          <w:rFonts w:eastAsia="Times New Roman" w:cs="Times New Roman"/>
+          <w:b/>
+          <w:bCs/>
+          <w:i/>
           <w:kern w:val="36"/>
           <w:sz w:val="40"/>
           <w:szCs w:val="40"/>
           <w:lang w:eastAsia="nl-BE"/>
           <w14:ligatures w14:val="none"/>
         </w:rPr>
-        <w:t xml:space="preserve"> </w:t>
-      </w:r>
-      <w:r>
-        <w:rPr>
-          <w:rFonts w:eastAsia="Times New Roman" w:cs="Times New Roman"/>
-          <w:b/>
-          <w:bCs/>
+        <w:t xml:space="preserve">Ontwikkeling van een gebruiksvriendelijke </w:t>
+      </w:r>
+      <w:r>
+        <w:rPr>
+          <w:rFonts w:eastAsia="Times New Roman" w:cs="Times New Roman"/>
+          <w:b/>
+          <w:bCs/>
+          <w:i/>
           <w:kern w:val="36"/>
           <w:sz w:val="40"/>
           <w:szCs w:val="40"/>
           <w:lang w:eastAsia="nl-BE"/>
           <w14:ligatures w14:val="none"/>
         </w:rPr>
-        <w:t>“</w:t>
+        <w:t xml:space="preserve">security </w:t>
       </w:r>
       <w:r>
         <w:rPr>
@@ -99,7 +97,7 @@
           <w:lang w:eastAsia="nl-BE"/>
           <w14:ligatures w14:val="none"/>
         </w:rPr>
-        <w:t xml:space="preserve">Ontwikkeling van een gebruiksvriendelijke </w:t>
+        <w:t xml:space="preserve">modellering applicatie </w:t>
       </w:r>
       <w:r>
         <w:rPr>
@@ -113,107 +111,19 @@
           <w:lang w:eastAsia="nl-BE"/>
           <w14:ligatures w14:val="none"/>
         </w:rPr>
-        <w:t xml:space="preserve">security </w:t>
-      </w:r>
-      <w:r>
-        <w:rPr>
-          <w:rFonts w:eastAsia="Times New Roman" w:cs="Times New Roman"/>
-          <w:b/>
-          <w:bCs/>
-          <w:i/>
+        <w:t>gebaseerd op fortunately/unfortunately methode</w:t>
+      </w:r>
+      <w:r>
+        <w:rPr>
+          <w:rFonts w:eastAsia="Times New Roman" w:cs="Times New Roman"/>
+          <w:b/>
+          <w:bCs/>
           <w:kern w:val="36"/>
           <w:sz w:val="40"/>
           <w:szCs w:val="40"/>
           <w:lang w:eastAsia="nl-BE"/>
           <w14:ligatures w14:val="none"/>
         </w:rPr>
-        <w:t xml:space="preserve">modellering applicatie </w:t>
-      </w:r>
-      <w:r>
-        <w:rPr>
-          <w:rFonts w:eastAsia="Times New Roman" w:cs="Times New Roman"/>
-          <w:b/>
-          <w:bCs/>
-          <w:i/>
-          <w:kern w:val="36"/>
-          <w:sz w:val="40"/>
-          <w:szCs w:val="40"/>
-          <w:lang w:eastAsia="nl-BE"/>
-          <w14:ligatures w14:val="none"/>
-        </w:rPr>
-        <w:t xml:space="preserve">gebaseerd op </w:t>
-      </w:r>
-      <w:proofErr w:type="spellStart"/>
-      <w:r>
-        <w:rPr>
-          <w:rFonts w:eastAsia="Times New Roman" w:cs="Times New Roman"/>
-          <w:b/>
-          <w:bCs/>
-          <w:i/>
-          <w:kern w:val="36"/>
-          <w:sz w:val="40"/>
-          <w:szCs w:val="40"/>
-          <w:lang w:eastAsia="nl-BE"/>
-          <w14:ligatures w14:val="none"/>
-        </w:rPr>
-        <w:t>fortunately</w:t>
-      </w:r>
-      <w:proofErr w:type="spellEnd"/>
-      <w:r>
-        <w:rPr>
-          <w:rFonts w:eastAsia="Times New Roman" w:cs="Times New Roman"/>
-          <w:b/>
-          <w:bCs/>
-          <w:i/>
-          <w:kern w:val="36"/>
-          <w:sz w:val="40"/>
-          <w:szCs w:val="40"/>
-          <w:lang w:eastAsia="nl-BE"/>
-          <w14:ligatures w14:val="none"/>
-        </w:rPr>
-        <w:t>/</w:t>
-      </w:r>
-      <w:proofErr w:type="spellStart"/>
-      <w:r>
-        <w:rPr>
-          <w:rFonts w:eastAsia="Times New Roman" w:cs="Times New Roman"/>
-          <w:b/>
-          <w:bCs/>
-          <w:i/>
-          <w:kern w:val="36"/>
-          <w:sz w:val="40"/>
-          <w:szCs w:val="40"/>
-          <w:lang w:eastAsia="nl-BE"/>
-          <w14:ligatures w14:val="none"/>
-        </w:rPr>
-        <w:t>unfortunately</w:t>
-      </w:r>
-      <w:proofErr w:type="spellEnd"/>
-      <w:r>
-        <w:rPr>
-          <w:rFonts w:eastAsia="Times New Roman" w:cs="Times New Roman"/>
-          <w:b/>
-          <w:bCs/>
-          <w:i/>
-          <w:kern w:val="36"/>
-          <w:sz w:val="40"/>
-          <w:szCs w:val="40"/>
-          <w:lang w:eastAsia="nl-BE"/>
-          <w14:ligatures w14:val="none"/>
-        </w:rPr>
-        <w:t xml:space="preserve"> methode</w:t>
-      </w:r>
-      <w:r>
-        <w:rPr>
-          <w:rFonts w:eastAsia="Times New Roman" w:cs="Times New Roman"/>
-          <w:b/>
-          <w:bCs/>
-          <w:kern w:val="36"/>
-          <w:sz w:val="40"/>
-          <w:szCs w:val="40"/>
-          <w:lang w:eastAsia="nl-BE"/>
-          <w14:ligatures w14:val="none"/>
-        </w:rPr>
         <w:t>”</w:t>
       </w:r>
     </w:p>
@@ -401,47 +311,7 @@
           <w:lang w:eastAsia="nl-BE"/>
           <w14:ligatures w14:val="none"/>
         </w:rPr>
-        <w:t>U wordt uitgenodigd om deel te nemen aan een studie die onderzoekt hoe softwaregebruikers security- en AI-risicoscenario’s analyseren met behulp van een “</w:t>
-      </w:r>
-      <w:proofErr w:type="spellStart"/>
-      <w:r>
-        <w:rPr>
-          <w:rFonts w:eastAsia="Times New Roman" w:cs="Times New Roman"/>
-          <w:kern w:val="0"/>
-          <w:lang w:eastAsia="nl-BE"/>
-          <w14:ligatures w14:val="none"/>
-        </w:rPr>
-        <w:t>Fortunately</w:t>
-      </w:r>
-      <w:proofErr w:type="spellEnd"/>
-      <w:r>
-        <w:rPr>
-          <w:rFonts w:eastAsia="Times New Roman" w:cs="Times New Roman"/>
-          <w:kern w:val="0"/>
-          <w:lang w:eastAsia="nl-BE"/>
-          <w14:ligatures w14:val="none"/>
-        </w:rPr>
-        <w:t>–</w:t>
-      </w:r>
-      <w:proofErr w:type="spellStart"/>
-      <w:r>
-        <w:rPr>
-          <w:rFonts w:eastAsia="Times New Roman" w:cs="Times New Roman"/>
-          <w:kern w:val="0"/>
-          <w:lang w:eastAsia="nl-BE"/>
-          <w14:ligatures w14:val="none"/>
-        </w:rPr>
-        <w:t>Unfortunately</w:t>
-      </w:r>
-      <w:proofErr w:type="spellEnd"/>
-      <w:r>
-        <w:rPr>
-          <w:rFonts w:eastAsia="Times New Roman" w:cs="Times New Roman"/>
-          <w:kern w:val="0"/>
-          <w:lang w:eastAsia="nl-BE"/>
-          <w14:ligatures w14:val="none"/>
-        </w:rPr>
-        <w:t>”-model. Uw deelname helpt ons om de bruikbaarheid, helderheid en efficiëntie van de software te evalueren en te verbeteren.</w:t>
+        <w:t>U wordt uitgenodigd om deel te nemen aan een studie die onderzoekt hoe softwaregebruikers security- en AI-risicoscenario’s analyseren met behulp van een “Fortunately–Unfortunately”-model. Uw deelname helpt ons om de bruikbaarheid, helderheid en efficiëntie van de software te evalueren en te verbeteren.</w:t>
       </w:r>
     </w:p>
     <w:p>
@@ -2110,7 +1980,6 @@
         </w:rPr>
         <w:t xml:space="preserve">Alle verzamelde gegevens zullen </w:t>
       </w:r>
-      <w:proofErr w:type="spellStart"/>
       <w:r>
         <w:rPr>
           <w:rFonts w:eastAsia="Times New Roman" w:cs="Times New Roman"/>
@@ -2122,7 +1991,6 @@
         </w:rPr>
         <w:t>gepseudonimiseerd</w:t>
       </w:r>
-      <w:proofErr w:type="spellEnd"/>
       <w:r>
         <w:rPr>
           <w:rFonts w:eastAsia="Times New Roman" w:cs="Times New Roman"/>
@@ -2592,27 +2460,7 @@
           <w:lang w:eastAsia="nl-BE"/>
           <w14:ligatures w14:val="none"/>
         </w:rPr>
-        <w:t xml:space="preserve">De data zal niet </w:t>
-      </w:r>
-      <w:proofErr w:type="spellStart"/>
-      <w:r>
-        <w:rPr>
-          <w:rFonts w:eastAsia="Times New Roman" w:cs="Times New Roman"/>
-          <w:kern w:val="0"/>
-          <w:lang w:eastAsia="nl-BE"/>
-          <w14:ligatures w14:val="none"/>
-        </w:rPr>
-        <w:t>gelinked</w:t>
-      </w:r>
-      <w:proofErr w:type="spellEnd"/>
-      <w:r>
-        <w:rPr>
-          <w:rFonts w:eastAsia="Times New Roman" w:cs="Times New Roman"/>
-          <w:kern w:val="0"/>
-          <w:lang w:eastAsia="nl-BE"/>
-          <w14:ligatures w14:val="none"/>
-        </w:rPr>
-        <w:t xml:space="preserve"> worden aan uw naam maar aan een ID zodat u later kan vragen deze data te verwijderen</w:t>
+        <w:t>De data zal niet gelinked worden aan uw naam maar aan een ID zodat u later kan vragen deze data te verwijderen</w:t>
       </w:r>
       <w:r>
         <w:rPr>
@@ -2890,30 +2738,7 @@
           <w14:ligatures w14:val="none"/>
         </w:rPr>
         <w:tab/>
-      </w:r>
-      <w:proofErr w:type="spellStart"/>
-      <w:r>
-        <w:rPr>
-          <w:rFonts w:eastAsia="Times New Roman" w:cs="Times New Roman"/>
-          <w:b/>
-          <w:bCs/>
-          <w:kern w:val="0"/>
-          <w:lang w:val="en-US" w:eastAsia="nl-BE"/>
-          <w14:ligatures w14:val="none"/>
-        </w:rPr>
-        <w:t>Handtekening</w:t>
-      </w:r>
-      <w:proofErr w:type="spellEnd"/>
-      <w:r>
-        <w:rPr>
-          <w:rFonts w:eastAsia="Times New Roman" w:cs="Times New Roman"/>
-          <w:b/>
-          <w:bCs/>
-          <w:kern w:val="0"/>
-          <w:lang w:val="en-US" w:eastAsia="nl-BE"/>
-          <w14:ligatures w14:val="none"/>
-        </w:rPr>
-        <w:t>:</w:t>
+        <w:t>Handtekening:</w:t>
       </w:r>
     </w:p>
     <w:p>
@@ -2958,7 +2783,6 @@
           <w:lang w:val="en-US"/>
         </w:rPr>
       </w:pPr>
-      <w:proofErr w:type="spellStart"/>
       <w:r>
         <w:rPr>
           <w:b/>
@@ -2968,53 +2792,30 @@
           <w:lang w:val="en-US"/>
         </w:rPr>
         <w:lastRenderedPageBreak/>
-        <w:t>Uitleg</w:t>
-      </w:r>
-      <w:proofErr w:type="spellEnd"/>
-      <w:r>
-        <w:rPr>
-          <w:b/>
-          <w:bCs/>
+        <w:t xml:space="preserve">Uitleg </w:t>
+      </w:r>
+      <w:r>
+        <w:rPr>
+          <w:b/>
+          <w:bCs/>
+          <w:i/>
+          <w:iCs/>
           <w:sz w:val="40"/>
           <w:szCs w:val="40"/>
           <w:lang w:val="en-US"/>
         </w:rPr>
-        <w:t xml:space="preserve"> </w:t>
-      </w:r>
-      <w:r>
-        <w:rPr>
-          <w:b/>
-          <w:bCs/>
-          <w:i/>
-          <w:iCs/>
+        <w:t>Fortunately–Unfortunately</w:t>
+      </w:r>
+      <w:r>
+        <w:rPr>
+          <w:b/>
+          <w:bCs/>
           <w:sz w:val="40"/>
           <w:szCs w:val="40"/>
           <w:lang w:val="en-US"/>
         </w:rPr>
-        <w:t>Fortunately–Unfortunately</w:t>
-      </w:r>
-      <w:r>
-        <w:rPr>
-          <w:b/>
-          <w:bCs/>
-          <w:sz w:val="40"/>
-          <w:szCs w:val="40"/>
-          <w:lang w:val="en-US"/>
-        </w:rPr>
-        <w:t>-</w:t>
-      </w:r>
-      <w:proofErr w:type="spellStart"/>
-      <w:r>
-        <w:rPr>
-          <w:b/>
-          <w:bCs/>
-          <w:sz w:val="40"/>
-          <w:szCs w:val="40"/>
-          <w:lang w:val="en-US"/>
-        </w:rPr>
-        <w:t>methode</w:t>
-      </w:r>
-      <w:proofErr w:type="spellEnd"/>
+        <w:t>-methode</w:t>
+      </w:r>
     </w:p>
     <w:p>
       <w:pPr>
@@ -3035,49 +2836,15 @@
       <w:r>
         <w:t xml:space="preserve">De </w:t>
       </w:r>
-      <w:proofErr w:type="spellStart"/>
-      <w:r>
-        <w:rPr>
-          <w:i/>
-          <w:iCs/>
-        </w:rPr>
-        <w:t>Fortunately</w:t>
-      </w:r>
-      <w:proofErr w:type="spellEnd"/>
-      <w:r>
-        <w:rPr>
-          <w:i/>
-          <w:iCs/>
-        </w:rPr>
-        <w:t>–</w:t>
-      </w:r>
-      <w:proofErr w:type="spellStart"/>
-      <w:r>
-        <w:rPr>
-          <w:i/>
-          <w:iCs/>
-        </w:rPr>
-        <w:t>Unfortunately</w:t>
-      </w:r>
-      <w:proofErr w:type="spellEnd"/>
-      <w:r>
-        <w:t>-methode komt oorspronkelijk uit improvisatietheater. Het is een techniek waarbij een verhaal zich afwisselend positief en negatief ontwikkelt. Elke nieuwe stap begint met “</w:t>
-      </w:r>
-      <w:proofErr w:type="spellStart"/>
-      <w:r>
-        <w:t>Fortunately</w:t>
-      </w:r>
-      <w:proofErr w:type="spellEnd"/>
-      <w:r>
-        <w:t>…” (gelukkig/positieve tegenmaatregel) of “</w:t>
-      </w:r>
-      <w:proofErr w:type="spellStart"/>
-      <w:r>
-        <w:t>Unfortunately</w:t>
-      </w:r>
-      <w:proofErr w:type="spellEnd"/>
-      <w:r>
-        <w:t>…” (helaas/risico’s) en verandert zo het verloop van het verhaal. Dit zorgt ervoor dat gebruikers verschillende scenario’s verkennen en onverwachte wendingen ontdekken.</w:t>
+      <w:r>
+        <w:rPr>
+          <w:i/>
+          <w:iCs/>
+        </w:rPr>
+        <w:t>Fortunately–Unfortunately</w:t>
+      </w:r>
+      <w:r>
+        <w:t>-methode komt oorspronkelijk uit improvisatietheater. Het is een techniek waarbij een verhaal zich afwisselend positief en negatief ontwikkelt. Elke nieuwe stap begint met “Fortunately…” (gelukkig/positieve tegenmaatregel) of “Unfortunately…” (helaas/risico’s) en verandert zo het verloop van het verhaal. Dit zorgt ervoor dat gebruikers verschillende scenario’s verkennen en onverwachte wendingen ontdekken.</w:t>
       </w:r>
     </w:p>
     <w:p>
@@ -3609,7 +3376,7 @@
           <w:noProof/>
         </w:rPr>
         <w:drawing>
-          <wp:inline distT="0" distB="0" distL="0" distR="0" wp14:anchorId="459308C6" wp14:editId="765E9237">
+          <wp:inline distT="0" distB="0" distL="0" distR="0" wp14:anchorId="459308C6" wp14:editId="28DB9650">
             <wp:extent cx="5760720" cy="3239135"/>
             <wp:effectExtent l="0" t="0" r="0" b="0"/>
             <wp:docPr id="744949087" name="Afbeelding 1" descr="Afbeelding met tekst, schermopname, Lettertype, nummer&#10;&#10;Door AI gegenereerde inhoud is mogelijk onjuist."/>
@@ -3670,28 +3437,11 @@
         <w:t>E</w:t>
       </w:r>
       <w:r>
-        <w:t xml:space="preserve">en </w:t>
-      </w:r>
-      <w:proofErr w:type="spellStart"/>
-      <w:r>
-        <w:t>unfortunately</w:t>
-      </w:r>
-      <w:proofErr w:type="spellEnd"/>
-      <w:r>
-        <w:t xml:space="preserve">-node zonder </w:t>
-      </w:r>
-      <w:proofErr w:type="spellStart"/>
-      <w:r>
-        <w:t>fortunately</w:t>
-      </w:r>
-      <w:proofErr w:type="spellEnd"/>
-      <w:r>
-        <w:t xml:space="preserve"> kinderen</w:t>
+        <w:t>en unfortunately-node zonder fortunately kinderen</w:t>
       </w:r>
       <w:r>
         <w:t xml:space="preserve"> is een </w:t>
       </w:r>
-      <w:proofErr w:type="spellStart"/>
       <w:r>
         <w:rPr>
           <w:b/>
@@ -3699,7 +3449,6 @@
         </w:rPr>
         <w:t>Weakness</w:t>
       </w:r>
-      <w:proofErr w:type="spellEnd"/>
       <w:r>
         <w:rPr>
           <w:b/>
@@ -3725,31 +3474,14 @@
         </w:numPr>
       </w:pPr>
       <w:r>
-        <w:t xml:space="preserve">Een </w:t>
-      </w:r>
-      <w:proofErr w:type="spellStart"/>
-      <w:r>
-        <w:t>unfortunately</w:t>
-      </w:r>
-      <w:proofErr w:type="spellEnd"/>
-      <w:r>
-        <w:t xml:space="preserve">-node met bestaande uitwerkingen (kinderen), maar die nog moet worden herbekeken of verder verfijnd, wordt aangeduid als een </w:t>
-      </w:r>
-      <w:proofErr w:type="spellStart"/>
-      <w:r>
-        <w:rPr>
-          <w:b/>
-          <w:bCs/>
-        </w:rPr>
-        <w:t>Weakness</w:t>
-      </w:r>
-      <w:proofErr w:type="spellEnd"/>
-      <w:r>
-        <w:rPr>
-          <w:b/>
-          <w:bCs/>
-        </w:rPr>
-        <w:t xml:space="preserve"> Under Review</w:t>
+        <w:t xml:space="preserve">Een unfortunately-node met bestaande uitwerkingen (kinderen), maar die nog moet worden herbekeken of verder verfijnd, wordt aangeduid als een </w:t>
+      </w:r>
+      <w:r>
+        <w:rPr>
+          <w:b/>
+          <w:bCs/>
+        </w:rPr>
+        <w:t>Weakness Under Review</w:t>
       </w:r>
       <w:r>
         <w:t>.</w:t>
@@ -3766,15 +3498,7 @@
         </w:numPr>
       </w:pPr>
       <w:r>
-        <w:t xml:space="preserve">Een </w:t>
-      </w:r>
-      <w:proofErr w:type="spellStart"/>
-      <w:r>
-        <w:t>fortunately</w:t>
-      </w:r>
-      <w:proofErr w:type="spellEnd"/>
-      <w:r>
-        <w:t xml:space="preserve">-node met kinderen, maar waarvan de uitwerking </w:t>
+        <w:t xml:space="preserve">Een fortunately-node met kinderen, maar waarvan de uitwerking </w:t>
       </w:r>
       <w:r>
         <w:t xml:space="preserve">nog </w:t>
@@ -3785,21 +3509,12 @@
       <w:r>
         <w:t xml:space="preserve">, krijgt de status van een </w:t>
       </w:r>
-      <w:proofErr w:type="spellStart"/>
-      <w:r>
-        <w:rPr>
-          <w:b/>
-          <w:bCs/>
-        </w:rPr>
-        <w:t>Assumption</w:t>
-      </w:r>
-      <w:proofErr w:type="spellEnd"/>
-      <w:r>
-        <w:rPr>
-          <w:b/>
-          <w:bCs/>
-        </w:rPr>
-        <w:t xml:space="preserve"> Under Review</w:t>
+      <w:r>
+        <w:rPr>
+          <w:b/>
+          <w:bCs/>
+        </w:rPr>
+        <w:t>Assumption Under Review</w:t>
       </w:r>
       <w:r>
         <w:t>.</w:t>
@@ -3816,15 +3531,7 @@
         </w:numPr>
       </w:pPr>
       <w:r>
-        <w:t xml:space="preserve">Een </w:t>
-      </w:r>
-      <w:proofErr w:type="spellStart"/>
-      <w:r>
-        <w:t>fortunately</w:t>
-      </w:r>
-      <w:proofErr w:type="spellEnd"/>
-      <w:r>
-        <w:t xml:space="preserve">-node waarvan de uitwerking </w:t>
+        <w:t xml:space="preserve">Een fortunately-node waarvan de uitwerking </w:t>
       </w:r>
       <w:r>
         <w:t>in orde is</w:t>
@@ -3838,31 +3545,13 @@
       <w:r>
         <w:t xml:space="preserve"> geen kinderen heeft, krijgt de status van een </w:t>
       </w:r>
-      <w:proofErr w:type="spellStart"/>
-      <w:r>
-        <w:rPr>
-          <w:b/>
-          <w:bCs/>
-        </w:rPr>
-        <w:t>Verified</w:t>
-      </w:r>
-      <w:proofErr w:type="spellEnd"/>
-      <w:r>
-        <w:rPr>
-          <w:b/>
-          <w:bCs/>
-        </w:rPr>
-        <w:t xml:space="preserve"> </w:t>
-      </w:r>
-      <w:proofErr w:type="spellStart"/>
-      <w:r>
-        <w:rPr>
-          <w:b/>
-          <w:bCs/>
-        </w:rPr>
-        <w:t>Assumption</w:t>
-      </w:r>
-      <w:proofErr w:type="spellEnd"/>
+      <w:r>
+        <w:rPr>
+          <w:b/>
+          <w:bCs/>
+        </w:rPr>
+        <w:t>Verified Assumption</w:t>
+      </w:r>
       <w:r>
         <w:t>.</w:t>
       </w:r>
@@ -3881,43 +3570,18 @@
         <w:lastRenderedPageBreak/>
         <w:t xml:space="preserve">De </w:t>
       </w:r>
-      <w:proofErr w:type="spellStart"/>
-      <w:r>
-        <w:rPr>
-          <w:b/>
-          <w:bCs/>
-        </w:rPr>
-        <w:t>danger</w:t>
-      </w:r>
-      <w:proofErr w:type="spellEnd"/>
-      <w:r>
-        <w:rPr>
-          <w:b/>
-          <w:bCs/>
-        </w:rPr>
-        <w:t xml:space="preserve"> rating</w:t>
-      </w:r>
-      <w:r>
-        <w:t xml:space="preserve"> is een classificatie van een </w:t>
-      </w:r>
-      <w:proofErr w:type="spellStart"/>
-      <w:r>
-        <w:t>unfortunately</w:t>
-      </w:r>
-      <w:proofErr w:type="spellEnd"/>
-      <w:r>
-        <w:t xml:space="preserve">-node om het niveau van gevaar uit te drukken. </w:t>
-      </w:r>
-      <w:r>
-        <w:t xml:space="preserve">Het is een relatief getal dat bijvoorbeeld berekend kan worden op basis van </w:t>
-      </w:r>
-      <w:proofErr w:type="spellStart"/>
-      <w:r>
-        <w:t>likelihood</w:t>
-      </w:r>
-      <w:proofErr w:type="spellEnd"/>
-      <w:r>
-        <w:t xml:space="preserve"> en impact.</w:t>
+      <w:r>
+        <w:rPr>
+          <w:b/>
+          <w:bCs/>
+        </w:rPr>
+        <w:t>danger rating</w:t>
+      </w:r>
+      <w:r>
+        <w:t xml:space="preserve"> is een classificatie van een unfortunately-node om het niveau van gevaar uit te drukken. </w:t>
+      </w:r>
+      <w:r>
+        <w:t>Het is een relatief getal dat bijvoorbeeld berekend kan worden op basis van likelihood en impact.</w:t>
       </w:r>
     </w:p>
     <w:p>
@@ -3976,31 +3640,13 @@
       <w:r>
         <w:t xml:space="preserve"> een </w:t>
       </w:r>
-      <w:proofErr w:type="spellStart"/>
-      <w:r>
-        <w:rPr>
-          <w:i/>
-          <w:iCs/>
-        </w:rPr>
-        <w:t>Fortunately</w:t>
-      </w:r>
-      <w:proofErr w:type="spellEnd"/>
-      <w:r>
-        <w:rPr>
-          <w:i/>
-          <w:iCs/>
-        </w:rPr>
-        <w:t>–</w:t>
-      </w:r>
-      <w:proofErr w:type="spellStart"/>
-      <w:r>
-        <w:rPr>
-          <w:i/>
-          <w:iCs/>
-        </w:rPr>
-        <w:t>Unfortunately</w:t>
-      </w:r>
-      <w:proofErr w:type="spellEnd"/>
+      <w:r>
+        <w:rPr>
+          <w:i/>
+          <w:iCs/>
+        </w:rPr>
+        <w:t>Fortunately–Unfortunately</w:t>
+      </w:r>
       <w:r>
         <w:t>-model.</w:t>
       </w:r>
@@ -4043,7 +3689,6 @@
       <w:r>
         <w:t xml:space="preserve">Bij het controleren van de tree merk je dat er nog een </w:t>
       </w:r>
-      <w:proofErr w:type="spellStart"/>
       <w:r>
         <w:rPr>
           <w:i/>
@@ -4051,17 +3696,8 @@
         </w:rPr>
         <w:t>unfortunate</w:t>
       </w:r>
-      <w:proofErr w:type="spellEnd"/>
-      <w:r>
-        <w:t xml:space="preserve"> ontbreekt: een </w:t>
-      </w:r>
-      <w:proofErr w:type="spellStart"/>
-      <w:r>
-        <w:t>weakness</w:t>
-      </w:r>
-      <w:proofErr w:type="spellEnd"/>
-      <w:r>
-        <w:t xml:space="preserve">/risico dat nog niet in het model is opgenomen, namelijk </w:t>
+      <w:r>
+        <w:t xml:space="preserve"> ontbreekt: een weakness/risico dat nog niet in het model is opgenomen, namelijk </w:t>
       </w:r>
       <w:r>
         <w:rPr>
@@ -4084,26 +3720,10 @@
         <w:t xml:space="preserve">. </w:t>
       </w:r>
       <w:r>
-        <w:t xml:space="preserve">“Dit was de laatste </w:t>
-      </w:r>
-      <w:proofErr w:type="spellStart"/>
-      <w:r>
-        <w:t>unfortunately</w:t>
-      </w:r>
-      <w:proofErr w:type="spellEnd"/>
-      <w:r>
-        <w:t xml:space="preserve"> node in deze tak</w:t>
-      </w:r>
-      <w:r>
-        <w:t xml:space="preserve">. Omdat deze </w:t>
-      </w:r>
-      <w:proofErr w:type="spellStart"/>
-      <w:r>
-        <w:t>unfortunately</w:t>
-      </w:r>
-      <w:proofErr w:type="spellEnd"/>
-      <w:r>
-        <w:t xml:space="preserve"> node gezien wordt als </w:t>
+        <w:t>“Dit was de laatste unfortunately node in deze tak</w:t>
+      </w:r>
+      <w:r>
+        <w:t xml:space="preserve">. Omdat deze unfortunately node gezien wordt als </w:t>
       </w:r>
       <w:r>
         <w:rPr>
@@ -4141,15 +3761,7 @@
         <w:t>”</w:t>
       </w:r>
       <w:r>
-        <w:t xml:space="preserve"> mag je deze status erbij zetten en mag de bovenliggende </w:t>
-      </w:r>
-      <w:proofErr w:type="spellStart"/>
-      <w:r>
-        <w:t>fortunately</w:t>
-      </w:r>
-      <w:proofErr w:type="spellEnd"/>
-      <w:r>
-        <w:t>-node beschouwd worden als</w:t>
+        <w:t xml:space="preserve"> mag je deze status erbij zetten en mag de bovenliggende fortunately-node beschouwd worden als</w:t>
       </w:r>
       <w:r>
         <w:t xml:space="preserve"> een</w:t>
@@ -4162,33 +3774,91 @@
           <w:i/>
           <w:iCs/>
         </w:rPr>
+        <w:t>“Verified</w:t>
+      </w:r>
+      <w:r>
+        <w:rPr>
+          <w:i/>
+          <w:iCs/>
+        </w:rPr>
+        <w:t xml:space="preserve"> Assumption</w:t>
+      </w:r>
+      <w:r>
+        <w:rPr>
+          <w:i/>
+          <w:iCs/>
+        </w:rPr>
+        <w:t>”</w:t>
+      </w:r>
+      <w:r>
+        <w:rPr>
+          <w:i/>
+          <w:iCs/>
+        </w:rPr>
+        <w:t>.</w:t>
+      </w:r>
+      <w:r>
+        <w:rPr>
+          <w:i/>
+          <w:iCs/>
+        </w:rPr>
+        <w:t xml:space="preserve"> </w:t>
+      </w:r>
+      <w:r>
+        <w:t>Noteer/markeer dit bij deze laatste fortunately-node</w:t>
+      </w:r>
+      <w:r>
+        <w:t>.</w:t>
+      </w:r>
+    </w:p>
+    <w:p>
+      <w:pPr>
+        <w:rPr>
+          <w:b/>
+          <w:bCs/>
+        </w:rPr>
+      </w:pPr>
+      <w:r>
+        <w:rPr>
+          <w:b/>
+          <w:bCs/>
+        </w:rPr>
+        <w:t>Taak 2:</w:t>
+      </w:r>
+    </w:p>
+    <w:p>
+      <w:pPr>
+        <w:rPr>
+          <w:i/>
+          <w:iCs/>
+        </w:rPr>
+      </w:pPr>
+      <w:r>
+        <w:t>Er wordt nu binnen het team verder nagedacht over een authenticatieprovider.</w:t>
+      </w:r>
+      <w:r>
+        <w:t xml:space="preserve"> </w:t>
+      </w:r>
+      <w:r>
+        <w:t>Zoek de correcte plaats in de tree</w:t>
+      </w:r>
+      <w:r>
+        <w:t xml:space="preserve"> (namelijk: </w:t>
+      </w:r>
+      <w:r>
+        <w:rPr>
+          <w:i/>
+          <w:iCs/>
+        </w:rPr>
         <w:t>“</w:t>
       </w:r>
-      <w:proofErr w:type="spellStart"/>
-      <w:r>
-        <w:rPr>
-          <w:i/>
-          <w:iCs/>
-        </w:rPr>
-        <w:t>Verified</w:t>
-      </w:r>
-      <w:proofErr w:type="spellEnd"/>
-      <w:r>
-        <w:rPr>
-          <w:i/>
-          <w:iCs/>
-        </w:rPr>
-        <w:t xml:space="preserve"> </w:t>
-      </w:r>
-      <w:proofErr w:type="spellStart"/>
-      <w:r>
-        <w:rPr>
-          <w:i/>
-          <w:iCs/>
-        </w:rPr>
-        <w:t>Assumption</w:t>
-      </w:r>
-      <w:proofErr w:type="spellEnd"/>
+      <w:r>
+        <w:rPr>
+          <w:i/>
+          <w:iCs/>
+        </w:rPr>
+        <w:t>Provider-storingen kunnen alle werknemers buitensluiten</w:t>
+      </w:r>
       <w:r>
         <w:rPr>
           <w:i/>
@@ -4197,103 +3867,14 @@
         <w:t>”</w:t>
       </w:r>
       <w:r>
-        <w:rPr>
-          <w:i/>
-          <w:iCs/>
-        </w:rPr>
-        <w:t>.</w:t>
-      </w:r>
-      <w:r>
-        <w:rPr>
-          <w:i/>
-          <w:iCs/>
-        </w:rPr>
-        <w:t xml:space="preserve"> </w:t>
-      </w:r>
-      <w:r>
-        <w:t xml:space="preserve">Noteer/markeer dit bij deze laatste </w:t>
-      </w:r>
-      <w:proofErr w:type="spellStart"/>
-      <w:r>
-        <w:t>fortunately</w:t>
-      </w:r>
-      <w:proofErr w:type="spellEnd"/>
-      <w:r>
-        <w:t>-node</w:t>
-      </w:r>
-      <w:r>
-        <w:t>.</w:t>
-      </w:r>
-    </w:p>
-    <w:p>
-      <w:pPr>
-        <w:rPr>
-          <w:b/>
-          <w:bCs/>
-        </w:rPr>
-      </w:pPr>
-      <w:r>
-        <w:rPr>
-          <w:b/>
-          <w:bCs/>
-        </w:rPr>
-        <w:t>Taak 2:</w:t>
-      </w:r>
-    </w:p>
-    <w:p>
-      <w:pPr>
-        <w:rPr>
-          <w:i/>
-          <w:iCs/>
-        </w:rPr>
-      </w:pPr>
-      <w:r>
-        <w:t>Er wordt nu binnen het team verder nagedacht over een authenticatieprovider.</w:t>
-      </w:r>
-      <w:r>
-        <w:t xml:space="preserve"> </w:t>
-      </w:r>
-      <w:r>
-        <w:t>Zoek de correcte plaats in de tree</w:t>
-      </w:r>
-      <w:r>
-        <w:t xml:space="preserve"> (namelijk: </w:t>
-      </w:r>
-      <w:r>
-        <w:rPr>
-          <w:i/>
-          <w:iCs/>
-        </w:rPr>
-        <w:t>“</w:t>
-      </w:r>
-      <w:r>
-        <w:rPr>
-          <w:i/>
-          <w:iCs/>
-        </w:rPr>
-        <w:t>Provider-storingen kunnen alle werknemers buitensluiten</w:t>
-      </w:r>
-      <w:r>
-        <w:rPr>
-          <w:i/>
-          <w:iCs/>
-        </w:rPr>
-        <w:t>”</w:t>
-      </w:r>
-      <w:r>
         <w:t>)</w:t>
       </w:r>
       <w:r>
         <w:t xml:space="preserve"> en voeg</w:t>
       </w:r>
       <w:r>
-        <w:t xml:space="preserve"> de volgende </w:t>
-      </w:r>
-      <w:proofErr w:type="spellStart"/>
-      <w:r>
-        <w:t>nodes</w:t>
-      </w:r>
-      <w:proofErr w:type="spellEnd"/>
+        <w:t xml:space="preserve"> de volgende nodes</w:t>
+      </w:r>
       <w:r>
         <w:t xml:space="preserve"> onder elkaar</w:t>
       </w:r>
@@ -4336,43 +3917,7 @@
           <w:iCs/>
           <w:lang w:val="en-US"/>
         </w:rPr>
-        <w:t xml:space="preserve">Team </w:t>
-      </w:r>
-      <w:proofErr w:type="spellStart"/>
-      <w:r>
-        <w:rPr>
-          <w:i/>
-          <w:iCs/>
-          <w:lang w:val="en-US"/>
-        </w:rPr>
-        <w:t>richt</w:t>
-      </w:r>
-      <w:proofErr w:type="spellEnd"/>
-      <w:r>
-        <w:rPr>
-          <w:i/>
-          <w:iCs/>
-          <w:lang w:val="en-US"/>
-        </w:rPr>
-        <w:t xml:space="preserve"> on-prem fallback-</w:t>
-      </w:r>
-      <w:proofErr w:type="spellStart"/>
-      <w:r>
-        <w:rPr>
-          <w:i/>
-          <w:iCs/>
-          <w:lang w:val="en-US"/>
-        </w:rPr>
-        <w:t>authenticatieserver</w:t>
-      </w:r>
-      <w:proofErr w:type="spellEnd"/>
-      <w:r>
-        <w:rPr>
-          <w:i/>
-          <w:iCs/>
-          <w:lang w:val="en-US"/>
-        </w:rPr>
-        <w:t xml:space="preserve"> in</w:t>
+        <w:t>Team richt on-prem fallback-authenticatieserver in</w:t>
       </w:r>
       <w:r>
         <w:rPr>
@@ -4415,36 +3960,8 @@
           <w:iCs/>
           <w:lang w:val="en-US"/>
         </w:rPr>
-        <w:t xml:space="preserve">On-prem fallback </w:t>
-      </w:r>
-      <w:proofErr w:type="spellStart"/>
-      <w:r>
-        <w:rPr>
-          <w:i/>
-          <w:iCs/>
-          <w:lang w:val="en-US"/>
-        </w:rPr>
-        <w:t>synchroniseert</w:t>
-      </w:r>
-      <w:proofErr w:type="spellEnd"/>
-      <w:r>
-        <w:rPr>
-          <w:i/>
-          <w:iCs/>
-          <w:lang w:val="en-US"/>
-        </w:rPr>
-        <w:t xml:space="preserve"> credentials </w:t>
-      </w:r>
-      <w:proofErr w:type="spellStart"/>
-      <w:r>
-        <w:rPr>
-          <w:i/>
-          <w:iCs/>
-          <w:lang w:val="en-US"/>
-        </w:rPr>
-        <w:t>vertraagd</w:t>
-      </w:r>
-      <w:proofErr w:type="spellEnd"/>
+        <w:t>On-prem fallback synchroniseert credentials vertraagd</w:t>
+      </w:r>
       <w:r>
         <w:rPr>
           <w:i/>
@@ -4466,19 +3983,11 @@
           <w:lang w:val="en-US"/>
         </w:rPr>
       </w:pPr>
-      <w:proofErr w:type="spellStart"/>
       <w:r>
         <w:rPr>
           <w:lang w:val="en-US"/>
         </w:rPr>
-        <w:t>Likelyhood</w:t>
-      </w:r>
-      <w:proofErr w:type="spellEnd"/>
-      <w:r>
-        <w:rPr>
-          <w:lang w:val="en-US"/>
-        </w:rPr>
-        <w:t>: 4</w:t>
+        <w:t>Likelyhood: 4</w:t>
       </w:r>
     </w:p>
     <w:p>
@@ -4530,13 +4039,8 @@
           <w:iCs/>
         </w:rPr>
       </w:pPr>
-      <w:proofErr w:type="spellStart"/>
-      <w:r>
-        <w:t>Fortunately</w:t>
-      </w:r>
-      <w:proofErr w:type="spellEnd"/>
-      <w:r>
-        <w:t xml:space="preserve">: </w:t>
+      <w:r>
+        <w:t xml:space="preserve">Fortunately: </w:t>
       </w:r>
       <w:r>
         <w:rPr>
@@ -4607,29 +4111,14 @@
         <w:lastRenderedPageBreak/>
         <w:t xml:space="preserve">De </w:t>
       </w:r>
-      <w:proofErr w:type="spellStart"/>
-      <w:r>
-        <w:t>verified</w:t>
-      </w:r>
-      <w:proofErr w:type="spellEnd"/>
-      <w:r>
-        <w:t xml:space="preserve"> </w:t>
-      </w:r>
-      <w:proofErr w:type="spellStart"/>
+      <w:r>
+        <w:t xml:space="preserve">verified </w:t>
+      </w:r>
       <w:r>
         <w:t>assumption</w:t>
       </w:r>
-      <w:proofErr w:type="spellEnd"/>
-      <w:r>
-        <w:t xml:space="preserve"> </w:t>
-      </w:r>
-      <w:proofErr w:type="spellStart"/>
-      <w:r>
-        <w:t>nodes</w:t>
-      </w:r>
-      <w:proofErr w:type="spellEnd"/>
-      <w:r>
-        <w:t xml:space="preserve"> </w:t>
+      <w:r>
+        <w:t xml:space="preserve"> nodes </w:t>
       </w:r>
       <w:r>
         <w:t>die het model bevat.</w:t>
@@ -4689,49 +4178,26 @@
       <w:r>
         <w:t>“</w:t>
       </w:r>
-      <w:proofErr w:type="spellStart"/>
       <w:r>
         <w:t>weaknes</w:t>
       </w:r>
       <w:r>
         <w:t>s</w:t>
       </w:r>
-      <w:proofErr w:type="spellEnd"/>
+      <w:r>
+        <w:t xml:space="preserve"> under review</w:t>
+      </w:r>
+      <w:r>
+        <w:t>”</w:t>
+      </w:r>
       <w:r>
         <w:t xml:space="preserve"> </w:t>
       </w:r>
-      <w:proofErr w:type="spellStart"/>
-      <w:r>
-        <w:t>under</w:t>
-      </w:r>
-      <w:proofErr w:type="spellEnd"/>
-      <w:r>
-        <w:t xml:space="preserve"> review</w:t>
-      </w:r>
-      <w:r>
-        <w:t>”</w:t>
-      </w:r>
-      <w:r>
-        <w:t xml:space="preserve"> </w:t>
-      </w:r>
-      <w:proofErr w:type="spellStart"/>
-      <w:r>
-        <w:t>nodes</w:t>
-      </w:r>
-      <w:proofErr w:type="spellEnd"/>
-      <w:r>
-        <w:t xml:space="preserve"> </w:t>
-      </w:r>
-      <w:r>
-        <w:t xml:space="preserve">met de hoogste </w:t>
-      </w:r>
-      <w:proofErr w:type="spellStart"/>
-      <w:r>
-        <w:t>danger</w:t>
-      </w:r>
-      <w:proofErr w:type="spellEnd"/>
-      <w:r>
-        <w:t xml:space="preserve"> rating</w:t>
+      <w:r>
+        <w:t xml:space="preserve">nodes </w:t>
+      </w:r>
+      <w:r>
+        <w:t>met de hoogste danger rating</w:t>
       </w:r>
       <w:r>
         <w:t>.</w:t>
@@ -4766,32 +4232,17 @@
         </w:numPr>
       </w:pPr>
       <w:r>
-        <w:t xml:space="preserve">De </w:t>
-      </w:r>
-      <w:proofErr w:type="spellStart"/>
-      <w:r>
-        <w:t>weakness</w:t>
-      </w:r>
-      <w:proofErr w:type="spellEnd"/>
-      <w:r>
-        <w:t xml:space="preserve"> </w:t>
-      </w:r>
-      <w:proofErr w:type="spellStart"/>
-      <w:r>
-        <w:t>nodes</w:t>
-      </w:r>
-      <w:proofErr w:type="spellEnd"/>
+        <w:t>De weakness</w:t>
+      </w:r>
+      <w:r>
+        <w:t xml:space="preserve"> nodes</w:t>
+      </w:r>
       <w:r>
         <w:t>.</w:t>
       </w:r>
       <w:r>
-        <w:t xml:space="preserve"> Rangschik deze op basis van de </w:t>
-      </w:r>
-      <w:proofErr w:type="spellStart"/>
-      <w:r>
-        <w:t>dangerrating</w:t>
-      </w:r>
-      <w:proofErr w:type="spellEnd"/>
+        <w:t xml:space="preserve"> Rangschik deze op basis van de dangerrating</w:t>
+      </w:r>
       <w:r>
         <w:t xml:space="preserve"> van hoogste naar laagste rating</w:t>
       </w:r>
@@ -4826,32 +4277,11 @@
       <w:r>
         <w:t>“</w:t>
       </w:r>
-      <w:proofErr w:type="spellStart"/>
-      <w:r>
-        <w:t>assumption</w:t>
-      </w:r>
-      <w:proofErr w:type="spellEnd"/>
-      <w:r>
-        <w:t xml:space="preserve"> </w:t>
-      </w:r>
-      <w:proofErr w:type="spellStart"/>
-      <w:r>
-        <w:t>under</w:t>
-      </w:r>
-      <w:proofErr w:type="spellEnd"/>
-      <w:r>
-        <w:t xml:space="preserve"> review</w:t>
-      </w:r>
-      <w:r>
-        <w:t xml:space="preserve">” </w:t>
-      </w:r>
-      <w:proofErr w:type="spellStart"/>
-      <w:r>
-        <w:t>nodes</w:t>
-      </w:r>
-      <w:proofErr w:type="spellEnd"/>
-      <w:r>
-        <w:t xml:space="preserve"> er zijn</w:t>
+      <w:r>
+        <w:t>assumption under review</w:t>
+      </w:r>
+      <w:r>
+        <w:t>” nodes er zijn</w:t>
       </w:r>
       <w:r>
         <w:t>.</w:t>
@@ -4883,51 +4313,11 @@
     </w:p>
     <w:p>
       <w:r>
-        <w:t xml:space="preserve">Tot slot moeten de verantwoordelijkheden verdeeld worden binnen het team. Kies een </w:t>
-      </w:r>
-      <w:proofErr w:type="spellStart"/>
-      <w:r>
-        <w:t>branch</w:t>
-      </w:r>
-      <w:proofErr w:type="spellEnd"/>
-      <w:r>
-        <w:t xml:space="preserve"> in de tree dat eindigt op een "</w:t>
-      </w:r>
-      <w:proofErr w:type="spellStart"/>
-      <w:r>
-        <w:t>verified</w:t>
-      </w:r>
-      <w:proofErr w:type="spellEnd"/>
-      <w:r>
-        <w:t xml:space="preserve"> </w:t>
-      </w:r>
-      <w:proofErr w:type="spellStart"/>
-      <w:r>
-        <w:t>assumption</w:t>
-      </w:r>
-      <w:proofErr w:type="spellEnd"/>
-      <w:r>
-        <w:t>".</w:t>
+        <w:t>Tot slot moeten de verantwoordelijkheden verdeeld worden binnen het team. Kies een branch in de tree dat eindigt op een "verified assumption".</w:t>
       </w:r>
       <w:r>
         <w:br/>
-        <w:t xml:space="preserve">Gebruik de volledige </w:t>
-      </w:r>
-      <w:proofErr w:type="spellStart"/>
-      <w:r>
-        <w:t>fortunately</w:t>
-      </w:r>
-      <w:proofErr w:type="spellEnd"/>
-      <w:r>
-        <w:t>/</w:t>
-      </w:r>
-      <w:proofErr w:type="spellStart"/>
-      <w:r>
-        <w:t>unfortunately</w:t>
-      </w:r>
-      <w:proofErr w:type="spellEnd"/>
-      <w:r>
-        <w:t>-keten</w:t>
+        <w:t>Gebruik de volledige fortunately/unfortunately-keten</w:t>
       </w:r>
       <w:r>
         <w:t xml:space="preserve"> (keten vanaf root node tot huidige node)</w:t>
@@ -4956,39 +4346,8 @@
           <w:sz w:val="40"/>
           <w:szCs w:val="40"/>
         </w:rPr>
-        <w:t xml:space="preserve">User </w:t>
-      </w:r>
-      <w:proofErr w:type="spellStart"/>
-      <w:r>
-        <w:rPr>
-          <w:b/>
-          <w:bCs/>
-          <w:sz w:val="40"/>
-          <w:szCs w:val="40"/>
-        </w:rPr>
-        <w:t>experience</w:t>
-      </w:r>
-      <w:proofErr w:type="spellEnd"/>
-      <w:r>
-        <w:rPr>
-          <w:b/>
-          <w:bCs/>
-          <w:sz w:val="40"/>
-          <w:szCs w:val="40"/>
-        </w:rPr>
-        <w:t xml:space="preserve"> </w:t>
-      </w:r>
-      <w:proofErr w:type="spellStart"/>
-      <w:r>
-        <w:rPr>
-          <w:b/>
-          <w:bCs/>
-          <w:sz w:val="40"/>
-          <w:szCs w:val="40"/>
-        </w:rPr>
-        <w:t>questionair</w:t>
-      </w:r>
-      <w:proofErr w:type="spellEnd"/>
+        <w:t>User experience questionair</w:t>
+      </w:r>
     </w:p>
     <w:p>
       <w:pPr>
@@ -5012,23 +4371,7 @@
         </w:rPr>
       </w:pPr>
       <w:r>
-        <w:t xml:space="preserve">Vul na het oplossen van de taken de user </w:t>
-      </w:r>
-      <w:proofErr w:type="spellStart"/>
-      <w:r>
-        <w:t>experience</w:t>
-      </w:r>
-      <w:proofErr w:type="spellEnd"/>
-      <w:r>
-        <w:t xml:space="preserve"> </w:t>
-      </w:r>
-      <w:proofErr w:type="spellStart"/>
-      <w:r>
-        <w:t>questionair</w:t>
-      </w:r>
-      <w:proofErr w:type="spellEnd"/>
-      <w:r>
-        <w:t xml:space="preserve"> in. Wanneer je hiermee klaar bent, mag je versie 1/versie 2 van de software openen en story 1/story 2 inladen. Begin met de software even te bekijken en start hierna aan het eerste/tweede scenario.</w:t>
+        <w:t>Vul na het oplossen van de taken de user experience questionair in. Wanneer je hiermee klaar bent, mag je versie 1/versie 2 van de software openen en story 1/story 2 inladen. Begin met de software even te bekijken en start hierna aan het eerste/tweede scenario.</w:t>
       </w:r>
       <w:r>
         <w:rPr>
@@ -5070,31 +4413,13 @@
       <w:r>
         <w:t xml:space="preserve">Je zit in een softwareteam dat werkt aan een AI-systeem om fraude te detecteren. Er is al een begin gemaakt met een </w:t>
       </w:r>
-      <w:proofErr w:type="spellStart"/>
-      <w:r>
-        <w:rPr>
-          <w:i/>
-          <w:iCs/>
-        </w:rPr>
-        <w:t>Fortunately</w:t>
-      </w:r>
-      <w:proofErr w:type="spellEnd"/>
-      <w:r>
-        <w:rPr>
-          <w:i/>
-          <w:iCs/>
-        </w:rPr>
-        <w:t>–</w:t>
-      </w:r>
-      <w:proofErr w:type="spellStart"/>
-      <w:r>
-        <w:rPr>
-          <w:i/>
-          <w:iCs/>
-        </w:rPr>
-        <w:t>Unfortunately</w:t>
-      </w:r>
-      <w:proofErr w:type="spellEnd"/>
+      <w:r>
+        <w:rPr>
+          <w:i/>
+          <w:iCs/>
+        </w:rPr>
+        <w:t>Fortunately–Unfortunately</w:t>
+      </w:r>
       <w:r>
         <w:t>-model, maar het is nog niet compleet en sommige onderdelen moeten verder uitgewerkt worden.</w:t>
       </w:r>
@@ -5136,19 +4461,12 @@
       <w:r>
         <w:t>“</w:t>
       </w:r>
-      <w:proofErr w:type="spellStart"/>
       <w:r>
         <w:t>weakness</w:t>
       </w:r>
-      <w:proofErr w:type="spellEnd"/>
-      <w:r>
-        <w:t xml:space="preserve">” </w:t>
-      </w:r>
-      <w:proofErr w:type="spellStart"/>
-      <w:r>
-        <w:t>nodes</w:t>
-      </w:r>
-      <w:proofErr w:type="spellEnd"/>
+      <w:r>
+        <w:t>” nodes</w:t>
+      </w:r>
       <w:r>
         <w:t>.</w:t>
       </w:r>
@@ -5287,35 +4605,14 @@
       <w:r>
         <w:t>“</w:t>
       </w:r>
-      <w:proofErr w:type="spellStart"/>
-      <w:r>
-        <w:t>weakness</w:t>
-      </w:r>
-      <w:proofErr w:type="spellEnd"/>
-      <w:r>
-        <w:t xml:space="preserve"> </w:t>
-      </w:r>
-      <w:proofErr w:type="spellStart"/>
-      <w:r>
-        <w:t>under</w:t>
-      </w:r>
-      <w:proofErr w:type="spellEnd"/>
-      <w:r>
-        <w:t xml:space="preserve"> review</w:t>
+      <w:r>
+        <w:t>weakness under review</w:t>
       </w:r>
       <w:r>
         <w:t>” node</w:t>
       </w:r>
       <w:r>
-        <w:t xml:space="preserve"> met de hoogste </w:t>
-      </w:r>
-      <w:proofErr w:type="spellStart"/>
-      <w:r>
-        <w:t>danger</w:t>
-      </w:r>
-      <w:proofErr w:type="spellEnd"/>
-      <w:r>
-        <w:t xml:space="preserve"> rating</w:t>
+        <w:t xml:space="preserve"> met de hoogste danger rating</w:t>
       </w:r>
       <w:r>
         <w:t>.</w:t>
@@ -5335,52 +4632,36 @@
           <w:lang w:val="en-US"/>
         </w:rPr>
       </w:pPr>
-      <w:proofErr w:type="spellStart"/>
       <w:r>
         <w:rPr>
           <w:lang w:val="en-US"/>
         </w:rPr>
-        <w:t>Hoeveel</w:t>
-      </w:r>
-      <w:proofErr w:type="spellEnd"/>
+        <w:t xml:space="preserve">Hoeveel </w:t>
+      </w:r>
       <w:r>
         <w:rPr>
           <w:lang w:val="en-US"/>
         </w:rPr>
-        <w:t xml:space="preserve"> </w:t>
+        <w:t>“</w:t>
       </w:r>
       <w:r>
         <w:rPr>
           <w:lang w:val="en-US"/>
         </w:rPr>
-        <w:t>“</w:t>
+        <w:t>assumption under review</w:t>
       </w:r>
       <w:r>
         <w:rPr>
           <w:lang w:val="en-US"/>
         </w:rPr>
-        <w:t>assumption under review</w:t>
+        <w:t>” nodes</w:t>
       </w:r>
       <w:r>
         <w:rPr>
           <w:lang w:val="en-US"/>
         </w:rPr>
-        <w:t>” nodes</w:t>
-      </w:r>
-      <w:r>
-        <w:rPr>
-          <w:lang w:val="en-US"/>
-        </w:rPr>
-        <w:t xml:space="preserve"> er </w:t>
-      </w:r>
-      <w:proofErr w:type="spellStart"/>
-      <w:r>
-        <w:rPr>
-          <w:lang w:val="en-US"/>
-        </w:rPr>
-        <w:t>zijn</w:t>
-      </w:r>
-      <w:proofErr w:type="spellEnd"/>
+        <w:t xml:space="preserve"> er zijn</w:t>
+      </w:r>
       <w:r>
         <w:rPr>
           <w:lang w:val="en-US"/>
@@ -5437,15 +4718,7 @@
         <w:t>Bij de</w:t>
       </w:r>
       <w:r>
-        <w:t xml:space="preserve"> gevaarlijkste </w:t>
-      </w:r>
-      <w:proofErr w:type="spellStart"/>
-      <w:r>
-        <w:t>weakness</w:t>
-      </w:r>
-      <w:proofErr w:type="spellEnd"/>
-      <w:r>
-        <w:t xml:space="preserve"> merk je dat er nog iets ontbreekt. Zonder dit kan, zoals al aangehaald in de tree, er “</w:t>
+        <w:t xml:space="preserve"> gevaarlijkste weakness merk je dat er nog iets ontbreekt. Zonder dit kan, zoals al aangehaald in de tree, er “</w:t>
       </w:r>
       <w:r>
         <w:rPr>
@@ -5469,11 +4742,9 @@
       <w:r>
         <w:t xml:space="preserve">ontbrekende </w:t>
       </w:r>
-      <w:proofErr w:type="spellStart"/>
       <w:r>
         <w:t>nodes</w:t>
       </w:r>
-      <w:proofErr w:type="spellEnd"/>
       <w:r>
         <w:t xml:space="preserve"> </w:t>
       </w:r>
@@ -5481,13 +4752,8 @@
         <w:t xml:space="preserve">onder elkaar </w:t>
       </w:r>
       <w:r>
-        <w:t xml:space="preserve">toe aan deze </w:t>
-      </w:r>
-      <w:proofErr w:type="spellStart"/>
-      <w:r>
-        <w:t>weakness</w:t>
-      </w:r>
-      <w:proofErr w:type="spellEnd"/>
+        <w:t>toe aan deze weakness</w:t>
+      </w:r>
       <w:r>
         <w:t>.</w:t>
       </w:r>
@@ -5512,23 +4778,7 @@
           <w:i/>
           <w:iCs/>
         </w:rPr>
-        <w:t>Toegang wordt beperkt tot geverifieerde accounts [</w:t>
-      </w:r>
-      <w:proofErr w:type="spellStart"/>
-      <w:r>
-        <w:rPr>
-          <w:i/>
-          <w:iCs/>
-        </w:rPr>
-        <w:t>Assumption</w:t>
-      </w:r>
-      <w:proofErr w:type="spellEnd"/>
-      <w:r>
-        <w:rPr>
-          <w:i/>
-          <w:iCs/>
-        </w:rPr>
-        <w:t xml:space="preserve"> Under Review]</w:t>
+        <w:t>Toegang wordt beperkt tot geverifieerde accounts [Assumption Under Review]</w:t>
       </w:r>
       <w:r>
         <w:rPr>
@@ -5572,17 +4822,8 @@
           <w:i/>
           <w:iCs/>
         </w:rPr>
-        <w:t>[</w:t>
-      </w:r>
-      <w:proofErr w:type="spellStart"/>
-      <w:r>
-        <w:rPr>
-          <w:i/>
-          <w:iCs/>
-        </w:rPr>
-        <w:t>Weakness</w:t>
-      </w:r>
-      <w:proofErr w:type="spellEnd"/>
+        <w:t>[Weakness</w:t>
+      </w:r>
       <w:r>
         <w:rPr>
           <w:i/>
@@ -5613,13 +4854,8 @@
           <w:numId w:val="3"/>
         </w:numPr>
       </w:pPr>
-      <w:proofErr w:type="spellStart"/>
-      <w:r>
-        <w:t>Likelyhood</w:t>
-      </w:r>
-      <w:proofErr w:type="spellEnd"/>
-      <w:r>
-        <w:t>: 5</w:t>
+      <w:r>
+        <w:t>Likelyhood: 5</w:t>
       </w:r>
     </w:p>
     <w:p>
@@ -5642,13 +4878,8 @@
           <w:numId w:val="3"/>
         </w:numPr>
       </w:pPr>
-      <w:proofErr w:type="spellStart"/>
-      <w:r>
-        <w:t>Danger</w:t>
-      </w:r>
-      <w:proofErr w:type="spellEnd"/>
-      <w:r>
-        <w:t xml:space="preserve"> rating: 5*2 =&gt; 10</w:t>
+      <w:r>
+        <w:t>Danger rating: 5*2 =&gt; 10</w:t>
       </w:r>
     </w:p>
     <w:p>
@@ -5668,109 +4899,174 @@
           <w:iCs/>
           <w:lang w:val="en-US"/>
         </w:rPr>
-        <w:t xml:space="preserve">“Self-service </w:t>
-      </w:r>
-      <w:proofErr w:type="spellStart"/>
+        <w:t>“Self-service accountbeheer vermindert werklast voor IT-support [Verified Assumption]</w:t>
+      </w:r>
       <w:r>
         <w:rPr>
           <w:i/>
           <w:iCs/>
           <w:lang w:val="en-US"/>
         </w:rPr>
-        <w:t>accountbeheer</w:t>
-      </w:r>
-      <w:proofErr w:type="spellEnd"/>
-      <w:r>
-        <w:rPr>
-          <w:i/>
-          <w:iCs/>
+        <w:t>”</w:t>
+      </w:r>
+    </w:p>
+    <w:p>
+      <w:r>
+        <w:rPr>
           <w:lang w:val="en-US"/>
         </w:rPr>
         <w:t xml:space="preserve"> </w:t>
       </w:r>
-      <w:proofErr w:type="spellStart"/>
-      <w:r>
-        <w:rPr>
-          <w:i/>
-          <w:iCs/>
-          <w:lang w:val="en-US"/>
-        </w:rPr>
-        <w:t>vermindert</w:t>
-      </w:r>
-      <w:proofErr w:type="spellEnd"/>
-      <w:r>
-        <w:rPr>
-          <w:i/>
-          <w:iCs/>
-          <w:lang w:val="en-US"/>
-        </w:rPr>
+      <w:r>
+        <w:t xml:space="preserve">Alles voor deze piste is toegevoegd. Noteer of markeer </w:t>
+      </w:r>
+      <w:r>
+        <w:t xml:space="preserve">bij de laatste fortunately node dat dit een </w:t>
+      </w:r>
+      <w:r>
+        <w:rPr>
+          <w:i/>
+          <w:iCs/>
+        </w:rPr>
+        <w:t xml:space="preserve">“Verified Assumption” </w:t>
+      </w:r>
+      <w:r>
+        <w:t>is.</w:t>
+      </w:r>
+    </w:p>
+    <w:p>
+      <w:pPr>
+        <w:rPr>
+          <w:b/>
+          <w:bCs/>
+        </w:rPr>
+      </w:pPr>
+      <w:r>
+        <w:rPr>
+          <w:b/>
+          <w:bCs/>
+        </w:rPr>
+        <w:t>Taak 3:</w:t>
+      </w:r>
+    </w:p>
+    <w:p>
+      <w:r>
+        <w:t xml:space="preserve">Je ziet nog een </w:t>
+      </w:r>
+      <w:r>
+        <w:t>tak</w:t>
+      </w:r>
+      <w:r>
         <w:t xml:space="preserve"> </w:t>
       </w:r>
-      <w:proofErr w:type="spellStart"/>
-      <w:r>
-        <w:rPr>
-          <w:i/>
-          <w:iCs/>
-          <w:lang w:val="en-US"/>
-        </w:rPr>
-        <w:t>werklast</w:t>
-      </w:r>
-      <w:proofErr w:type="spellEnd"/>
-      <w:r>
-        <w:rPr>
-          <w:i/>
-          <w:iCs/>
-          <w:lang w:val="en-US"/>
-        </w:rPr>
+      <w:r>
+        <w:t>die</w:t>
+      </w:r>
+      <w:r>
+        <w:t xml:space="preserve"> je wilt bespreken met je collega’s in de volgende vergadering</w:t>
+      </w:r>
+      <w:r>
+        <w:t xml:space="preserve">, namelijk </w:t>
+      </w:r>
+      <w:r>
+        <w:t>“</w:t>
+      </w:r>
+      <w:r>
+        <w:rPr>
+          <w:i/>
+          <w:iCs/>
+        </w:rPr>
+        <w:t>Junior teamleden besluiten alle servers uit te schakelen om fraude te stoppen</w:t>
+      </w:r>
+      <w:r>
+        <w:rPr>
+          <w:i/>
+          <w:iCs/>
+        </w:rPr>
+        <w:t>”</w:t>
+      </w:r>
+      <w:r>
+        <w:t xml:space="preserve">. </w:t>
+      </w:r>
+      <w:r>
+        <w:t>Deze node is incorrect en</w:t>
+      </w:r>
+      <w:r>
+        <w:t xml:space="preserve"> hoort</w:t>
+      </w:r>
+      <w:r>
+        <w:t xml:space="preserve"> ook</w:t>
+      </w:r>
+      <w:r>
         <w:t xml:space="preserve"> </w:t>
       </w:r>
-      <w:proofErr w:type="spellStart"/>
-      <w:r>
-        <w:rPr>
-          <w:i/>
-          <w:iCs/>
-          <w:lang w:val="en-US"/>
-        </w:rPr>
-        <w:t>voor</w:t>
-      </w:r>
-      <w:proofErr w:type="spellEnd"/>
-      <w:r>
-        <w:rPr>
-          <w:i/>
-          <w:iCs/>
-          <w:lang w:val="en-US"/>
-        </w:rPr>
-        <w:t xml:space="preserve"> IT-support [Verified Assumption]</w:t>
-      </w:r>
-      <w:r>
-        <w:rPr>
-          <w:i/>
-          <w:iCs/>
-          <w:lang w:val="en-US"/>
-        </w:rPr>
-        <w:t>”</w:t>
-      </w:r>
-    </w:p>
-    <w:p>
-      <w:r>
-        <w:rPr>
-          <w:lang w:val="en-US"/>
-        </w:rPr>
+      <w:r>
+        <w:t>niet onder de classificatie van een fortunately node</w:t>
+      </w:r>
+      <w:r>
+        <w:t>.</w:t>
+      </w:r>
+      <w:r>
         <w:t xml:space="preserve"> </w:t>
       </w:r>
       <w:r>
-        <w:t xml:space="preserve">Alles voor deze piste is toegevoegd. Noteer of markeer </w:t>
-      </w:r>
-      <w:r>
-        <w:t xml:space="preserve">bij de laatste </w:t>
-      </w:r>
-      <w:proofErr w:type="spellStart"/>
-      <w:r>
-        <w:t>fortunately</w:t>
-      </w:r>
-      <w:proofErr w:type="spellEnd"/>
-      <w:r>
-        <w:t xml:space="preserve"> node dat dit een </w:t>
+        <w:t>Omdat je dit eerst wil bespreken, wil je nog geen aanpassingen doen</w:t>
+      </w:r>
+      <w:r>
+        <w:t>.</w:t>
+      </w:r>
+      <w:r>
+        <w:t xml:space="preserve"> </w:t>
+      </w:r>
+      <w:r>
+        <w:t>Zoek</w:t>
+      </w:r>
+      <w:r>
+        <w:t xml:space="preserve"> wel</w:t>
+      </w:r>
+      <w:r>
+        <w:t xml:space="preserve"> de node op en documenteer de keten van nodes vanaf de root tot aan deze specifieke node</w:t>
+      </w:r>
+      <w:r>
+        <w:t>.</w:t>
+      </w:r>
+    </w:p>
+    <w:p>
+      <w:pPr>
+        <w:rPr>
+          <w:b/>
+          <w:bCs/>
+        </w:rPr>
+      </w:pPr>
+      <w:r>
+        <w:rPr>
+          <w:b/>
+          <w:bCs/>
+        </w:rPr>
+        <w:t>Taak 4:</w:t>
+      </w:r>
+    </w:p>
+    <w:p>
+      <w:r>
+        <w:t xml:space="preserve">Daarnaast </w:t>
+      </w:r>
+      <w:r>
+        <w:t>vraag je je af</w:t>
+      </w:r>
+      <w:r>
+        <w:t xml:space="preserve"> wat er gebeurt als we het </w:t>
+      </w:r>
+      <w:r>
+        <w:t>AI fraudedetectiesysteem</w:t>
+      </w:r>
+      <w:r>
+        <w:t xml:space="preserve"> </w:t>
+      </w:r>
+      <w:r>
+        <w:t xml:space="preserve">simpelweg afstemmen om minder false negatives te hebben. Dit noteren in de tree, maakt het mogelijk om hierover te brainstormen binnen het team. </w:t>
+      </w:r>
+      <w:r>
+        <w:t xml:space="preserve">Zoek de node </w:t>
       </w:r>
       <w:r>
         <w:rPr>
@@ -5779,31 +5075,13 @@
         </w:rPr>
         <w:t>“</w:t>
       </w:r>
-      <w:proofErr w:type="spellStart"/>
-      <w:r>
-        <w:rPr>
-          <w:i/>
-          <w:iCs/>
-        </w:rPr>
-        <w:t>Verified</w:t>
-      </w:r>
-      <w:proofErr w:type="spellEnd"/>
-      <w:r>
-        <w:rPr>
-          <w:i/>
-          <w:iCs/>
-        </w:rPr>
-        <w:t xml:space="preserve"> </w:t>
-      </w:r>
-      <w:proofErr w:type="spellStart"/>
-      <w:r>
-        <w:rPr>
-          <w:i/>
-          <w:iCs/>
-        </w:rPr>
-        <w:t>Assumption</w:t>
-      </w:r>
-      <w:proofErr w:type="spellEnd"/>
+      <w:r>
+        <w:rPr>
+          <w:i/>
+          <w:iCs/>
+        </w:rPr>
+        <w:t>Hoge false positives blokkeren legitieme gebruikers</w:t>
+      </w:r>
       <w:r>
         <w:rPr>
           <w:i/>
@@ -5812,241 +5090,10 @@
         <w:t xml:space="preserve">” </w:t>
       </w:r>
       <w:r>
-        <w:t>is.</w:t>
-      </w:r>
-    </w:p>
-    <w:p>
-      <w:pPr>
-        <w:rPr>
-          <w:b/>
-          <w:bCs/>
-        </w:rPr>
-      </w:pPr>
-      <w:r>
-        <w:rPr>
-          <w:b/>
-          <w:bCs/>
-        </w:rPr>
-        <w:t>Taak 3:</w:t>
-      </w:r>
-    </w:p>
-    <w:p>
-      <w:r>
-        <w:t xml:space="preserve">Je ziet nog een </w:t>
-      </w:r>
-      <w:r>
-        <w:t>tak</w:t>
-      </w:r>
-      <w:r>
-        <w:t xml:space="preserve"> </w:t>
-      </w:r>
-      <w:r>
-        <w:t>die</w:t>
-      </w:r>
-      <w:r>
-        <w:t xml:space="preserve"> je wilt bespreken met je collega’s in de volgende vergadering</w:t>
-      </w:r>
-      <w:r>
-        <w:t xml:space="preserve">, namelijk </w:t>
-      </w:r>
-      <w:r>
-        <w:t>“</w:t>
-      </w:r>
-      <w:r>
-        <w:rPr>
-          <w:i/>
-          <w:iCs/>
-        </w:rPr>
-        <w:t>Junior teamleden besluiten alle servers uit te schakelen om fraude te stoppen</w:t>
-      </w:r>
-      <w:r>
-        <w:rPr>
-          <w:i/>
-          <w:iCs/>
-        </w:rPr>
-        <w:t>”</w:t>
-      </w:r>
-      <w:r>
-        <w:t xml:space="preserve">. </w:t>
-      </w:r>
-      <w:r>
-        <w:t>Deze node is incorrect en</w:t>
-      </w:r>
-      <w:r>
-        <w:t xml:space="preserve"> hoort</w:t>
-      </w:r>
-      <w:r>
-        <w:t xml:space="preserve"> ook</w:t>
-      </w:r>
-      <w:r>
-        <w:t xml:space="preserve"> </w:t>
-      </w:r>
-      <w:r>
-        <w:t xml:space="preserve">niet onder de classificatie van een </w:t>
-      </w:r>
-      <w:proofErr w:type="spellStart"/>
-      <w:r>
-        <w:t>fortunately</w:t>
-      </w:r>
-      <w:proofErr w:type="spellEnd"/>
-      <w:r>
-        <w:t xml:space="preserve"> node</w:t>
-      </w:r>
-      <w:r>
-        <w:t>.</w:t>
-      </w:r>
-      <w:r>
-        <w:t xml:space="preserve"> </w:t>
-      </w:r>
-      <w:r>
-        <w:t>Omdat je dit eerst wil bespreken, wil je nog geen aanpassingen doen</w:t>
-      </w:r>
-      <w:r>
-        <w:t>.</w:t>
-      </w:r>
-      <w:r>
-        <w:t xml:space="preserve"> </w:t>
-      </w:r>
-      <w:r>
-        <w:t>Zoek</w:t>
-      </w:r>
-      <w:r>
-        <w:t xml:space="preserve"> wel</w:t>
-      </w:r>
-      <w:r>
-        <w:t xml:space="preserve"> de node op en documenteer de keten van </w:t>
-      </w:r>
-      <w:proofErr w:type="spellStart"/>
-      <w:r>
-        <w:t>nodes</w:t>
-      </w:r>
-      <w:proofErr w:type="spellEnd"/>
-      <w:r>
-        <w:t xml:space="preserve"> vanaf de root tot aan deze specifieke node</w:t>
-      </w:r>
-      <w:r>
-        <w:t>.</w:t>
-      </w:r>
-    </w:p>
-    <w:p>
-      <w:pPr>
-        <w:rPr>
-          <w:b/>
-          <w:bCs/>
-        </w:rPr>
-      </w:pPr>
-      <w:r>
-        <w:rPr>
-          <w:b/>
-          <w:bCs/>
-        </w:rPr>
-        <w:t>Taak 4:</w:t>
-      </w:r>
-    </w:p>
-    <w:p>
-      <w:r>
-        <w:t xml:space="preserve">Daarnaast </w:t>
-      </w:r>
-      <w:r>
-        <w:t>vraag je je af</w:t>
-      </w:r>
-      <w:r>
-        <w:t xml:space="preserve"> wat er gebeurt als we het </w:t>
-      </w:r>
-      <w:r>
-        <w:t>AI fraudedetectiesysteem</w:t>
-      </w:r>
-      <w:r>
-        <w:t xml:space="preserve"> </w:t>
-      </w:r>
-      <w:r>
-        <w:t xml:space="preserve">simpelweg afstemmen om minder </w:t>
-      </w:r>
-      <w:proofErr w:type="spellStart"/>
-      <w:r>
-        <w:t>false</w:t>
-      </w:r>
-      <w:proofErr w:type="spellEnd"/>
-      <w:r>
-        <w:t xml:space="preserve"> </w:t>
-      </w:r>
-      <w:proofErr w:type="spellStart"/>
-      <w:r>
-        <w:t>negatives</w:t>
-      </w:r>
-      <w:proofErr w:type="spellEnd"/>
-      <w:r>
-        <w:t xml:space="preserve"> te hebben. Dit noteren in de tree, maakt het mogelijk om hierover te brainstormen binnen het team. </w:t>
-      </w:r>
-      <w:r>
-        <w:t xml:space="preserve">Zoek de node </w:t>
-      </w:r>
-      <w:r>
-        <w:rPr>
-          <w:i/>
-          <w:iCs/>
-        </w:rPr>
-        <w:t>“</w:t>
-      </w:r>
-      <w:r>
-        <w:rPr>
-          <w:i/>
-          <w:iCs/>
-        </w:rPr>
-        <w:t xml:space="preserve">Hoge </w:t>
-      </w:r>
-      <w:proofErr w:type="spellStart"/>
-      <w:r>
-        <w:rPr>
-          <w:i/>
-          <w:iCs/>
-        </w:rPr>
-        <w:t>false</w:t>
-      </w:r>
-      <w:proofErr w:type="spellEnd"/>
-      <w:r>
-        <w:rPr>
-          <w:i/>
-          <w:iCs/>
-        </w:rPr>
-        <w:t xml:space="preserve"> </w:t>
-      </w:r>
-      <w:proofErr w:type="spellStart"/>
-      <w:r>
-        <w:rPr>
-          <w:i/>
-          <w:iCs/>
-        </w:rPr>
-        <w:t>positives</w:t>
-      </w:r>
-      <w:proofErr w:type="spellEnd"/>
-      <w:r>
-        <w:rPr>
-          <w:i/>
-          <w:iCs/>
-        </w:rPr>
-        <w:t xml:space="preserve"> blokkeren legitieme gebruikers</w:t>
-      </w:r>
-      <w:r>
-        <w:rPr>
-          <w:i/>
-          <w:iCs/>
-        </w:rPr>
-        <w:t xml:space="preserve">” </w:t>
-      </w:r>
-      <w:r>
         <w:t>en voeg onder</w:t>
       </w:r>
       <w:r>
-        <w:t xml:space="preserve">staande </w:t>
-      </w:r>
-      <w:proofErr w:type="spellStart"/>
-      <w:r>
-        <w:t>nodes</w:t>
-      </w:r>
-      <w:proofErr w:type="spellEnd"/>
-      <w:r>
-        <w:t xml:space="preserve"> onder elkaar toe</w:t>
+        <w:t>staande nodes onder elkaar toe</w:t>
       </w:r>
       <w:r>
         <w:t>:</w:t>
@@ -6059,13 +5106,8 @@
           <w:numId w:val="4"/>
         </w:numPr>
       </w:pPr>
-      <w:proofErr w:type="spellStart"/>
-      <w:r>
-        <w:t>Fortunately</w:t>
-      </w:r>
-      <w:proofErr w:type="spellEnd"/>
-      <w:r>
-        <w:t xml:space="preserve">: </w:t>
+      <w:r>
+        <w:t xml:space="preserve">Fortunately: </w:t>
       </w:r>
       <w:r>
         <w:rPr>
@@ -6079,23 +5121,7 @@
           <w:i/>
           <w:iCs/>
         </w:rPr>
-        <w:t xml:space="preserve"> [</w:t>
-      </w:r>
-      <w:proofErr w:type="spellStart"/>
-      <w:r>
-        <w:rPr>
-          <w:i/>
-          <w:iCs/>
-        </w:rPr>
-        <w:t>Assumption</w:t>
-      </w:r>
-      <w:proofErr w:type="spellEnd"/>
-      <w:r>
-        <w:rPr>
-          <w:i/>
-          <w:iCs/>
-        </w:rPr>
-        <w:t xml:space="preserve"> Under Review]</w:t>
+        <w:t xml:space="preserve"> [Assumption Under Review]</w:t>
       </w:r>
       <w:r>
         <w:rPr>
@@ -6112,100 +5138,22 @@
           <w:numId w:val="4"/>
         </w:numPr>
       </w:pPr>
-      <w:proofErr w:type="spellStart"/>
-      <w:r>
-        <w:t>Unfortunately</w:t>
-      </w:r>
-      <w:proofErr w:type="spellEnd"/>
-      <w:r>
-        <w:t xml:space="preserve">: </w:t>
-      </w:r>
-      <w:r>
-        <w:rPr>
-          <w:i/>
-          <w:iCs/>
-        </w:rPr>
-        <w:t xml:space="preserve">"Het terugdringen van </w:t>
-      </w:r>
-      <w:proofErr w:type="spellStart"/>
-      <w:r>
-        <w:rPr>
-          <w:i/>
-          <w:iCs/>
-        </w:rPr>
-        <w:t>false</w:t>
-      </w:r>
-      <w:proofErr w:type="spellEnd"/>
-      <w:r>
-        <w:rPr>
-          <w:i/>
-          <w:iCs/>
-        </w:rPr>
-        <w:t xml:space="preserve"> </w:t>
-      </w:r>
-      <w:proofErr w:type="spellStart"/>
-      <w:r>
-        <w:rPr>
-          <w:i/>
-          <w:iCs/>
-        </w:rPr>
-        <w:t>negatives</w:t>
-      </w:r>
-      <w:proofErr w:type="spellEnd"/>
-      <w:r>
-        <w:rPr>
-          <w:i/>
-          <w:iCs/>
-        </w:rPr>
-        <w:t xml:space="preserve"> leidt tot meer </w:t>
-      </w:r>
-      <w:proofErr w:type="spellStart"/>
-      <w:r>
-        <w:rPr>
-          <w:i/>
-          <w:iCs/>
-        </w:rPr>
-        <w:t>false</w:t>
-      </w:r>
-      <w:proofErr w:type="spellEnd"/>
-      <w:r>
-        <w:rPr>
-          <w:i/>
-          <w:iCs/>
-        </w:rPr>
-        <w:t xml:space="preserve"> </w:t>
-      </w:r>
-      <w:proofErr w:type="spellStart"/>
-      <w:r>
-        <w:rPr>
-          <w:i/>
-          <w:iCs/>
-        </w:rPr>
-        <w:t>positives</w:t>
-      </w:r>
-      <w:proofErr w:type="spellEnd"/>
-      <w:r>
-        <w:rPr>
-          <w:i/>
-          <w:iCs/>
-        </w:rPr>
-        <w:t xml:space="preserve"> [</w:t>
-      </w:r>
-      <w:proofErr w:type="spellStart"/>
-      <w:r>
-        <w:rPr>
-          <w:i/>
-          <w:iCs/>
-        </w:rPr>
-        <w:t>Weakness</w:t>
-      </w:r>
-      <w:proofErr w:type="spellEnd"/>
-      <w:r>
-        <w:rPr>
-          <w:i/>
-          <w:iCs/>
-        </w:rPr>
-        <w:t>]</w:t>
+      <w:r>
+        <w:t xml:space="preserve">Unfortunately: </w:t>
+      </w:r>
+      <w:r>
+        <w:rPr>
+          <w:i/>
+          <w:iCs/>
+        </w:rPr>
+        <w:t>"Het terugdringen van false negatives leidt tot meer false positives</w:t>
+      </w:r>
+      <w:r>
+        <w:rPr>
+          <w:i/>
+          <w:iCs/>
+        </w:rPr>
+        <w:t xml:space="preserve"> [Weakness]</w:t>
       </w:r>
       <w:r>
         <w:rPr>
@@ -6223,13 +5171,8 @@
           <w:numId w:val="4"/>
         </w:numPr>
       </w:pPr>
-      <w:proofErr w:type="spellStart"/>
-      <w:r>
-        <w:t>Likelyhood</w:t>
-      </w:r>
-      <w:proofErr w:type="spellEnd"/>
-      <w:r>
-        <w:t>: 5</w:t>
+      <w:r>
+        <w:t>Likelyhood: 5</w:t>
       </w:r>
     </w:p>
     <w:p>
@@ -6255,13 +5198,8 @@
           <w:numId w:val="4"/>
         </w:numPr>
       </w:pPr>
-      <w:proofErr w:type="spellStart"/>
-      <w:r>
-        <w:t>Danger</w:t>
-      </w:r>
-      <w:proofErr w:type="spellEnd"/>
-      <w:r>
-        <w:t xml:space="preserve"> rating: 5*</w:t>
+      <w:r>
+        <w:t>Danger rating: 5*</w:t>
       </w:r>
       <w:r>
         <w:t>1</w:t>
@@ -6299,20 +5237,8 @@
           <w:lang w:val="en-GB"/>
         </w:rPr>
         <w:lastRenderedPageBreak/>
-        <w:t xml:space="preserve">User experience </w:t>
-      </w:r>
-      <w:proofErr w:type="spellStart"/>
-      <w:r>
-        <w:rPr>
-          <w:b/>
-          <w:bCs/>
-          <w:sz w:val="40"/>
-          <w:szCs w:val="40"/>
-          <w:lang w:val="en-GB"/>
-        </w:rPr>
-        <w:t>questionair</w:t>
-      </w:r>
-      <w:proofErr w:type="spellEnd"/>
+        <w:t>User experience questionair</w:t>
+      </w:r>
     </w:p>
     <w:p>
       <w:pPr>
@@ -6332,23 +5258,7 @@
         <w:t>Vul na het</w:t>
       </w:r>
       <w:r>
-        <w:t xml:space="preserve"> oplossen van de taken de user </w:t>
-      </w:r>
-      <w:proofErr w:type="spellStart"/>
-      <w:r>
-        <w:t>experience</w:t>
-      </w:r>
-      <w:proofErr w:type="spellEnd"/>
-      <w:r>
-        <w:t xml:space="preserve"> </w:t>
-      </w:r>
-      <w:proofErr w:type="spellStart"/>
-      <w:r>
-        <w:t>questionair</w:t>
-      </w:r>
-      <w:proofErr w:type="spellEnd"/>
-      <w:r>
-        <w:t xml:space="preserve"> in. </w:t>
+        <w:t xml:space="preserve"> oplossen van de taken de user experience questionair in. </w:t>
       </w:r>
       <w:r>
         <w:t>Wanneer je hiermee klaar bent,</w:t>
@@ -6386,15 +5296,7 @@
     </w:p>
     <w:p>
       <w:r>
-        <w:t xml:space="preserve">Aan de hand van de volgende vragen, is het doel de toevoegingen ten op </w:t>
-      </w:r>
-      <w:proofErr w:type="spellStart"/>
-      <w:r>
-        <w:t>zichte</w:t>
-      </w:r>
-      <w:proofErr w:type="spellEnd"/>
-      <w:r>
-        <w:t xml:space="preserve"> van de basissoftware te bespreken.</w:t>
+        <w:t>Aan de hand van de volgende vragen, is het doel de toevoegingen ten op zichte van de basissoftware te bespreken.</w:t>
       </w:r>
     </w:p>
     <w:p>
@@ -6417,35 +5319,7 @@
         <w:rPr>
           <w:lang w:val="en-US"/>
         </w:rPr>
-        <w:t xml:space="preserve">Was de Fortunately-Unfortunately </w:t>
-      </w:r>
-      <w:proofErr w:type="spellStart"/>
-      <w:r>
-        <w:rPr>
-          <w:lang w:val="en-US"/>
-        </w:rPr>
-        <w:t>methode</w:t>
-      </w:r>
-      <w:proofErr w:type="spellEnd"/>
-      <w:r>
-        <w:rPr>
-          <w:lang w:val="en-US"/>
-        </w:rPr>
-        <w:t xml:space="preserve"> </w:t>
-      </w:r>
-      <w:proofErr w:type="spellStart"/>
-      <w:r>
-        <w:rPr>
-          <w:lang w:val="en-US"/>
-        </w:rPr>
-        <w:t>duidelijk</w:t>
-      </w:r>
-      <w:proofErr w:type="spellEnd"/>
-      <w:r>
-        <w:rPr>
-          <w:lang w:val="en-US"/>
-        </w:rPr>
-        <w:t>?</w:t>
+        <w:t>Was de Fortunately-Unfortunately methode duidelijk?</w:t>
       </w:r>
     </w:p>
     <w:p>
@@ -6582,13 +5456,8 @@
       <w:r>
         <w:t xml:space="preserve"> </w:t>
       </w:r>
-      <w:proofErr w:type="spellStart"/>
-      <w:r>
-        <w:t>nodes</w:t>
-      </w:r>
-      <w:proofErr w:type="spellEnd"/>
-      <w:r>
-        <w:t xml:space="preserve"> per bepaalde status</w:t>
+      <w:r>
+        <w:t>nodes per bepaalde status</w:t>
       </w:r>
     </w:p>
     <w:p>
@@ -6603,13 +5472,8 @@
         <w:tab/>
       </w:r>
       <w:r>
-        <w:t xml:space="preserve">Rangschikking op basis van </w:t>
-      </w:r>
-      <w:proofErr w:type="spellStart"/>
-      <w:r>
-        <w:t>danger</w:t>
-      </w:r>
-      <w:proofErr w:type="spellEnd"/>
+        <w:t>Rangschikking op basis van danger</w:t>
+      </w:r>
       <w:r>
         <w:t xml:space="preserve"> </w:t>
       </w:r>
@@ -6674,13 +5538,8 @@
         <w:tab/>
       </w:r>
       <w:r>
-        <w:t xml:space="preserve">Tooltips bij </w:t>
-      </w:r>
-      <w:proofErr w:type="spellStart"/>
-      <w:r>
-        <w:t>hoveren</w:t>
-      </w:r>
-      <w:proofErr w:type="spellEnd"/>
+        <w:t>Tooltips bij hoveren</w:t>
+      </w:r>
     </w:p>
     <w:p>
       <w:pPr>
@@ -6695,25 +5554,55 @@
           <w:ilvl w:val="0"/>
           <w:numId w:val="5"/>
         </w:numPr>
-        <w:spacing w:line="240" w:lineRule="auto"/>
-      </w:pPr>
-      <w:r>
-        <w:t>Zijn de tooltips noodzakelijk om de uitgebreide software efficiënt te kunnen gebruiken?</w:t>
-      </w:r>
-      <w:r>
-        <w:br/>
-      </w:r>
-      <w:r>
-        <w:br/>
-      </w:r>
-      <w:r>
-        <w:br/>
-      </w:r>
-    </w:p>
-    <w:p>
-      <w:pPr>
-        <w:spacing w:line="240" w:lineRule="auto"/>
-        <w:ind w:firstLine="708"/>
+      </w:pPr>
+      <w:r>
+        <w:t xml:space="preserve">Welke onderdelen van </w:t>
+      </w:r>
+      <w:r>
+        <w:t>versie 1/versie 2 van de</w:t>
+      </w:r>
+      <w:r>
+        <w:t xml:space="preserve"> software zouden volgens jou verbeterd kunnen worden?</w:t>
+      </w:r>
+    </w:p>
+    <w:p>
+      <w:pPr>
+        <w:pStyle w:val="Lijstalinea"/>
+      </w:pPr>
+    </w:p>
+    <w:p>
+      <w:pPr>
+        <w:pStyle w:val="Lijstalinea"/>
+      </w:pPr>
+    </w:p>
+    <w:p>
+      <w:pPr>
+        <w:pStyle w:val="Lijstalinea"/>
+      </w:pPr>
+    </w:p>
+    <w:p>
+      <w:pPr>
+        <w:pStyle w:val="Lijstalinea"/>
+      </w:pPr>
+    </w:p>
+    <w:p>
+      <w:pPr>
+        <w:pStyle w:val="Lijstalinea"/>
+      </w:pPr>
+    </w:p>
+    <w:p>
+      <w:pPr>
+        <w:pStyle w:val="Lijstalinea"/>
+      </w:pPr>
+    </w:p>
+    <w:p>
+      <w:pPr>
+        <w:pStyle w:val="Lijstalinea"/>
+      </w:pPr>
+    </w:p>
+    <w:p>
+      <w:pPr>
+        <w:pStyle w:val="Lijstalinea"/>
       </w:pPr>
     </w:p>
     <w:p>
@@ -6725,74 +5614,7 @@
         </w:numPr>
       </w:pPr>
       <w:r>
-        <w:lastRenderedPageBreak/>
-        <w:t xml:space="preserve">Welke onderdelen van </w:t>
-      </w:r>
-      <w:r>
-        <w:t>versie 1/versie 2 van de</w:t>
-      </w:r>
-      <w:r>
-        <w:t xml:space="preserve"> software zouden volgens jou verbeterd kunnen worden?</w:t>
-      </w:r>
-    </w:p>
-    <w:p>
-      <w:pPr>
-        <w:pStyle w:val="Lijstalinea"/>
-      </w:pPr>
-    </w:p>
-    <w:p>
-      <w:pPr>
-        <w:pStyle w:val="Lijstalinea"/>
-      </w:pPr>
-    </w:p>
-    <w:p>
-      <w:pPr>
-        <w:pStyle w:val="Lijstalinea"/>
-      </w:pPr>
-    </w:p>
-    <w:p>
-      <w:pPr>
-        <w:pStyle w:val="Lijstalinea"/>
-      </w:pPr>
-    </w:p>
-    <w:p>
-      <w:pPr>
-        <w:pStyle w:val="Lijstalinea"/>
-      </w:pPr>
-    </w:p>
-    <w:p>
-      <w:pPr>
-        <w:pStyle w:val="Lijstalinea"/>
-      </w:pPr>
-    </w:p>
-    <w:p>
-      <w:pPr>
-        <w:pStyle w:val="Lijstalinea"/>
-      </w:pPr>
-    </w:p>
-    <w:p>
-      <w:pPr>
-        <w:pStyle w:val="Lijstalinea"/>
-      </w:pPr>
-    </w:p>
-    <w:p>
-      <w:pPr>
-        <w:pStyle w:val="Lijstalinea"/>
-        <w:numPr>
-          <w:ilvl w:val="0"/>
-          <w:numId w:val="5"/>
-        </w:numPr>
-      </w:pPr>
-      <w:r>
-        <w:t xml:space="preserve">Heb je suggesties om features op een andere manier aan te pakken of een feature die nog nuttig kan zijn om de user </w:t>
-      </w:r>
-      <w:proofErr w:type="spellStart"/>
-      <w:r>
-        <w:t>experience</w:t>
-      </w:r>
-      <w:proofErr w:type="spellEnd"/>
-      <w:r>
-        <w:t xml:space="preserve"> te verbeteren?</w:t>
+        <w:t>Heb je suggesties om features op een andere manier aan te pakken of een feature die nog nuttig kan zijn om de user experience te verbeteren?</w:t>
       </w:r>
     </w:p>
     <w:p>
@@ -9235,6 +8057,7 @@
   <w:style w:type="character" w:default="1" w:styleId="Standaardalinea-lettertype">
     <w:name w:val="Default Paragraph Font"/>
     <w:uiPriority w:val="1"/>
+    <w:semiHidden/>
     <w:unhideWhenUsed/>
   </w:style>
   <w:style w:type="table" w:default="1" w:styleId="Standaardtabel">

</xml_diff>